<commit_message>
v2.2.0 - Calibracion visual popperiana: superindices de notas al pie (R-153), purga de resaltados (R-154), normalizacion de 596 plantillas y bump de version
</commit_message>
<xml_diff>
--- a/automatizacion_antigravity/modelos/MODELO_1_DDO.docx
+++ b/automatizacion_antigravity/modelos/MODELO_1_DDO.docx
@@ -59,7 +59,6 @@
           <w:bCs/>
           <w:color w:val="000000"/>
           <w:kern w:val="0"/>
-          <w:highlight w:val="green"/>
           <w:shd w:val="clear" w:color="auto" w:fill="FFFFFF"/>
           <w:lang w:eastAsia="es-PE"/>
           <w14:ligatures w14:val="none"/>
@@ -73,7 +72,6 @@
           <w:bCs/>
           <w:color w:val="000000"/>
           <w:kern w:val="0"/>
-          <w:highlight w:val="green"/>
           <w:shd w:val="clear" w:color="auto" w:fill="FFFFFF"/>
           <w:lang w:eastAsia="es-PE"/>
           <w14:ligatures w14:val="none"/>
@@ -87,7 +85,6 @@
           <w:bCs/>
           <w:color w:val="000000"/>
           <w:kern w:val="0"/>
-          <w:highlight w:val="green"/>
           <w:shd w:val="clear" w:color="auto" w:fill="FFFFFF"/>
           <w:lang w:eastAsia="es-PE"/>
           <w14:ligatures w14:val="none"/>
@@ -153,7 +150,6 @@
           <w:b/>
           <w:color w:val="000000"/>
           <w:kern w:val="0"/>
-          <w:highlight w:val="green"/>
           <w:lang w:eastAsia="es-PE"/>
           <w14:ligatures w14:val="none"/>
         </w:rPr>
@@ -229,7 +225,6 @@
           <w:b/>
           <w:color w:val="000000"/>
           <w:kern w:val="0"/>
-          <w:highlight w:val="green"/>
           <w:lang w:eastAsia="es-PE"/>
           <w14:ligatures w14:val="none"/>
         </w:rPr>
@@ -377,7 +372,6 @@
           <w:b/>
           <w:color w:val="000000"/>
           <w:kern w:val="0"/>
-          <w:highlight w:val="magenta"/>
           <w:lang w:eastAsia="es-PE"/>
           <w14:ligatures w14:val="none"/>
         </w:rPr>
@@ -433,7 +427,6 @@
           <w:rFonts w:ascii="Arial Narrow" w:eastAsia="Times New Roman" w:hAnsi="Arial Narrow" w:cs="Times New Roman"/>
           <w:color w:val="000000"/>
           <w:kern w:val="0"/>
-          <w:highlight w:val="magenta"/>
           <w:shd w:val="clear" w:color="auto" w:fill="FFFFFF"/>
           <w:lang w:eastAsia="es-PE"/>
           <w14:ligatures w14:val="none"/>
@@ -445,7 +438,6 @@
           <w:rFonts w:ascii="Arial Narrow" w:eastAsia="Times New Roman" w:hAnsi="Arial Narrow" w:cs="Times New Roman"/>
           <w:color w:val="000000"/>
           <w:kern w:val="0"/>
-          <w:highlight w:val="magenta"/>
           <w:shd w:val="clear" w:color="auto" w:fill="FFFFFF"/>
           <w:lang w:eastAsia="es-PE"/>
           <w14:ligatures w14:val="none"/>
@@ -468,7 +460,6 @@
           <w:rFonts w:ascii="Arial Narrow" w:eastAsia="Times New Roman" w:hAnsi="Arial Narrow" w:cs="Times New Roman"/>
           <w:color w:val="000000"/>
           <w:kern w:val="0"/>
-          <w:highlight w:val="cyan"/>
           <w:shd w:val="clear" w:color="auto" w:fill="FFFFFF"/>
           <w:lang w:eastAsia="es-PE"/>
           <w14:ligatures w14:val="none"/>
@@ -491,7 +482,6 @@
           <w:rFonts w:ascii="Arial Narrow" w:eastAsia="Times New Roman" w:hAnsi="Arial Narrow" w:cs="Times New Roman"/>
           <w:color w:val="000000"/>
           <w:kern w:val="0"/>
-          <w:highlight w:val="magenta"/>
           <w:shd w:val="clear" w:color="auto" w:fill="FFFFFF"/>
           <w:lang w:eastAsia="es-PE"/>
           <w14:ligatures w14:val="none"/>
@@ -589,7 +579,6 @@
           <w:rFonts w:ascii="Arial Narrow" w:eastAsia="Times New Roman" w:hAnsi="Arial Narrow" w:cs="Arial"/>
           <w:color w:val="000000"/>
           <w:kern w:val="0"/>
-          <w:highlight w:val="green"/>
           <w:lang w:val="es-ES" w:eastAsia="es-ES"/>
           <w14:ligatures w14:val="none"/>
         </w:rPr>
@@ -597,6 +586,7 @@
       </w:r>
       <w:r>
         <w:rPr>
+          <w:rStyle w:val="Refdenotaalpie"/>
           <w:rFonts w:ascii="Arial Narrow" w:eastAsia="Times New Roman" w:hAnsi="Arial Narrow" w:cs="Times New Roman"/>
           <w:color w:val="000000"/>
           <w:kern w:val="0"/>
@@ -611,7 +601,6 @@
           <w:rFonts w:ascii="Arial Narrow" w:eastAsia="Times New Roman" w:hAnsi="Arial Narrow" w:cs="Arial"/>
           <w:color w:val="000000"/>
           <w:kern w:val="0"/>
-          <w:highlight w:val="green"/>
           <w:lang w:val="es-ES" w:eastAsia="es-ES"/>
           <w14:ligatures w14:val="none"/>
         </w:rPr>
@@ -621,7 +610,6 @@
         <w:rPr>
           <w:rFonts w:ascii="Arial Narrow" w:eastAsia="Calibri" w:hAnsi="Arial Narrow" w:cs="Arial"/>
           <w:kern w:val="0"/>
-          <w:highlight w:val="green"/>
           <w14:ligatures w14:val="none"/>
         </w:rPr>
         <w:t>, y mediante el escrito del 12 de mayo de 2025,</w:t>
@@ -630,7 +618,6 @@
         <w:rPr>
           <w:rFonts w:ascii="Arial Narrow" w:eastAsia="Calibri" w:hAnsi="Arial Narrow" w:cs="Arial"/>
           <w:kern w:val="0"/>
-          <w:highlight w:val="green"/>
           <w14:ligatures w14:val="none"/>
         </w:rPr>
         <w:t xml:space="preserve"> la señora Medina d</w:t>
@@ -640,7 +627,6 @@
           <w:rFonts w:ascii="Arial Narrow" w:eastAsia="Times New Roman" w:hAnsi="Arial Narrow" w:cs="Arial"/>
           <w:color w:val="000000"/>
           <w:kern w:val="0"/>
-          <w:highlight w:val="green"/>
           <w:lang w:val="es-ES" w:eastAsia="es-ES"/>
           <w14:ligatures w14:val="none"/>
         </w:rPr>
@@ -688,6 +674,7 @@
       </w:r>
       <w:r>
         <w:rPr>
+          <w:rStyle w:val="Refdenotaalpie"/>
           <w:rFonts w:ascii="Arial Narrow" w:eastAsia="Times New Roman" w:hAnsi="Arial Narrow" w:cs="Times New Roman"/>
           <w:color w:val="000000"/>
           <w:kern w:val="0"/>
@@ -753,7 +740,6 @@
           <w:rFonts w:ascii="Arial Narrow" w:eastAsia="Times New Roman" w:hAnsi="Arial Narrow" w:cs="Arial"/>
           <w:color w:val="000000"/>
           <w:kern w:val="0"/>
-          <w:highlight w:val="green"/>
           <w:lang w:eastAsia="es-ES"/>
           <w14:ligatures w14:val="none"/>
         </w:rPr>
@@ -763,7 +749,6 @@
           <w:rFonts w:ascii="Arial Narrow" w:eastAsia="Times New Roman" w:hAnsi="Arial Narrow" w:cs="Arial"/>
           <w:color w:val="000000"/>
           <w:kern w:val="0"/>
-          <w:highlight w:val="green"/>
           <w:lang w:eastAsia="es-ES"/>
           <w14:ligatures w14:val="none"/>
         </w:rPr>
@@ -780,7 +765,6 @@
           <w:rFonts w:ascii="Arial Narrow" w:eastAsia="Times New Roman" w:hAnsi="Arial Narrow" w:cs="Arial"/>
           <w:color w:val="000000"/>
           <w:kern w:val="0"/>
-          <w:highlight w:val="green"/>
           <w:lang w:eastAsia="es-ES"/>
           <w14:ligatures w14:val="none"/>
         </w:rPr>
@@ -804,7 +788,6 @@
           <w:rFonts w:ascii="Arial Narrow" w:eastAsia="Times New Roman" w:hAnsi="Arial Narrow" w:cs="Arial"/>
           <w:color w:val="000000"/>
           <w:kern w:val="0"/>
-          <w:highlight w:val="green"/>
           <w:lang w:eastAsia="es-ES"/>
           <w14:ligatures w14:val="none"/>
         </w:rPr>
@@ -814,7 +797,6 @@
           <w:rFonts w:ascii="Arial Narrow" w:eastAsia="Times New Roman" w:hAnsi="Arial Narrow" w:cs="Arial"/>
           <w:color w:val="000000"/>
           <w:kern w:val="0"/>
-          <w:highlight w:val="green"/>
           <w:lang w:eastAsia="es-ES"/>
           <w14:ligatures w14:val="none"/>
         </w:rPr>
@@ -832,7 +814,6 @@
           <w:rFonts w:ascii="Arial Narrow" w:eastAsia="Times New Roman" w:hAnsi="Arial Narrow" w:cs="Arial"/>
           <w:color w:val="000000"/>
           <w:kern w:val="0"/>
-          <w:highlight w:val="green"/>
           <w:lang w:eastAsia="es-ES"/>
           <w14:ligatures w14:val="none"/>
         </w:rPr>
@@ -855,7 +836,6 @@
           <w:rFonts w:ascii="Arial Narrow" w:eastAsia="Times New Roman" w:hAnsi="Arial Narrow" w:cs="Arial"/>
           <w:color w:val="000000"/>
           <w:kern w:val="0"/>
-          <w:highlight w:val="green"/>
           <w:lang w:val="es-ES" w:eastAsia="es-ES"/>
           <w14:ligatures w14:val="none"/>
         </w:rPr>
@@ -865,7 +845,6 @@
           <w:rFonts w:ascii="Arial Narrow" w:eastAsia="Times New Roman" w:hAnsi="Arial Narrow" w:cs="Arial"/>
           <w:color w:val="000000"/>
           <w:kern w:val="0"/>
-          <w:highlight w:val="green"/>
           <w:lang w:val="es-ES" w:eastAsia="es-ES"/>
           <w14:ligatures w14:val="none"/>
         </w:rPr>
@@ -952,7 +931,6 @@
         <w:rPr>
           <w:rFonts w:ascii="Arial Narrow" w:eastAsia="Arial Narrow" w:hAnsi="Arial Narrow" w:cs="Arial Narrow"/>
           <w:kern w:val="0"/>
-          <w:highlight w:val="green"/>
           <w14:ligatures w14:val="none"/>
         </w:rPr>
       </w:pPr>
@@ -974,6 +952,7 @@
       <w:bookmarkEnd w:id="5"/>
       <w:r>
         <w:rPr>
+          <w:rStyle w:val="Refdenotaalpie"/>
           <w:rFonts w:ascii="Arial Narrow" w:eastAsia="Arial Narrow" w:hAnsi="Arial Narrow" w:cs="Arial Narrow"/>
           <w:kern w:val="0"/>
           <w:vertAlign w:val="superscript"/>
@@ -1023,7 +1002,6 @@
           <w:rFonts w:ascii="Arial Narrow" w:eastAsia="Times New Roman" w:hAnsi="Arial Narrow" w:cs="Times New Roman"/>
           <w:color w:val="000000"/>
           <w:kern w:val="0"/>
-          <w:highlight w:val="green"/>
           <w:shd w:val="clear" w:color="auto" w:fill="FFFFFF"/>
           <w:lang w:eastAsia="es-PE"/>
           <w14:ligatures w14:val="none"/>
@@ -1037,7 +1015,6 @@
           <w:rFonts w:ascii="Arial Narrow" w:eastAsia="Times New Roman" w:hAnsi="Arial Narrow" w:cs="Times New Roman"/>
           <w:color w:val="000000"/>
           <w:kern w:val="0"/>
-          <w:highlight w:val="green"/>
           <w:shd w:val="clear" w:color="auto" w:fill="FFFFFF"/>
           <w:lang w:eastAsia="es-PE"/>
           <w14:ligatures w14:val="none"/>
@@ -1050,7 +1027,6 @@
         <w:rPr>
           <w:rFonts w:ascii="Arial Narrow" w:eastAsia="Arial Narrow" w:hAnsi="Arial Narrow" w:cs="Arial Narrow"/>
           <w:kern w:val="0"/>
-          <w:highlight w:val="green"/>
           <w14:ligatures w14:val="none"/>
         </w:rPr>
         <w:t>; involucraría una presunta afectación a sus expectativas, quien no habría encontrado una correspondencia entre lo que esperaba recibir de parte del proveedor y lo que realmente recibió. Por consiguiente, corresponde calificar el hecho materia de denuncia como una presunta infracción al deber de idoneidad, tipificado en los artículos 18 y 19 del Código</w:t>
@@ -1059,9 +1035,9 @@
       <w:bookmarkEnd w:id="8"/>
       <w:r>
         <w:rPr>
-          <w:rFonts w:ascii="Arial Narrow" w:eastAsia="Arial Narrow" w:hAnsi="Arial Narrow" w:cs="Arial"/>
-          <w:kern w:val="0"/>
-          <w:highlight w:val="green"/>
+          <w:rStyle w:val="Refdenotaalpie"/>
+          <w:rFonts w:ascii="Arial Narrow" w:eastAsia="Arial Narrow" w:hAnsi="Arial Narrow" w:cs="Arial"/>
+          <w:kern w:val="0"/>
           <w:vertAlign w:val="superscript"/>
           <w14:ligatures w14:val="none"/>
         </w:rPr>
@@ -1072,7 +1048,6 @@
         <w:rPr>
           <w:rFonts w:ascii="Arial Narrow" w:eastAsia="Arial Narrow" w:hAnsi="Arial Narrow" w:cs="Arial Narrow"/>
           <w:kern w:val="0"/>
-          <w:highlight w:val="green"/>
           <w14:ligatures w14:val="none"/>
         </w:rPr>
         <w:t>.</w:t>
@@ -1088,7 +1063,6 @@
         <w:rPr>
           <w:rFonts w:ascii="Arial Narrow" w:eastAsia="Arial Narrow" w:hAnsi="Arial Narrow" w:cs="Arial Narrow"/>
           <w:kern w:val="0"/>
-          <w:highlight w:val="green"/>
           <w14:ligatures w14:val="none"/>
         </w:rPr>
       </w:pPr>
@@ -1106,7 +1080,6 @@
         <w:rPr>
           <w:rFonts w:ascii="Arial Narrow" w:eastAsia="Arial Narrow" w:hAnsi="Arial Narrow" w:cs="Arial Narrow"/>
           <w:kern w:val="0"/>
-          <w:highlight w:val="green"/>
           <w14:ligatures w14:val="none"/>
         </w:rPr>
       </w:pPr>
@@ -1115,7 +1088,6 @@
         <w:rPr>
           <w:rFonts w:ascii="Arial Narrow" w:eastAsia="Arial Narrow" w:hAnsi="Arial Narrow" w:cs="Arial Narrow"/>
           <w:kern w:val="0"/>
-          <w:highlight w:val="green"/>
           <w14:ligatures w14:val="none"/>
         </w:rPr>
         <w:t xml:space="preserve">Así también, la Secretaría Técnica, en ejercicio de sus facultades, </w:t>
@@ -1125,7 +1097,6 @@
           <w:rFonts w:ascii="Arial Narrow" w:eastAsia="Times New Roman" w:hAnsi="Arial Narrow" w:cs="Segoe UI"/>
           <w:color w:val="000000"/>
           <w:kern w:val="0"/>
-          <w:highlight w:val="green"/>
           <w:lang w:eastAsia="es-PE"/>
           <w14:ligatures w14:val="none"/>
         </w:rPr>
@@ -1135,7 +1106,6 @@
         <w:rPr>
           <w:rFonts w:ascii="Arial Narrow" w:eastAsia="Arial Narrow" w:hAnsi="Arial Narrow" w:cs="Arial Narrow"/>
           <w:kern w:val="0"/>
-          <w:highlight w:val="green"/>
           <w14:ligatures w14:val="none"/>
         </w:rPr>
         <w:t>que el hecho denunciado, consistente en que Pacífico Compañía d</w:t>
@@ -1145,7 +1115,6 @@
         <w:rPr>
           <w:rFonts w:ascii="Arial Narrow" w:eastAsia="Arial Narrow" w:hAnsi="Arial Narrow" w:cs="Arial Narrow"/>
           <w:kern w:val="0"/>
-          <w:highlight w:val="green"/>
           <w14:ligatures w14:val="none"/>
         </w:rPr>
         <w:t>e Seguros y Reaseguros S.A. negado injustificadamente la cobertura del Seguro de Protección de Tarjeta BCP – Póliza  1000001429 a la denunciante por el siniestro del 28 de marzo de 2025</w:t>
@@ -1154,7 +1123,6 @@
         <w:rPr>
           <w:rFonts w:ascii="Arial Narrow" w:eastAsia="Arial Narrow" w:hAnsi="Arial Narrow" w:cs="Arial Narrow"/>
           <w:kern w:val="0"/>
-          <w:highlight w:val="green"/>
           <w14:ligatures w14:val="none"/>
         </w:rPr>
         <w:t>.</w:t>
@@ -1163,7 +1131,6 @@
         <w:rPr>
           <w:rFonts w:ascii="Arial Narrow" w:eastAsia="Arial Narrow" w:hAnsi="Arial Narrow" w:cs="Arial Narrow"/>
           <w:kern w:val="0"/>
-          <w:highlight w:val="green"/>
           <w14:ligatures w14:val="none"/>
         </w:rPr>
         <w:t xml:space="preserve"> </w:t>
@@ -1174,7 +1141,6 @@
           <w:bCs/>
           <w:color w:val="000000"/>
           <w:kern w:val="0"/>
-          <w:highlight w:val="green"/>
           <w:lang w:eastAsia="es-PE"/>
           <w14:ligatures w14:val="none"/>
         </w:rPr>
@@ -1186,7 +1152,6 @@
           <w:bCs/>
           <w:color w:val="000000"/>
           <w:kern w:val="0"/>
-          <w:highlight w:val="green"/>
           <w:lang w:eastAsia="es-PE"/>
           <w14:ligatures w14:val="none"/>
         </w:rPr>
@@ -1198,7 +1163,6 @@
           <w:bCs/>
           <w:color w:val="000000"/>
           <w:kern w:val="0"/>
-          <w:highlight w:val="green"/>
           <w:lang w:eastAsia="es-PE"/>
           <w14:ligatures w14:val="none"/>
         </w:rPr>
@@ -1209,7 +1173,6 @@
           <w:rFonts w:ascii="Arial Narrow" w:eastAsia="Times New Roman" w:hAnsi="Arial Narrow" w:cs="Times New Roman"/>
           <w:color w:val="000000"/>
           <w:kern w:val="0"/>
-          <w:highlight w:val="green"/>
           <w:shd w:val="clear" w:color="auto" w:fill="FFFFFF"/>
           <w:lang w:eastAsia="es-PE"/>
           <w14:ligatures w14:val="none"/>
@@ -1222,7 +1185,6 @@
           <w:bCs/>
           <w:color w:val="000000"/>
           <w:kern w:val="0"/>
-          <w:highlight w:val="green"/>
           <w:lang w:eastAsia="es-PE"/>
           <w14:ligatures w14:val="none"/>
         </w:rPr>
@@ -1230,7 +1192,7 @@
       </w:r>
       <w:r>
         <w:rPr>
-          <w:highlight w:val="green"/>
+          <w:rStyle w:val="Refdenotaalpie"/>
           <w:vertAlign w:val="superscript"/>
           <w:lang w:eastAsia="es-PE"/>
         </w:rPr>
@@ -1242,7 +1204,6 @@
           <w:bCs/>
           <w:color w:val="000000"/>
           <w:kern w:val="0"/>
-          <w:highlight w:val="green"/>
           <w:lang w:eastAsia="es-PE"/>
           <w14:ligatures w14:val="none"/>
         </w:rPr>
@@ -1257,7 +1218,6 @@
         <w:rPr>
           <w:rFonts w:ascii="Arial Narrow" w:eastAsia="Arial Narrow" w:hAnsi="Arial Narrow" w:cs="Arial Narrow"/>
           <w:kern w:val="0"/>
-          <w:highlight w:val="green"/>
           <w14:ligatures w14:val="none"/>
         </w:rPr>
       </w:pPr>
@@ -1275,15 +1235,13 @@
         <w:rPr>
           <w:rFonts w:ascii="Arial Narrow" w:eastAsia="Arial Narrow" w:hAnsi="Arial Narrow" w:cs="Arial Narrow"/>
           <w:kern w:val="0"/>
-          <w:highlight w:val="green"/>
-          <w14:ligatures w14:val="none"/>
-        </w:rPr>
-      </w:pPr>
-      <w:r>
-        <w:rPr>
-          <w:rFonts w:ascii="Arial Narrow" w:eastAsia="Arial Narrow" w:hAnsi="Arial Narrow" w:cs="Arial Narrow"/>
-          <w:kern w:val="0"/>
-          <w:highlight w:val="green"/>
+          <w14:ligatures w14:val="none"/>
+        </w:rPr>
+      </w:pPr>
+      <w:r>
+        <w:rPr>
+          <w:rFonts w:ascii="Arial Narrow" w:eastAsia="Arial Narrow" w:hAnsi="Arial Narrow" w:cs="Arial Narrow"/>
+          <w:kern w:val="0"/>
           <w14:ligatures w14:val="none"/>
         </w:rPr>
         <w:t xml:space="preserve">Asimismo, </w:t>
@@ -1293,7 +1251,6 @@
           <w:rFonts w:ascii="Arial Narrow" w:eastAsia="Times New Roman" w:hAnsi="Arial Narrow" w:cs="Arial"/>
           <w:color w:val="000000"/>
           <w:kern w:val="0"/>
-          <w:highlight w:val="green"/>
           <w:lang w:eastAsia="es-PE"/>
           <w14:ligatures w14:val="none"/>
         </w:rPr>
@@ -1303,7 +1260,6 @@
         <w:rPr>
           <w:rFonts w:ascii="Arial Narrow" w:eastAsia="Arial Narrow" w:hAnsi="Arial Narrow" w:cs="Arial"/>
           <w:kern w:val="0"/>
-          <w:highlight w:val="green"/>
           <w14:ligatures w14:val="none"/>
         </w:rPr>
         <w:t xml:space="preserve">que el hecho denunciado, consistente en que </w:t>
@@ -1312,7 +1268,6 @@
         <w:rPr>
           <w:rFonts w:ascii="Arial Narrow" w:eastAsia="Arial Narrow" w:hAnsi="Arial Narrow" w:cs="Arial Narrow"/>
           <w:kern w:val="0"/>
-          <w:highlight w:val="green"/>
           <w14:ligatures w14:val="none"/>
         </w:rPr>
         <w:t>el Banco de Crédito del Perú S.A. y Pacífico Compañía de Seguros y Reaseguros S.A. no habrían cumplido oportunamente con entregar a la denunciante los documentos contractuales del Seguro de Protección de Tarjeta BCP  1000001429</w:t>
@@ -1321,7 +1276,6 @@
         <w:rPr>
           <w:rFonts w:ascii="Arial Narrow" w:eastAsia="Arial Narrow" w:hAnsi="Arial Narrow" w:cs="Arial"/>
           <w:kern w:val="0"/>
-          <w:highlight w:val="green"/>
           <w14:ligatures w14:val="none"/>
         </w:rPr>
         <w:t xml:space="preserve">. </w:t>
@@ -1331,16 +1285,15 @@
         <w:rPr>
           <w:rFonts w:ascii="Arial Narrow" w:eastAsia="Arial Narrow" w:hAnsi="Arial Narrow" w:cs="Arial"/>
           <w:kern w:val="0"/>
-          <w:highlight w:val="green"/>
           <w14:ligatures w14:val="none"/>
         </w:rPr>
         <w:t>Por consiguiente, corresponde calificar el hecho materia de denuncia como una presunta infracción al deber de entregar a los usuarios copia de los contratos y demás documentación relacionada con dichos actos jurídicos, tipificado en el literal e) del artículo 47 del Código</w:t>
       </w:r>
       <w:r>
         <w:rPr>
-          <w:rFonts w:ascii="Arial Narrow" w:eastAsia="Arial Narrow" w:hAnsi="Arial Narrow" w:cs="Arial"/>
-          <w:kern w:val="0"/>
-          <w:highlight w:val="green"/>
+          <w:rStyle w:val="Refdenotaalpie"/>
+          <w:rFonts w:ascii="Arial Narrow" w:eastAsia="Arial Narrow" w:hAnsi="Arial Narrow" w:cs="Arial"/>
+          <w:kern w:val="0"/>
           <w:vertAlign w:val="superscript"/>
           <w14:ligatures w14:val="none"/>
         </w:rPr>
@@ -1350,7 +1303,6 @@
         <w:rPr>
           <w:rFonts w:ascii="Arial Narrow" w:eastAsia="Arial Narrow" w:hAnsi="Arial Narrow" w:cs="Arial"/>
           <w:kern w:val="0"/>
-          <w:highlight w:val="green"/>
           <w14:ligatures w14:val="none"/>
         </w:rPr>
         <w:t>.</w:t>
@@ -1365,7 +1317,6 @@
         <w:rPr>
           <w:rFonts w:ascii="Arial Narrow" w:eastAsia="Arial Narrow" w:hAnsi="Arial Narrow" w:cs="Arial Narrow"/>
           <w:kern w:val="0"/>
-          <w:highlight w:val="green"/>
           <w14:ligatures w14:val="none"/>
         </w:rPr>
       </w:pPr>
@@ -1383,7 +1334,6 @@
         <w:rPr>
           <w:rFonts w:ascii="Arial Narrow" w:eastAsia="Arial Narrow" w:hAnsi="Arial Narrow" w:cs="Arial Narrow"/>
           <w:kern w:val="0"/>
-          <w:highlight w:val="green"/>
           <w14:ligatures w14:val="none"/>
         </w:rPr>
       </w:pPr>
@@ -1394,7 +1344,6 @@
           <w:rFonts w:ascii="Arial Narrow" w:eastAsia="Times New Roman" w:hAnsi="Arial Narrow" w:cs="Arial"/>
           <w:color w:val="000000"/>
           <w:kern w:val="0"/>
-          <w:highlight w:val="green"/>
           <w:lang w:eastAsia="es-PE"/>
           <w14:ligatures w14:val="none"/>
         </w:rPr>
@@ -1406,7 +1355,6 @@
           <w:rFonts w:ascii="Arial Narrow" w:eastAsia="Times New Roman" w:hAnsi="Arial Narrow" w:cs="Arial"/>
           <w:color w:val="000000"/>
           <w:kern w:val="0"/>
-          <w:highlight w:val="green"/>
           <w:lang w:eastAsia="es-PE"/>
           <w14:ligatures w14:val="none"/>
         </w:rPr>
@@ -1416,7 +1364,6 @@
         <w:rPr>
           <w:rFonts w:ascii="Arial Narrow" w:eastAsia="Arial Narrow" w:hAnsi="Arial Narrow" w:cs="Arial"/>
           <w:kern w:val="0"/>
-          <w:highlight w:val="green"/>
           <w14:ligatures w14:val="none"/>
         </w:rPr>
         <w:t xml:space="preserve">que el hecho denunciado, consistente en que </w:t>
@@ -1425,7 +1372,6 @@
         <w:rPr>
           <w:rFonts w:ascii="Arial Narrow" w:eastAsia="Arial Narrow" w:hAnsi="Arial Narrow" w:cs="Arial Narrow"/>
           <w:kern w:val="0"/>
-          <w:highlight w:val="cyan"/>
           <w14:ligatures w14:val="none"/>
         </w:rPr>
         <w:t>los proveedores denunciados no habrían cumplido con informar a la denunciante que el Seguro Devolución Vida suscrito el 5 de setiembre de 2023 con Pacífico Compañía de Seguros y Reaseguros S.A. había sido transferido a Rímac Seguros y Reaseguros S.A</w:t>
@@ -1436,7 +1382,6 @@
           <w:bCs/>
           <w:color w:val="000000"/>
           <w:kern w:val="0"/>
-          <w:highlight w:val="green"/>
           <w:lang w:eastAsia="es-PE"/>
           <w14:ligatures w14:val="none"/>
         </w:rPr>
@@ -1450,7 +1395,6 @@
           <w:bCs/>
           <w:color w:val="000000"/>
           <w:kern w:val="0"/>
-          <w:highlight w:val="green"/>
           <w:lang w:eastAsia="es-PE"/>
           <w14:ligatures w14:val="none"/>
         </w:rPr>
@@ -1463,7 +1407,6 @@
           <w:bCs/>
           <w:color w:val="000000"/>
           <w:kern w:val="0"/>
-          <w:highlight w:val="green"/>
           <w:lang w:eastAsia="es-PE"/>
           <w14:ligatures w14:val="none"/>
         </w:rPr>
@@ -1476,7 +1419,6 @@
           <w:bCs/>
           <w:color w:val="000000"/>
           <w:kern w:val="0"/>
-          <w:highlight w:val="green"/>
           <w:lang w:eastAsia="es-PE"/>
           <w14:ligatures w14:val="none"/>
         </w:rPr>
@@ -1486,11 +1428,11 @@
       <w:bookmarkEnd w:id="17"/>
       <w:r>
         <w:rPr>
+          <w:rStyle w:val="Refdenotaalpie"/>
           <w:rFonts w:ascii="Arial Narrow" w:eastAsia="Arial Narrow" w:hAnsi="Arial Narrow" w:cs="Arial"/>
           <w:bCs/>
           <w:color w:val="000000"/>
           <w:kern w:val="0"/>
-          <w:highlight w:val="green"/>
           <w:vertAlign w:val="superscript"/>
           <w:lang w:eastAsia="es-PE"/>
           <w14:ligatures w14:val="none"/>
@@ -1504,7 +1446,6 @@
           <w:bCs/>
           <w:color w:val="000000"/>
           <w:kern w:val="0"/>
-          <w:highlight w:val="green"/>
           <w:lang w:eastAsia="es-PE"/>
           <w14:ligatures w14:val="none"/>
         </w:rPr>
@@ -1522,7 +1463,6 @@
         <w:rPr>
           <w:rFonts w:ascii="Arial Narrow" w:eastAsia="Arial Narrow" w:hAnsi="Arial Narrow" w:cs="Arial Narrow"/>
           <w:kern w:val="0"/>
-          <w:highlight w:val="green"/>
           <w14:ligatures w14:val="none"/>
         </w:rPr>
       </w:pPr>
@@ -1540,7 +1480,6 @@
         <w:rPr>
           <w:rFonts w:ascii="Arial Narrow" w:eastAsia="Arial Narrow" w:hAnsi="Arial Narrow" w:cs="Arial Narrow"/>
           <w:kern w:val="0"/>
-          <w:highlight w:val="green"/>
           <w14:ligatures w14:val="none"/>
         </w:rPr>
       </w:pPr>
@@ -1558,7 +1497,6 @@
         <w:rPr>
           <w:rFonts w:ascii="Arial Narrow" w:eastAsia="Arial Narrow" w:hAnsi="Arial Narrow" w:cs="Arial"/>
           <w:kern w:val="0"/>
-          <w:highlight w:val="green"/>
           <w14:ligatures w14:val="none"/>
         </w:rPr>
         <w:t>el proveedor denunciado habría brindado una respuesta inadecuada al reclamo presentado por el denunciante el 12 de agosto de 2024. Por consiguiente, corresponde calificar el hecho materia de denuncia como una presunta infracción al numeral 88.1 del artículo 88 del Código</w:t>
@@ -1566,11 +1504,11 @@
       <w:bookmarkEnd w:id="21"/>
       <w:r>
         <w:rPr>
+          <w:rStyle w:val="Refdenotaalpie"/>
           <w:rFonts w:ascii="Arial Narrow" w:eastAsia="Arial Narrow" w:hAnsi="Arial Narrow" w:cs="Arial"/>
           <w:bCs/>
           <w:color w:val="000000"/>
           <w:kern w:val="0"/>
-          <w:highlight w:val="green"/>
           <w:vertAlign w:val="superscript"/>
           <w:lang w:eastAsia="es-PE"/>
           <w14:ligatures w14:val="none"/>
@@ -1583,7 +1521,6 @@
           <w:bCs/>
           <w:color w:val="000000"/>
           <w:kern w:val="0"/>
-          <w:highlight w:val="green"/>
           <w:lang w:eastAsia="es-PE"/>
           <w14:ligatures w14:val="none"/>
         </w:rPr>
@@ -1636,6 +1573,7 @@
       </w:r>
       <w:r>
         <w:rPr>
+          <w:rStyle w:val="Refdenotaalpie"/>
           <w:rFonts w:ascii="Arial Narrow" w:eastAsia="Arial Narrow" w:hAnsi="Arial Narrow" w:cs="Arial Narrow"/>
           <w:kern w:val="0"/>
           <w:vertAlign w:val="superscript"/>
@@ -1764,7 +1702,6 @@
           <w:rFonts w:ascii="Arial Narrow" w:eastAsia="Times New Roman" w:hAnsi="Arial Narrow" w:cs="Arial"/>
           <w:color w:val="000000"/>
           <w:kern w:val="0"/>
-          <w:highlight w:val="red"/>
           <w:lang w:val="es-ES" w:eastAsia="es-ES"/>
           <w14:ligatures w14:val="none"/>
         </w:rPr>
@@ -1785,7 +1722,6 @@
           <w:rFonts w:ascii="Arial Narrow" w:eastAsia="Times New Roman" w:hAnsi="Arial Narrow" w:cs="Arial"/>
           <w:color w:val="000000"/>
           <w:kern w:val="0"/>
-          <w:highlight w:val="green"/>
           <w:lang w:val="es-ES" w:eastAsia="es-ES"/>
           <w14:ligatures w14:val="none"/>
         </w:rPr>
@@ -1797,7 +1733,6 @@
           <w:rFonts w:ascii="Arial Narrow" w:eastAsia="Times New Roman" w:hAnsi="Arial Narrow" w:cs="Arial"/>
           <w:color w:val="000000"/>
           <w:kern w:val="0"/>
-          <w:highlight w:val="green"/>
           <w:lang w:val="es-ES" w:eastAsia="es-ES"/>
           <w14:ligatures w14:val="none"/>
         </w:rPr>
@@ -1809,7 +1744,6 @@
           <w:rFonts w:ascii="Arial Narrow" w:eastAsia="Times New Roman" w:hAnsi="Arial Narrow" w:cs="Arial"/>
           <w:color w:val="000000"/>
           <w:kern w:val="0"/>
-          <w:highlight w:val="green"/>
           <w:lang w:val="es-ES" w:eastAsia="es-ES"/>
           <w14:ligatures w14:val="none"/>
         </w:rPr>
@@ -1830,7 +1764,6 @@
           <w:rFonts w:ascii="Arial Narrow" w:eastAsia="Times New Roman" w:hAnsi="Arial Narrow" w:cs="Arial"/>
           <w:color w:val="000000"/>
           <w:kern w:val="0"/>
-          <w:highlight w:val="green"/>
           <w:lang w:val="es-ES" w:eastAsia="es-ES"/>
           <w14:ligatures w14:val="none"/>
         </w:rPr>
@@ -1841,7 +1774,6 @@
           <w:rFonts w:ascii="Arial Narrow" w:eastAsia="Times New Roman" w:hAnsi="Arial Narrow" w:cs="Arial"/>
           <w:color w:val="000000"/>
           <w:kern w:val="0"/>
-          <w:highlight w:val="green"/>
           <w:lang w:val="es-ES" w:eastAsia="es-ES"/>
           <w14:ligatures w14:val="none"/>
         </w:rPr>
@@ -1862,7 +1794,6 @@
           <w:rFonts w:ascii="Arial Narrow" w:eastAsia="Times New Roman" w:hAnsi="Arial Narrow" w:cs="Arial"/>
           <w:color w:val="000000"/>
           <w:kern w:val="0"/>
-          <w:highlight w:val="green"/>
           <w:lang w:val="es-ES" w:eastAsia="es-ES"/>
           <w14:ligatures w14:val="none"/>
         </w:rPr>
@@ -1993,7 +1924,6 @@
           <w:rFonts w:ascii="Arial Narrow" w:eastAsia="Times New Roman" w:hAnsi="Arial Narrow" w:cs="Times New Roman"/>
           <w:color w:val="000000"/>
           <w:kern w:val="0"/>
-          <w:highlight w:val="green"/>
           <w:shd w:val="clear" w:color="auto" w:fill="FFFFFF"/>
           <w:lang w:eastAsia="es-PE"/>
           <w14:ligatures w14:val="none"/>
@@ -2016,7 +1946,6 @@
           <w:rFonts w:ascii="Arial Narrow" w:eastAsia="Times New Roman" w:hAnsi="Arial Narrow" w:cs="Times New Roman"/>
           <w:color w:val="000000"/>
           <w:kern w:val="0"/>
-          <w:highlight w:val="green"/>
           <w:shd w:val="clear" w:color="auto" w:fill="FFFFFF"/>
           <w:lang w:eastAsia="es-PE"/>
           <w14:ligatures w14:val="none"/>
@@ -2039,7 +1968,6 @@
           <w:rFonts w:ascii="Arial Narrow" w:eastAsia="Times New Roman" w:hAnsi="Arial Narrow" w:cs="Times New Roman"/>
           <w:color w:val="000000"/>
           <w:kern w:val="0"/>
-          <w:highlight w:val="green"/>
           <w:shd w:val="clear" w:color="auto" w:fill="FFFFFF"/>
           <w:lang w:eastAsia="es-PE"/>
           <w14:ligatures w14:val="none"/>
@@ -2089,7 +2017,6 @@
         <w:rPr>
           <w:rFonts w:ascii="Arial Narrow" w:eastAsia="Calibri" w:hAnsi="Arial Narrow" w:cs="Arial Narrow"/>
           <w:kern w:val="0"/>
-          <w:highlight w:val="green"/>
           <w:lang w:eastAsia="es-PE"/>
           <w14:ligatures w14:val="none"/>
         </w:rPr>
@@ -2099,7 +2026,6 @@
           <w:rFonts w:ascii="Arial Narrow" w:eastAsia="Calibri" w:hAnsi="Arial Narrow" w:cs="Arial Narrow"/>
           <w:color w:val="000000"/>
           <w:kern w:val="0"/>
-          <w:highlight w:val="green"/>
           <w:lang w:eastAsia="es-PE"/>
           <w14:ligatures w14:val="none"/>
         </w:rPr>
@@ -2109,7 +2035,6 @@
         <w:rPr>
           <w:rFonts w:ascii="Arial Narrow" w:eastAsia="Times New Roman" w:hAnsi="Arial Narrow" w:cs="Times New Roman"/>
           <w:kern w:val="0"/>
-          <w:highlight w:val="green"/>
           <w:shd w:val="clear" w:color="auto" w:fill="FFFFFF"/>
           <w:lang w:eastAsia="es-PE"/>
           <w14:ligatures w14:val="none"/>
@@ -2120,7 +2045,6 @@
         <w:rPr>
           <w:rFonts w:ascii="Arial Narrow" w:eastAsia="Calibri" w:hAnsi="Arial Narrow" w:cs="Arial Narrow"/>
           <w:kern w:val="0"/>
-          <w:highlight w:val="green"/>
           <w:lang w:eastAsia="es-PE"/>
           <w14:ligatures w14:val="none"/>
         </w:rPr>
@@ -2130,7 +2054,6 @@
         <w:rPr>
           <w:rFonts w:ascii="Arial Narrow" w:eastAsia="Times New Roman" w:hAnsi="Arial Narrow" w:cs="Times New Roman"/>
           <w:kern w:val="0"/>
-          <w:highlight w:val="green"/>
           <w:shd w:val="clear" w:color="auto" w:fill="FFFFFF"/>
           <w:lang w:eastAsia="es-PE"/>
           <w14:ligatures w14:val="none"/>
@@ -2151,7 +2074,6 @@
         <w:rPr>
           <w:rFonts w:ascii="Arial Narrow" w:eastAsia="Times New Roman" w:hAnsi="Arial Narrow" w:cs="Times New Roman"/>
           <w:kern w:val="0"/>
-          <w:highlight w:val="green"/>
           <w:shd w:val="clear" w:color="auto" w:fill="FFFFFF"/>
           <w:lang w:eastAsia="es-PE"/>
           <w14:ligatures w14:val="none"/>
@@ -2162,7 +2084,6 @@
         <w:rPr>
           <w:rFonts w:ascii="Arial Narrow" w:eastAsia="Times New Roman" w:hAnsi="Arial Narrow" w:cs="Times New Roman"/>
           <w:kern w:val="0"/>
-          <w:highlight w:val="green"/>
           <w:shd w:val="clear" w:color="auto" w:fill="FFFFFF"/>
           <w:lang w:eastAsia="es-PE"/>
           <w14:ligatures w14:val="none"/>
@@ -2173,7 +2094,6 @@
         <w:rPr>
           <w:rFonts w:ascii="Arial Narrow" w:eastAsia="Times New Roman" w:hAnsi="Arial Narrow" w:cs="Times New Roman"/>
           <w:kern w:val="0"/>
-          <w:highlight w:val="green"/>
           <w:shd w:val="clear" w:color="auto" w:fill="FFFFFF"/>
           <w:lang w:eastAsia="es-PE"/>
           <w14:ligatures w14:val="none"/>
@@ -2184,7 +2104,6 @@
         <w:rPr>
           <w:rFonts w:ascii="Arial Narrow" w:eastAsia="Times New Roman" w:hAnsi="Arial Narrow" w:cs="Times New Roman"/>
           <w:kern w:val="0"/>
-          <w:highlight w:val="green"/>
           <w:shd w:val="clear" w:color="auto" w:fill="FFFFFF"/>
           <w:lang w:eastAsia="es-PE"/>
           <w14:ligatures w14:val="none"/>
@@ -2205,7 +2124,6 @@
         <w:rPr>
           <w:rFonts w:ascii="Arial Narrow" w:eastAsia="Times New Roman" w:hAnsi="Arial Narrow" w:cs="Times New Roman"/>
           <w:kern w:val="0"/>
-          <w:highlight w:val="green"/>
           <w:shd w:val="clear" w:color="auto" w:fill="FFFFFF"/>
           <w:lang w:eastAsia="es-PE"/>
           <w14:ligatures w14:val="none"/>
@@ -2216,7 +2134,6 @@
         <w:rPr>
           <w:rFonts w:ascii="Arial Narrow" w:eastAsia="Arial Narrow" w:hAnsi="Arial Narrow" w:cs="Arial Narrow"/>
           <w:kern w:val="0"/>
-          <w:highlight w:val="green"/>
           <w14:ligatures w14:val="none"/>
         </w:rPr>
         <w:t>.</w:t>
@@ -2231,7 +2148,6 @@
         <w:rPr>
           <w:rFonts w:ascii="Arial Narrow" w:eastAsia="Calibri" w:hAnsi="Arial Narrow" w:cs="Arial Narrow"/>
           <w:kern w:val="0"/>
-          <w:highlight w:val="green"/>
           <w:lang w:eastAsia="es-PE"/>
           <w14:ligatures w14:val="none"/>
         </w:rPr>
@@ -2254,7 +2170,6 @@
         <w:rPr>
           <w:rFonts w:ascii="Arial Narrow" w:eastAsia="Calibri" w:hAnsi="Arial Narrow" w:cs="Arial Narrow"/>
           <w:kern w:val="0"/>
-          <w:highlight w:val="green"/>
           <w:lang w:eastAsia="es-PE"/>
           <w14:ligatures w14:val="none"/>
         </w:rPr>
@@ -2264,7 +2179,6 @@
           <w:rFonts w:ascii="Arial Narrow" w:eastAsia="Calibri" w:hAnsi="Arial Narrow" w:cs="Arial Narrow"/>
           <w:color w:val="000000"/>
           <w:kern w:val="0"/>
-          <w:highlight w:val="green"/>
           <w:lang w:eastAsia="es-PE"/>
           <w14:ligatures w14:val="none"/>
         </w:rPr>
@@ -2285,7 +2199,6 @@
           <w:rFonts w:ascii="Arial Narrow" w:eastAsia="Calibri" w:hAnsi="Arial Narrow" w:cs="Arial Narrow"/>
           <w:color w:val="000000"/>
           <w:kern w:val="0"/>
-          <w:highlight w:val="green"/>
           <w:lang w:eastAsia="es-PE"/>
           <w14:ligatures w14:val="none"/>
         </w:rPr>
@@ -2295,7 +2208,6 @@
         <w:rPr>
           <w:rFonts w:ascii="Arial Narrow" w:eastAsia="Times New Roman" w:hAnsi="Arial Narrow" w:cs="Times New Roman"/>
           <w:kern w:val="0"/>
-          <w:highlight w:val="green"/>
           <w:shd w:val="clear" w:color="auto" w:fill="FFFFFF"/>
           <w:lang w:eastAsia="es-PE"/>
           <w14:ligatures w14:val="none"/>
@@ -2307,7 +2219,6 @@
           <w:rFonts w:ascii="Arial Narrow" w:eastAsia="Times New Roman" w:hAnsi="Arial Narrow" w:cs="Arial"/>
           <w:color w:val="000000"/>
           <w:kern w:val="0"/>
-          <w:highlight w:val="green"/>
           <w:lang w:eastAsia="es-ES"/>
           <w14:ligatures w14:val="none"/>
         </w:rPr>
@@ -2317,7 +2228,6 @@
         <w:rPr>
           <w:rFonts w:ascii="Arial Narrow" w:eastAsia="Times New Roman" w:hAnsi="Arial Narrow" w:cs="Times New Roman"/>
           <w:kern w:val="0"/>
-          <w:highlight w:val="green"/>
           <w:shd w:val="clear" w:color="auto" w:fill="FFFFFF"/>
           <w:lang w:eastAsia="es-PE"/>
           <w14:ligatures w14:val="none"/>
@@ -2328,7 +2238,6 @@
         <w:rPr>
           <w:rFonts w:ascii="Arial Narrow" w:eastAsia="Times New Roman" w:hAnsi="Arial Narrow" w:cs="Times New Roman"/>
           <w:kern w:val="0"/>
-          <w:highlight w:val="green"/>
           <w:shd w:val="clear" w:color="auto" w:fill="FFFFFF"/>
           <w:lang w:eastAsia="es-PE"/>
           <w14:ligatures w14:val="none"/>
@@ -2343,7 +2252,6 @@
         <w:rPr>
           <w:rFonts w:ascii="Arial Narrow" w:eastAsia="Calibri" w:hAnsi="Arial Narrow" w:cs="Arial Narrow"/>
           <w:kern w:val="0"/>
-          <w:highlight w:val="green"/>
           <w:lang w:eastAsia="es-PE"/>
           <w14:ligatures w14:val="none"/>
         </w:rPr>
@@ -2366,15 +2274,13 @@
         <w:rPr>
           <w:rFonts w:ascii="Arial Narrow" w:eastAsia="Arial Narrow" w:hAnsi="Arial Narrow" w:cs="Arial Narrow"/>
           <w:kern w:val="0"/>
-          <w:highlight w:val="green"/>
-          <w14:ligatures w14:val="none"/>
-        </w:rPr>
-      </w:pPr>
-      <w:r>
-        <w:rPr>
-          <w:rFonts w:ascii="Arial Narrow" w:eastAsia="Arial Narrow" w:hAnsi="Arial Narrow" w:cs="Arial Narrow"/>
-          <w:kern w:val="0"/>
-          <w:highlight w:val="green"/>
+          <w14:ligatures w14:val="none"/>
+        </w:rPr>
+      </w:pPr>
+      <w:r>
+        <w:rPr>
+          <w:rFonts w:ascii="Arial Narrow" w:eastAsia="Arial Narrow" w:hAnsi="Arial Narrow" w:cs="Arial Narrow"/>
+          <w:kern w:val="0"/>
           <w14:ligatures w14:val="none"/>
         </w:rPr>
         <w:t xml:space="preserve">Presunta </w:t>
@@ -2383,7 +2289,6 @@
         <w:rPr>
           <w:rFonts w:ascii="Arial Narrow" w:eastAsia="Times New Roman" w:hAnsi="Arial Narrow" w:cs="Arial"/>
           <w:kern w:val="0"/>
-          <w:highlight w:val="green"/>
           <w:shd w:val="clear" w:color="auto" w:fill="FFFFFF"/>
           <w:lang w:eastAsia="es-PE"/>
           <w14:ligatures w14:val="none"/>
@@ -2394,7 +2299,6 @@
         <w:rPr>
           <w:rFonts w:ascii="Arial Narrow" w:eastAsia="Calibri" w:hAnsi="Arial Narrow" w:cs="Arial"/>
           <w:kern w:val="0"/>
-          <w:highlight w:val="green"/>
           <w14:ligatures w14:val="none"/>
         </w:rPr>
         <w:t>de</w:t>
@@ -2403,7 +2307,6 @@
         <w:rPr>
           <w:rFonts w:ascii="Arial Narrow" w:eastAsia="Times New Roman" w:hAnsi="Arial Narrow" w:cs="Arial"/>
           <w:kern w:val="0"/>
-          <w:highlight w:val="green"/>
           <w:shd w:val="clear" w:color="auto" w:fill="FFFFFF"/>
           <w:lang w:eastAsia="es-PE"/>
           <w14:ligatures w14:val="none"/>
@@ -2424,7 +2327,6 @@
         <w:rPr>
           <w:rFonts w:ascii="Arial Narrow" w:eastAsia="Times New Roman" w:hAnsi="Arial Narrow" w:cs="Arial"/>
           <w:kern w:val="0"/>
-          <w:highlight w:val="green"/>
           <w:shd w:val="clear" w:color="auto" w:fill="FFFFFF"/>
           <w:lang w:eastAsia="es-PE"/>
           <w14:ligatures w14:val="none"/>
@@ -2437,7 +2339,6 @@
           <w:bCs/>
           <w:color w:val="000000"/>
           <w:kern w:val="0"/>
-          <w:highlight w:val="green"/>
           <w:lang w:eastAsia="es-PE"/>
           <w14:ligatures w14:val="none"/>
         </w:rPr>
@@ -2447,7 +2348,6 @@
         <w:rPr>
           <w:rFonts w:ascii="Arial Narrow" w:eastAsia="Arial Narrow" w:hAnsi="Arial Narrow" w:cs="Arial Narrow"/>
           <w:kern w:val="0"/>
-          <w:highlight w:val="green"/>
           <w14:ligatures w14:val="none"/>
         </w:rPr>
         <w:t xml:space="preserve">el </w:t>
@@ -2456,7 +2356,6 @@
         <w:rPr>
           <w:rFonts w:ascii="Arial Narrow" w:eastAsia="Times New Roman" w:hAnsi="Arial Narrow" w:cs="Times New Roman"/>
           <w:kern w:val="0"/>
-          <w:highlight w:val="green"/>
           <w:shd w:val="clear" w:color="auto" w:fill="FFFFFF"/>
           <w:lang w:eastAsia="es-PE"/>
           <w14:ligatures w14:val="none"/>
@@ -2469,7 +2368,6 @@
           <w:bCs/>
           <w:color w:val="000000"/>
           <w:kern w:val="0"/>
-          <w:highlight w:val="green"/>
           <w:lang w:eastAsia="es-PE"/>
           <w14:ligatures w14:val="none"/>
         </w:rPr>
@@ -2480,7 +2378,6 @@
           <w:rFonts w:ascii="Arial Narrow" w:eastAsia="Times New Roman" w:hAnsi="Arial Narrow" w:cs="Arial"/>
           <w:color w:val="000000"/>
           <w:kern w:val="0"/>
-          <w:highlight w:val="green"/>
           <w:lang w:eastAsia="es-ES"/>
           <w14:ligatures w14:val="none"/>
         </w:rPr>
@@ -2492,7 +2389,6 @@
           <w:bCs/>
           <w:color w:val="000000"/>
           <w:kern w:val="0"/>
-          <w:highlight w:val="green"/>
           <w:lang w:eastAsia="es-PE"/>
           <w14:ligatures w14:val="none"/>
         </w:rPr>
@@ -2503,7 +2399,6 @@
           <w:rFonts w:ascii="Arial Narrow" w:eastAsia="Times New Roman" w:hAnsi="Arial Narrow" w:cs="Arial"/>
           <w:color w:val="000000"/>
           <w:kern w:val="0"/>
-          <w:highlight w:val="green"/>
           <w:lang w:eastAsia="es-ES"/>
           <w14:ligatures w14:val="none"/>
         </w:rPr>
@@ -2518,7 +2413,6 @@
         <w:rPr>
           <w:rFonts w:ascii="Arial Narrow" w:eastAsia="Calibri" w:hAnsi="Arial Narrow" w:cs="Arial Narrow"/>
           <w:kern w:val="0"/>
-          <w:highlight w:val="green"/>
           <w:lang w:eastAsia="es-PE"/>
           <w14:ligatures w14:val="none"/>
         </w:rPr>
@@ -2541,7 +2435,6 @@
         <w:rPr>
           <w:rFonts w:ascii="Arial Narrow" w:eastAsia="Arial Narrow" w:hAnsi="Arial Narrow" w:cs="Arial Narrow"/>
           <w:kern w:val="0"/>
-          <w:highlight w:val="green"/>
           <w14:ligatures w14:val="none"/>
         </w:rPr>
       </w:pPr>
@@ -2550,7 +2443,6 @@
         <w:rPr>
           <w:rFonts w:ascii="Arial Narrow" w:eastAsia="Arial Narrow" w:hAnsi="Arial Narrow" w:cs="Arial Narrow"/>
           <w:kern w:val="0"/>
-          <w:highlight w:val="green"/>
           <w14:ligatures w14:val="none"/>
         </w:rPr>
         <w:t xml:space="preserve">Presunta infracción al artículo 1, numeral 1, literal b) y al artículo 2 de la Ley </w:t>
@@ -2567,7 +2459,6 @@
         <w:rPr>
           <w:rFonts w:ascii="Arial Narrow" w:eastAsia="Arial Narrow" w:hAnsi="Arial Narrow" w:cs="Arial Narrow"/>
           <w:kern w:val="0"/>
-          <w:highlight w:val="green"/>
           <w14:ligatures w14:val="none"/>
         </w:rPr>
         <w:t>, Código de Protección y Defensa del Consumidor</w:t>
@@ -2577,7 +2468,6 @@
         <w:rPr>
           <w:rFonts w:ascii="Arial Narrow" w:eastAsia="Arial Narrow" w:hAnsi="Arial Narrow" w:cs="Arial Narrow"/>
           <w:kern w:val="0"/>
-          <w:highlight w:val="green"/>
           <w14:ligatures w14:val="none"/>
         </w:rPr>
         <w:t xml:space="preserve">, </w:t>
@@ -2586,7 +2476,6 @@
         <w:rPr>
           <w:rFonts w:ascii="Arial Narrow" w:eastAsia="Times New Roman" w:hAnsi="Arial Narrow" w:cs="Times New Roman"/>
           <w:kern w:val="0"/>
-          <w:highlight w:val="green"/>
           <w:shd w:val="clear" w:color="auto" w:fill="FFFFFF"/>
           <w:lang w:eastAsia="es-PE"/>
           <w14:ligatures w14:val="none"/>
@@ -2597,7 +2486,6 @@
         <w:rPr>
           <w:rFonts w:ascii="Arial Narrow" w:eastAsia="Arial Narrow" w:hAnsi="Arial Narrow" w:cs="Arial Narrow"/>
           <w:kern w:val="0"/>
-          <w:highlight w:val="green"/>
           <w14:ligatures w14:val="none"/>
         </w:rPr>
         <w:t xml:space="preserve">el </w:t>
@@ -2606,7 +2494,6 @@
         <w:rPr>
           <w:rFonts w:ascii="Arial Narrow" w:eastAsia="Times New Roman" w:hAnsi="Arial Narrow" w:cs="Times New Roman"/>
           <w:kern w:val="0"/>
-          <w:highlight w:val="green"/>
           <w:shd w:val="clear" w:color="auto" w:fill="FFFFFF"/>
           <w:lang w:eastAsia="es-PE"/>
           <w14:ligatures w14:val="none"/>
@@ -2618,7 +2505,6 @@
           <w:rFonts w:ascii="Arial Narrow" w:eastAsia="Times New Roman" w:hAnsi="Arial Narrow" w:cs="Arial"/>
           <w:color w:val="000000"/>
           <w:kern w:val="0"/>
-          <w:highlight w:val="green"/>
           <w:lang w:eastAsia="es-ES"/>
           <w14:ligatures w14:val="none"/>
         </w:rPr>
@@ -2628,7 +2514,6 @@
         <w:rPr>
           <w:rFonts w:ascii="Arial Narrow" w:eastAsia="Times New Roman" w:hAnsi="Arial Narrow" w:cs="Times New Roman"/>
           <w:kern w:val="0"/>
-          <w:highlight w:val="green"/>
           <w:shd w:val="clear" w:color="auto" w:fill="FFFFFF"/>
           <w:lang w:eastAsia="es-PE"/>
           <w14:ligatures w14:val="none"/>
@@ -2640,7 +2525,6 @@
           <w:rFonts w:ascii="Arial Narrow" w:eastAsia="Times New Roman" w:hAnsi="Arial Narrow" w:cs="Arial"/>
           <w:color w:val="000000"/>
           <w:kern w:val="0"/>
-          <w:highlight w:val="green"/>
           <w:lang w:eastAsia="es-ES"/>
           <w14:ligatures w14:val="none"/>
         </w:rPr>
@@ -2650,7 +2534,6 @@
         <w:rPr>
           <w:rFonts w:ascii="Arial Narrow" w:eastAsia="Arial Narrow" w:hAnsi="Arial Narrow" w:cs="Arial Narrow"/>
           <w:kern w:val="0"/>
-          <w:highlight w:val="green"/>
           <w14:ligatures w14:val="none"/>
         </w:rPr>
         <w:t>.</w:t>
@@ -2663,7 +2546,6 @@
         <w:rPr>
           <w:rFonts w:ascii="Arial Narrow" w:eastAsia="Arial Narrow" w:hAnsi="Arial Narrow" w:cs="Arial Narrow"/>
           <w:kern w:val="0"/>
-          <w:highlight w:val="green"/>
           <w14:ligatures w14:val="none"/>
         </w:rPr>
       </w:pPr>
@@ -2685,7 +2567,6 @@
         <w:rPr>
           <w:rFonts w:ascii="Arial Narrow" w:eastAsia="Arial Narrow" w:hAnsi="Arial Narrow" w:cs="Arial Narrow"/>
           <w:kern w:val="0"/>
-          <w:highlight w:val="green"/>
           <w14:ligatures w14:val="none"/>
         </w:rPr>
       </w:pPr>
@@ -2693,7 +2574,6 @@
       <w:r>
         <w:rPr>
           <w:rFonts w:ascii="Arial Narrow" w:eastAsia="Arial Narrow" w:hAnsi="Arial Narrow" w:cs="Arial Narrow"/>
-          <w:highlight w:val="green"/>
         </w:rPr>
         <w:t xml:space="preserve">Presunta infracción al numeral 88.1 del artículo 88 de la Ley </w:t>
       </w:r>
@@ -2710,7 +2590,6 @@
       <w:r>
         <w:rPr>
           <w:rFonts w:ascii="Arial Narrow" w:eastAsia="Arial Narrow" w:hAnsi="Arial Narrow" w:cs="Arial Narrow"/>
-          <w:highlight w:val="green"/>
         </w:rPr>
         <w:t xml:space="preserve">, Código de Protección y Defensa del Consumidor, </w:t>
       </w:r>
@@ -2718,7 +2597,6 @@
         <w:rPr>
           <w:rFonts w:ascii="Arial Narrow" w:eastAsia="Arial Narrow" w:hAnsi="Arial Narrow" w:cs="Arial Narrow"/>
           <w:kern w:val="0"/>
-          <w:highlight w:val="green"/>
           <w14:ligatures w14:val="none"/>
         </w:rPr>
         <w:t>en tanto el proveedor denunciado habría brindado una respuesta inadecuada al reclamo presentado por el denunciante el 12 de agosto de 2024</w:t>
@@ -2793,7 +2671,6 @@
           <w:rFonts w:ascii="Arial Narrow" w:eastAsia="Times New Roman" w:hAnsi="Arial Narrow" w:cs="Arial"/>
           <w:color w:val="000000"/>
           <w:kern w:val="0"/>
-          <w:highlight w:val="green"/>
           <w:lang w:val="es-ES" w:eastAsia="es-ES"/>
           <w14:ligatures w14:val="none"/>
         </w:rPr>
@@ -2803,7 +2680,6 @@
         <w:rPr>
           <w:rFonts w:ascii="Arial Narrow" w:eastAsia="Calibri" w:hAnsi="Arial Narrow" w:cs="Arial"/>
           <w:kern w:val="0"/>
-          <w:highlight w:val="green"/>
           <w14:ligatures w14:val="none"/>
         </w:rPr>
         <w:t xml:space="preserve"> de marzo de 2025, subsanada por escrito del 4 de abril de 2025</w:t>
@@ -2869,7 +2745,6 @@
           <w:rFonts w:ascii="Arial Narrow" w:eastAsia="Arial Narrow" w:hAnsi="Arial Narrow" w:cs="Arial Narrow"/>
           <w:color w:val="000000"/>
           <w:kern w:val="0"/>
-          <w:highlight w:val="green"/>
           <w:lang w:eastAsia="es-PE"/>
           <w14:ligatures w14:val="none"/>
         </w:rPr>
@@ -3052,6 +2927,7 @@
       </w:r>
       <w:r>
         <w:rPr>
+          <w:rStyle w:val="Refdenotaalpie"/>
           <w:rFonts w:ascii="Arial Narrow" w:eastAsia="Calibri" w:hAnsi="Arial Narrow" w:cs="Arial"/>
           <w:kern w:val="0"/>
           <w:vertAlign w:val="superscript"/>
@@ -3078,6 +2954,7 @@
       </w:r>
       <w:r>
         <w:rPr>
+          <w:rStyle w:val="Refdenotaalpie"/>
           <w:rFonts w:ascii="Arial Narrow" w:eastAsia="Calibri" w:hAnsi="Arial Narrow" w:cs="Arial"/>
           <w:spacing w:val="-2"/>
           <w:kern w:val="0"/>
@@ -3158,7 +3035,6 @@
           <w:rFonts w:ascii="Arial Narrow" w:eastAsia="Times New Roman" w:hAnsi="Arial Narrow" w:cs="Arial"/>
           <w:color w:val="000000"/>
           <w:kern w:val="0"/>
-          <w:highlight w:val="green"/>
           <w:lang w:val="es-ES" w:eastAsia="es-ES"/>
           <w14:ligatures w14:val="none"/>
         </w:rPr>
@@ -3168,7 +3044,6 @@
         <w:rPr>
           <w:rFonts w:ascii="Arial Narrow" w:eastAsia="Calibri" w:hAnsi="Arial Narrow" w:cs="Arial"/>
           <w:kern w:val="0"/>
-          <w:highlight w:val="green"/>
           <w14:ligatures w14:val="none"/>
         </w:rPr>
         <w:t xml:space="preserve"> de marzo de 2025, subsanada por escrito del 4 de abril de 2025, </w:t>
@@ -3178,7 +3053,6 @@
           <w:rFonts w:ascii="Arial Narrow" w:eastAsia="Arial Narrow" w:hAnsi="Arial Narrow" w:cs="Arial Narrow"/>
           <w:color w:val="000000"/>
           <w:kern w:val="0"/>
-          <w:highlight w:val="green"/>
           <w:lang w:eastAsia="es-PE"/>
           <w14:ligatures w14:val="none"/>
         </w:rPr>
@@ -3189,7 +3063,6 @@
           <w:rFonts w:ascii="Arial Narrow" w:eastAsia="Times New Roman" w:hAnsi="Arial Narrow" w:cs="Times New Roman"/>
           <w:color w:val="000000"/>
           <w:kern w:val="0"/>
-          <w:highlight w:val="green"/>
           <w:shd w:val="clear" w:color="auto" w:fill="FFFFFF"/>
           <w:lang w:eastAsia="es-PE"/>
           <w14:ligatures w14:val="none"/>
@@ -3201,7 +3074,6 @@
           <w:rFonts w:ascii="Arial Narrow" w:eastAsia="Arial Narrow" w:hAnsi="Arial Narrow" w:cs="Arial Narrow"/>
           <w:color w:val="000000"/>
           <w:kern w:val="0"/>
-          <w:highlight w:val="green"/>
           <w:lang w:eastAsia="es-PE"/>
           <w14:ligatures w14:val="none"/>
         </w:rPr>
@@ -3334,7 +3206,6 @@
           <w:rFonts w:ascii="Arial Narrow" w:eastAsia="Times New Roman" w:hAnsi="Arial Narrow" w:cs="Arial"/>
           <w:color w:val="000000"/>
           <w:kern w:val="0"/>
-          <w:highlight w:val="green"/>
           <w:lang w:val="es-ES" w:eastAsia="es-ES"/>
           <w14:ligatures w14:val="none"/>
         </w:rPr>
@@ -3345,7 +3216,6 @@
           <w:rFonts w:ascii="Arial Narrow" w:eastAsia="Times New Roman" w:hAnsi="Arial Narrow" w:cs="Arial"/>
           <w:color w:val="000000"/>
           <w:kern w:val="0"/>
-          <w:highlight w:val="green"/>
           <w:lang w:eastAsia="es-ES"/>
           <w14:ligatures w14:val="none"/>
         </w:rPr>
@@ -3356,7 +3226,6 @@
           <w:rFonts w:ascii="Arial Narrow" w:eastAsia="Times New Roman" w:hAnsi="Arial Narrow" w:cs="Arial"/>
           <w:color w:val="000000"/>
           <w:kern w:val="0"/>
-          <w:highlight w:val="green"/>
           <w:lang w:val="es-ES" w:eastAsia="es-ES"/>
           <w14:ligatures w14:val="none"/>
         </w:rPr>
@@ -3377,7 +3246,6 @@
           <w:rFonts w:ascii="Arial Narrow" w:eastAsia="Times New Roman" w:hAnsi="Arial Narrow" w:cs="Arial"/>
           <w:color w:val="000000"/>
           <w:kern w:val="0"/>
-          <w:highlight w:val="green"/>
           <w:lang w:val="es-ES" w:eastAsia="es-ES"/>
           <w14:ligatures w14:val="none"/>
         </w:rPr>
@@ -3388,7 +3256,6 @@
           <w:rFonts w:ascii="Arial Narrow" w:eastAsia="Times New Roman" w:hAnsi="Arial Narrow" w:cs="Arial"/>
           <w:color w:val="000000"/>
           <w:kern w:val="0"/>
-          <w:highlight w:val="green"/>
           <w:lang w:eastAsia="es-ES"/>
           <w14:ligatures w14:val="none"/>
         </w:rPr>
@@ -3399,7 +3266,6 @@
           <w:rFonts w:ascii="Arial Narrow" w:eastAsia="Times New Roman" w:hAnsi="Arial Narrow" w:cs="Arial"/>
           <w:color w:val="000000"/>
           <w:kern w:val="0"/>
-          <w:highlight w:val="green"/>
           <w:lang w:val="es-ES" w:eastAsia="es-ES"/>
           <w14:ligatures w14:val="none"/>
         </w:rPr>
@@ -3546,6 +3412,7 @@
       </w:r>
       <w:r>
         <w:rPr>
+          <w:rStyle w:val="Refdenotaalpie"/>
           <w:rFonts w:ascii="Arial Narrow" w:eastAsia="Arial Narrow" w:hAnsi="Arial Narrow" w:cs="Times New Roman"/>
           <w:color w:val="000000"/>
           <w:kern w:val="0"/>
@@ -3578,6 +3445,7 @@
       </w:r>
       <w:r>
         <w:rPr>
+          <w:rStyle w:val="Refdenotaalpie"/>
           <w:rFonts w:ascii="Arial Narrow" w:eastAsia="Arial Narrow" w:hAnsi="Arial Narrow" w:cs="Times New Roman"/>
           <w:color w:val="000000"/>
           <w:kern w:val="0"/>
@@ -3611,6 +3479,7 @@
       </w:r>
       <w:r>
         <w:rPr>
+          <w:rStyle w:val="Refdenotaalpie"/>
           <w:rFonts w:ascii="Arial Narrow" w:eastAsia="Arial Narrow" w:hAnsi="Arial Narrow" w:cs="Times New Roman"/>
           <w:color w:val="000000"/>
           <w:kern w:val="0"/>
@@ -3736,6 +3605,7 @@
       </w:r>
       <w:r>
         <w:rPr>
+          <w:rStyle w:val="Refdenotaalpie"/>
           <w:rFonts w:ascii="Arial Narrow" w:eastAsia="Calibri" w:hAnsi="Arial Narrow" w:cs="Arial"/>
           <w:kern w:val="0"/>
           <w:vertAlign w:val="superscript"/>
@@ -3896,7 +3766,6 @@
           <w:bCs/>
           <w:spacing w:val="-3"/>
           <w:kern w:val="0"/>
-          <w:highlight w:val="red"/>
           <w14:ligatures w14:val="none"/>
         </w:rPr>
         <w:t xml:space="preserve">a la señora </w:t>
@@ -3906,7 +3775,6 @@
           <w:rFonts w:ascii="Arial Narrow" w:eastAsia="Times New Roman" w:hAnsi="Arial Narrow" w:cs="Times New Roman"/>
           <w:color w:val="000000"/>
           <w:kern w:val="0"/>
-          <w:highlight w:val="red"/>
           <w:shd w:val="clear" w:color="auto" w:fill="FFFFFF"/>
           <w:lang w:eastAsia="es-PE"/>
           <w14:ligatures w14:val="none"/>
@@ -3924,7 +3792,6 @@
         <w:rPr>
           <w:rFonts w:ascii="Arial Narrow" w:hAnsi="Arial Narrow"/>
           <w:color w:val="000000"/>
-          <w:highlight w:val="red"/>
         </w:rPr>
         <w:t>reciba</w:t>
       </w:r>
@@ -3939,7 +3806,6 @@
         <w:rPr>
           <w:rFonts w:ascii="Arial Narrow" w:hAnsi="Arial Narrow"/>
           <w:color w:val="000000"/>
-          <w:highlight w:val="red"/>
         </w:rPr>
         <w:t>su bandeja</w:t>
       </w:r>
@@ -3954,7 +3820,6 @@
         <w:rPr>
           <w:rFonts w:ascii="Arial Narrow" w:hAnsi="Arial Narrow"/>
           <w:color w:val="000000"/>
-          <w:highlight w:val="red"/>
         </w:rPr>
         <w:t>efectúe</w:t>
       </w:r>
@@ -3969,7 +3834,6 @@
         <w:rPr>
           <w:rFonts w:ascii="Arial Narrow" w:hAnsi="Arial Narrow"/>
           <w:color w:val="000000"/>
-          <w:highlight w:val="red"/>
         </w:rPr>
         <w:t>su correo electrónico</w:t>
       </w:r>
@@ -3992,7 +3856,6 @@
         <w:rPr>
           <w:rFonts w:ascii="Arial Narrow" w:hAnsi="Arial Narrow"/>
           <w:color w:val="000000"/>
-          <w:highlight w:val="red"/>
         </w:rPr>
         <w:t>notificarle</w:t>
       </w:r>
@@ -4005,6 +3868,7 @@
       </w:r>
       <w:r>
         <w:rPr>
+          <w:rStyle w:val="Refdenotaalpie"/>
           <w:rFonts w:ascii="Arial Narrow" w:hAnsi="Arial Narrow"/>
           <w:vertAlign w:val="superscript"/>
         </w:rPr>
@@ -4061,7 +3925,6 @@
         <w:rPr>
           <w:rFonts w:ascii="Arial Narrow" w:eastAsia="Arial Narrow" w:hAnsi="Arial Narrow" w:cs="Arial Narrow"/>
           <w:bCs/>
-          <w:highlight w:val="red"/>
         </w:rPr>
         <w:t>Mapfre Perú Compañía de Seguros y Reaseguros S.A</w:t>
       </w:r>
@@ -4082,7 +3945,6 @@
       <w:r>
         <w:rPr>
           <w:rFonts w:ascii="Arial Narrow" w:eastAsia="Calibri" w:hAnsi="Arial Narrow"/>
-          <w:highlight w:val="red"/>
         </w:rPr>
         <w:t>efectúe(((N))))</w:t>
       </w:r>
@@ -4095,7 +3957,6 @@
       <w:r>
         <w:rPr>
           <w:rFonts w:ascii="Arial Narrow" w:eastAsia="Calibri" w:hAnsi="Arial Narrow"/>
-          <w:highlight w:val="red"/>
         </w:rPr>
         <w:t>notificación remitida por este despacho a su Casilla Electrónica</w:t>
       </w:r>
@@ -4108,7 +3969,6 @@
       <w:r>
         <w:rPr>
           <w:rFonts w:ascii="Arial Narrow" w:eastAsia="Calibri" w:hAnsi="Arial Narrow"/>
-          <w:highlight w:val="red"/>
         </w:rPr>
         <w:t>recibe</w:t>
       </w:r>
@@ -4153,7 +4013,6 @@
         <w:rPr>
           <w:rFonts w:ascii="Arial Narrow" w:eastAsia="Arial Narrow" w:hAnsi="Arial Narrow" w:cs="Arial Narrow"/>
           <w:bCs/>
-          <w:highlight w:val="red"/>
         </w:rPr>
         <w:t xml:space="preserve"> Comité de Administración del Fondo de Asistencia y Estímulo</w:t>
       </w:r>
@@ -4163,7 +4022,6 @@
           <w:bCs/>
           <w:spacing w:val="-3"/>
           <w:kern w:val="0"/>
-          <w:highlight w:val="red"/>
           <w14:ligatures w14:val="none"/>
         </w:rPr>
         <w:t xml:space="preserve"> </w:t>
@@ -4172,7 +4030,6 @@
         <w:rPr>
           <w:rFonts w:ascii="Arial Narrow" w:hAnsi="Arial Narrow"/>
           <w:color w:val="000000"/>
-          <w:highlight w:val="red"/>
         </w:rPr>
         <w:t xml:space="preserve">para que, </w:t>
       </w:r>
@@ -4182,7 +4039,6 @@
           <w:bCs/>
           <w:color w:val="000000"/>
           <w:kern w:val="0"/>
-          <w:highlight w:val="red"/>
           <w:lang w:eastAsia="es-PE"/>
           <w14:ligatures w14:val="none"/>
         </w:rPr>
@@ -4192,7 +4048,6 @@
         <w:rPr>
           <w:rFonts w:ascii="Arial Narrow" w:hAnsi="Arial Narrow"/>
           <w:color w:val="000000"/>
-          <w:highlight w:val="red"/>
         </w:rPr>
         <w:t>, señale(NNN) un correo electrónico autorizando recibir las notificaciones correspondientes por dicho medio.</w:t>
       </w:r>
@@ -4250,7 +4105,6 @@
           <w:b/>
           <w:color w:val="000000"/>
           <w:kern w:val="0"/>
-          <w:highlight w:val="magenta"/>
           <w:lang w:val="es-ES" w:eastAsia="es-PE"/>
           <w14:ligatures w14:val="none"/>
         </w:rPr>
@@ -4436,14 +4290,14 @@
         <w:tab w:val="right" w:pos="8838"/>
       </w:tabs>
       <w:rPr>
-        <w:rFonts w:ascii="Arial" w:eastAsia="Arial" w:hAnsi="Arial" w:cs="Arial"/>
+        <w:rFonts w:ascii="Arial Narrow" w:eastAsia="Arial" w:hAnsi="Arial Narrow" w:cs="Arial"/>
         <w:sz w:val="16"/>
         <w:szCs w:val="16"/>
       </w:rPr>
     </w:pPr>
     <w:r>
       <w:rPr>
-        <w:rFonts w:ascii="Arial" w:eastAsia="Arial" w:hAnsi="Arial" w:cs="Arial"/>
+        <w:rFonts w:ascii="Arial Narrow" w:eastAsia="Arial" w:hAnsi="Arial Narrow" w:cs="Arial"/>
         <w:sz w:val="16"/>
         <w:szCs w:val="16"/>
       </w:rPr>
@@ -4457,7 +4311,7 @@
     </w:pPr>
     <w:r>
       <w:rPr>
-        <w:rFonts w:ascii="Arial" w:eastAsia="Arial" w:hAnsi="Arial" w:cs="Arial"/>
+        <w:rFonts w:ascii="Arial Narrow" w:eastAsia="Arial" w:hAnsi="Arial Narrow" w:cs="Arial"/>
         <w:sz w:val="16"/>
         <w:szCs w:val="16"/>
       </w:rPr>
@@ -4465,7 +4319,7 @@
     </w:r>
     <w:r>
       <w:rPr>
-        <w:rFonts w:ascii="Arial" w:eastAsia="Arial" w:hAnsi="Arial" w:cs="Arial"/>
+        <w:rFonts w:ascii="Arial Narrow" w:eastAsia="Arial" w:hAnsi="Arial Narrow" w:cs="Arial"/>
         <w:sz w:val="16"/>
         <w:szCs w:val="16"/>
       </w:rPr>
@@ -4473,7 +4327,7 @@
     </w:r>
     <w:r>
       <w:rPr>
-        <w:rFonts w:ascii="Arial" w:eastAsia="Arial" w:hAnsi="Arial" w:cs="Arial"/>
+        <w:rFonts w:ascii="Arial Narrow" w:eastAsia="Arial" w:hAnsi="Arial Narrow" w:cs="Arial"/>
         <w:sz w:val="16"/>
         <w:szCs w:val="16"/>
       </w:rPr>
@@ -4481,7 +4335,7 @@
     </w:r>
     <w:r>
       <w:rPr>
-        <w:rFonts w:ascii="Arial" w:eastAsia="Arial" w:hAnsi="Arial" w:cs="Arial"/>
+        <w:rFonts w:ascii="Arial Narrow" w:eastAsia="Arial" w:hAnsi="Arial Narrow" w:cs="Arial"/>
         <w:sz w:val="16"/>
         <w:szCs w:val="16"/>
       </w:rPr>
@@ -4489,7 +4343,7 @@
     </w:r>
     <w:r>
       <w:rPr>
-        <w:rFonts w:ascii="Arial" w:eastAsia="Arial" w:hAnsi="Arial" w:cs="Arial"/>
+        <w:rFonts w:ascii="Arial Narrow" w:eastAsia="Arial" w:hAnsi="Arial Narrow" w:cs="Arial"/>
         <w:sz w:val="16"/>
         <w:szCs w:val="16"/>
       </w:rPr>
@@ -4549,7 +4403,7 @@
           <w:rFonts w:ascii="Arial Narrow" w:hAnsi="Arial Narrow" w:cs="Arial"/>
           <w:sz w:val="16"/>
           <w:szCs w:val="16"/>
-          <w:highlight w:val="red"/>
+          <w:vertAlign w:val="superscript"/>
         </w:rPr>
         <w:footnoteRef/>
       </w:r>
@@ -4558,7 +4412,6 @@
           <w:rFonts w:ascii="Arial Narrow" w:hAnsi="Arial Narrow" w:cs="Arial"/>
           <w:sz w:val="16"/>
           <w:szCs w:val="16"/>
-          <w:highlight w:val="red"/>
         </w:rPr>
         <w:t xml:space="preserve"> </w:t>
       </w:r>
@@ -4567,7 +4420,6 @@
           <w:rFonts w:ascii="Arial Narrow" w:hAnsi="Arial Narrow" w:cs="Arial"/>
           <w:sz w:val="16"/>
           <w:szCs w:val="16"/>
-          <w:highlight w:val="red"/>
         </w:rPr>
         <w:tab/>
       </w:r>
@@ -4584,7 +4436,6 @@
           <w:rFonts w:ascii="Arial Narrow" w:hAnsi="Arial Narrow" w:cs="Arial"/>
           <w:sz w:val="16"/>
           <w:szCs w:val="16"/>
-          <w:highlight w:val="red"/>
         </w:rPr>
         <w:t xml:space="preserve">MEMORANDUM  000405-2025-LAM/INDECOPI </w:t>
       </w:r>
@@ -4601,7 +4452,6 @@
           <w:rFonts w:ascii="Arial Narrow" w:hAnsi="Arial Narrow" w:cs="Arial"/>
           <w:sz w:val="16"/>
           <w:szCs w:val="16"/>
-          <w:highlight w:val="red"/>
         </w:rPr>
         <w:t xml:space="preserve">16 de abril del 2025, </w:t>
       </w:r>
@@ -4618,7 +4468,6 @@
           <w:rFonts w:ascii="Arial Narrow" w:hAnsi="Arial Narrow" w:cs="Arial"/>
           <w:sz w:val="16"/>
           <w:szCs w:val="16"/>
-          <w:highlight w:val="red"/>
         </w:rPr>
         <w:t>el 16 de abril del 2025.</w:t>
       </w:r>
@@ -4654,6 +4503,7 @@
           <w:rFonts w:ascii="Arial Narrow" w:hAnsi="Arial Narrow" w:cs="Arial"/>
           <w:sz w:val="16"/>
           <w:szCs w:val="16"/>
+          <w:vertAlign w:val="superscript"/>
         </w:rPr>
         <w:footnoteRef/>
       </w:r>
@@ -4728,6 +4578,7 @@
           <w:rFonts w:ascii="Arial Narrow" w:hAnsi="Arial Narrow" w:cs="Arial"/>
           <w:sz w:val="16"/>
           <w:szCs w:val="16"/>
+          <w:vertAlign w:val="superscript"/>
         </w:rPr>
         <w:footnoteRef/>
       </w:r>
@@ -4981,6 +4832,7 @@
           <w:rFonts w:ascii="Arial Narrow" w:hAnsi="Arial Narrow"/>
           <w:sz w:val="16"/>
           <w:szCs w:val="16"/>
+          <w:vertAlign w:val="superscript"/>
         </w:rPr>
         <w:footnoteRef/>
       </w:r>
@@ -5164,6 +5016,7 @@
           <w:rFonts w:ascii="Arial Narrow" w:hAnsi="Arial Narrow"/>
           <w:sz w:val="16"/>
           <w:szCs w:val="16"/>
+          <w:vertAlign w:val="superscript"/>
         </w:rPr>
         <w:footnoteRef/>
       </w:r>
@@ -5315,6 +5168,7 @@
           <w:rFonts w:ascii="Arial Narrow" w:hAnsi="Arial Narrow"/>
           <w:sz w:val="16"/>
           <w:szCs w:val="16"/>
+          <w:vertAlign w:val="superscript"/>
         </w:rPr>
         <w:footnoteRef/>
       </w:r>
@@ -5464,6 +5318,7 @@
           <w:rFonts w:ascii="Arial Narrow" w:hAnsi="Arial Narrow"/>
           <w:sz w:val="16"/>
           <w:szCs w:val="16"/>
+          <w:vertAlign w:val="superscript"/>
         </w:rPr>
         <w:footnoteRef/>
       </w:r>
@@ -5773,6 +5628,7 @@
           <w:rFonts w:ascii="Arial Narrow" w:hAnsi="Arial Narrow"/>
           <w:sz w:val="16"/>
           <w:szCs w:val="16"/>
+          <w:vertAlign w:val="superscript"/>
         </w:rPr>
         <w:footnoteRef/>
       </w:r>
@@ -5889,6 +5745,7 @@
           <w:rFonts w:ascii="Arial Narrow" w:hAnsi="Arial Narrow" w:cs="Arial"/>
           <w:sz w:val="16"/>
           <w:szCs w:val="16"/>
+          <w:vertAlign w:val="superscript"/>
         </w:rPr>
         <w:footnoteRef/>
       </w:r>
@@ -6056,6 +5913,7 @@
           <w:rFonts w:ascii="Arial Narrow" w:hAnsi="Arial Narrow" w:cs="Arial"/>
           <w:sz w:val="16"/>
           <w:szCs w:val="16"/>
+          <w:vertAlign w:val="superscript"/>
         </w:rPr>
         <w:footnoteRef/>
       </w:r>
@@ -6108,6 +5966,7 @@
           <w:rFonts w:ascii="Arial Narrow" w:hAnsi="Arial Narrow" w:cs="Arial"/>
           <w:sz w:val="16"/>
           <w:szCs w:val="16"/>
+          <w:vertAlign w:val="superscript"/>
         </w:rPr>
         <w:footnoteRef/>
       </w:r>
@@ -6313,7 +6172,7 @@
       </w:pPr>
       <w:r>
         <w:rPr>
-          <w:rStyle w:val="TextonotapieCar"/>
+          <w:rStyle w:val="Refdenotaalpie"/>
           <w:rFonts w:ascii="Arial Narrow" w:hAnsi="Arial Narrow" w:cs="Arial"/>
           <w:sz w:val="16"/>
           <w:szCs w:val="16"/>
@@ -6548,6 +6407,7 @@
           <w:rFonts w:ascii="Arial Narrow" w:hAnsi="Arial Narrow" w:cs="Arial"/>
           <w:sz w:val="16"/>
           <w:szCs w:val="16"/>
+          <w:vertAlign w:val="superscript"/>
         </w:rPr>
         <w:footnoteRef/>
       </w:r>
@@ -7333,6 +7193,7 @@
           <w:rFonts w:ascii="Arial Narrow" w:hAnsi="Arial Narrow" w:cs="Arial"/>
           <w:sz w:val="16"/>
           <w:szCs w:val="16"/>
+          <w:vertAlign w:val="superscript"/>
         </w:rPr>
         <w:footnoteRef/>
       </w:r>
@@ -7553,6 +7414,7 @@
           <w:bCs/>
           <w:sz w:val="16"/>
           <w:szCs w:val="16"/>
+          <w:vertAlign w:val="superscript"/>
         </w:rPr>
         <w:footnoteRef/>
       </w:r>
@@ -7642,6 +7504,7 @@
           <w:rFonts w:ascii="Arial Narrow" w:hAnsi="Arial Narrow" w:cs="Arial"/>
           <w:sz w:val="16"/>
           <w:szCs w:val="16"/>
+          <w:vertAlign w:val="superscript"/>
         </w:rPr>
         <w:footnoteRef/>
       </w:r>
@@ -10126,6 +9989,17 @@
       <w:szCs w:val="20"/>
     </w:rPr>
   </w:style>
+  <w:style w:type="character" w:styleId="FootnoteReference">
+    <w:name w:val="footnote reference"/>
+    <w:basedOn w:val="Fuentedeprrafopredeter"/>
+    <w:uiPriority w:val="99"/>
+    <w:semiHidden/>
+    <w:unhideWhenUsed/>
+    <w:rPr>
+      <w:rFonts w:ascii="Arial Narrow" w:hAnsi="Arial Narrow"/>
+      <w:vertAlign w:val="superscript"/>
+    </w:rPr>
+  </w:style>
 </w:styles>
 </file>
 

</xml_diff>

<commit_message>
v2.3.0 - Formula canonica obligatoria de traslado y descargos (R-155), derogacion de formulas A y B, y calibracion de 596 plantillas
</commit_message>
<xml_diff>
--- a/automatizacion_antigravity/modelos/MODELO_1_DDO.docx
+++ b/automatizacion_antigravity/modelos/MODELO_1_DDO.docx
@@ -1,8 +1,8 @@
 
 <file path=word/document.xml><?xml version="1.0" encoding="utf-8"?>
-<w:document xmlns:wpc="http://schemas.microsoft.com/office/word/2010/wordprocessingCanvas" xmlns:cx="http://schemas.microsoft.com/office/drawing/2014/chartex" xmlns:cx1="http://schemas.microsoft.com/office/drawing/2015/9/8/chartex" xmlns:cx2="http://schemas.microsoft.com/office/drawing/2015/10/21/chartex" xmlns:cx3="http://schemas.microsoft.com/office/drawing/2016/5/9/chartex" xmlns:cx4="http://schemas.microsoft.com/office/drawing/2016/5/10/chartex" xmlns:cx5="http://schemas.microsoft.com/office/drawing/2016/5/11/chartex" xmlns:cx6="http://schemas.microsoft.com/office/drawing/2016/5/12/chartex" xmlns:cx7="http://schemas.microsoft.com/office/drawing/2016/5/13/chartex" xmlns:cx8="http://schemas.microsoft.com/office/drawing/2016/5/14/chartex" xmlns:mc="http://schemas.openxmlformats.org/markup-compatibility/2006" xmlns:aink="http://schemas.microsoft.com/office/drawing/2016/ink" xmlns:am3d="http://schemas.microsoft.com/office/drawing/2017/model3d" xmlns:o="urn:schemas-microsoft-com:office:office" xmlns:oel="http://schemas.microsoft.com/office/2019/extlst" xmlns:r="http://schemas.openxmlformats.org/officeDocument/2006/relationships" xmlns:m="http://schemas.openxmlformats.org/officeDocument/2006/math" xmlns:v="urn:schemas-microsoft-com:vml" xmlns:wp14="http://schemas.microsoft.com/office/word/2010/wordprocessingDrawing" xmlns:wp="http://schemas.openxmlformats.org/drawingml/2006/wordprocessingDrawing" xmlns:w10="urn:schemas-microsoft-com:office:word" xmlns:w="http://schemas.openxmlformats.org/wordprocessingml/2006/main" xmlns:w14="http://schemas.microsoft.com/office/word/2010/wordml" xmlns:w15="http://schemas.microsoft.com/office/word/2012/wordml" xmlns:w16cei="http://schemas.microsoft.com/office/word/2026/wordml/cei" xmlns:w16cex="http://schemas.microsoft.com/office/word/2018/wordml/cex" xmlns:w16cid="http://schemas.microsoft.com/office/word/2016/wordml/cid" xmlns:w16="http://schemas.microsoft.com/office/word/2018/wordml" xmlns:w16du="http://schemas.microsoft.com/office/word/2023/wordml/word16du" xmlns:w16sdtdh="http://schemas.microsoft.com/office/word/2020/wordml/sdtdatahash" xmlns:w16sdtfl="http://schemas.microsoft.com/office/word/2024/wordml/sdtformatlock" xmlns:w16se="http://schemas.microsoft.com/office/word/2015/wordml/symex" xmlns:wpg="http://schemas.microsoft.com/office/word/2010/wordprocessingGroup" xmlns:wpi="http://schemas.microsoft.com/office/word/2010/wordprocessingInk" xmlns:wne="http://schemas.microsoft.com/office/word/2006/wordml" xmlns:wps="http://schemas.microsoft.com/office/word/2010/wordprocessingShape" mc:Ignorable="w14 w15 w16se w16cid w16 w16cex w16sdtdh w16sdtfl w16du wp14">
+<w:document xmlns:ns1="http://schemas.openxmlformats.org/markup-compatibility/2006" xmlns:ns2="http://schemas.microsoft.com/office/word/2010/wordml" xmlns:ns3="http://schemas.openxmlformats.org/officeDocument/2006/relationships" xmlns:w="http://schemas.openxmlformats.org/wordprocessingml/2006/main" ns1:Ignorable="w14 w15 w16se w16cid w16 w16cex w16sdtdh w16sdtfl w16du wp14">
   <w:body>
-    <w:p>
+    <w:p ns2:paraId="1B509B2D" ns2:textId="614B86B2">
       <w:pPr>
         <w:tabs>
           <w:tab w:val="left" w:pos="1701"/>
@@ -14,7 +14,7 @@
           <w:color w:val="000000"/>
           <w:kern w:val="0"/>
           <w:lang w:eastAsia="es-PE"/>
-          <w14:ligatures w14:val="none"/>
+          <ns2:ligatures ns2:val="none"/>
         </w:rPr>
       </w:pPr>
       <w:bookmarkStart w:id="0" w:name="_Hlk80343540"/>
@@ -25,7 +25,7 @@
           <w:color w:val="000000"/>
           <w:kern w:val="0"/>
           <w:lang w:eastAsia="es-PE"/>
-          <w14:ligatures w14:val="none"/>
+          <ns2:ligatures ns2:val="none"/>
         </w:rPr>
         <w:t xml:space="preserve">EXPEDIENTE </w:t>
       </w:r>
@@ -36,7 +36,7 @@
           <w:color w:val="000000"/>
           <w:kern w:val="0"/>
           <w:lang w:eastAsia="es-PE"/>
-          <w14:ligatures w14:val="none"/>
+          <ns2:ligatures ns2:val="none"/>
         </w:rPr>
         <w:tab/>
         <w:t>:</w:t>
@@ -48,7 +48,7 @@
           <w:color w:val="000000"/>
           <w:kern w:val="0"/>
           <w:lang w:eastAsia="es-PE"/>
-          <w14:ligatures w14:val="none"/>
+          <ns2:ligatures ns2:val="none"/>
         </w:rPr>
         <w:tab/>
       </w:r>
@@ -61,7 +61,7 @@
           <w:kern w:val="0"/>
           <w:shd w:val="clear" w:color="auto" w:fill="FFFFFF"/>
           <w:lang w:eastAsia="es-PE"/>
-          <w14:ligatures w14:val="none"/>
+          <ns2:ligatures ns2:val="none"/>
         </w:rPr>
         <w:t>0672-202</w:t>
       </w:r>
@@ -74,7 +74,7 @@
           <w:kern w:val="0"/>
           <w:shd w:val="clear" w:color="auto" w:fill="FFFFFF"/>
           <w:lang w:eastAsia="es-PE"/>
-          <w14:ligatures w14:val="none"/>
+          <ns2:ligatures ns2:val="none"/>
         </w:rPr>
         <w:t>6</w:t>
       </w:r>
@@ -87,12 +87,12 @@
           <w:kern w:val="0"/>
           <w:shd w:val="clear" w:color="auto" w:fill="FFFFFF"/>
           <w:lang w:eastAsia="es-PE"/>
-          <w14:ligatures w14:val="none"/>
+          <ns2:ligatures ns2:val="none"/>
         </w:rPr>
         <w:t>/CC1</w:t>
       </w:r>
     </w:p>
-    <w:p>
+    <w:p ns2:paraId="7E5DC22B" ns2:textId="77777777">
       <w:pPr>
         <w:tabs>
           <w:tab w:val="left" w:pos="1701"/>
@@ -107,17 +107,17 @@
           <w:color w:val="000000"/>
           <w:kern w:val="0"/>
           <w:lang w:eastAsia="es-PE"/>
-          <w14:ligatures w14:val="none"/>
-        </w:rPr>
-      </w:pPr>
-      <w:r>
-        <w:rPr>
-          <w:rFonts w:ascii="Arial Narrow" w:eastAsia="Arial Narrow" w:hAnsi="Arial Narrow" w:cs="Arial Narrow"/>
-          <w:b/>
-          <w:color w:val="000000"/>
-          <w:kern w:val="0"/>
-          <w:lang w:eastAsia="es-PE"/>
-          <w14:ligatures w14:val="none"/>
+          <ns2:ligatures ns2:val="none"/>
+        </w:rPr>
+      </w:pPr>
+      <w:r>
+        <w:rPr>
+          <w:rFonts w:ascii="Arial Narrow" w:eastAsia="Arial Narrow" w:hAnsi="Arial Narrow" w:cs="Arial Narrow"/>
+          <w:b/>
+          <w:color w:val="000000"/>
+          <w:kern w:val="0"/>
+          <w:lang w:eastAsia="es-PE"/>
+          <ns2:ligatures ns2:val="none"/>
         </w:rPr>
         <w:t>DENUNCIANTE</w:t>
       </w:r>
@@ -128,7 +128,7 @@
           <w:color w:val="000000"/>
           <w:kern w:val="0"/>
           <w:lang w:eastAsia="es-PE"/>
-          <w14:ligatures w14:val="none"/>
+          <ns2:ligatures ns2:val="none"/>
         </w:rPr>
         <w:tab/>
         <w:t>:</w:t>
@@ -140,7 +140,7 @@
           <w:color w:val="000000"/>
           <w:kern w:val="0"/>
           <w:lang w:eastAsia="es-PE"/>
-          <w14:ligatures w14:val="none"/>
+          <ns2:ligatures ns2:val="none"/>
         </w:rPr>
         <w:tab/>
       </w:r>
@@ -151,12 +151,12 @@
           <w:color w:val="000000"/>
           <w:kern w:val="0"/>
           <w:lang w:eastAsia="es-PE"/>
-          <w14:ligatures w14:val="none"/>
+          <ns2:ligatures ns2:val="none"/>
         </w:rPr>
         <w:t>MEDALITH MEDINA GUTIERREZ (SEÑORA MEDINA)</w:t>
       </w:r>
     </w:p>
-    <w:p>
+    <w:p ns2:paraId="6DEEEDFE" ns2:textId="57C2DEC6">
       <w:pPr>
         <w:tabs>
           <w:tab w:val="left" w:pos="1701"/>
@@ -171,17 +171,17 @@
           <w:color w:val="000000"/>
           <w:kern w:val="0"/>
           <w:lang w:eastAsia="es-PE"/>
-          <w14:ligatures w14:val="none"/>
-        </w:rPr>
-      </w:pPr>
-      <w:r>
-        <w:rPr>
-          <w:rFonts w:ascii="Arial Narrow" w:eastAsia="Arial Narrow" w:hAnsi="Arial Narrow" w:cs="Arial Narrow"/>
-          <w:b/>
-          <w:color w:val="000000"/>
-          <w:kern w:val="0"/>
-          <w:lang w:eastAsia="es-PE"/>
-          <w14:ligatures w14:val="none"/>
+          <ns2:ligatures ns2:val="none"/>
+        </w:rPr>
+      </w:pPr>
+      <w:r>
+        <w:rPr>
+          <w:rFonts w:ascii="Arial Narrow" w:eastAsia="Arial Narrow" w:hAnsi="Arial Narrow" w:cs="Arial Narrow"/>
+          <w:b/>
+          <w:color w:val="000000"/>
+          <w:kern w:val="0"/>
+          <w:lang w:eastAsia="es-PE"/>
+          <ns2:ligatures ns2:val="none"/>
         </w:rPr>
         <w:t>DENUNCIADO</w:t>
       </w:r>
@@ -192,7 +192,7 @@
           <w:color w:val="000000"/>
           <w:kern w:val="0"/>
           <w:lang w:eastAsia="es-PE"/>
-          <w14:ligatures w14:val="none"/>
+          <ns2:ligatures ns2:val="none"/>
         </w:rPr>
         <w:t>(S)</w:t>
       </w:r>
@@ -203,7 +203,7 @@
           <w:color w:val="000000"/>
           <w:kern w:val="0"/>
           <w:lang w:eastAsia="es-PE"/>
-          <w14:ligatures w14:val="none"/>
+          <ns2:ligatures ns2:val="none"/>
         </w:rPr>
         <w:tab/>
         <w:t>:</w:t>
@@ -215,7 +215,7 @@
           <w:color w:val="000000"/>
           <w:kern w:val="0"/>
           <w:lang w:eastAsia="es-PE"/>
-          <w14:ligatures w14:val="none"/>
+          <ns2:ligatures ns2:val="none"/>
         </w:rPr>
         <w:tab/>
       </w:r>
@@ -226,12 +226,12 @@
           <w:color w:val="000000"/>
           <w:kern w:val="0"/>
           <w:lang w:eastAsia="es-PE"/>
-          <w14:ligatures w14:val="none"/>
+          <ns2:ligatures ns2:val="none"/>
         </w:rPr>
         <w:t>RÍMAC SEGUROS Y REASEGUROS S.A. (RÍMAC)</w:t>
       </w:r>
     </w:p>
-    <w:p>
+    <w:p ns2:paraId="022D2B94" ns2:textId="77777777">
       <w:pPr>
         <w:tabs>
           <w:tab w:val="left" w:pos="1701"/>
@@ -246,17 +246,17 @@
           <w:color w:val="000000"/>
           <w:kern w:val="0"/>
           <w:lang w:eastAsia="es-PE"/>
-          <w14:ligatures w14:val="none"/>
-        </w:rPr>
-      </w:pPr>
-      <w:r>
-        <w:rPr>
-          <w:rFonts w:ascii="Arial Narrow" w:eastAsia="Arial Narrow" w:hAnsi="Arial Narrow" w:cs="Arial Narrow"/>
-          <w:b/>
-          <w:color w:val="000000"/>
-          <w:kern w:val="0"/>
-          <w:lang w:eastAsia="es-PE"/>
-          <w14:ligatures w14:val="none"/>
+          <ns2:ligatures ns2:val="none"/>
+        </w:rPr>
+      </w:pPr>
+      <w:r>
+        <w:rPr>
+          <w:rFonts w:ascii="Arial Narrow" w:eastAsia="Arial Narrow" w:hAnsi="Arial Narrow" w:cs="Arial Narrow"/>
+          <w:b/>
+          <w:color w:val="000000"/>
+          <w:kern w:val="0"/>
+          <w:lang w:eastAsia="es-PE"/>
+          <ns2:ligatures ns2:val="none"/>
         </w:rPr>
         <w:t>MATERIAS</w:t>
       </w:r>
@@ -267,7 +267,7 @@
           <w:color w:val="000000"/>
           <w:kern w:val="0"/>
           <w:lang w:eastAsia="es-PE"/>
-          <w14:ligatures w14:val="none"/>
+          <ns2:ligatures ns2:val="none"/>
         </w:rPr>
         <w:tab/>
         <w:t xml:space="preserve">:       </w:t>
@@ -279,13 +279,13 @@
           <w:color w:val="000000"/>
           <w:kern w:val="0"/>
           <w:lang w:eastAsia="es-PE"/>
-          <w14:ligatures w14:val="none"/>
+          <ns2:ligatures ns2:val="none"/>
         </w:rPr>
         <w:tab/>
         <w:t>ADMISIÓN A TRÁMITE</w:t>
       </w:r>
     </w:p>
-    <w:p>
+    <w:p ns2:paraId="19ED7B73" ns2:textId="77777777">
       <w:pPr>
         <w:tabs>
           <w:tab w:val="left" w:pos="1701"/>
@@ -300,22 +300,22 @@
           <w:color w:val="000000"/>
           <w:kern w:val="0"/>
           <w:lang w:eastAsia="es-PE"/>
-          <w14:ligatures w14:val="none"/>
-        </w:rPr>
-      </w:pPr>
-      <w:r>
-        <w:rPr>
-          <w:rFonts w:ascii="Arial Narrow" w:eastAsia="Arial Narrow" w:hAnsi="Arial Narrow" w:cs="Arial Narrow"/>
-          <w:b/>
-          <w:color w:val="000000"/>
-          <w:kern w:val="0"/>
-          <w:lang w:eastAsia="es-PE"/>
-          <w14:ligatures w14:val="none"/>
+          <ns2:ligatures ns2:val="none"/>
+        </w:rPr>
+      </w:pPr>
+      <w:r>
+        <w:rPr>
+          <w:rFonts w:ascii="Arial Narrow" w:eastAsia="Arial Narrow" w:hAnsi="Arial Narrow" w:cs="Arial Narrow"/>
+          <w:b/>
+          <w:color w:val="000000"/>
+          <w:kern w:val="0"/>
+          <w:lang w:eastAsia="es-PE"/>
+          <ns2:ligatures ns2:val="none"/>
         </w:rPr>
         <w:t xml:space="preserve">REQUERIMIENTO DE INFORMACIÓN </w:t>
       </w:r>
     </w:p>
-    <w:p>
+    <w:p ns2:paraId="46A5A479" ns2:textId="48A7B29A">
       <w:pPr>
         <w:tabs>
           <w:tab w:val="left" w:pos="1701"/>
@@ -329,17 +329,17 @@
           <w:color w:val="000000"/>
           <w:kern w:val="0"/>
           <w:lang w:eastAsia="es-PE"/>
-          <w14:ligatures w14:val="none"/>
-        </w:rPr>
-      </w:pPr>
-      <w:r>
-        <w:rPr>
-          <w:rFonts w:ascii="Arial Narrow" w:eastAsia="Arial Narrow" w:hAnsi="Arial Narrow" w:cs="Arial Narrow"/>
-          <w:b/>
-          <w:color w:val="000000"/>
-          <w:kern w:val="0"/>
-          <w:lang w:eastAsia="es-PE"/>
-          <w14:ligatures w14:val="none"/>
+          <ns2:ligatures ns2:val="none"/>
+        </w:rPr>
+      </w:pPr>
+      <w:r>
+        <w:rPr>
+          <w:rFonts w:ascii="Arial Narrow" w:eastAsia="Arial Narrow" w:hAnsi="Arial Narrow" w:cs="Arial Narrow"/>
+          <w:b/>
+          <w:color w:val="000000"/>
+          <w:kern w:val="0"/>
+          <w:lang w:eastAsia="es-PE"/>
+          <ns2:ligatures ns2:val="none"/>
         </w:rPr>
         <w:t xml:space="preserve">RESOLUCIÓN </w:t>
       </w:r>
@@ -350,7 +350,7 @@
           <w:color w:val="000000"/>
           <w:kern w:val="0"/>
           <w:lang w:eastAsia="es-PE"/>
-          <w14:ligatures w14:val="none"/>
+          <ns2:ligatures ns2:val="none"/>
         </w:rPr>
         <w:tab/>
         <w:t>:</w:t>
@@ -362,7 +362,7 @@
           <w:color w:val="000000"/>
           <w:kern w:val="0"/>
           <w:lang w:eastAsia="es-PE"/>
-          <w14:ligatures w14:val="none"/>
+          <ns2:ligatures ns2:val="none"/>
         </w:rPr>
         <w:tab/>
       </w:r>
@@ -373,12 +373,12 @@
           <w:color w:val="000000"/>
           <w:kern w:val="0"/>
           <w:lang w:eastAsia="es-PE"/>
-          <w14:ligatures w14:val="none"/>
+          <ns2:ligatures ns2:val="none"/>
         </w:rPr>
         <w:t>1</w:t>
       </w:r>
     </w:p>
-    <w:p>
+    <w:p ns2:paraId="5BA3A18D" ns2:textId="77777777">
       <w:pPr>
         <w:tabs>
           <w:tab w:val="left" w:pos="1014"/>
@@ -391,11 +391,11 @@
           <w:kern w:val="0"/>
           <w:shd w:val="clear" w:color="auto" w:fill="FFFFFF"/>
           <w:lang w:eastAsia="es-PE"/>
-          <w14:ligatures w14:val="none"/>
-        </w:rPr>
-      </w:pPr>
-    </w:p>
-    <w:p>
+          <ns2:ligatures ns2:val="none"/>
+        </w:rPr>
+      </w:pPr>
+    </w:p>
+    <w:p ns2:paraId="2F799822" ns2:textId="3084BC0F">
       <w:pPr>
         <w:tabs>
           <w:tab w:val="left" w:pos="1014"/>
@@ -408,7 +408,7 @@
           <w:kern w:val="0"/>
           <w:shd w:val="clear" w:color="auto" w:fill="FFFFFF"/>
           <w:lang w:eastAsia="es-PE"/>
-          <w14:ligatures w14:val="none"/>
+          <ns2:ligatures ns2:val="none"/>
         </w:rPr>
       </w:pPr>
       <w:r>
@@ -418,7 +418,7 @@
           <w:kern w:val="0"/>
           <w:shd w:val="clear" w:color="auto" w:fill="FFFFFF"/>
           <w:lang w:eastAsia="es-PE"/>
-          <w14:ligatures w14:val="none"/>
+          <ns2:ligatures ns2:val="none"/>
         </w:rPr>
         <w:t xml:space="preserve">Lima, </w:t>
       </w:r>
@@ -429,7 +429,7 @@
           <w:kern w:val="0"/>
           <w:shd w:val="clear" w:color="auto" w:fill="FFFFFF"/>
           <w:lang w:eastAsia="es-PE"/>
-          <w14:ligatures w14:val="none"/>
+          <ns2:ligatures ns2:val="none"/>
         </w:rPr>
         <w:t>1</w:t>
       </w:r>
@@ -440,7 +440,7 @@
           <w:kern w:val="0"/>
           <w:shd w:val="clear" w:color="auto" w:fill="FFFFFF"/>
           <w:lang w:eastAsia="es-PE"/>
-          <w14:ligatures w14:val="none"/>
+          <ns2:ligatures ns2:val="none"/>
         </w:rPr>
         <w:t>4</w:t>
       </w:r>
@@ -451,7 +451,7 @@
           <w:kern w:val="0"/>
           <w:shd w:val="clear" w:color="auto" w:fill="FFFFFF"/>
           <w:lang w:eastAsia="es-PE"/>
-          <w14:ligatures w14:val="none"/>
+          <ns2:ligatures ns2:val="none"/>
         </w:rPr>
         <w:t xml:space="preserve"> de </w:t>
       </w:r>
@@ -462,7 +462,7 @@
           <w:kern w:val="0"/>
           <w:shd w:val="clear" w:color="auto" w:fill="FFFFFF"/>
           <w:lang w:eastAsia="es-PE"/>
-          <w14:ligatures w14:val="none"/>
+          <ns2:ligatures ns2:val="none"/>
         </w:rPr>
         <w:t>agosto</w:t>
       </w:r>
@@ -473,7 +473,7 @@
           <w:kern w:val="0"/>
           <w:shd w:val="clear" w:color="auto" w:fill="FFFFFF"/>
           <w:lang w:eastAsia="es-PE"/>
-          <w14:ligatures w14:val="none"/>
+          <ns2:ligatures ns2:val="none"/>
         </w:rPr>
         <w:t xml:space="preserve"> de </w:t>
       </w:r>
@@ -484,12 +484,12 @@
           <w:kern w:val="0"/>
           <w:shd w:val="clear" w:color="auto" w:fill="FFFFFF"/>
           <w:lang w:eastAsia="es-PE"/>
-          <w14:ligatures w14:val="none"/>
+          <ns2:ligatures ns2:val="none"/>
         </w:rPr>
         <w:t>2026</w:t>
       </w:r>
     </w:p>
-    <w:p>
+    <w:p ns2:paraId="66CE1821" ns2:textId="77777777">
       <w:pPr>
         <w:tabs>
           <w:tab w:val="left" w:pos="1014"/>
@@ -501,11 +501,11 @@
           <w:color w:val="000000"/>
           <w:kern w:val="0"/>
           <w:lang w:eastAsia="es-PE"/>
-          <w14:ligatures w14:val="none"/>
-        </w:rPr>
-      </w:pPr>
-    </w:p>
-    <w:p>
+          <ns2:ligatures ns2:val="none"/>
+        </w:rPr>
+      </w:pPr>
+    </w:p>
+    <w:p ns2:paraId="0B80AAA5" ns2:textId="77777777">
       <w:pPr>
         <w:numPr>
           <w:ilvl w:val="0"/>
@@ -519,22 +519,22 @@
           <w:color w:val="000000"/>
           <w:kern w:val="0"/>
           <w:lang w:eastAsia="es-PE"/>
-          <w14:ligatures w14:val="none"/>
-        </w:rPr>
-      </w:pPr>
-      <w:r>
-        <w:rPr>
-          <w:rFonts w:ascii="Arial Narrow" w:eastAsia="Arial Narrow" w:hAnsi="Arial Narrow" w:cs="Arial Narrow"/>
-          <w:b/>
-          <w:color w:val="000000"/>
-          <w:kern w:val="0"/>
-          <w:lang w:eastAsia="es-PE"/>
-          <w14:ligatures w14:val="none"/>
+          <ns2:ligatures ns2:val="none"/>
+        </w:rPr>
+      </w:pPr>
+      <w:r>
+        <w:rPr>
+          <w:rFonts w:ascii="Arial Narrow" w:eastAsia="Arial Narrow" w:hAnsi="Arial Narrow" w:cs="Arial Narrow"/>
+          <w:b/>
+          <w:color w:val="000000"/>
+          <w:kern w:val="0"/>
+          <w:lang w:eastAsia="es-PE"/>
+          <ns2:ligatures ns2:val="none"/>
         </w:rPr>
         <w:t xml:space="preserve">HECHOS </w:t>
       </w:r>
     </w:p>
-    <w:p>
+    <w:p ns2:paraId="621F2AB2" ns2:textId="77777777">
       <w:pPr>
         <w:spacing w:after="0" w:line="240" w:lineRule="auto"/>
         <w:jc w:val="both"/>
@@ -543,11 +543,11 @@
           <w:color w:val="000000"/>
           <w:kern w:val="0"/>
           <w:lang w:eastAsia="es-PE"/>
-          <w14:ligatures w14:val="none"/>
-        </w:rPr>
-      </w:pPr>
-    </w:p>
-    <w:p>
+          <ns2:ligatures ns2:val="none"/>
+        </w:rPr>
+      </w:pPr>
+    </w:p>
+    <w:p ns2:paraId="60B5D5B0" ns2:textId="2E851644">
       <w:pPr>
         <w:numPr>
           <w:ilvl w:val="1"/>
@@ -561,7 +561,7 @@
           <w:color w:val="000000"/>
           <w:kern w:val="0"/>
           <w:lang w:val="es-ES" w:eastAsia="es-ES"/>
-          <w14:ligatures w14:val="none"/>
+          <ns2:ligatures ns2:val="none"/>
         </w:rPr>
       </w:pPr>
       <w:r>
@@ -570,7 +570,7 @@
           <w:color w:val="000000"/>
           <w:kern w:val="0"/>
           <w:lang w:val="es-ES" w:eastAsia="es-ES"/>
-          <w14:ligatures w14:val="none"/>
+          <ns2:ligatures ns2:val="none"/>
         </w:rPr>
         <w:t xml:space="preserve">Mediante </w:t>
       </w:r>
@@ -580,7 +580,7 @@
           <w:color w:val="000000"/>
           <w:kern w:val="0"/>
           <w:lang w:val="es-ES" w:eastAsia="es-ES"/>
-          <w14:ligatures w14:val="none"/>
+          <ns2:ligatures ns2:val="none"/>
         </w:rPr>
         <w:t>el escrito del 17 de marzo de 2025</w:t>
       </w:r>
@@ -592,7 +592,7 @@
           <w:kern w:val="0"/>
           <w:vertAlign w:val="superscript"/>
           <w:lang w:val="es-ES" w:eastAsia="es-ES"/>
-          <w14:ligatures w14:val="none"/>
+          <ns2:ligatures ns2:val="none"/>
         </w:rPr>
         <w:footnoteReference w:id="1"/>
       </w:r>
@@ -602,7 +602,7 @@
           <w:color w:val="000000"/>
           <w:kern w:val="0"/>
           <w:lang w:val="es-ES" w:eastAsia="es-ES"/>
-          <w14:ligatures w14:val="none"/>
+          <ns2:ligatures ns2:val="none"/>
         </w:rPr>
         <w:t>, subsanada mediante escrito del 12 de marzo de 2025</w:t>
       </w:r>
@@ -610,7 +610,7 @@
         <w:rPr>
           <w:rFonts w:ascii="Arial Narrow" w:eastAsia="Calibri" w:hAnsi="Arial Narrow" w:cs="Arial"/>
           <w:kern w:val="0"/>
-          <w14:ligatures w14:val="none"/>
+          <ns2:ligatures ns2:val="none"/>
         </w:rPr>
         <w:t>, y mediante el escrito del 12 de mayo de 2025,</w:t>
       </w:r>
@@ -618,7 +618,7 @@
         <w:rPr>
           <w:rFonts w:ascii="Arial Narrow" w:eastAsia="Calibri" w:hAnsi="Arial Narrow" w:cs="Arial"/>
           <w:kern w:val="0"/>
-          <w14:ligatures w14:val="none"/>
+          <ns2:ligatures ns2:val="none"/>
         </w:rPr>
         <w:t xml:space="preserve"> la señora Medina d</w:t>
       </w:r>
@@ -628,7 +628,7 @@
           <w:color w:val="000000"/>
           <w:kern w:val="0"/>
           <w:lang w:val="es-ES" w:eastAsia="es-ES"/>
-          <w14:ligatures w14:val="none"/>
+          <ns2:ligatures ns2:val="none"/>
         </w:rPr>
         <w:t>enunció a Rímac</w:t>
       </w:r>
@@ -638,7 +638,7 @@
           <w:color w:val="000000"/>
           <w:kern w:val="0"/>
           <w:lang w:val="es-ES" w:eastAsia="es-ES"/>
-          <w14:ligatures w14:val="none"/>
+          <ns2:ligatures ns2:val="none"/>
         </w:rPr>
         <w:t xml:space="preserve"> por presuntas infracciones a la </w:t>
       </w:r>
@@ -648,7 +648,7 @@
           <w:color w:val="000000"/>
           <w:kern w:val="0"/>
           <w:lang w:val="es-ES" w:eastAsia="es-ES"/>
-          <w14:ligatures w14:val="none"/>
+          <ns2:ligatures ns2:val="none"/>
         </w:rPr>
         <w:t xml:space="preserve">Ley </w:t>
       </w:r>
@@ -658,7 +658,7 @@
           <w:kern w:val="0"/>
           <w:shd w:val="clear" w:color="auto" w:fill="FFFFFF"/>
           <w:lang w:eastAsia="es-PE"/>
-          <w14:ligatures w14:val="none"/>
+          <ns2:ligatures ns2:val="none"/>
         </w:rPr>
         <w:t>29571</w:t>
       </w:r>
@@ -668,7 +668,7 @@
           <w:color w:val="000000"/>
           <w:kern w:val="0"/>
           <w:lang w:val="es-ES" w:eastAsia="es-ES"/>
-          <w14:ligatures w14:val="none"/>
+          <ns2:ligatures ns2:val="none"/>
         </w:rPr>
         <w:t>, Código de Protección y Defensa del Consumidor (en adelante, Código)</w:t>
       </w:r>
@@ -680,7 +680,7 @@
           <w:kern w:val="0"/>
           <w:vertAlign w:val="superscript"/>
           <w:lang w:val="es-ES" w:eastAsia="es-ES"/>
-          <w14:ligatures w14:val="none"/>
+          <ns2:ligatures ns2:val="none"/>
         </w:rPr>
         <w:footnoteReference w:id="2"/>
       </w:r>
@@ -690,7 +690,7 @@
           <w:color w:val="000000"/>
           <w:kern w:val="0"/>
           <w:lang w:val="es-ES" w:eastAsia="es-ES"/>
-          <w14:ligatures w14:val="none"/>
+          <ns2:ligatures ns2:val="none"/>
         </w:rPr>
         <w:t xml:space="preserve">, señalando </w:t>
       </w:r>
@@ -701,12 +701,12 @@
           <w:color w:val="000000"/>
           <w:kern w:val="0"/>
           <w:lang w:val="es-ES" w:eastAsia="es-ES"/>
-          <w14:ligatures w14:val="none"/>
+          <ns2:ligatures ns2:val="none"/>
         </w:rPr>
         <w:t>lo siguiente:</w:t>
       </w:r>
     </w:p>
-    <w:p>
+    <w:p ns2:paraId="3AD3B7C6" ns2:textId="77777777">
       <w:pPr>
         <w:tabs>
           <w:tab w:val="left" w:pos="1134"/>
@@ -718,11 +718,11 @@
           <w:color w:val="000000"/>
           <w:kern w:val="0"/>
           <w:lang w:val="es-ES" w:eastAsia="es-ES"/>
-          <w14:ligatures w14:val="none"/>
-        </w:rPr>
-      </w:pPr>
-    </w:p>
-    <w:p>
+          <ns2:ligatures ns2:val="none"/>
+        </w:rPr>
+      </w:pPr>
+    </w:p>
+    <w:p ns2:paraId="673E03EA" ns2:textId="482CAA5C">
       <w:pPr>
         <w:pStyle w:val="Prrafodelista"/>
         <w:numPr>
@@ -741,7 +741,7 @@
           <w:color w:val="000000"/>
           <w:kern w:val="0"/>
           <w:lang w:eastAsia="es-ES"/>
-          <w14:ligatures w14:val="none"/>
+          <ns2:ligatures ns2:val="none"/>
         </w:rPr>
       </w:pPr>
       <w:r>
@@ -750,12 +750,12 @@
           <w:color w:val="000000"/>
           <w:kern w:val="0"/>
           <w:lang w:eastAsia="es-ES"/>
-          <w14:ligatures w14:val="none"/>
+          <ns2:ligatures ns2:val="none"/>
         </w:rPr>
         <w:t xml:space="preserve">El xx de abril de 202x, adquirió la Póliza 1364266 del Seguro Vehicular de Rímac en favor del vehículo con Placa de Rodaje  xxx-322 cuya vigencia se extendía hasta el 24 de abril de 2024, acordando que se le otorgaría una indemnización por el valor equivalente a US$ xxxx. Asimismo, se acordó que el valor de la prima mensual era equivalente a US$ 4xxx,00. </w:t>
       </w:r>
     </w:p>
-    <w:p>
+    <w:p ns2:paraId="512911CE" ns2:textId="77777777">
       <w:pPr>
         <w:pStyle w:val="Prrafodelista"/>
         <w:spacing w:after="0" w:line="240" w:lineRule="auto"/>
@@ -766,11 +766,11 @@
           <w:color w:val="000000"/>
           <w:kern w:val="0"/>
           <w:lang w:eastAsia="es-ES"/>
-          <w14:ligatures w14:val="none"/>
-        </w:rPr>
-      </w:pPr>
-    </w:p>
-    <w:p>
+          <ns2:ligatures ns2:val="none"/>
+        </w:rPr>
+      </w:pPr>
+    </w:p>
+    <w:p ns2:paraId="2F9CF7F5" ns2:textId="69AA709F">
       <w:pPr>
         <w:pStyle w:val="Prrafodelista"/>
         <w:numPr>
@@ -789,7 +789,7 @@
           <w:color w:val="000000"/>
           <w:kern w:val="0"/>
           <w:lang w:eastAsia="es-ES"/>
-          <w14:ligatures w14:val="none"/>
+          <ns2:ligatures ns2:val="none"/>
         </w:rPr>
       </w:pPr>
       <w:r>
@@ -798,12 +798,12 @@
           <w:color w:val="000000"/>
           <w:kern w:val="0"/>
           <w:lang w:eastAsia="es-ES"/>
-          <w14:ligatures w14:val="none"/>
+          <ns2:ligatures ns2:val="none"/>
         </w:rPr>
         <w:t xml:space="preserve">El 5 de abril de 2024, fue víctima del robo total del vehículo asegurado. El 24 de abril de 2024, mediante a Carta CRT-854049, Rímac le comunicó que para calcular el valor indemnizable del vehículo asegurado se tomará como base el importe de US$ 8,300.00. Por ello, a través de un documento de transacción, le informó que el valor indemnizable del vehículo asegurado era equivalente a US$ 6 640,00, siendo este valor monetario inferior al acordado en la Póliza  2101-1031084 del Seguro Vehicular. </w:t>
       </w:r>
     </w:p>
-    <w:p>
+    <w:p ns2:paraId="33E14FF7" ns2:textId="77777777">
       <w:pPr>
         <w:tabs>
           <w:tab w:val="left" w:pos="1134"/>
@@ -815,11 +815,11 @@
           <w:color w:val="000000"/>
           <w:kern w:val="0"/>
           <w:lang w:eastAsia="es-ES"/>
-          <w14:ligatures w14:val="none"/>
-        </w:rPr>
-      </w:pPr>
-    </w:p>
-    <w:p>
+          <ns2:ligatures ns2:val="none"/>
+        </w:rPr>
+      </w:pPr>
+    </w:p>
+    <w:p ns2:paraId="65C58807" ns2:textId="4AAF6D09">
       <w:pPr>
         <w:numPr>
           <w:ilvl w:val="1"/>
@@ -837,7 +837,7 @@
           <w:color w:val="000000"/>
           <w:kern w:val="0"/>
           <w:lang w:val="es-ES" w:eastAsia="es-ES"/>
-          <w14:ligatures w14:val="none"/>
+          <ns2:ligatures ns2:val="none"/>
         </w:rPr>
       </w:pPr>
       <w:r>
@@ -846,12 +846,12 @@
           <w:color w:val="000000"/>
           <w:kern w:val="0"/>
           <w:lang w:val="es-ES" w:eastAsia="es-ES"/>
-          <w14:ligatures w14:val="none"/>
+          <ns2:ligatures ns2:val="none"/>
         </w:rPr>
         <w:t>La señora Medina solicitó, en calidad de medida correctiva, que Rímac cumpla con otorgar la suma asegurada convenida en la Póliza  2101-1031084 del Seguro Vehicular, ascendente a US$ 9 959, 40. Asimismo, requirió el reembolso de costos y costas del presente procedimiento.</w:t>
       </w:r>
     </w:p>
-    <w:p>
+    <w:p ns2:paraId="66005174" ns2:textId="77777777">
       <w:pPr>
         <w:spacing w:after="0" w:line="240" w:lineRule="auto"/>
         <w:contextualSpacing/>
@@ -862,11 +862,11 @@
           <w:color w:val="000000"/>
           <w:kern w:val="0"/>
           <w:lang w:eastAsia="es-PE"/>
-          <w14:ligatures w14:val="none"/>
-        </w:rPr>
-      </w:pPr>
-    </w:p>
-    <w:p>
+          <ns2:ligatures ns2:val="none"/>
+        </w:rPr>
+      </w:pPr>
+    </w:p>
+    <w:p ns2:paraId="3541B1F9" ns2:textId="77777777">
       <w:pPr>
         <w:pStyle w:val="Prrafodelista"/>
         <w:numPr>
@@ -886,22 +886,22 @@
           <w:color w:val="000000"/>
           <w:kern w:val="0"/>
           <w:lang w:eastAsia="es-PE"/>
-          <w14:ligatures w14:val="none"/>
-        </w:rPr>
-      </w:pPr>
-      <w:r>
-        <w:rPr>
-          <w:rFonts w:ascii="Arial Narrow" w:eastAsia="Arial Narrow" w:hAnsi="Arial Narrow" w:cs="Arial Narrow"/>
-          <w:b/>
-          <w:color w:val="000000"/>
-          <w:kern w:val="0"/>
-          <w:lang w:eastAsia="es-PE"/>
-          <w14:ligatures w14:val="none"/>
+          <ns2:ligatures ns2:val="none"/>
+        </w:rPr>
+      </w:pPr>
+      <w:r>
+        <w:rPr>
+          <w:rFonts w:ascii="Arial Narrow" w:eastAsia="Arial Narrow" w:hAnsi="Arial Narrow" w:cs="Arial Narrow"/>
+          <w:b/>
+          <w:color w:val="000000"/>
+          <w:kern w:val="0"/>
+          <w:lang w:eastAsia="es-PE"/>
+          <ns2:ligatures ns2:val="none"/>
         </w:rPr>
         <w:t>DE LA ADMISIÓN A TRÁMITE DE LA DENUNCIA</w:t>
       </w:r>
     </w:p>
-    <w:p>
+    <w:p ns2:paraId="34556756" ns2:textId="77777777">
       <w:pPr>
         <w:spacing w:after="0" w:line="240" w:lineRule="auto"/>
         <w:contextualSpacing/>
@@ -912,13 +912,13 @@
           <w:color w:val="000000"/>
           <w:kern w:val="0"/>
           <w:lang w:eastAsia="es-PE"/>
-          <w14:ligatures w14:val="none"/>
+          <ns2:ligatures ns2:val="none"/>
         </w:rPr>
       </w:pPr>
       <w:bookmarkStart w:id="1" w:name="_Hlk212795168"/>
       <w:bookmarkStart w:id="2" w:name="_Hlk218848146"/>
     </w:p>
-    <w:p>
+    <w:p ns2:paraId="5F4266A4" ns2:textId="1BFD44A9">
       <w:pPr>
         <w:pStyle w:val="Prrafodelista"/>
         <w:numPr>
@@ -931,7 +931,7 @@
         <w:rPr>
           <w:rFonts w:ascii="Arial Narrow" w:eastAsia="Arial Narrow" w:hAnsi="Arial Narrow" w:cs="Arial Narrow"/>
           <w:kern w:val="0"/>
-          <w14:ligatures w14:val="none"/>
+          <ns2:ligatures ns2:val="none"/>
         </w:rPr>
       </w:pPr>
       <w:bookmarkStart w:id="3" w:name="_Hlk140755208"/>
@@ -943,7 +943,7 @@
           <w:color w:val="000000"/>
           <w:kern w:val="0"/>
           <w:lang w:eastAsia="es-PE"/>
-          <w14:ligatures w14:val="none"/>
+          <ns2:ligatures ns2:val="none"/>
         </w:rPr>
         <w:t>La Secretaría Técnica de la Comisión de Protección al Consumidor 1 (en adelante, la Secretaría Técnica), en ejercicio de sus facultades</w:t>
       </w:r>
@@ -956,7 +956,7 @@
           <w:rFonts w:ascii="Arial Narrow" w:eastAsia="Arial Narrow" w:hAnsi="Arial Narrow" w:cs="Arial Narrow"/>
           <w:kern w:val="0"/>
           <w:vertAlign w:val="superscript"/>
-          <w14:ligatures w14:val="none"/>
+          <ns2:ligatures ns2:val="none"/>
         </w:rPr>
         <w:footnoteReference w:id="3"/>
       </w:r>
@@ -966,7 +966,7 @@
           <w:color w:val="000000"/>
           <w:kern w:val="0"/>
           <w:lang w:eastAsia="es-PE"/>
-          <w14:ligatures w14:val="none"/>
+          <ns2:ligatures ns2:val="none"/>
         </w:rPr>
         <w:t xml:space="preserve">, </w:t>
       </w:r>
@@ -976,7 +976,7 @@
           <w:color w:val="000000"/>
           <w:kern w:val="0"/>
           <w:lang w:eastAsia="es-PE"/>
-          <w14:ligatures w14:val="none"/>
+          <ns2:ligatures ns2:val="none"/>
         </w:rPr>
         <w:t xml:space="preserve">considera </w:t>
       </w:r>
@@ -984,7 +984,7 @@
         <w:rPr>
           <w:rFonts w:ascii="Arial Narrow" w:eastAsia="Arial Narrow" w:hAnsi="Arial Narrow" w:cs="Arial Narrow"/>
           <w:kern w:val="0"/>
-          <w14:ligatures w14:val="none"/>
+          <ns2:ligatures ns2:val="none"/>
         </w:rPr>
         <w:t xml:space="preserve">que el hecho denunciado, </w:t>
       </w:r>
@@ -993,7 +993,7 @@
         <w:rPr>
           <w:rFonts w:ascii="Arial Narrow" w:eastAsia="Arial Narrow" w:hAnsi="Arial Narrow" w:cs="Arial Narrow"/>
           <w:kern w:val="0"/>
-          <w14:ligatures w14:val="none"/>
+          <ns2:ligatures ns2:val="none"/>
         </w:rPr>
         <w:t xml:space="preserve">consistente en que </w:t>
       </w:r>
@@ -1004,7 +1004,7 @@
           <w:kern w:val="0"/>
           <w:shd w:val="clear" w:color="auto" w:fill="FFFFFF"/>
           <w:lang w:eastAsia="es-PE"/>
-          <w14:ligatures w14:val="none"/>
+          <ns2:ligatures ns2:val="none"/>
         </w:rPr>
         <w:lastRenderedPageBreak/>
         <w:t xml:space="preserve">Pacífico Compañía de Seguros y Reaseguros S.A. </w:t>
@@ -1017,7 +1017,7 @@
           <w:kern w:val="0"/>
           <w:shd w:val="clear" w:color="auto" w:fill="FFFFFF"/>
           <w:lang w:eastAsia="es-PE"/>
-          <w14:ligatures w14:val="none"/>
+          <ns2:ligatures ns2:val="none"/>
         </w:rPr>
         <w:t>habría condicionado la activación del Seguro de Protección de Tarjeta BCP  1000001429 a que la denunciante se sometiera a una prueba poligráfica, pese a que dicho requisito no fue informado al momento de la contratación y le habría generado una afectación a su estado emocional</w:t>
       </w:r>
@@ -1027,7 +1027,7 @@
         <w:rPr>
           <w:rFonts w:ascii="Arial Narrow" w:eastAsia="Arial Narrow" w:hAnsi="Arial Narrow" w:cs="Arial Narrow"/>
           <w:kern w:val="0"/>
-          <w14:ligatures w14:val="none"/>
+          <ns2:ligatures ns2:val="none"/>
         </w:rPr>
         <w:t>; involucraría una presunta afectación a sus expectativas, quien no habría encontrado una correspondencia entre lo que esperaba recibir de parte del proveedor y lo que realmente recibió. Por consiguiente, corresponde calificar el hecho materia de denuncia como una presunta infracción al deber de idoneidad, tipificado en los artículos 18 y 19 del Código</w:t>
       </w:r>
@@ -1039,7 +1039,7 @@
           <w:rFonts w:ascii="Arial Narrow" w:eastAsia="Arial Narrow" w:hAnsi="Arial Narrow" w:cs="Arial"/>
           <w:kern w:val="0"/>
           <w:vertAlign w:val="superscript"/>
-          <w14:ligatures w14:val="none"/>
+          <ns2:ligatures ns2:val="none"/>
         </w:rPr>
         <w:footnoteReference w:id="4"/>
       </w:r>
@@ -1048,13 +1048,13 @@
         <w:rPr>
           <w:rFonts w:ascii="Arial Narrow" w:eastAsia="Arial Narrow" w:hAnsi="Arial Narrow" w:cs="Arial Narrow"/>
           <w:kern w:val="0"/>
-          <w14:ligatures w14:val="none"/>
+          <ns2:ligatures ns2:val="none"/>
         </w:rPr>
         <w:t>.</w:t>
       </w:r>
       <w:bookmarkEnd w:id="9"/>
     </w:p>
-    <w:p>
+    <w:p ns2:paraId="116891C0" ns2:textId="77777777">
       <w:pPr>
         <w:pStyle w:val="Prrafodelista"/>
         <w:spacing w:after="0" w:line="240" w:lineRule="auto"/>
@@ -1063,11 +1063,11 @@
         <w:rPr>
           <w:rFonts w:ascii="Arial Narrow" w:eastAsia="Arial Narrow" w:hAnsi="Arial Narrow" w:cs="Arial Narrow"/>
           <w:kern w:val="0"/>
-          <w14:ligatures w14:val="none"/>
-        </w:rPr>
-      </w:pPr>
-    </w:p>
-    <w:p>
+          <ns2:ligatures ns2:val="none"/>
+        </w:rPr>
+      </w:pPr>
+    </w:p>
+    <w:p ns2:paraId="73AC2300" ns2:textId="0C37930E">
       <w:pPr>
         <w:pStyle w:val="Prrafodelista"/>
         <w:numPr>
@@ -1080,7 +1080,7 @@
         <w:rPr>
           <w:rFonts w:ascii="Arial Narrow" w:eastAsia="Arial Narrow" w:hAnsi="Arial Narrow" w:cs="Arial Narrow"/>
           <w:kern w:val="0"/>
-          <w14:ligatures w14:val="none"/>
+          <ns2:ligatures ns2:val="none"/>
         </w:rPr>
       </w:pPr>
       <w:bookmarkStart w:id="11" w:name="_Hlk213150180"/>
@@ -1088,7 +1088,7 @@
         <w:rPr>
           <w:rFonts w:ascii="Arial Narrow" w:eastAsia="Arial Narrow" w:hAnsi="Arial Narrow" w:cs="Arial Narrow"/>
           <w:kern w:val="0"/>
-          <w14:ligatures w14:val="none"/>
+          <ns2:ligatures ns2:val="none"/>
         </w:rPr>
         <w:t xml:space="preserve">Así también, la Secretaría Técnica, en ejercicio de sus facultades, </w:t>
       </w:r>
@@ -1098,7 +1098,7 @@
           <w:color w:val="000000"/>
           <w:kern w:val="0"/>
           <w:lang w:eastAsia="es-PE"/>
-          <w14:ligatures w14:val="none"/>
+          <ns2:ligatures ns2:val="none"/>
         </w:rPr>
         <w:t xml:space="preserve">considera </w:t>
       </w:r>
@@ -1106,7 +1106,7 @@
         <w:rPr>
           <w:rFonts w:ascii="Arial Narrow" w:eastAsia="Arial Narrow" w:hAnsi="Arial Narrow" w:cs="Arial Narrow"/>
           <w:kern w:val="0"/>
-          <w14:ligatures w14:val="none"/>
+          <ns2:ligatures ns2:val="none"/>
         </w:rPr>
         <w:t>que el hecho denunciado, consistente en que Pacífico Compañía d</w:t>
       </w:r>
@@ -1115,7 +1115,7 @@
         <w:rPr>
           <w:rFonts w:ascii="Arial Narrow" w:eastAsia="Arial Narrow" w:hAnsi="Arial Narrow" w:cs="Arial Narrow"/>
           <w:kern w:val="0"/>
-          <w14:ligatures w14:val="none"/>
+          <ns2:ligatures ns2:val="none"/>
         </w:rPr>
         <w:t>e Seguros y Reaseguros S.A. negado injustificadamente la cobertura del Seguro de Protección de Tarjeta BCP – Póliza  1000001429 a la denunciante por el siniestro del 28 de marzo de 2025</w:t>
       </w:r>
@@ -1123,7 +1123,7 @@
         <w:rPr>
           <w:rFonts w:ascii="Arial Narrow" w:eastAsia="Arial Narrow" w:hAnsi="Arial Narrow" w:cs="Arial Narrow"/>
           <w:kern w:val="0"/>
-          <w14:ligatures w14:val="none"/>
+          <ns2:ligatures ns2:val="none"/>
         </w:rPr>
         <w:t>.</w:t>
       </w:r>
@@ -1131,7 +1131,7 @@
         <w:rPr>
           <w:rFonts w:ascii="Arial Narrow" w:eastAsia="Arial Narrow" w:hAnsi="Arial Narrow" w:cs="Arial Narrow"/>
           <w:kern w:val="0"/>
-          <w14:ligatures w14:val="none"/>
+          <ns2:ligatures ns2:val="none"/>
         </w:rPr>
         <w:t xml:space="preserve"> </w:t>
       </w:r>
@@ -1142,7 +1142,7 @@
           <w:color w:val="000000"/>
           <w:kern w:val="0"/>
           <w:lang w:eastAsia="es-PE"/>
-          <w14:ligatures w14:val="none"/>
+          <ns2:ligatures ns2:val="none"/>
         </w:rPr>
         <w:t>Por consiguiente, corresponde calificar el hecho materia de denuncia como una presunta infracción al deber de protección contra los métodos comerciales</w:t>
       </w:r>
@@ -1153,7 +1153,7 @@
           <w:color w:val="000000"/>
           <w:kern w:val="0"/>
           <w:lang w:eastAsia="es-PE"/>
-          <w14:ligatures w14:val="none"/>
+          <ns2:ligatures ns2:val="none"/>
         </w:rPr>
         <w:t xml:space="preserve"> coercitivos</w:t>
       </w:r>
@@ -1164,7 +1164,7 @@
           <w:color w:val="000000"/>
           <w:kern w:val="0"/>
           <w:lang w:eastAsia="es-PE"/>
-          <w14:ligatures w14:val="none"/>
+          <ns2:ligatures ns2:val="none"/>
         </w:rPr>
         <w:t xml:space="preserve">, tipificado en </w:t>
       </w:r>
@@ -1175,7 +1175,7 @@
           <w:kern w:val="0"/>
           <w:shd w:val="clear" w:color="auto" w:fill="FFFFFF"/>
           <w:lang w:eastAsia="es-PE"/>
-          <w14:ligatures w14:val="none"/>
+          <ns2:ligatures ns2:val="none"/>
         </w:rPr>
         <w:t xml:space="preserve">literal g) del artículo 56 </w:t>
       </w:r>
@@ -1186,7 +1186,7 @@
           <w:color w:val="000000"/>
           <w:kern w:val="0"/>
           <w:lang w:eastAsia="es-PE"/>
-          <w14:ligatures w14:val="none"/>
+          <ns2:ligatures ns2:val="none"/>
         </w:rPr>
         <w:t>del Código</w:t>
       </w:r>
@@ -1205,24 +1205,24 @@
           <w:color w:val="000000"/>
           <w:kern w:val="0"/>
           <w:lang w:eastAsia="es-PE"/>
-          <w14:ligatures w14:val="none"/>
+          <ns2:ligatures ns2:val="none"/>
         </w:rPr>
         <w:t xml:space="preserve">.  </w:t>
       </w:r>
     </w:p>
     <w:bookmarkEnd w:id="1"/>
-    <w:p>
-      <w:pPr>
-        <w:spacing w:after="0" w:line="240" w:lineRule="auto"/>
-        <w:jc w:val="both"/>
-        <w:rPr>
-          <w:rFonts w:ascii="Arial Narrow" w:eastAsia="Arial Narrow" w:hAnsi="Arial Narrow" w:cs="Arial Narrow"/>
-          <w:kern w:val="0"/>
-          <w14:ligatures w14:val="none"/>
-        </w:rPr>
-      </w:pPr>
-    </w:p>
-    <w:p>
+    <w:p ns2:paraId="2DC7B64E" ns2:textId="77777777">
+      <w:pPr>
+        <w:spacing w:after="0" w:line="240" w:lineRule="auto"/>
+        <w:jc w:val="both"/>
+        <w:rPr>
+          <w:rFonts w:ascii="Arial Narrow" w:eastAsia="Arial Narrow" w:hAnsi="Arial Narrow" w:cs="Arial Narrow"/>
+          <w:kern w:val="0"/>
+          <ns2:ligatures ns2:val="none"/>
+        </w:rPr>
+      </w:pPr>
+    </w:p>
+    <w:p ns2:paraId="61A99930" ns2:textId="436D73FF">
       <w:pPr>
         <w:pStyle w:val="Prrafodelista"/>
         <w:numPr>
@@ -1235,14 +1235,14 @@
         <w:rPr>
           <w:rFonts w:ascii="Arial Narrow" w:eastAsia="Arial Narrow" w:hAnsi="Arial Narrow" w:cs="Arial Narrow"/>
           <w:kern w:val="0"/>
-          <w14:ligatures w14:val="none"/>
-        </w:rPr>
-      </w:pPr>
-      <w:r>
-        <w:rPr>
-          <w:rFonts w:ascii="Arial Narrow" w:eastAsia="Arial Narrow" w:hAnsi="Arial Narrow" w:cs="Arial Narrow"/>
-          <w:kern w:val="0"/>
-          <w14:ligatures w14:val="none"/>
+          <ns2:ligatures ns2:val="none"/>
+        </w:rPr>
+      </w:pPr>
+      <w:r>
+        <w:rPr>
+          <w:rFonts w:ascii="Arial Narrow" w:eastAsia="Arial Narrow" w:hAnsi="Arial Narrow" w:cs="Arial Narrow"/>
+          <w:kern w:val="0"/>
+          <ns2:ligatures ns2:val="none"/>
         </w:rPr>
         <w:t xml:space="preserve">Asimismo, </w:t>
       </w:r>
@@ -1252,7 +1252,7 @@
           <w:color w:val="000000"/>
           <w:kern w:val="0"/>
           <w:lang w:eastAsia="es-PE"/>
-          <w14:ligatures w14:val="none"/>
+          <ns2:ligatures ns2:val="none"/>
         </w:rPr>
         <w:t xml:space="preserve">la Secretaría Técnica, en ejercicio de sus facultades, considera </w:t>
       </w:r>
@@ -1260,7 +1260,7 @@
         <w:rPr>
           <w:rFonts w:ascii="Arial Narrow" w:eastAsia="Arial Narrow" w:hAnsi="Arial Narrow" w:cs="Arial"/>
           <w:kern w:val="0"/>
-          <w14:ligatures w14:val="none"/>
+          <ns2:ligatures ns2:val="none"/>
         </w:rPr>
         <w:t xml:space="preserve">que el hecho denunciado, consistente en que </w:t>
       </w:r>
@@ -1268,7 +1268,7 @@
         <w:rPr>
           <w:rFonts w:ascii="Arial Narrow" w:eastAsia="Arial Narrow" w:hAnsi="Arial Narrow" w:cs="Arial Narrow"/>
           <w:kern w:val="0"/>
-          <w14:ligatures w14:val="none"/>
+          <ns2:ligatures ns2:val="none"/>
         </w:rPr>
         <w:t>el Banco de Crédito del Perú S.A. y Pacífico Compañía de Seguros y Reaseguros S.A. no habrían cumplido oportunamente con entregar a la denunciante los documentos contractuales del Seguro de Protección de Tarjeta BCP  1000001429</w:t>
       </w:r>
@@ -1276,7 +1276,7 @@
         <w:rPr>
           <w:rFonts w:ascii="Arial Narrow" w:eastAsia="Arial Narrow" w:hAnsi="Arial Narrow" w:cs="Arial"/>
           <w:kern w:val="0"/>
-          <w14:ligatures w14:val="none"/>
+          <ns2:ligatures ns2:val="none"/>
         </w:rPr>
         <w:t xml:space="preserve">. </w:t>
       </w:r>
@@ -1285,7 +1285,7 @@
         <w:rPr>
           <w:rFonts w:ascii="Arial Narrow" w:eastAsia="Arial Narrow" w:hAnsi="Arial Narrow" w:cs="Arial"/>
           <w:kern w:val="0"/>
-          <w14:ligatures w14:val="none"/>
+          <ns2:ligatures ns2:val="none"/>
         </w:rPr>
         <w:t>Por consiguiente, corresponde calificar el hecho materia de denuncia como una presunta infracción al deber de entregar a los usuarios copia de los contratos y demás documentación relacionada con dichos actos jurídicos, tipificado en el literal e) del artículo 47 del Código</w:t>
       </w:r>
@@ -1295,7 +1295,7 @@
           <w:rFonts w:ascii="Arial Narrow" w:eastAsia="Arial Narrow" w:hAnsi="Arial Narrow" w:cs="Arial"/>
           <w:kern w:val="0"/>
           <w:vertAlign w:val="superscript"/>
-          <w14:ligatures w14:val="none"/>
+          <ns2:ligatures ns2:val="none"/>
         </w:rPr>
         <w:footnoteReference w:id="6"/>
       </w:r>
@@ -1303,25 +1303,25 @@
         <w:rPr>
           <w:rFonts w:ascii="Arial Narrow" w:eastAsia="Arial Narrow" w:hAnsi="Arial Narrow" w:cs="Arial"/>
           <w:kern w:val="0"/>
-          <w14:ligatures w14:val="none"/>
+          <ns2:ligatures ns2:val="none"/>
         </w:rPr>
         <w:t>.</w:t>
       </w:r>
       <w:bookmarkStart w:id="13" w:name="_Hlk212534267"/>
       <w:bookmarkEnd w:id="12"/>
     </w:p>
-    <w:p>
-      <w:pPr>
-        <w:spacing w:after="0" w:line="240" w:lineRule="auto"/>
-        <w:jc w:val="both"/>
-        <w:rPr>
-          <w:rFonts w:ascii="Arial Narrow" w:eastAsia="Arial Narrow" w:hAnsi="Arial Narrow" w:cs="Arial Narrow"/>
-          <w:kern w:val="0"/>
-          <w14:ligatures w14:val="none"/>
-        </w:rPr>
-      </w:pPr>
-    </w:p>
-    <w:p>
+    <w:p ns2:paraId="4266B1E3" ns2:textId="77777777">
+      <w:pPr>
+        <w:spacing w:after="0" w:line="240" w:lineRule="auto"/>
+        <w:jc w:val="both"/>
+        <w:rPr>
+          <w:rFonts w:ascii="Arial Narrow" w:eastAsia="Arial Narrow" w:hAnsi="Arial Narrow" w:cs="Arial Narrow"/>
+          <w:kern w:val="0"/>
+          <ns2:ligatures ns2:val="none"/>
+        </w:rPr>
+      </w:pPr>
+    </w:p>
+    <w:p ns2:paraId="78C31712" ns2:textId="19F6D69F">
       <w:pPr>
         <w:pStyle w:val="Prrafodelista"/>
         <w:numPr>
@@ -1334,7 +1334,7 @@
         <w:rPr>
           <w:rFonts w:ascii="Arial Narrow" w:eastAsia="Arial Narrow" w:hAnsi="Arial Narrow" w:cs="Arial Narrow"/>
           <w:kern w:val="0"/>
-          <w14:ligatures w14:val="none"/>
+          <ns2:ligatures ns2:val="none"/>
         </w:rPr>
       </w:pPr>
       <w:bookmarkStart w:id="14" w:name="_Hlk214534552"/>
@@ -1345,7 +1345,7 @@
           <w:color w:val="000000"/>
           <w:kern w:val="0"/>
           <w:lang w:eastAsia="es-PE"/>
-          <w14:ligatures w14:val="none"/>
+          <ns2:ligatures ns2:val="none"/>
         </w:rPr>
         <w:t xml:space="preserve">Además, </w:t>
       </w:r>
@@ -1356,7 +1356,7 @@
           <w:color w:val="000000"/>
           <w:kern w:val="0"/>
           <w:lang w:eastAsia="es-PE"/>
-          <w14:ligatures w14:val="none"/>
+          <ns2:ligatures ns2:val="none"/>
         </w:rPr>
         <w:t xml:space="preserve">la Secretaría Técnica, en ejercicio de sus facultades, considera </w:t>
       </w:r>
@@ -1364,7 +1364,7 @@
         <w:rPr>
           <w:rFonts w:ascii="Arial Narrow" w:eastAsia="Arial Narrow" w:hAnsi="Arial Narrow" w:cs="Arial"/>
           <w:kern w:val="0"/>
-          <w14:ligatures w14:val="none"/>
+          <ns2:ligatures ns2:val="none"/>
         </w:rPr>
         <w:t xml:space="preserve">que el hecho denunciado, consistente en que </w:t>
       </w:r>
@@ -1372,7 +1372,7 @@
         <w:rPr>
           <w:rFonts w:ascii="Arial Narrow" w:eastAsia="Arial Narrow" w:hAnsi="Arial Narrow" w:cs="Arial Narrow"/>
           <w:kern w:val="0"/>
-          <w14:ligatures w14:val="none"/>
+          <ns2:ligatures ns2:val="none"/>
         </w:rPr>
         <w:t>los proveedores denunciados no habrían cumplido con informar a la denunciante que el Seguro Devolución Vida suscrito el 5 de setiembre de 2023 con Pacífico Compañía de Seguros y Reaseguros S.A. había sido transferido a Rímac Seguros y Reaseguros S.A</w:t>
       </w:r>
@@ -1383,7 +1383,7 @@
           <w:color w:val="000000"/>
           <w:kern w:val="0"/>
           <w:lang w:eastAsia="es-PE"/>
-          <w14:ligatures w14:val="none"/>
+          <ns2:ligatures ns2:val="none"/>
         </w:rPr>
         <w:t xml:space="preserve">. </w:t>
       </w:r>
@@ -1396,7 +1396,7 @@
           <w:color w:val="000000"/>
           <w:kern w:val="0"/>
           <w:lang w:eastAsia="es-PE"/>
-          <w14:ligatures w14:val="none"/>
+          <ns2:ligatures ns2:val="none"/>
         </w:rPr>
         <w:t xml:space="preserve">Por consiguiente, corresponde calificar el hecho materia de denuncia como una presunta infracción al deber de información, tipificado en el </w:t>
       </w:r>
@@ -1408,7 +1408,7 @@
           <w:color w:val="000000"/>
           <w:kern w:val="0"/>
           <w:lang w:eastAsia="es-PE"/>
-          <w14:ligatures w14:val="none"/>
+          <ns2:ligatures ns2:val="none"/>
         </w:rPr>
         <w:t xml:space="preserve">artículo 1, numeral 1, literal b) </w:t>
       </w:r>
@@ -1420,7 +1420,7 @@
           <w:color w:val="000000"/>
           <w:kern w:val="0"/>
           <w:lang w:eastAsia="es-PE"/>
-          <w14:ligatures w14:val="none"/>
+          <ns2:ligatures ns2:val="none"/>
         </w:rPr>
         <w:t>y al artículo 2 del Código</w:t>
       </w:r>
@@ -1435,7 +1435,7 @@
           <w:kern w:val="0"/>
           <w:vertAlign w:val="superscript"/>
           <w:lang w:eastAsia="es-PE"/>
-          <w14:ligatures w14:val="none"/>
+          <ns2:ligatures ns2:val="none"/>
         </w:rPr>
         <w:footnoteReference w:id="7"/>
       </w:r>
@@ -1447,7 +1447,7 @@
           <w:color w:val="000000"/>
           <w:kern w:val="0"/>
           <w:lang w:eastAsia="es-PE"/>
-          <w14:ligatures w14:val="none"/>
+          <ns2:ligatures ns2:val="none"/>
         </w:rPr>
         <w:t xml:space="preserve">.    </w:t>
       </w:r>
@@ -1456,18 +1456,18 @@
     </w:p>
     <w:bookmarkEnd w:id="13"/>
     <w:bookmarkEnd w:id="14"/>
-    <w:p>
+    <w:p ns2:paraId="7A2CF596" ns2:textId="77777777">
       <w:pPr>
         <w:pStyle w:val="Prrafodelista"/>
         <w:spacing w:after="0" w:line="240" w:lineRule="auto"/>
         <w:rPr>
           <w:rFonts w:ascii="Arial Narrow" w:eastAsia="Arial Narrow" w:hAnsi="Arial Narrow" w:cs="Arial Narrow"/>
           <w:kern w:val="0"/>
-          <w14:ligatures w14:val="none"/>
-        </w:rPr>
-      </w:pPr>
-    </w:p>
-    <w:p>
+          <ns2:ligatures ns2:val="none"/>
+        </w:rPr>
+      </w:pPr>
+    </w:p>
+    <w:p ns2:paraId="07559B21" ns2:textId="2BB84C44">
       <w:pPr>
         <w:pStyle w:val="Prrafodelista"/>
         <w:numPr>
@@ -1480,7 +1480,7 @@
         <w:rPr>
           <w:rFonts w:ascii="Arial Narrow" w:eastAsia="Arial Narrow" w:hAnsi="Arial Narrow" w:cs="Arial Narrow"/>
           <w:kern w:val="0"/>
-          <w14:ligatures w14:val="none"/>
+          <ns2:ligatures ns2:val="none"/>
         </w:rPr>
       </w:pPr>
       <w:bookmarkStart w:id="21" w:name="_Hlk214962902"/>
@@ -1489,7 +1489,7 @@
         <w:rPr>
           <w:rFonts w:ascii="Arial Narrow" w:eastAsia="Arial Narrow" w:hAnsi="Arial Narrow" w:cs="Arial Narrow"/>
           <w:kern w:val="0"/>
-          <w14:ligatures w14:val="none"/>
+          <ns2:ligatures ns2:val="none"/>
         </w:rPr>
         <w:t xml:space="preserve">Asimismo, la Secretaría Técnica, en ejercicio de sus facultades, considera que el hecho denunciado, consistente en que </w:t>
       </w:r>
@@ -1497,7 +1497,7 @@
         <w:rPr>
           <w:rFonts w:ascii="Arial Narrow" w:eastAsia="Arial Narrow" w:hAnsi="Arial Narrow" w:cs="Arial"/>
           <w:kern w:val="0"/>
-          <w14:ligatures w14:val="none"/>
+          <ns2:ligatures ns2:val="none"/>
         </w:rPr>
         <w:t>el proveedor denunciado habría brindado una respuesta inadecuada al reclamo presentado por el denunciante el 12 de agosto de 2024. Por consiguiente, corresponde calificar el hecho materia de denuncia como una presunta infracción al numeral 88.1 del artículo 88 del Código</w:t>
       </w:r>
@@ -1511,7 +1511,7 @@
           <w:kern w:val="0"/>
           <w:vertAlign w:val="superscript"/>
           <w:lang w:eastAsia="es-PE"/>
-          <w14:ligatures w14:val="none"/>
+          <ns2:ligatures ns2:val="none"/>
         </w:rPr>
         <w:footnoteReference w:id="8"/>
       </w:r>
@@ -1522,7 +1522,7 @@
           <w:color w:val="000000"/>
           <w:kern w:val="0"/>
           <w:lang w:eastAsia="es-PE"/>
-          <w14:ligatures w14:val="none"/>
+          <ns2:ligatures ns2:val="none"/>
         </w:rPr>
         <w:t>.</w:t>
       </w:r>
@@ -1531,7 +1531,7 @@
     <w:bookmarkEnd w:id="7"/>
     <w:bookmarkEnd w:id="15"/>
     <w:bookmarkEnd w:id="22"/>
-    <w:p>
+    <w:p ns2:paraId="432038D6" ns2:textId="0A9F6D75">
       <w:pPr>
         <w:spacing w:after="0" w:line="240" w:lineRule="auto"/>
         <w:jc w:val="both"/>
@@ -1539,12 +1539,12 @@
           <w:rFonts w:ascii="Arial Narrow" w:eastAsia="Calibri" w:hAnsi="Arial Narrow" w:cs="Arial Narrow"/>
           <w:kern w:val="0"/>
           <w:lang w:eastAsia="es-PE"/>
-          <w14:ligatures w14:val="none"/>
+          <ns2:ligatures ns2:val="none"/>
         </w:rPr>
       </w:pPr>
     </w:p>
     <w:bookmarkEnd w:id="2"/>
-    <w:p>
+    <w:p ns2:paraId="463134E5" ns2:textId="77777777">
       <w:pPr>
         <w:pStyle w:val="Prrafodelista"/>
         <w:numPr>
@@ -1558,7 +1558,7 @@
           <w:rFonts w:ascii="Arial Narrow" w:eastAsia="Calibri" w:hAnsi="Arial Narrow" w:cs="Arial Narrow"/>
           <w:kern w:val="0"/>
           <w:lang w:eastAsia="es-PE"/>
-          <w14:ligatures w14:val="none"/>
+          <ns2:ligatures ns2:val="none"/>
         </w:rPr>
       </w:pPr>
       <w:r>
@@ -1567,7 +1567,7 @@
           <w:color w:val="000000"/>
           <w:kern w:val="0"/>
           <w:lang w:eastAsia="es-PE"/>
-          <w14:ligatures w14:val="none"/>
+          <ns2:ligatures ns2:val="none"/>
         </w:rPr>
         <w:t>En tanto la denuncia reúne los requisitos establecidos por la norma citada, corresponde admitirla a trámite</w:t>
       </w:r>
@@ -1577,7 +1577,7 @@
           <w:rFonts w:ascii="Arial Narrow" w:eastAsia="Arial Narrow" w:hAnsi="Arial Narrow" w:cs="Arial Narrow"/>
           <w:kern w:val="0"/>
           <w:vertAlign w:val="superscript"/>
-          <w14:ligatures w14:val="none"/>
+          <ns2:ligatures ns2:val="none"/>
         </w:rPr>
         <w:footnoteReference w:id="9"/>
       </w:r>
@@ -1587,13 +1587,13 @@
           <w:color w:val="000000"/>
           <w:kern w:val="0"/>
           <w:lang w:eastAsia="es-PE"/>
-          <w14:ligatures w14:val="none"/>
+          <ns2:ligatures ns2:val="none"/>
         </w:rPr>
         <w:t>.</w:t>
       </w:r>
       <w:bookmarkStart w:id="23" w:name="_Hlk214963039"/>
     </w:p>
-    <w:p>
+    <w:p ns2:paraId="68C71625" ns2:textId="77777777">
       <w:pPr>
         <w:spacing w:after="0" w:line="240" w:lineRule="auto"/>
         <w:ind w:left="567"/>
@@ -1604,12 +1604,12 @@
           <w:color w:val="000000"/>
           <w:kern w:val="0"/>
           <w:lang w:eastAsia="es-PE"/>
-          <w14:ligatures w14:val="none"/>
+          <ns2:ligatures ns2:val="none"/>
         </w:rPr>
       </w:pPr>
       <w:bookmarkStart w:id="24" w:name="_Hlk214963071"/>
     </w:p>
-    <w:p>
+    <w:p ns2:paraId="38A98B4B" ns2:textId="77777777">
       <w:pPr>
         <w:pStyle w:val="Prrafodelista"/>
         <w:numPr>
@@ -1629,22 +1629,22 @@
           <w:color w:val="000000"/>
           <w:kern w:val="0"/>
           <w:lang w:eastAsia="es-PE"/>
-          <w14:ligatures w14:val="none"/>
-        </w:rPr>
-      </w:pPr>
-      <w:r>
-        <w:rPr>
-          <w:rFonts w:ascii="Arial Narrow" w:eastAsia="Arial Narrow" w:hAnsi="Arial Narrow" w:cs="Arial Narrow"/>
-          <w:b/>
-          <w:color w:val="000000"/>
-          <w:kern w:val="0"/>
-          <w:lang w:eastAsia="es-PE"/>
-          <w14:ligatures w14:val="none"/>
+          <ns2:ligatures ns2:val="none"/>
+        </w:rPr>
+      </w:pPr>
+      <w:r>
+        <w:rPr>
+          <w:rFonts w:ascii="Arial Narrow" w:eastAsia="Arial Narrow" w:hAnsi="Arial Narrow" w:cs="Arial Narrow"/>
+          <w:b/>
+          <w:color w:val="000000"/>
+          <w:kern w:val="0"/>
+          <w:lang w:eastAsia="es-PE"/>
+          <ns2:ligatures ns2:val="none"/>
         </w:rPr>
         <w:t>REQUERIMIENTO DE INFORMACIÓN</w:t>
       </w:r>
     </w:p>
-    <w:p>
+    <w:p ns2:paraId="5B518DC4" ns2:textId="77777777">
       <w:pPr>
         <w:spacing w:after="0" w:line="240" w:lineRule="auto"/>
         <w:jc w:val="both"/>
@@ -1653,11 +1653,11 @@
           <w:color w:val="000000"/>
           <w:kern w:val="0"/>
           <w:lang w:val="es-ES" w:eastAsia="es-ES"/>
-          <w14:ligatures w14:val="none"/>
-        </w:rPr>
-      </w:pPr>
-    </w:p>
-    <w:p>
+          <ns2:ligatures ns2:val="none"/>
+        </w:rPr>
+      </w:pPr>
+    </w:p>
+    <w:p ns2:paraId="62B88A04" ns2:textId="1C43ABBA">
       <w:pPr>
         <w:pStyle w:val="Prrafodelista"/>
         <w:numPr>
@@ -1672,7 +1672,7 @@
           <w:color w:val="000000"/>
           <w:kern w:val="0"/>
           <w:lang w:val="es-ES" w:eastAsia="es-ES"/>
-          <w14:ligatures w14:val="none"/>
+          <ns2:ligatures ns2:val="none"/>
         </w:rPr>
       </w:pPr>
       <w:r>
@@ -1681,7 +1681,7 @@
           <w:color w:val="000000"/>
           <w:kern w:val="0"/>
           <w:lang w:val="es-ES" w:eastAsia="es-ES"/>
-          <w14:ligatures w14:val="none"/>
+          <ns2:ligatures ns2:val="none"/>
         </w:rPr>
         <w:lastRenderedPageBreak/>
         <w:t xml:space="preserve">A efectos de tener mayores elementos </w:t>
@@ -1693,7 +1693,7 @@
           <w:color w:val="000000"/>
           <w:kern w:val="0"/>
           <w:lang w:val="es-ES" w:eastAsia="es-ES"/>
-          <w14:ligatures w14:val="none"/>
+          <ns2:ligatures ns2:val="none"/>
         </w:rPr>
         <w:t xml:space="preserve">que sirvan para la resolución definitiva del presente caso, la Secretaría Técnica, en ejercicio de las facultades que la ley le confiere, conviene </w:t>
       </w:r>
@@ -1703,7 +1703,7 @@
           <w:color w:val="000000"/>
           <w:kern w:val="0"/>
           <w:lang w:val="es-ES" w:eastAsia="es-ES"/>
-          <w14:ligatures w14:val="none"/>
+          <ns2:ligatures ns2:val="none"/>
         </w:rPr>
         <w:t>requerir al proveedor denunciado que</w:t>
       </w:r>
@@ -1713,7 +1713,7 @@
           <w:color w:val="000000"/>
           <w:kern w:val="0"/>
           <w:lang w:val="es-ES" w:eastAsia="es-ES"/>
-          <w14:ligatures w14:val="none"/>
+          <ns2:ligatures ns2:val="none"/>
         </w:rPr>
         <w:t xml:space="preserve">, en un plazo no mayor de cinco (5) días hábiles contado a partir del día siguiente de la notificación de la presente resolución, cumpla con lo siguiente: </w:t>
       </w:r>
@@ -1723,7 +1723,7 @@
           <w:color w:val="000000"/>
           <w:kern w:val="0"/>
           <w:lang w:val="es-ES" w:eastAsia="es-ES"/>
-          <w14:ligatures w14:val="none"/>
+          <ns2:ligatures ns2:val="none"/>
         </w:rPr>
         <w:t xml:space="preserve">(i) presentar una copia completa, legible y debidamente suscrita de la Póliza  2101-1031084 del Seguro Vehicular, </w:t>
       </w:r>
@@ -1734,7 +1734,7 @@
           <w:color w:val="000000"/>
           <w:kern w:val="0"/>
           <w:lang w:val="es-ES" w:eastAsia="es-ES"/>
-          <w14:ligatures w14:val="none"/>
+          <ns2:ligatures ns2:val="none"/>
         </w:rPr>
         <w:t>así como el cargo de remisión de la póliza</w:t>
       </w:r>
@@ -1745,7 +1745,7 @@
           <w:color w:val="000000"/>
           <w:kern w:val="0"/>
           <w:lang w:val="es-ES" w:eastAsia="es-ES"/>
-          <w14:ligatures w14:val="none"/>
+          <ns2:ligatures ns2:val="none"/>
         </w:rPr>
         <w:t xml:space="preserve">; (ii) presentar los medios probatorios que acrediten el valor a indemnizar del vehículo asegurado de acuerdo a los términos y condiciones de la póliza; y, (iii) presentar todas las comunicaciones cursadas </w:t>
       </w:r>
@@ -1755,7 +1755,7 @@
           <w:color w:val="000000"/>
           <w:kern w:val="0"/>
           <w:lang w:val="es-ES" w:eastAsia="es-ES"/>
-          <w14:ligatures w14:val="none"/>
+          <ns2:ligatures ns2:val="none"/>
         </w:rPr>
         <w:t>con la parte denunciante</w:t>
       </w:r>
@@ -1765,7 +1765,7 @@
           <w:color w:val="000000"/>
           <w:kern w:val="0"/>
           <w:lang w:val="es-ES" w:eastAsia="es-ES"/>
-          <w14:ligatures w14:val="none"/>
+          <ns2:ligatures ns2:val="none"/>
         </w:rPr>
         <w:t xml:space="preserve"> </w:t>
       </w:r>
@@ -1775,7 +1775,7 @@
           <w:color w:val="000000"/>
           <w:kern w:val="0"/>
           <w:lang w:val="es-ES" w:eastAsia="es-ES"/>
-          <w14:ligatures w14:val="none"/>
+          <ns2:ligatures ns2:val="none"/>
         </w:rPr>
         <w:t xml:space="preserve">en virtud </w:t>
       </w:r>
@@ -1785,7 +1785,7 @@
           <w:color w:val="000000"/>
           <w:kern w:val="0"/>
           <w:lang w:val="es-ES" w:eastAsia="es-ES"/>
-          <w14:ligatures w14:val="none"/>
+          <ns2:ligatures ns2:val="none"/>
         </w:rPr>
         <w:t xml:space="preserve">de los hechos materia </w:t>
       </w:r>
@@ -1795,7 +1795,7 @@
           <w:color w:val="000000"/>
           <w:kern w:val="0"/>
           <w:lang w:val="es-ES" w:eastAsia="es-ES"/>
-          <w14:ligatures w14:val="none"/>
+          <ns2:ligatures ns2:val="none"/>
         </w:rPr>
         <w:t>de denuncia</w:t>
       </w:r>
@@ -1805,7 +1805,7 @@
           <w:color w:val="000000"/>
           <w:kern w:val="0"/>
           <w:lang w:val="es-ES" w:eastAsia="es-ES"/>
-          <w14:ligatures w14:val="none"/>
+          <ns2:ligatures ns2:val="none"/>
         </w:rPr>
         <w:t>.</w:t>
       </w:r>
@@ -1815,13 +1815,13 @@
           <w:color w:val="000000"/>
           <w:kern w:val="0"/>
           <w:lang w:eastAsia="es-ES"/>
-          <w14:ligatures w14:val="none"/>
+          <ns2:ligatures ns2:val="none"/>
         </w:rPr>
         <w:t xml:space="preserve"> </w:t>
       </w:r>
     </w:p>
     <w:bookmarkEnd w:id="24"/>
-    <w:p>
+    <w:p ns2:paraId="5C93B848" ns2:textId="77777777">
       <w:pPr>
         <w:pStyle w:val="Prrafodelista"/>
         <w:spacing w:after="0" w:line="240" w:lineRule="auto"/>
@@ -1832,11 +1832,11 @@
           <w:color w:val="000000"/>
           <w:kern w:val="0"/>
           <w:lang w:val="es-ES" w:eastAsia="es-ES"/>
-          <w14:ligatures w14:val="none"/>
-        </w:rPr>
-      </w:pPr>
-    </w:p>
-    <w:p>
+          <ns2:ligatures ns2:val="none"/>
+        </w:rPr>
+      </w:pPr>
+    </w:p>
+    <w:p ns2:paraId="2A119386" ns2:textId="77777777">
       <w:pPr>
         <w:pStyle w:val="Prrafodelista"/>
         <w:numPr>
@@ -1856,36 +1856,36 @@
           <w:color w:val="000000"/>
           <w:kern w:val="0"/>
           <w:lang w:eastAsia="es-PE"/>
-          <w14:ligatures w14:val="none"/>
-        </w:rPr>
-      </w:pPr>
-      <w:r>
-        <w:rPr>
-          <w:rFonts w:ascii="Arial Narrow" w:eastAsia="Arial Narrow" w:hAnsi="Arial Narrow" w:cs="Arial Narrow"/>
-          <w:b/>
-          <w:color w:val="000000"/>
-          <w:kern w:val="0"/>
-          <w:lang w:eastAsia="es-PE"/>
-          <w14:ligatures w14:val="none"/>
+          <ns2:ligatures ns2:val="none"/>
+        </w:rPr>
+      </w:pPr>
+      <w:r>
+        <w:rPr>
+          <w:rFonts w:ascii="Arial Narrow" w:eastAsia="Arial Narrow" w:hAnsi="Arial Narrow" w:cs="Arial Narrow"/>
+          <w:b/>
+          <w:color w:val="000000"/>
+          <w:kern w:val="0"/>
+          <w:lang w:eastAsia="es-PE"/>
+          <ns2:ligatures ns2:val="none"/>
         </w:rPr>
         <w:t xml:space="preserve">RESOLUCIÓN DE LA SECRETARÍA TÉCNICA  </w:t>
       </w:r>
     </w:p>
-    <w:p>
-      <w:pPr>
-        <w:spacing w:after="0" w:line="240" w:lineRule="auto"/>
-        <w:jc w:val="both"/>
-        <w:rPr>
-          <w:rFonts w:ascii="Arial Narrow" w:eastAsia="Arial Narrow" w:hAnsi="Arial Narrow" w:cs="Arial Narrow"/>
-          <w:b/>
-          <w:color w:val="000000"/>
-          <w:kern w:val="0"/>
-          <w:lang w:eastAsia="es-PE"/>
-          <w14:ligatures w14:val="none"/>
-        </w:rPr>
-      </w:pPr>
-    </w:p>
-    <w:p>
+    <w:p ns2:paraId="7F554EB2" ns2:textId="77777777">
+      <w:pPr>
+        <w:spacing w:after="0" w:line="240" w:lineRule="auto"/>
+        <w:jc w:val="both"/>
+        <w:rPr>
+          <w:rFonts w:ascii="Arial Narrow" w:eastAsia="Arial Narrow" w:hAnsi="Arial Narrow" w:cs="Arial Narrow"/>
+          <w:b/>
+          <w:color w:val="000000"/>
+          <w:kern w:val="0"/>
+          <w:lang w:eastAsia="es-PE"/>
+          <ns2:ligatures ns2:val="none"/>
+        </w:rPr>
+      </w:pPr>
+    </w:p>
+    <w:p ns2:paraId="40BE44E6" ns2:textId="77777777">
       <w:pPr>
         <w:spacing w:after="0" w:line="240" w:lineRule="auto"/>
         <w:jc w:val="both"/>
@@ -1894,17 +1894,17 @@
           <w:color w:val="000000"/>
           <w:kern w:val="0"/>
           <w:lang w:eastAsia="es-PE"/>
-          <w14:ligatures w14:val="none"/>
-        </w:rPr>
-      </w:pPr>
-      <w:r>
-        <w:rPr>
-          <w:rFonts w:ascii="Arial Narrow" w:eastAsia="Arial Narrow" w:hAnsi="Arial Narrow" w:cs="Arial Narrow"/>
-          <w:b/>
-          <w:color w:val="000000"/>
-          <w:kern w:val="0"/>
-          <w:lang w:eastAsia="es-PE"/>
-          <w14:ligatures w14:val="none"/>
+          <ns2:ligatures ns2:val="none"/>
+        </w:rPr>
+      </w:pPr>
+      <w:r>
+        <w:rPr>
+          <w:rFonts w:ascii="Arial Narrow" w:eastAsia="Arial Narrow" w:hAnsi="Arial Narrow" w:cs="Arial Narrow"/>
+          <w:b/>
+          <w:color w:val="000000"/>
+          <w:kern w:val="0"/>
+          <w:lang w:eastAsia="es-PE"/>
+          <ns2:ligatures ns2:val="none"/>
         </w:rPr>
         <w:t xml:space="preserve">PRIMERO: </w:t>
       </w:r>
@@ -1915,7 +1915,7 @@
           <w:kern w:val="0"/>
           <w:shd w:val="clear" w:color="auto" w:fill="FFFFFF"/>
           <w:lang w:eastAsia="es-PE"/>
-          <w14:ligatures w14:val="none"/>
+          <ns2:ligatures ns2:val="none"/>
         </w:rPr>
         <w:t xml:space="preserve">admitir a trámite la denuncia del </w:t>
       </w:r>
@@ -1926,7 +1926,7 @@
           <w:kern w:val="0"/>
           <w:shd w:val="clear" w:color="auto" w:fill="FFFFFF"/>
           <w:lang w:eastAsia="es-PE"/>
-          <w14:ligatures w14:val="none"/>
+          <ns2:ligatures ns2:val="none"/>
         </w:rPr>
         <w:t xml:space="preserve">12 de enero de 2025 </w:t>
       </w:r>
@@ -1937,7 +1937,7 @@
           <w:kern w:val="0"/>
           <w:shd w:val="clear" w:color="auto" w:fill="FFFFFF"/>
           <w:lang w:eastAsia="es-PE"/>
-          <w14:ligatures w14:val="none"/>
+          <ns2:ligatures ns2:val="none"/>
         </w:rPr>
         <w:t xml:space="preserve">interpuesta </w:t>
       </w:r>
@@ -1948,7 +1948,7 @@
           <w:kern w:val="0"/>
           <w:shd w:val="clear" w:color="auto" w:fill="FFFFFF"/>
           <w:lang w:eastAsia="es-PE"/>
-          <w14:ligatures w14:val="none"/>
+          <ns2:ligatures ns2:val="none"/>
         </w:rPr>
         <w:t xml:space="preserve">por el señor Oswaldo Chamorro Cisterna </w:t>
       </w:r>
@@ -1959,7 +1959,7 @@
           <w:kern w:val="0"/>
           <w:shd w:val="clear" w:color="auto" w:fill="FFFFFF"/>
           <w:lang w:eastAsia="es-PE"/>
-          <w14:ligatures w14:val="none"/>
+          <ns2:ligatures ns2:val="none"/>
         </w:rPr>
         <w:t xml:space="preserve">contra </w:t>
       </w:r>
@@ -1970,7 +1970,7 @@
           <w:kern w:val="0"/>
           <w:shd w:val="clear" w:color="auto" w:fill="FFFFFF"/>
           <w:lang w:eastAsia="es-PE"/>
-          <w14:ligatures w14:val="none"/>
+          <ns2:ligatures ns2:val="none"/>
         </w:rPr>
         <w:t xml:space="preserve">Rímac Seguros y Reaseguros S.A., </w:t>
       </w:r>
@@ -1982,12 +1982,12 @@
           <w:kern w:val="0"/>
           <w:shd w:val="clear" w:color="auto" w:fill="FFFFFF"/>
           <w:lang w:eastAsia="es-PE"/>
-          <w14:ligatures w14:val="none"/>
+          <ns2:ligatures ns2:val="none"/>
         </w:rPr>
         <w:t>por lo siguiente:</w:t>
       </w:r>
     </w:p>
-    <w:p>
+    <w:p ns2:paraId="5E66126E" ns2:textId="77777777">
       <w:pPr>
         <w:spacing w:after="0" w:line="240" w:lineRule="auto"/>
         <w:jc w:val="both"/>
@@ -1996,11 +1996,11 @@
           <w:color w:val="000000"/>
           <w:kern w:val="0"/>
           <w:lang w:eastAsia="es-PE"/>
-          <w14:ligatures w14:val="none"/>
-        </w:rPr>
-      </w:pPr>
-    </w:p>
-    <w:p>
+          <ns2:ligatures ns2:val="none"/>
+        </w:rPr>
+      </w:pPr>
+    </w:p>
+    <w:p ns2:paraId="0CDDEEDD" ns2:textId="7CF54386">
       <w:pPr>
         <w:pStyle w:val="Prrafodelista"/>
         <w:numPr>
@@ -2018,7 +2018,7 @@
           <w:rFonts w:ascii="Arial Narrow" w:eastAsia="Calibri" w:hAnsi="Arial Narrow" w:cs="Arial Narrow"/>
           <w:kern w:val="0"/>
           <w:lang w:eastAsia="es-PE"/>
-          <w14:ligatures w14:val="none"/>
+          <ns2:ligatures ns2:val="none"/>
         </w:rPr>
       </w:pPr>
       <w:r>
@@ -2027,7 +2027,7 @@
           <w:color w:val="000000"/>
           <w:kern w:val="0"/>
           <w:lang w:eastAsia="es-PE"/>
-          <w14:ligatures w14:val="none"/>
+          <ns2:ligatures ns2:val="none"/>
         </w:rPr>
         <w:t>Presunta</w:t>
       </w:r>
@@ -2037,7 +2037,7 @@
           <w:kern w:val="0"/>
           <w:shd w:val="clear" w:color="auto" w:fill="FFFFFF"/>
           <w:lang w:eastAsia="es-PE"/>
-          <w14:ligatures w14:val="none"/>
+          <ns2:ligatures ns2:val="none"/>
         </w:rPr>
         <w:t xml:space="preserve"> infracción a los artículos 18 y 19</w:t>
       </w:r>
@@ -2046,7 +2046,7 @@
           <w:rFonts w:ascii="Arial Narrow" w:eastAsia="Calibri" w:hAnsi="Arial Narrow" w:cs="Arial Narrow"/>
           <w:kern w:val="0"/>
           <w:lang w:eastAsia="es-PE"/>
-          <w14:ligatures w14:val="none"/>
+          <ns2:ligatures ns2:val="none"/>
         </w:rPr>
         <w:t xml:space="preserve"> de </w:t>
       </w:r>
@@ -2056,7 +2056,7 @@
           <w:kern w:val="0"/>
           <w:shd w:val="clear" w:color="auto" w:fill="FFFFFF"/>
           <w:lang w:eastAsia="es-PE"/>
-          <w14:ligatures w14:val="none"/>
+          <ns2:ligatures ns2:val="none"/>
         </w:rPr>
         <w:t xml:space="preserve">la Ley </w:t>
       </w:r>
@@ -2066,7 +2066,7 @@
           <w:kern w:val="0"/>
           <w:shd w:val="clear" w:color="auto" w:fill="FFFFFF"/>
           <w:lang w:eastAsia="es-PE"/>
-          <w14:ligatures w14:val="none"/>
+          <ns2:ligatures ns2:val="none"/>
         </w:rPr>
         <w:t>29571</w:t>
       </w:r>
@@ -2076,7 +2076,7 @@
           <w:kern w:val="0"/>
           <w:shd w:val="clear" w:color="auto" w:fill="FFFFFF"/>
           <w:lang w:eastAsia="es-PE"/>
-          <w14:ligatures w14:val="none"/>
+          <ns2:ligatures ns2:val="none"/>
         </w:rPr>
         <w:t xml:space="preserve">, Código de Protección y Defensa del Consumidor, en tanto </w:t>
       </w:r>
@@ -2086,7 +2086,7 @@
           <w:kern w:val="0"/>
           <w:shd w:val="clear" w:color="auto" w:fill="FFFFFF"/>
           <w:lang w:eastAsia="es-PE"/>
-          <w14:ligatures w14:val="none"/>
+          <ns2:ligatures ns2:val="none"/>
         </w:rPr>
         <w:t xml:space="preserve">la compañía aseguradora habría </w:t>
       </w:r>
@@ -2096,7 +2096,7 @@
           <w:kern w:val="0"/>
           <w:shd w:val="clear" w:color="auto" w:fill="FFFFFF"/>
           <w:lang w:eastAsia="es-PE"/>
-          <w14:ligatures w14:val="none"/>
+          <ns2:ligatures ns2:val="none"/>
         </w:rPr>
         <w:t xml:space="preserve">negado </w:t>
       </w:r>
@@ -2106,7 +2106,7 @@
           <w:kern w:val="0"/>
           <w:shd w:val="clear" w:color="auto" w:fill="FFFFFF"/>
           <w:lang w:eastAsia="es-PE"/>
-          <w14:ligatures w14:val="none"/>
+          <ns2:ligatures ns2:val="none"/>
         </w:rPr>
         <w:t>de manera injustificada</w:t>
       </w:r>
@@ -2116,7 +2116,7 @@
           <w:kern w:val="0"/>
           <w:shd w:val="clear" w:color="auto" w:fill="FFFFFF"/>
           <w:lang w:eastAsia="es-PE"/>
-          <w14:ligatures w14:val="none"/>
+          <ns2:ligatures ns2:val="none"/>
         </w:rPr>
         <w:t xml:space="preserve"> </w:t>
       </w:r>
@@ -2126,7 +2126,7 @@
           <w:kern w:val="0"/>
           <w:shd w:val="clear" w:color="auto" w:fill="FFFFFF"/>
           <w:lang w:eastAsia="es-PE"/>
-          <w14:ligatures w14:val="none"/>
+          <ns2:ligatures ns2:val="none"/>
         </w:rPr>
         <w:t>al denunciante la cobertura del Seguro Vehicular - Póliza  2101-1513017 por el siniestro del 12 de abril de 2025</w:t>
       </w:r>
@@ -2134,12 +2134,12 @@
         <w:rPr>
           <w:rFonts w:ascii="Arial Narrow" w:eastAsia="Arial Narrow" w:hAnsi="Arial Narrow" w:cs="Arial Narrow"/>
           <w:kern w:val="0"/>
-          <w14:ligatures w14:val="none"/>
+          <ns2:ligatures ns2:val="none"/>
         </w:rPr>
         <w:t>.</w:t>
       </w:r>
     </w:p>
-    <w:p>
+    <w:p ns2:paraId="39215327" ns2:textId="77777777">
       <w:pPr>
         <w:pStyle w:val="Prrafodelista"/>
         <w:spacing w:after="0" w:line="240" w:lineRule="auto"/>
@@ -2149,11 +2149,11 @@
           <w:rFonts w:ascii="Arial Narrow" w:eastAsia="Calibri" w:hAnsi="Arial Narrow" w:cs="Arial Narrow"/>
           <w:kern w:val="0"/>
           <w:lang w:eastAsia="es-PE"/>
-          <w14:ligatures w14:val="none"/>
-        </w:rPr>
-      </w:pPr>
-    </w:p>
-    <w:p>
+          <ns2:ligatures ns2:val="none"/>
+        </w:rPr>
+      </w:pPr>
+    </w:p>
+    <w:p ns2:paraId="4E7FC1DB" ns2:textId="0AEA4586">
       <w:pPr>
         <w:pStyle w:val="Prrafodelista"/>
         <w:numPr>
@@ -2171,7 +2171,7 @@
           <w:rFonts w:ascii="Arial Narrow" w:eastAsia="Calibri" w:hAnsi="Arial Narrow" w:cs="Arial Narrow"/>
           <w:kern w:val="0"/>
           <w:lang w:eastAsia="es-PE"/>
-          <w14:ligatures w14:val="none"/>
+          <ns2:ligatures ns2:val="none"/>
         </w:rPr>
       </w:pPr>
       <w:r>
@@ -2180,7 +2180,7 @@
           <w:color w:val="000000"/>
           <w:kern w:val="0"/>
           <w:lang w:eastAsia="es-PE"/>
-          <w14:ligatures w14:val="none"/>
+          <ns2:ligatures ns2:val="none"/>
         </w:rPr>
         <w:t xml:space="preserve">Presunta infracción al literal g) del artículo 56 de la Ley </w:t>
       </w:r>
@@ -2190,7 +2190,7 @@
           <w:kern w:val="0"/>
           <w:shd w:val="clear" w:color="auto" w:fill="FFFFFF"/>
           <w:lang w:eastAsia="es-PE"/>
-          <w14:ligatures w14:val="none"/>
+          <ns2:ligatures ns2:val="none"/>
         </w:rPr>
         <w:t>29571</w:t>
       </w:r>
@@ -2200,7 +2200,7 @@
           <w:color w:val="000000"/>
           <w:kern w:val="0"/>
           <w:lang w:eastAsia="es-PE"/>
-          <w14:ligatures w14:val="none"/>
+          <ns2:ligatures ns2:val="none"/>
         </w:rPr>
         <w:t>, Código de Protección y Defensa del Consumidor</w:t>
       </w:r>
@@ -2210,7 +2210,7 @@
           <w:kern w:val="0"/>
           <w:shd w:val="clear" w:color="auto" w:fill="FFFFFF"/>
           <w:lang w:eastAsia="es-PE"/>
-          <w14:ligatures w14:val="none"/>
+          <ns2:ligatures ns2:val="none"/>
         </w:rPr>
         <w:t xml:space="preserve">, en tanto Pacífico Compañía de Seguros y Reaseguros S.A. habría condicionado la activación del </w:t>
       </w:r>
@@ -2220,7 +2220,7 @@
           <w:color w:val="000000"/>
           <w:kern w:val="0"/>
           <w:lang w:eastAsia="es-ES"/>
-          <w14:ligatures w14:val="none"/>
+          <ns2:ligatures ns2:val="none"/>
         </w:rPr>
         <w:t xml:space="preserve">Seguro de Protección de Tarjeta BCP  1000001429 a que </w:t>
       </w:r>
@@ -2230,7 +2230,7 @@
           <w:kern w:val="0"/>
           <w:shd w:val="clear" w:color="auto" w:fill="FFFFFF"/>
           <w:lang w:eastAsia="es-PE"/>
-          <w14:ligatures w14:val="none"/>
+          <ns2:ligatures ns2:val="none"/>
         </w:rPr>
         <w:t>la denunciante se sometiera a una prueba poligráfica, pese a que dicho requisito no fue informado al momento de la contratación y le habría generado una afectación a su estado emocional</w:t>
       </w:r>
@@ -2240,12 +2240,12 @@
           <w:kern w:val="0"/>
           <w:shd w:val="clear" w:color="auto" w:fill="FFFFFF"/>
           <w:lang w:eastAsia="es-PE"/>
-          <w14:ligatures w14:val="none"/>
+          <ns2:ligatures ns2:val="none"/>
         </w:rPr>
         <w:t>.</w:t>
       </w:r>
     </w:p>
-    <w:p>
+    <w:p ns2:paraId="163CBB5D" ns2:textId="77777777">
       <w:pPr>
         <w:spacing w:after="0" w:line="240" w:lineRule="auto"/>
         <w:jc w:val="both"/>
@@ -2253,11 +2253,11 @@
           <w:rFonts w:ascii="Arial Narrow" w:eastAsia="Calibri" w:hAnsi="Arial Narrow" w:cs="Arial Narrow"/>
           <w:kern w:val="0"/>
           <w:lang w:eastAsia="es-PE"/>
-          <w14:ligatures w14:val="none"/>
-        </w:rPr>
-      </w:pPr>
-    </w:p>
-    <w:p>
+          <ns2:ligatures ns2:val="none"/>
+        </w:rPr>
+      </w:pPr>
+    </w:p>
+    <w:p ns2:paraId="32EC993B" ns2:textId="5879D7CE">
       <w:pPr>
         <w:pStyle w:val="Prrafodelista"/>
         <w:numPr>
@@ -2274,14 +2274,14 @@
         <w:rPr>
           <w:rFonts w:ascii="Arial Narrow" w:eastAsia="Arial Narrow" w:hAnsi="Arial Narrow" w:cs="Arial Narrow"/>
           <w:kern w:val="0"/>
-          <w14:ligatures w14:val="none"/>
-        </w:rPr>
-      </w:pPr>
-      <w:r>
-        <w:rPr>
-          <w:rFonts w:ascii="Arial Narrow" w:eastAsia="Arial Narrow" w:hAnsi="Arial Narrow" w:cs="Arial Narrow"/>
-          <w:kern w:val="0"/>
-          <w14:ligatures w14:val="none"/>
+          <ns2:ligatures ns2:val="none"/>
+        </w:rPr>
+      </w:pPr>
+      <w:r>
+        <w:rPr>
+          <w:rFonts w:ascii="Arial Narrow" w:eastAsia="Arial Narrow" w:hAnsi="Arial Narrow" w:cs="Arial Narrow"/>
+          <w:kern w:val="0"/>
+          <ns2:ligatures ns2:val="none"/>
         </w:rPr>
         <w:t xml:space="preserve">Presunta </w:t>
       </w:r>
@@ -2291,7 +2291,7 @@
           <w:kern w:val="0"/>
           <w:shd w:val="clear" w:color="auto" w:fill="FFFFFF"/>
           <w:lang w:eastAsia="es-PE"/>
-          <w14:ligatures w14:val="none"/>
+          <ns2:ligatures ns2:val="none"/>
         </w:rPr>
         <w:t xml:space="preserve">infracción al literal e) del artículo 47 </w:t>
       </w:r>
@@ -2299,7 +2299,7 @@
         <w:rPr>
           <w:rFonts w:ascii="Arial Narrow" w:eastAsia="Calibri" w:hAnsi="Arial Narrow" w:cs="Arial"/>
           <w:kern w:val="0"/>
-          <w14:ligatures w14:val="none"/>
+          <ns2:ligatures ns2:val="none"/>
         </w:rPr>
         <w:t>de</w:t>
       </w:r>
@@ -2309,7 +2309,7 @@
           <w:kern w:val="0"/>
           <w:shd w:val="clear" w:color="auto" w:fill="FFFFFF"/>
           <w:lang w:eastAsia="es-PE"/>
-          <w14:ligatures w14:val="none"/>
+          <ns2:ligatures ns2:val="none"/>
         </w:rPr>
         <w:t xml:space="preserve"> la Ley </w:t>
       </w:r>
@@ -2319,7 +2319,7 @@
           <w:kern w:val="0"/>
           <w:shd w:val="clear" w:color="auto" w:fill="FFFFFF"/>
           <w:lang w:eastAsia="es-PE"/>
-          <w14:ligatures w14:val="none"/>
+          <ns2:ligatures ns2:val="none"/>
         </w:rPr>
         <w:t>29571</w:t>
       </w:r>
@@ -2329,7 +2329,7 @@
           <w:kern w:val="0"/>
           <w:shd w:val="clear" w:color="auto" w:fill="FFFFFF"/>
           <w:lang w:eastAsia="es-PE"/>
-          <w14:ligatures w14:val="none"/>
+          <ns2:ligatures ns2:val="none"/>
         </w:rPr>
         <w:t xml:space="preserve">, Código de Protección y Defensa del Consumidor, </w:t>
       </w:r>
@@ -2340,7 +2340,7 @@
           <w:color w:val="000000"/>
           <w:kern w:val="0"/>
           <w:lang w:eastAsia="es-PE"/>
-          <w14:ligatures w14:val="none"/>
+          <ns2:ligatures ns2:val="none"/>
         </w:rPr>
         <w:t xml:space="preserve">en tanto </w:t>
       </w:r>
@@ -2348,7 +2348,7 @@
         <w:rPr>
           <w:rFonts w:ascii="Arial Narrow" w:eastAsia="Arial Narrow" w:hAnsi="Arial Narrow" w:cs="Arial Narrow"/>
           <w:kern w:val="0"/>
-          <w14:ligatures w14:val="none"/>
+          <ns2:ligatures ns2:val="none"/>
         </w:rPr>
         <w:t xml:space="preserve">el </w:t>
       </w:r>
@@ -2358,7 +2358,7 @@
           <w:kern w:val="0"/>
           <w:shd w:val="clear" w:color="auto" w:fill="FFFFFF"/>
           <w:lang w:eastAsia="es-PE"/>
-          <w14:ligatures w14:val="none"/>
+          <ns2:ligatures ns2:val="none"/>
         </w:rPr>
         <w:t>Banco de Crédito del Perú S.A. y Pacífico Compañía de Seguros y Reaseguros S.A. no habrían</w:t>
       </w:r>
@@ -2369,7 +2369,7 @@
           <w:color w:val="000000"/>
           <w:kern w:val="0"/>
           <w:lang w:eastAsia="es-PE"/>
-          <w14:ligatures w14:val="none"/>
+          <ns2:ligatures ns2:val="none"/>
         </w:rPr>
         <w:t xml:space="preserve"> cumplido </w:t>
       </w:r>
@@ -2379,7 +2379,7 @@
           <w:color w:val="000000"/>
           <w:kern w:val="0"/>
           <w:lang w:eastAsia="es-ES"/>
-          <w14:ligatures w14:val="none"/>
+          <ns2:ligatures ns2:val="none"/>
         </w:rPr>
         <w:t xml:space="preserve">oportunamente </w:t>
       </w:r>
@@ -2390,7 +2390,7 @@
           <w:color w:val="000000"/>
           <w:kern w:val="0"/>
           <w:lang w:eastAsia="es-PE"/>
-          <w14:ligatures w14:val="none"/>
+          <ns2:ligatures ns2:val="none"/>
         </w:rPr>
         <w:t xml:space="preserve">con entregar a la denunciante los documentos contractuales del </w:t>
       </w:r>
@@ -2400,13 +2400,13 @@
           <w:color w:val="000000"/>
           <w:kern w:val="0"/>
           <w:lang w:eastAsia="es-ES"/>
-          <w14:ligatures w14:val="none"/>
+          <ns2:ligatures ns2:val="none"/>
         </w:rPr>
         <w:t>Seguro de Protección de Tarjeta BCP  1000001429.</w:t>
       </w:r>
       <w:bookmarkStart w:id="27" w:name="_Hlk215162047"/>
     </w:p>
-    <w:p>
+    <w:p ns2:paraId="39BF39FC" ns2:textId="77777777">
       <w:pPr>
         <w:spacing w:after="0" w:line="240" w:lineRule="auto"/>
         <w:jc w:val="both"/>
@@ -2414,11 +2414,11 @@
           <w:rFonts w:ascii="Arial Narrow" w:eastAsia="Calibri" w:hAnsi="Arial Narrow" w:cs="Arial Narrow"/>
           <w:kern w:val="0"/>
           <w:lang w:eastAsia="es-PE"/>
-          <w14:ligatures w14:val="none"/>
-        </w:rPr>
-      </w:pPr>
-    </w:p>
-    <w:p>
+          <ns2:ligatures ns2:val="none"/>
+        </w:rPr>
+      </w:pPr>
+    </w:p>
+    <w:p ns2:paraId="7820524F" ns2:textId="5558E788">
       <w:pPr>
         <w:pStyle w:val="Prrafodelista"/>
         <w:numPr>
@@ -2435,7 +2435,7 @@
         <w:rPr>
           <w:rFonts w:ascii="Arial Narrow" w:eastAsia="Arial Narrow" w:hAnsi="Arial Narrow" w:cs="Arial Narrow"/>
           <w:kern w:val="0"/>
-          <w14:ligatures w14:val="none"/>
+          <ns2:ligatures ns2:val="none"/>
         </w:rPr>
       </w:pPr>
       <w:bookmarkStart w:id="28" w:name="_Hlk212534295"/>
@@ -2443,7 +2443,7 @@
         <w:rPr>
           <w:rFonts w:ascii="Arial Narrow" w:eastAsia="Arial Narrow" w:hAnsi="Arial Narrow" w:cs="Arial Narrow"/>
           <w:kern w:val="0"/>
-          <w14:ligatures w14:val="none"/>
+          <ns2:ligatures ns2:val="none"/>
         </w:rPr>
         <w:t xml:space="preserve">Presunta infracción al artículo 1, numeral 1, literal b) y al artículo 2 de la Ley </w:t>
       </w:r>
@@ -2451,7 +2451,7 @@
         <w:rPr>
           <w:rFonts w:ascii="Arial Narrow" w:eastAsia="Arial Narrow" w:hAnsi="Arial Narrow" w:cs="Arial Narrow"/>
           <w:kern w:val="0"/>
-          <w14:ligatures w14:val="none"/>
+          <ns2:ligatures ns2:val="none"/>
         </w:rPr>
         <w:t>29571</w:t>
       </w:r>
@@ -2459,7 +2459,7 @@
         <w:rPr>
           <w:rFonts w:ascii="Arial Narrow" w:eastAsia="Arial Narrow" w:hAnsi="Arial Narrow" w:cs="Arial Narrow"/>
           <w:kern w:val="0"/>
-          <w14:ligatures w14:val="none"/>
+          <ns2:ligatures ns2:val="none"/>
         </w:rPr>
         <w:t>, Código de Protección y Defensa del Consumidor</w:t>
       </w:r>
@@ -2468,7 +2468,7 @@
         <w:rPr>
           <w:rFonts w:ascii="Arial Narrow" w:eastAsia="Arial Narrow" w:hAnsi="Arial Narrow" w:cs="Arial Narrow"/>
           <w:kern w:val="0"/>
-          <w14:ligatures w14:val="none"/>
+          <ns2:ligatures ns2:val="none"/>
         </w:rPr>
         <w:t xml:space="preserve">, </w:t>
       </w:r>
@@ -2478,7 +2478,7 @@
           <w:kern w:val="0"/>
           <w:shd w:val="clear" w:color="auto" w:fill="FFFFFF"/>
           <w:lang w:eastAsia="es-PE"/>
-          <w14:ligatures w14:val="none"/>
+          <ns2:ligatures ns2:val="none"/>
         </w:rPr>
         <w:t xml:space="preserve">en tanto </w:t>
       </w:r>
@@ -2486,7 +2486,7 @@
         <w:rPr>
           <w:rFonts w:ascii="Arial Narrow" w:eastAsia="Arial Narrow" w:hAnsi="Arial Narrow" w:cs="Arial Narrow"/>
           <w:kern w:val="0"/>
-          <w14:ligatures w14:val="none"/>
+          <ns2:ligatures ns2:val="none"/>
         </w:rPr>
         <w:t xml:space="preserve">el </w:t>
       </w:r>
@@ -2496,7 +2496,7 @@
           <w:kern w:val="0"/>
           <w:shd w:val="clear" w:color="auto" w:fill="FFFFFF"/>
           <w:lang w:eastAsia="es-PE"/>
-          <w14:ligatures w14:val="none"/>
+          <ns2:ligatures ns2:val="none"/>
         </w:rPr>
         <w:t xml:space="preserve">Banco de Crédito del Perú S.A. y Pacífico Compañía de Seguros y Reaseguros S.A. no habrían cumplido con informar a la denunciante el </w:t>
       </w:r>
@@ -2506,7 +2506,7 @@
           <w:color w:val="000000"/>
           <w:kern w:val="0"/>
           <w:lang w:eastAsia="es-ES"/>
-          <w14:ligatures w14:val="none"/>
+          <ns2:ligatures ns2:val="none"/>
         </w:rPr>
         <w:t>28 de marzo de 2025</w:t>
       </w:r>
@@ -2516,7 +2516,7 @@
           <w:kern w:val="0"/>
           <w:shd w:val="clear" w:color="auto" w:fill="FFFFFF"/>
           <w:lang w:eastAsia="es-PE"/>
-          <w14:ligatures w14:val="none"/>
+          <ns2:ligatures ns2:val="none"/>
         </w:rPr>
         <w:t xml:space="preserve"> el procedimiento para activar el </w:t>
       </w:r>
@@ -2526,7 +2526,7 @@
           <w:color w:val="000000"/>
           <w:kern w:val="0"/>
           <w:lang w:eastAsia="es-ES"/>
-          <w14:ligatures w14:val="none"/>
+          <ns2:ligatures ns2:val="none"/>
         </w:rPr>
         <w:t>Seguro de Protección de Tarjeta BCP  1000001429</w:t>
       </w:r>
@@ -2534,23 +2534,23 @@
         <w:rPr>
           <w:rFonts w:ascii="Arial Narrow" w:eastAsia="Arial Narrow" w:hAnsi="Arial Narrow" w:cs="Arial Narrow"/>
           <w:kern w:val="0"/>
-          <w14:ligatures w14:val="none"/>
+          <ns2:ligatures ns2:val="none"/>
         </w:rPr>
         <w:t>.</w:t>
       </w:r>
     </w:p>
-    <w:p>
+    <w:p ns2:paraId="0B0291C5" ns2:textId="77777777">
       <w:pPr>
         <w:pStyle w:val="Prrafodelista"/>
         <w:spacing w:after="0" w:line="240" w:lineRule="auto"/>
         <w:rPr>
           <w:rFonts w:ascii="Arial Narrow" w:eastAsia="Arial Narrow" w:hAnsi="Arial Narrow" w:cs="Arial Narrow"/>
           <w:kern w:val="0"/>
-          <w14:ligatures w14:val="none"/>
-        </w:rPr>
-      </w:pPr>
-    </w:p>
-    <w:p>
+          <ns2:ligatures ns2:val="none"/>
+        </w:rPr>
+      </w:pPr>
+    </w:p>
+    <w:p ns2:paraId="7C9EE9C9" ns2:textId="4EB7233F">
       <w:pPr>
         <w:pStyle w:val="Prrafodelista"/>
         <w:numPr>
@@ -2567,7 +2567,7 @@
         <w:rPr>
           <w:rFonts w:ascii="Arial Narrow" w:eastAsia="Arial Narrow" w:hAnsi="Arial Narrow" w:cs="Arial Narrow"/>
           <w:kern w:val="0"/>
-          <w14:ligatures w14:val="none"/>
+          <ns2:ligatures ns2:val="none"/>
         </w:rPr>
       </w:pPr>
       <w:bookmarkStart w:id="29" w:name="_Hlk213688106"/>
@@ -2583,7 +2583,7 @@
           <w:kern w:val="0"/>
           <w:shd w:val="clear" w:color="auto" w:fill="FFFFFF"/>
           <w:lang w:eastAsia="es-PE"/>
-          <w14:ligatures w14:val="none"/>
+          <ns2:ligatures ns2:val="none"/>
         </w:rPr>
         <w:t>29571</w:t>
       </w:r>
@@ -2597,7 +2597,7 @@
         <w:rPr>
           <w:rFonts w:ascii="Arial Narrow" w:eastAsia="Arial Narrow" w:hAnsi="Arial Narrow" w:cs="Arial Narrow"/>
           <w:kern w:val="0"/>
-          <w14:ligatures w14:val="none"/>
+          <ns2:ligatures ns2:val="none"/>
         </w:rPr>
         <w:t>en tanto el proveedor denunciado habría brindado una respuesta inadecuada al reclamo presentado por el denunciante el 12 de agosto de 2024</w:t>
       </w:r>
@@ -2606,25 +2606,25 @@
         <w:rPr>
           <w:rFonts w:ascii="Arial Narrow" w:eastAsia="Arial Narrow" w:hAnsi="Arial Narrow" w:cs="Arial Narrow"/>
           <w:kern w:val="0"/>
-          <w14:ligatures w14:val="none"/>
+          <ns2:ligatures ns2:val="none"/>
         </w:rPr>
         <w:t>.</w:t>
       </w:r>
     </w:p>
     <w:bookmarkEnd w:id="26"/>
     <w:bookmarkEnd w:id="27"/>
-    <w:p>
-      <w:pPr>
-        <w:spacing w:after="0" w:line="240" w:lineRule="auto"/>
-        <w:jc w:val="both"/>
-        <w:rPr>
-          <w:rFonts w:ascii="Arial Narrow" w:eastAsia="Arial Narrow" w:hAnsi="Arial Narrow" w:cs="Arial Narrow"/>
-          <w:kern w:val="0"/>
-          <w14:ligatures w14:val="none"/>
-        </w:rPr>
-      </w:pPr>
-    </w:p>
-    <w:p>
+    <w:p ns2:paraId="042B3F54" ns2:textId="777BBF33">
+      <w:pPr>
+        <w:spacing w:after="0" w:line="240" w:lineRule="auto"/>
+        <w:jc w:val="both"/>
+        <w:rPr>
+          <w:rFonts w:ascii="Arial Narrow" w:eastAsia="Arial Narrow" w:hAnsi="Arial Narrow" w:cs="Arial Narrow"/>
+          <w:kern w:val="0"/>
+          <ns2:ligatures ns2:val="none"/>
+        </w:rPr>
+      </w:pPr>
+    </w:p>
+    <w:p ns2:paraId="0A292C9F" ns2:textId="77777777">
       <w:pPr>
         <w:spacing w:after="0" w:line="240" w:lineRule="auto"/>
         <w:contextualSpacing/>
@@ -2632,17 +2632,17 @@
         <w:rPr>
           <w:rFonts w:ascii="Arial Narrow" w:eastAsia="Calibri" w:hAnsi="Arial Narrow" w:cs="Arial"/>
           <w:kern w:val="0"/>
-          <w14:ligatures w14:val="none"/>
-        </w:rPr>
-      </w:pPr>
-      <w:r>
-        <w:rPr>
-          <w:rFonts w:ascii="Arial Narrow" w:eastAsia="Arial Narrow" w:hAnsi="Arial Narrow" w:cs="Arial Narrow"/>
-          <w:b/>
-          <w:color w:val="000000"/>
-          <w:kern w:val="0"/>
-          <w:lang w:eastAsia="es-PE"/>
-          <w14:ligatures w14:val="none"/>
+          <ns2:ligatures ns2:val="none"/>
+        </w:rPr>
+      </w:pPr>
+      <w:r>
+        <w:rPr>
+          <w:rFonts w:ascii="Arial Narrow" w:eastAsia="Arial Narrow" w:hAnsi="Arial Narrow" w:cs="Arial Narrow"/>
+          <w:b/>
+          <w:color w:val="000000"/>
+          <w:kern w:val="0"/>
+          <w:lang w:eastAsia="es-PE"/>
+          <ns2:ligatures ns2:val="none"/>
         </w:rPr>
         <w:t>SEGUNDO:</w:t>
       </w:r>
@@ -2652,7 +2652,7 @@
           <w:color w:val="000000"/>
           <w:kern w:val="0"/>
           <w:lang w:eastAsia="es-PE"/>
-          <w14:ligatures w14:val="none"/>
+          <ns2:ligatures ns2:val="none"/>
         </w:rPr>
         <w:t xml:space="preserve"> tener por ofrecidos los medios probatorios presentados en el escrito de denuncia </w:t>
       </w:r>
@@ -2662,7 +2662,7 @@
           <w:color w:val="000000"/>
           <w:kern w:val="0"/>
           <w:lang w:val="es-ES" w:eastAsia="es-ES"/>
-          <w14:ligatures w14:val="none"/>
+          <ns2:ligatures ns2:val="none"/>
         </w:rPr>
         <w:t xml:space="preserve">del </w:t>
       </w:r>
@@ -2672,7 +2672,7 @@
           <w:color w:val="000000"/>
           <w:kern w:val="0"/>
           <w:lang w:val="es-ES" w:eastAsia="es-ES"/>
-          <w14:ligatures w14:val="none"/>
+          <ns2:ligatures ns2:val="none"/>
         </w:rPr>
         <w:t>5</w:t>
       </w:r>
@@ -2680,7 +2680,7 @@
         <w:rPr>
           <w:rFonts w:ascii="Arial Narrow" w:eastAsia="Calibri" w:hAnsi="Arial Narrow" w:cs="Arial"/>
           <w:kern w:val="0"/>
-          <w14:ligatures w14:val="none"/>
+          <ns2:ligatures ns2:val="none"/>
         </w:rPr>
         <w:t xml:space="preserve"> de marzo de 2025, subsanada por escrito del 4 de abril de 2025</w:t>
       </w:r>
@@ -2688,12 +2688,12 @@
         <w:rPr>
           <w:rFonts w:ascii="Arial Narrow" w:eastAsia="Calibri" w:hAnsi="Arial Narrow" w:cs="Arial"/>
           <w:kern w:val="0"/>
-          <w14:ligatures w14:val="none"/>
+          <ns2:ligatures ns2:val="none"/>
         </w:rPr>
         <w:t>.</w:t>
       </w:r>
     </w:p>
-    <w:p>
+    <w:p ns2:paraId="68A17E97" ns2:textId="77777777">
       <w:pPr>
         <w:spacing w:after="0" w:line="240" w:lineRule="auto"/>
         <w:contextualSpacing/>
@@ -2703,30 +2703,30 @@
           <w:color w:val="000000"/>
           <w:kern w:val="0"/>
           <w:lang w:eastAsia="es-PE"/>
-          <w14:ligatures w14:val="none"/>
-        </w:rPr>
-      </w:pPr>
-    </w:p>
-    <w:p>
-      <w:pPr>
-        <w:spacing w:after="0" w:line="240" w:lineRule="auto"/>
-        <w:jc w:val="both"/>
-        <w:rPr>
-          <w:rFonts w:ascii="Arial Narrow" w:eastAsia="Arial Narrow" w:hAnsi="Arial Narrow" w:cs="Arial Narrow"/>
-          <w:color w:val="000000"/>
-          <w:kern w:val="0"/>
-          <w:lang w:eastAsia="es-PE"/>
-          <w14:ligatures w14:val="none"/>
-        </w:rPr>
-      </w:pPr>
-      <w:r>
-        <w:rPr>
-          <w:rFonts w:ascii="Arial Narrow" w:eastAsia="Arial Narrow" w:hAnsi="Arial Narrow" w:cs="Arial Narrow"/>
-          <w:b/>
-          <w:color w:val="000000"/>
-          <w:kern w:val="0"/>
-          <w:lang w:eastAsia="es-PE"/>
-          <w14:ligatures w14:val="none"/>
+          <ns2:ligatures ns2:val="none"/>
+        </w:rPr>
+      </w:pPr>
+    </w:p>
+    <w:p ns2:paraId="168254DA" ns2:textId="77777777">
+      <w:pPr>
+        <w:spacing w:after="0" w:line="240" w:lineRule="auto"/>
+        <w:jc w:val="both"/>
+        <w:rPr>
+          <w:rFonts w:ascii="Arial Narrow" w:eastAsia="Arial Narrow" w:hAnsi="Arial Narrow" w:cs="Arial Narrow"/>
+          <w:color w:val="000000"/>
+          <w:kern w:val="0"/>
+          <w:lang w:eastAsia="es-PE"/>
+          <ns2:ligatures ns2:val="none"/>
+        </w:rPr>
+      </w:pPr>
+      <w:r>
+        <w:rPr>
+          <w:rFonts w:ascii="Arial Narrow" w:eastAsia="Arial Narrow" w:hAnsi="Arial Narrow" w:cs="Arial Narrow"/>
+          <w:b/>
+          <w:color w:val="000000"/>
+          <w:kern w:val="0"/>
+          <w:lang w:eastAsia="es-PE"/>
+          <ns2:ligatures ns2:val="none"/>
         </w:rPr>
         <w:t xml:space="preserve">TERCERO: </w:t>
       </w:r>
@@ -2736,7 +2736,7 @@
           <w:color w:val="000000"/>
           <w:kern w:val="0"/>
           <w:lang w:eastAsia="es-PE"/>
-          <w14:ligatures w14:val="none"/>
+          <ns2:ligatures ns2:val="none"/>
         </w:rPr>
         <w:t xml:space="preserve">requerir a </w:t>
       </w:r>
@@ -2746,7 +2746,7 @@
           <w:color w:val="000000"/>
           <w:kern w:val="0"/>
           <w:lang w:eastAsia="es-PE"/>
-          <w14:ligatures w14:val="none"/>
+          <ns2:ligatures ns2:val="none"/>
         </w:rPr>
         <w:t>Rímac Seguros y Reaseguros S.A.</w:t>
       </w:r>
@@ -2756,12 +2756,12 @@
           <w:color w:val="000000"/>
           <w:kern w:val="0"/>
           <w:lang w:eastAsia="es-PE"/>
-          <w14:ligatures w14:val="none"/>
+          <ns2:ligatures ns2:val="none"/>
         </w:rPr>
         <w:t xml:space="preserve"> que cumpla con lo siguiente:</w:t>
       </w:r>
     </w:p>
-    <w:p>
+    <w:p ns2:paraId="20FDFB8D" ns2:textId="77777777">
       <w:pPr>
         <w:spacing w:after="0" w:line="240" w:lineRule="auto"/>
         <w:jc w:val="both"/>
@@ -2770,11 +2770,11 @@
           <w:color w:val="000000"/>
           <w:kern w:val="0"/>
           <w:lang w:eastAsia="es-PE"/>
-          <w14:ligatures w14:val="none"/>
-        </w:rPr>
-      </w:pPr>
-    </w:p>
-    <w:p>
+          <ns2:ligatures ns2:val="none"/>
+        </w:rPr>
+      </w:pPr>
+    </w:p>
+    <w:p ns2:paraId="4AA80738" ns2:textId="77777777">
       <w:pPr>
         <w:numPr>
           <w:ilvl w:val="0"/>
@@ -2788,21 +2788,21 @@
           <w:color w:val="000000"/>
           <w:kern w:val="0"/>
           <w:lang w:eastAsia="es-PE"/>
-          <w14:ligatures w14:val="none"/>
-        </w:rPr>
-      </w:pPr>
-      <w:r>
-        <w:rPr>
-          <w:rFonts w:ascii="Arial Narrow" w:eastAsia="Arial Narrow" w:hAnsi="Arial Narrow" w:cs="Arial Narrow"/>
-          <w:color w:val="000000"/>
-          <w:kern w:val="0"/>
-          <w:lang w:eastAsia="es-PE"/>
-          <w14:ligatures w14:val="none"/>
+          <ns2:ligatures ns2:val="none"/>
+        </w:rPr>
+      </w:pPr>
+      <w:r>
+        <w:rPr>
+          <w:rFonts w:ascii="Arial Narrow" w:eastAsia="Arial Narrow" w:hAnsi="Arial Narrow" w:cs="Arial Narrow"/>
+          <w:color w:val="000000"/>
+          <w:kern w:val="0"/>
+          <w:lang w:eastAsia="es-PE"/>
+          <ns2:ligatures ns2:val="none"/>
         </w:rPr>
         <w:t>presentar documentos que acrediten su inscripción en los Registros Públicos o una declaración jurada que indique que cuenta con dicha inscripción;</w:t>
       </w:r>
     </w:p>
-    <w:p>
+    <w:p ns2:paraId="2B29D59F" ns2:textId="77777777">
       <w:pPr>
         <w:numPr>
           <w:ilvl w:val="0"/>
@@ -2816,22 +2816,22 @@
           <w:color w:val="000000"/>
           <w:kern w:val="0"/>
           <w:lang w:eastAsia="es-PE"/>
-          <w14:ligatures w14:val="none"/>
-        </w:rPr>
-      </w:pPr>
-      <w:r>
-        <w:rPr>
-          <w:rFonts w:ascii="Arial Narrow" w:eastAsia="Arial Narrow" w:hAnsi="Arial Narrow" w:cs="Arial Narrow"/>
-          <w:color w:val="000000"/>
-          <w:kern w:val="0"/>
-          <w:lang w:eastAsia="es-PE"/>
-          <w14:ligatures w14:val="none"/>
+          <ns2:ligatures ns2:val="none"/>
+        </w:rPr>
+      </w:pPr>
+      <w:r>
+        <w:rPr>
+          <w:rFonts w:ascii="Arial Narrow" w:eastAsia="Arial Narrow" w:hAnsi="Arial Narrow" w:cs="Arial Narrow"/>
+          <w:color w:val="000000"/>
+          <w:kern w:val="0"/>
+          <w:lang w:eastAsia="es-PE"/>
+          <ns2:ligatures ns2:val="none"/>
         </w:rPr>
         <w:lastRenderedPageBreak/>
         <w:t>presentar copia simple de las facultades de representación de su representante legal en el presente procedimiento o la declaración jurada que indique que cuenta con dichas facultades y que estas se encuentran vigentes;</w:t>
       </w:r>
     </w:p>
-    <w:p>
+    <w:p ns2:paraId="7EF50C46" ns2:textId="77777777">
       <w:pPr>
         <w:numPr>
           <w:ilvl w:val="0"/>
@@ -2845,21 +2845,21 @@
           <w:color w:val="000000"/>
           <w:kern w:val="0"/>
           <w:lang w:eastAsia="es-PE"/>
-          <w14:ligatures w14:val="none"/>
-        </w:rPr>
-      </w:pPr>
-      <w:r>
-        <w:rPr>
-          <w:rFonts w:ascii="Arial Narrow" w:eastAsia="Arial Narrow" w:hAnsi="Arial Narrow" w:cs="Arial Narrow"/>
-          <w:color w:val="000000"/>
-          <w:kern w:val="0"/>
-          <w:lang w:eastAsia="es-PE"/>
-          <w14:ligatures w14:val="none"/>
+          <ns2:ligatures ns2:val="none"/>
+        </w:rPr>
+      </w:pPr>
+      <w:r>
+        <w:rPr>
+          <w:rFonts w:ascii="Arial Narrow" w:eastAsia="Arial Narrow" w:hAnsi="Arial Narrow" w:cs="Arial Narrow"/>
+          <w:color w:val="000000"/>
+          <w:kern w:val="0"/>
+          <w:lang w:eastAsia="es-PE"/>
+          <ns2:ligatures ns2:val="none"/>
         </w:rPr>
         <w:t>consignar el Número de Registro Único de Contribuyentes (RUC); y,</w:t>
       </w:r>
     </w:p>
-    <w:p>
+    <w:p ns2:paraId="19E4DFA1" ns2:textId="2D033D4A">
       <w:pPr>
         <w:numPr>
           <w:ilvl w:val="0"/>
@@ -2871,16 +2871,16 @@
         <w:rPr>
           <w:rFonts w:ascii="Arial Narrow" w:eastAsia="Calibri" w:hAnsi="Arial Narrow" w:cs="Arial"/>
           <w:kern w:val="0"/>
-          <w14:ligatures w14:val="none"/>
-        </w:rPr>
-      </w:pPr>
-      <w:r>
-        <w:rPr>
-          <w:rFonts w:ascii="Arial Narrow" w:eastAsia="Arial Narrow" w:hAnsi="Arial Narrow" w:cs="Arial Narrow"/>
-          <w:color w:val="000000"/>
-          <w:kern w:val="0"/>
-          <w:lang w:eastAsia="es-PE"/>
-          <w14:ligatures w14:val="none"/>
+          <ns2:ligatures ns2:val="none"/>
+        </w:rPr>
+      </w:pPr>
+      <w:r>
+        <w:rPr>
+          <w:rFonts w:ascii="Arial Narrow" w:eastAsia="Arial Narrow" w:hAnsi="Arial Narrow" w:cs="Arial Narrow"/>
+          <w:color w:val="000000"/>
+          <w:kern w:val="0"/>
+          <w:lang w:eastAsia="es-PE"/>
+          <ns2:ligatures ns2:val="none"/>
         </w:rPr>
         <w:t xml:space="preserve">fijar domicilio procesal para el procedimiento, de conformidad con el numeral 1 del artículo 442 del Código Procesal Civil. </w:t>
       </w:r>
@@ -2888,7 +2888,7 @@
         <w:rPr>
           <w:rFonts w:ascii="Arial Narrow" w:eastAsia="Calibri" w:hAnsi="Arial Narrow" w:cs="Arial"/>
           <w:kern w:val="0"/>
-          <w14:ligatures w14:val="none"/>
+          <ns2:ligatures ns2:val="none"/>
         </w:rPr>
         <w:t>Para ello podrá señalar domicilio físico o una dirección electrónica a la que pueda remitirse las notificaciones</w:t>
       </w:r>
@@ -2897,12 +2897,12 @@
           <w:rFonts w:ascii="Arial Narrow" w:eastAsia="Arial" w:hAnsi="Arial Narrow" w:cs="Arial"/>
           <w:kern w:val="0"/>
           <w:lang w:val="es"/>
-          <w14:ligatures w14:val="none"/>
+          <ns2:ligatures ns2:val="none"/>
         </w:rPr>
         <w:t>;</w:t>
       </w:r>
     </w:p>
-    <w:p>
+    <w:p ns2:paraId="7C63E340" ns2:textId="70531021">
       <w:pPr>
         <w:numPr>
           <w:ilvl w:val="0"/>
@@ -2914,14 +2914,14 @@
         <w:rPr>
           <w:rFonts w:ascii="Arial Narrow" w:eastAsia="Calibri" w:hAnsi="Arial Narrow" w:cs="Arial"/>
           <w:kern w:val="0"/>
-          <w14:ligatures w14:val="none"/>
+          <ns2:ligatures ns2:val="none"/>
         </w:rPr>
       </w:pPr>
       <w:r>
         <w:rPr>
           <w:rFonts w:ascii="Arial Narrow" w:eastAsia="Calibri" w:hAnsi="Arial Narrow" w:cs="Arial"/>
           <w:kern w:val="0"/>
-          <w14:ligatures w14:val="none"/>
+          <ns2:ligatures ns2:val="none"/>
         </w:rPr>
         <w:t>en caso califique como micro empresa o pequeña empresa, presentar los documentos que acrediten su volumen de ventas o ingresos brutos percibidos el año anterior relativo a todas sus actividades económicas y el número de trabajadores con el que cuenta</w:t>
       </w:r>
@@ -2931,7 +2931,7 @@
           <w:rFonts w:ascii="Arial Narrow" w:eastAsia="Calibri" w:hAnsi="Arial Narrow" w:cs="Arial"/>
           <w:kern w:val="0"/>
           <w:vertAlign w:val="superscript"/>
-          <w14:ligatures w14:val="none"/>
+          <ns2:ligatures ns2:val="none"/>
         </w:rPr>
         <w:footnoteReference w:id="10"/>
       </w:r>
@@ -2939,7 +2939,7 @@
         <w:rPr>
           <w:rFonts w:ascii="Arial Narrow" w:eastAsia="Calibri" w:hAnsi="Arial Narrow" w:cs="Arial"/>
           <w:kern w:val="0"/>
-          <w14:ligatures w14:val="none"/>
+          <ns2:ligatures ns2:val="none"/>
         </w:rPr>
         <w:t xml:space="preserve">. Ello, a fin de que la Comisión pueda meritar dicha documentación, conforme lo establece el artículo 110 del </w:t>
       </w:r>
@@ -2948,7 +2948,7 @@
           <w:rFonts w:ascii="Arial Narrow" w:eastAsia="Calibri" w:hAnsi="Arial Narrow" w:cs="Arial"/>
           <w:spacing w:val="-2"/>
           <w:kern w:val="0"/>
-          <w14:ligatures w14:val="none"/>
+          <ns2:ligatures ns2:val="none"/>
         </w:rPr>
         <w:t>Código</w:t>
       </w:r>
@@ -2959,7 +2959,7 @@
           <w:spacing w:val="-2"/>
           <w:kern w:val="0"/>
           <w:vertAlign w:val="superscript"/>
-          <w14:ligatures w14:val="none"/>
+          <ns2:ligatures ns2:val="none"/>
         </w:rPr>
         <w:footnoteReference w:id="11"/>
       </w:r>
@@ -2968,12 +2968,12 @@
           <w:rFonts w:ascii="Arial Narrow" w:eastAsia="Calibri" w:hAnsi="Arial Narrow" w:cs="Arial"/>
           <w:spacing w:val="-2"/>
           <w:kern w:val="0"/>
-          <w14:ligatures w14:val="none"/>
+          <ns2:ligatures ns2:val="none"/>
         </w:rPr>
         <w:t>.</w:t>
       </w:r>
     </w:p>
-    <w:p>
+    <w:p ns2:paraId="1F11FE32" ns2:textId="77777777">
       <w:pPr>
         <w:spacing w:after="0" w:line="240" w:lineRule="auto"/>
         <w:ind w:left="567"/>
@@ -2983,81 +2983,120 @@
           <w:color w:val="000000"/>
           <w:kern w:val="0"/>
           <w:lang w:eastAsia="es-PE"/>
-          <w14:ligatures w14:val="none"/>
-        </w:rPr>
-      </w:pPr>
-    </w:p>
-    <w:p>
-      <w:pPr>
-        <w:spacing w:after="0" w:line="240" w:lineRule="auto"/>
-        <w:jc w:val="both"/>
-        <w:rPr>
-          <w:rFonts w:ascii="Arial Narrow" w:eastAsia="Arial Narrow" w:hAnsi="Arial Narrow" w:cs="Arial Narrow"/>
-          <w:color w:val="000000"/>
-          <w:kern w:val="0"/>
-          <w:lang w:eastAsia="es-PE"/>
-          <w14:ligatures w14:val="none"/>
-        </w:rPr>
-      </w:pPr>
-      <w:r>
-        <w:rPr>
-          <w:rFonts w:ascii="Arial Narrow" w:eastAsia="Arial Narrow" w:hAnsi="Arial Narrow" w:cs="Arial Narrow"/>
-          <w:b/>
-          <w:color w:val="000000"/>
-          <w:kern w:val="0"/>
-          <w:lang w:eastAsia="es-PE"/>
-          <w14:ligatures w14:val="none"/>
+          <ns2:ligatures ns2:val="none"/>
+        </w:rPr>
+      </w:pPr>
+    </w:p>
+    <w:p>
+      <w:pPr>
+        <w:spacing w:after="0" w:line="240" w:lineRule="auto"/>
+        <w:jc w:val="both"/>
+        <w:rPr>
+          <w:rFonts w:ascii="Arial Narrow" w:eastAsia="Arial Narrow" w:hAnsi="Arial Narrow" w:cs="Arial Narrow"/>
+          <w:color w:val="000000"/>
+          <w:kern w:val="0"/>
+          <w:lang w:eastAsia="es-PE"/>
+          <ns2:ligatures ns2:val="none"/>
+        </w:rPr>
+      </w:pPr>
+      <w:r>
+        <w:rPr>
+          <w:rFonts w:ascii="Arial Narrow" w:hAnsi="Arial Narrow" w:cs="Arial Narrow"/>
+          <w:b w:val="1"/>
+          <w:bCs w:val="1"/>
+          <w:sz w:val="20"/>
+          <w:szCs w:val="20"/>
         </w:rPr>
         <w:t xml:space="preserve">CUARTO: </w:t>
       </w:r>
       <w:r>
         <w:rPr>
-          <w:rFonts w:ascii="Arial Narrow" w:eastAsia="Arial Narrow" w:hAnsi="Arial Narrow" w:cs="Arial Narrow"/>
-          <w:color w:val="000000"/>
-          <w:kern w:val="0"/>
-          <w:lang w:eastAsia="es-PE"/>
-          <w14:ligatures w14:val="none"/>
-        </w:rPr>
-        <w:t xml:space="preserve">correr traslado de la denuncia interpuesta </w:t>
-      </w:r>
-      <w:r>
+          <w:rFonts w:ascii="Arial Narrow" w:hAnsi="Arial Narrow" w:cs="Arial Narrow"/>
+          <w:sz w:val="20"/>
+          <w:szCs w:val="20"/>
+        </w:rPr>
+        <w:t xml:space="preserve">correr traslado de la presente resolución a La Positiva Vida Seguros y Reaseguros S.A para que, de conformidad con lo dispuesto por el artículo 26° de la Ley sobre Facultades, Normas y Organización del Indecopi, aprobado por Decreto Legislativo N° 8079, presente sus descargos sobre la imputación de cargos realizada en un plazo no mayor a cinco (5) días hábiles contado a partir del día siguiente de la notificación de la presente resolución, vencido el cual, el Secretario Técnico declarará en rebeldía a los denunciados que no lo hubieran presentado. Debe precisarse que de conformidad con lo establecido por el artículo 223° del Texto Único Ordenado de la Ley N° 27444, Ley del Procedimiento Administrativo General, las alegaciones y los hechos relevantes de la reclamación, salvo que hayan sido específicamente negadas en la contestación, se tendrán por aceptadas o meritadas como ciertas.</w:t>
+      </w:r>
+    </w:p>
+    <w:p ns2:paraId="228F876C" ns2:textId="77777777">
+      <w:pPr>
+        <w:spacing w:after="0" w:line="240" w:lineRule="auto"/>
+        <w:jc w:val="both"/>
+        <w:rPr>
+          <w:rFonts w:ascii="Arial Narrow" w:eastAsia="Arial Narrow" w:hAnsi="Arial Narrow" w:cs="Arial Narrow"/>
+          <w:color w:val="000000"/>
+          <w:kern w:val="0"/>
+          <w:lang w:eastAsia="es-PE"/>
+          <ns2:ligatures ns2:val="none"/>
+        </w:rPr>
+      </w:pPr>
+    </w:p>
+    <w:p ns2:paraId="774AFBA5" ns2:textId="7702CEFA">
+      <w:pPr>
+        <w:spacing w:after="0" w:line="240" w:lineRule="auto"/>
+        <w:jc w:val="both"/>
         <w:rPr>
           <w:rFonts w:ascii="Arial Narrow" w:eastAsia="Times New Roman" w:hAnsi="Arial Narrow" w:cs="Arial"/>
           <w:color w:val="000000"/>
           <w:kern w:val="0"/>
           <w:lang w:val="es-ES" w:eastAsia="es-ES"/>
-          <w14:ligatures w14:val="none"/>
-        </w:rPr>
-        <w:t xml:space="preserve">el </w:t>
-      </w:r>
+          <ns2:ligatures ns2:val="none"/>
+        </w:rPr>
+      </w:pPr>
+      <w:r>
+        <w:rPr>
+          <w:rFonts w:ascii="Arial Narrow" w:eastAsia="Arial Narrow" w:hAnsi="Arial Narrow" w:cs="Arial Narrow"/>
+          <w:b/>
+          <w:color w:val="000000"/>
+          <w:kern w:val="0"/>
+          <w:lang w:eastAsia="es-PE"/>
+          <ns2:ligatures ns2:val="none"/>
+        </w:rPr>
+        <w:t xml:space="preserve">QUINTO: </w:t>
+      </w:r>
+      <w:bookmarkStart w:id="30" w:name="_Hlk188286813"/>
       <w:r>
         <w:rPr>
           <w:rFonts w:ascii="Arial Narrow" w:eastAsia="Times New Roman" w:hAnsi="Arial Narrow" w:cs="Arial"/>
           <w:color w:val="000000"/>
           <w:kern w:val="0"/>
+          <w:lang w:eastAsia="es-ES"/>
+          <ns2:ligatures ns2:val="none"/>
+        </w:rPr>
+        <w:t xml:space="preserve">requerir </w:t>
+      </w:r>
+      <w:r>
+        <w:rPr>
+          <w:rFonts w:ascii="Arial Narrow" w:eastAsia="Times New Roman" w:hAnsi="Arial Narrow" w:cs="Arial"/>
+          <w:color w:val="000000"/>
+          <w:kern w:val="0"/>
           <w:lang w:val="es-ES" w:eastAsia="es-ES"/>
-          <w14:ligatures w14:val="none"/>
-        </w:rPr>
-        <w:t>5</w:t>
-      </w:r>
-      <w:r>
-        <w:rPr>
-          <w:rFonts w:ascii="Arial Narrow" w:eastAsia="Calibri" w:hAnsi="Arial Narrow" w:cs="Arial"/>
-          <w:kern w:val="0"/>
-          <w14:ligatures w14:val="none"/>
-        </w:rPr>
-        <w:t xml:space="preserve"> de marzo de 2025, subsanada por escrito del 4 de abril de 2025, </w:t>
-      </w:r>
-      <w:r>
-        <w:rPr>
-          <w:rFonts w:ascii="Arial Narrow" w:eastAsia="Arial Narrow" w:hAnsi="Arial Narrow" w:cs="Arial Narrow"/>
-          <w:color w:val="000000"/>
-          <w:kern w:val="0"/>
-          <w:lang w:eastAsia="es-PE"/>
-          <w14:ligatures w14:val="none"/>
-        </w:rPr>
-        <w:t>a</w:t>
-      </w:r>
+          <ns2:ligatures ns2:val="none"/>
+        </w:rPr>
+        <w:t xml:space="preserve">que, en un </w:t>
+      </w:r>
+      <w:r>
+        <w:rPr>
+          <w:rFonts w:ascii="Arial Narrow" w:eastAsia="Times New Roman" w:hAnsi="Arial Narrow" w:cs="Arial"/>
+          <w:color w:val="000000"/>
+          <w:kern w:val="0"/>
+          <w:lang w:eastAsia="es-ES"/>
+          <ns2:ligatures ns2:val="none"/>
+        </w:rPr>
+        <w:t>plazo no mayor de cinco (5) días hábiles contado a partir del día siguiente de la notificación de la presente resolución</w:t>
+      </w:r>
+      <w:bookmarkEnd w:id="30"/>
+      <w:r>
+        <w:rPr>
+          <w:rFonts w:ascii="Arial Narrow" w:eastAsia="Times New Roman" w:hAnsi="Arial Narrow" w:cs="Arial"/>
+          <w:color w:val="000000"/>
+          <w:kern w:val="0"/>
+          <w:lang w:eastAsia="es-ES"/>
+          <ns2:ligatures ns2:val="none"/>
+        </w:rPr>
+        <w:t xml:space="preserve">, </w:t>
+      </w:r>
+      <w:bookmarkStart w:id="31" w:name="_Hlk188286828"/>
       <w:r>
         <w:rPr>
           <w:rFonts w:ascii="Arial Narrow" w:eastAsia="Times New Roman" w:hAnsi="Arial Narrow" w:cs="Times New Roman"/>
@@ -3065,77 +3104,50 @@
           <w:kern w:val="0"/>
           <w:shd w:val="clear" w:color="auto" w:fill="FFFFFF"/>
           <w:lang w:eastAsia="es-PE"/>
-          <w14:ligatures w14:val="none"/>
-        </w:rPr>
-        <w:t xml:space="preserve"> La Positiva Vida Seguros y Reaseguros S.A.</w:t>
-      </w:r>
-      <w:r>
-        <w:rPr>
-          <w:rFonts w:ascii="Arial Narrow" w:eastAsia="Arial Narrow" w:hAnsi="Arial Narrow" w:cs="Arial Narrow"/>
-          <w:color w:val="000000"/>
-          <w:kern w:val="0"/>
-          <w:lang w:eastAsia="es-PE"/>
-          <w14:ligatures w14:val="none"/>
-        </w:rPr>
-        <w:t>,</w:t>
-      </w:r>
-      <w:r>
-        <w:rPr>
-          <w:rFonts w:ascii="Arial Narrow" w:eastAsia="Arial Narrow" w:hAnsi="Arial Narrow" w:cs="Arial Narrow"/>
-          <w:color w:val="000000"/>
-          <w:kern w:val="0"/>
-          <w:lang w:eastAsia="es-PE"/>
-          <w14:ligatures w14:val="none"/>
-        </w:rPr>
-        <w:t xml:space="preserve"> para que, de conformidad con lo dispuesto por el artículo 26 de la Ley sobre Facultades, Normas y Organización del Indecopi, aprobada por Decreto Legislativo 807, presente sus descargos en un plazo no mayor de cinco (5) días hábiles contados desde la notificación. </w:t>
-      </w:r>
-    </w:p>
-    <w:p>
-      <w:pPr>
-        <w:spacing w:after="0" w:line="240" w:lineRule="auto"/>
-        <w:jc w:val="both"/>
-        <w:rPr>
-          <w:rFonts w:ascii="Arial Narrow" w:eastAsia="Arial Narrow" w:hAnsi="Arial Narrow" w:cs="Arial Narrow"/>
-          <w:color w:val="000000"/>
-          <w:kern w:val="0"/>
-          <w:lang w:eastAsia="es-PE"/>
-          <w14:ligatures w14:val="none"/>
-        </w:rPr>
-      </w:pPr>
-    </w:p>
-    <w:p>
-      <w:pPr>
-        <w:spacing w:after="0" w:line="240" w:lineRule="auto"/>
-        <w:jc w:val="both"/>
+          <ns2:ligatures ns2:val="none"/>
+        </w:rPr>
+        <w:t>el proveedor denunciado</w:t>
+      </w:r>
+      <w:r>
         <w:rPr>
           <w:rFonts w:ascii="Arial Narrow" w:eastAsia="Times New Roman" w:hAnsi="Arial Narrow" w:cs="Arial"/>
           <w:color w:val="000000"/>
           <w:kern w:val="0"/>
+          <w:lang w:eastAsia="es-ES"/>
+          <ns2:ligatures ns2:val="none"/>
+        </w:rPr>
+        <w:t xml:space="preserve"> </w:t>
+      </w:r>
+      <w:bookmarkEnd w:id="31"/>
+      <w:r>
+        <w:rPr>
+          <w:rFonts w:ascii="Arial Narrow" w:eastAsia="Times New Roman" w:hAnsi="Arial Narrow" w:cs="Arial"/>
+          <w:color w:val="000000"/>
+          <w:kern w:val="0"/>
           <w:lang w:val="es-ES" w:eastAsia="es-ES"/>
-          <w14:ligatures w14:val="none"/>
-        </w:rPr>
-      </w:pPr>
-      <w:r>
-        <w:rPr>
-          <w:rFonts w:ascii="Arial Narrow" w:eastAsia="Arial Narrow" w:hAnsi="Arial Narrow" w:cs="Arial Narrow"/>
-          <w:b/>
-          <w:color w:val="000000"/>
-          <w:kern w:val="0"/>
-          <w:lang w:eastAsia="es-PE"/>
-          <w14:ligatures w14:val="none"/>
-        </w:rPr>
-        <w:t xml:space="preserve">QUINTO: </w:t>
-      </w:r>
-      <w:bookmarkStart w:id="30" w:name="_Hlk188286813"/>
+          <ns2:ligatures ns2:val="none"/>
+        </w:rPr>
+        <w:t xml:space="preserve">cumpla con: (i) presentar una copia completa, legible y debidamente suscrita de la </w:t>
+      </w:r>
       <w:r>
         <w:rPr>
           <w:rFonts w:ascii="Arial Narrow" w:eastAsia="Times New Roman" w:hAnsi="Arial Narrow" w:cs="Arial"/>
           <w:color w:val="000000"/>
           <w:kern w:val="0"/>
+          <w:lang w:val="es-ES" w:eastAsia="es-ES"/>
+          <ns2:ligatures ns2:val="none"/>
+        </w:rPr>
+        <w:t xml:space="preserve">Póliza  30150448 del </w:t>
+      </w:r>
+      <w:r>
+        <w:rPr>
+          <w:rFonts w:ascii="Arial Narrow" w:eastAsia="Times New Roman" w:hAnsi="Arial Narrow" w:cs="Arial"/>
+          <w:color w:val="000000"/>
+          <w:kern w:val="0"/>
           <w:lang w:eastAsia="es-ES"/>
-          <w14:ligatures w14:val="none"/>
-        </w:rPr>
-        <w:t xml:space="preserve">requerir </w:t>
+          <ns2:ligatures ns2:val="none"/>
+        </w:rPr>
+        <w:t>Seguro Complementario de Trabajo de Riesgo</w:t>
       </w:r>
       <w:r>
         <w:rPr>
@@ -3143,260 +3155,176 @@
           <w:color w:val="000000"/>
           <w:kern w:val="0"/>
           <w:lang w:val="es-ES" w:eastAsia="es-ES"/>
-          <w14:ligatures w14:val="none"/>
-        </w:rPr>
-        <w:t xml:space="preserve">que, en un </w:t>
+          <ns2:ligatures ns2:val="none"/>
+        </w:rPr>
+        <w:t>, así como el cargo de remisión de la póliza</w:t>
       </w:r>
       <w:r>
         <w:rPr>
           <w:rFonts w:ascii="Arial Narrow" w:eastAsia="Times New Roman" w:hAnsi="Arial Narrow" w:cs="Arial"/>
           <w:color w:val="000000"/>
           <w:kern w:val="0"/>
+          <w:lang w:val="es-ES" w:eastAsia="es-ES"/>
+          <ns2:ligatures ns2:val="none"/>
+        </w:rPr>
+        <w:t xml:space="preserve">; (ii) presentar los medios probatorios que acrediten </w:t>
+      </w:r>
+      <w:r>
+        <w:rPr>
+          <w:rFonts w:ascii="Arial Narrow" w:eastAsia="Times New Roman" w:hAnsi="Arial Narrow" w:cs="Arial"/>
+          <w:color w:val="000000"/>
+          <w:kern w:val="0"/>
+          <w:lang w:val="es-ES" w:eastAsia="es-ES"/>
+          <ns2:ligatures ns2:val="none"/>
+        </w:rPr>
+        <w:t xml:space="preserve">que el cálculo realizado para definir el monto de la liquidación única total y definitiva de la Póliza  30150448 del </w:t>
+      </w:r>
+      <w:r>
+        <w:rPr>
+          <w:rFonts w:ascii="Arial Narrow" w:eastAsia="Times New Roman" w:hAnsi="Arial Narrow" w:cs="Arial"/>
+          <w:color w:val="000000"/>
+          <w:kern w:val="0"/>
           <w:lang w:eastAsia="es-ES"/>
-          <w14:ligatures w14:val="none"/>
-        </w:rPr>
-        <w:t>plazo no mayor de cinco (5) días hábiles contado a partir del día siguiente de la notificación de la presente resolución</w:t>
-      </w:r>
-      <w:bookmarkEnd w:id="30"/>
+          <ns2:ligatures ns2:val="none"/>
+        </w:rPr>
+        <w:t xml:space="preserve">Seguro Complementario de Trabajo de Riesgo </w:t>
+      </w:r>
       <w:r>
         <w:rPr>
           <w:rFonts w:ascii="Arial Narrow" w:eastAsia="Times New Roman" w:hAnsi="Arial Narrow" w:cs="Arial"/>
           <w:color w:val="000000"/>
           <w:kern w:val="0"/>
+          <w:lang w:val="es-ES" w:eastAsia="es-ES"/>
+          <ns2:ligatures ns2:val="none"/>
+        </w:rPr>
+        <w:t>fue acorde a la normativa actual</w:t>
+      </w:r>
+      <w:r>
+        <w:rPr>
+          <w:rFonts w:ascii="Arial Narrow" w:eastAsia="Times New Roman" w:hAnsi="Arial Narrow" w:cs="Arial"/>
+          <w:color w:val="000000"/>
+          <w:kern w:val="0"/>
           <w:lang w:eastAsia="es-ES"/>
-          <w14:ligatures w14:val="none"/>
-        </w:rPr>
-        <w:t xml:space="preserve">, </w:t>
-      </w:r>
-      <w:bookmarkStart w:id="31" w:name="_Hlk188286828"/>
+          <ns2:ligatures ns2:val="none"/>
+        </w:rPr>
+        <w:t xml:space="preserve">; y, (iii) </w:t>
+      </w:r>
+      <w:r>
+        <w:rPr>
+          <w:rFonts w:ascii="Arial Narrow" w:eastAsia="Times New Roman" w:hAnsi="Arial Narrow" w:cs="Arial"/>
+          <w:color w:val="000000"/>
+          <w:kern w:val="0"/>
+          <w:lang w:val="es-ES" w:eastAsia="es-ES"/>
+          <ns2:ligatures ns2:val="none"/>
+        </w:rPr>
+        <w:t xml:space="preserve">presentar todas las comunicaciones cursadas </w:t>
+      </w:r>
+      <w:r>
+        <w:rPr>
+          <w:rFonts w:ascii="Arial Narrow" w:eastAsia="Times New Roman" w:hAnsi="Arial Narrow" w:cs="Arial"/>
+          <w:color w:val="000000"/>
+          <w:kern w:val="0"/>
+          <w:lang w:val="es-ES" w:eastAsia="es-ES"/>
+          <ns2:ligatures ns2:val="none"/>
+        </w:rPr>
+        <w:t xml:space="preserve">con la parte denunciante </w:t>
+      </w:r>
+      <w:r>
+        <w:rPr>
+          <w:rFonts w:ascii="Arial Narrow" w:eastAsia="Times New Roman" w:hAnsi="Arial Narrow" w:cs="Arial"/>
+          <w:color w:val="000000"/>
+          <w:kern w:val="0"/>
+          <w:lang w:val="es-ES" w:eastAsia="es-ES"/>
+          <ns2:ligatures ns2:val="none"/>
+        </w:rPr>
+        <w:t xml:space="preserve">en virtud </w:t>
+      </w:r>
+      <w:r>
+        <w:rPr>
+          <w:rFonts w:ascii="Arial Narrow" w:eastAsia="Times New Roman" w:hAnsi="Arial Narrow" w:cs="Arial"/>
+          <w:color w:val="000000"/>
+          <w:kern w:val="0"/>
+          <w:lang w:val="es-ES" w:eastAsia="es-ES"/>
+          <ns2:ligatures ns2:val="none"/>
+        </w:rPr>
+        <w:t xml:space="preserve">de los hechos materia </w:t>
+      </w:r>
+      <w:r>
+        <w:rPr>
+          <w:rFonts w:ascii="Arial Narrow" w:eastAsia="Times New Roman" w:hAnsi="Arial Narrow" w:cs="Arial"/>
+          <w:color w:val="000000"/>
+          <w:kern w:val="0"/>
+          <w:lang w:val="es-ES" w:eastAsia="es-ES"/>
+          <ns2:ligatures ns2:val="none"/>
+        </w:rPr>
+        <w:t>de denuncia.</w:t>
+      </w:r>
+    </w:p>
+    <w:p ns2:paraId="12A4D8BD" ns2:textId="77777777">
+      <w:pPr>
+        <w:spacing w:after="0" w:line="240" w:lineRule="auto"/>
+        <w:jc w:val="both"/>
+        <w:rPr>
+          <w:rFonts w:ascii="Arial Narrow" w:eastAsia="Arial Narrow" w:hAnsi="Arial Narrow" w:cs="Arial Narrow"/>
+          <w:b/>
+          <w:color w:val="000000"/>
+          <w:kern w:val="0"/>
+          <w:lang w:val="es-ES" w:eastAsia="es-PE"/>
+          <ns2:ligatures ns2:val="none"/>
+        </w:rPr>
+      </w:pPr>
+    </w:p>
+    <w:p ns2:paraId="591B7E6F" ns2:textId="62D015BB">
+      <w:pPr>
+        <w:spacing w:after="0" w:line="240" w:lineRule="auto"/>
+        <w:jc w:val="both"/>
+        <w:rPr>
+          <w:rFonts w:ascii="Arial Narrow" w:eastAsia="Arial Narrow" w:hAnsi="Arial Narrow" w:cs="Arial Narrow"/>
+          <w:color w:val="000000"/>
+          <w:kern w:val="0"/>
+          <w:lang w:eastAsia="es-PE"/>
+          <ns2:ligatures ns2:val="none"/>
+        </w:rPr>
+      </w:pPr>
+      <w:r>
+        <w:rPr>
+          <w:rFonts w:ascii="Arial Narrow" w:eastAsia="Arial Narrow" w:hAnsi="Arial Narrow" w:cs="Arial Narrow"/>
+          <w:b/>
+          <w:color w:val="000000"/>
+          <w:kern w:val="0"/>
+          <w:lang w:eastAsia="es-PE"/>
+          <ns2:ligatures ns2:val="none"/>
+        </w:rPr>
+        <w:t>SEXTO:</w:t>
+      </w:r>
+      <w:r>
+        <w:rPr>
+          <w:rFonts w:ascii="Arial Narrow" w:eastAsia="Arial Narrow" w:hAnsi="Arial Narrow" w:cs="Arial Narrow"/>
+          <w:color w:val="000000"/>
+          <w:kern w:val="0"/>
+          <w:lang w:eastAsia="es-PE"/>
+          <ns2:ligatures ns2:val="none"/>
+        </w:rPr>
+        <w:t xml:space="preserve"> </w:t>
+      </w:r>
+      <w:bookmarkStart w:id="32" w:name="_Hlk188286915"/>
+      <w:r>
+        <w:rPr>
+          <w:rFonts w:ascii="Arial Narrow" w:eastAsia="Arial Narrow" w:hAnsi="Arial Narrow" w:cs="Arial Narrow"/>
+          <w:color w:val="000000"/>
+          <w:kern w:val="0"/>
+          <w:lang w:eastAsia="es-PE"/>
+          <ns2:ligatures ns2:val="none"/>
+        </w:rPr>
+        <w:t xml:space="preserve">informar a las partes que el artículo 110 de la Ley </w:t>
+      </w:r>
       <w:r>
         <w:rPr>
           <w:rFonts w:ascii="Arial Narrow" w:eastAsia="Times New Roman" w:hAnsi="Arial Narrow" w:cs="Times New Roman"/>
-          <w:color w:val="000000"/>
           <w:kern w:val="0"/>
           <w:shd w:val="clear" w:color="auto" w:fill="FFFFFF"/>
           <w:lang w:eastAsia="es-PE"/>
-          <w14:ligatures w14:val="none"/>
-        </w:rPr>
-        <w:t>el proveedor denunciado</w:t>
-      </w:r>
-      <w:r>
-        <w:rPr>
-          <w:rFonts w:ascii="Arial Narrow" w:eastAsia="Times New Roman" w:hAnsi="Arial Narrow" w:cs="Arial"/>
-          <w:color w:val="000000"/>
-          <w:kern w:val="0"/>
-          <w:lang w:eastAsia="es-ES"/>
-          <w14:ligatures w14:val="none"/>
-        </w:rPr>
-        <w:t xml:space="preserve"> </w:t>
-      </w:r>
-      <w:bookmarkEnd w:id="31"/>
-      <w:r>
-        <w:rPr>
-          <w:rFonts w:ascii="Arial Narrow" w:eastAsia="Times New Roman" w:hAnsi="Arial Narrow" w:cs="Arial"/>
-          <w:color w:val="000000"/>
-          <w:kern w:val="0"/>
-          <w:lang w:val="es-ES" w:eastAsia="es-ES"/>
-          <w14:ligatures w14:val="none"/>
-        </w:rPr>
-        <w:t xml:space="preserve">cumpla con: (i) presentar una copia completa, legible y debidamente suscrita de la </w:t>
-      </w:r>
-      <w:r>
-        <w:rPr>
-          <w:rFonts w:ascii="Arial Narrow" w:eastAsia="Times New Roman" w:hAnsi="Arial Narrow" w:cs="Arial"/>
-          <w:color w:val="000000"/>
-          <w:kern w:val="0"/>
-          <w:lang w:val="es-ES" w:eastAsia="es-ES"/>
-          <w14:ligatures w14:val="none"/>
-        </w:rPr>
-        <w:t xml:space="preserve">Póliza  30150448 del </w:t>
-      </w:r>
-      <w:r>
-        <w:rPr>
-          <w:rFonts w:ascii="Arial Narrow" w:eastAsia="Times New Roman" w:hAnsi="Arial Narrow" w:cs="Arial"/>
-          <w:color w:val="000000"/>
-          <w:kern w:val="0"/>
-          <w:lang w:eastAsia="es-ES"/>
-          <w14:ligatures w14:val="none"/>
-        </w:rPr>
-        <w:t>Seguro Complementario de Trabajo de Riesgo</w:t>
-      </w:r>
-      <w:r>
-        <w:rPr>
-          <w:rFonts w:ascii="Arial Narrow" w:eastAsia="Times New Roman" w:hAnsi="Arial Narrow" w:cs="Arial"/>
-          <w:color w:val="000000"/>
-          <w:kern w:val="0"/>
-          <w:lang w:val="es-ES" w:eastAsia="es-ES"/>
-          <w14:ligatures w14:val="none"/>
-        </w:rPr>
-        <w:t>, así como el cargo de remisión de la póliza</w:t>
-      </w:r>
-      <w:r>
-        <w:rPr>
-          <w:rFonts w:ascii="Arial Narrow" w:eastAsia="Times New Roman" w:hAnsi="Arial Narrow" w:cs="Arial"/>
-          <w:color w:val="000000"/>
-          <w:kern w:val="0"/>
-          <w:lang w:val="es-ES" w:eastAsia="es-ES"/>
-          <w14:ligatures w14:val="none"/>
-        </w:rPr>
-        <w:t xml:space="preserve">; (ii) presentar los medios probatorios que acrediten </w:t>
-      </w:r>
-      <w:r>
-        <w:rPr>
-          <w:rFonts w:ascii="Arial Narrow" w:eastAsia="Times New Roman" w:hAnsi="Arial Narrow" w:cs="Arial"/>
-          <w:color w:val="000000"/>
-          <w:kern w:val="0"/>
-          <w:lang w:val="es-ES" w:eastAsia="es-ES"/>
-          <w14:ligatures w14:val="none"/>
-        </w:rPr>
-        <w:t xml:space="preserve">que el cálculo realizado para definir el monto de la liquidación única total y definitiva de la Póliza  30150448 del </w:t>
-      </w:r>
-      <w:r>
-        <w:rPr>
-          <w:rFonts w:ascii="Arial Narrow" w:eastAsia="Times New Roman" w:hAnsi="Arial Narrow" w:cs="Arial"/>
-          <w:color w:val="000000"/>
-          <w:kern w:val="0"/>
-          <w:lang w:eastAsia="es-ES"/>
-          <w14:ligatures w14:val="none"/>
-        </w:rPr>
-        <w:t xml:space="preserve">Seguro Complementario de Trabajo de Riesgo </w:t>
-      </w:r>
-      <w:r>
-        <w:rPr>
-          <w:rFonts w:ascii="Arial Narrow" w:eastAsia="Times New Roman" w:hAnsi="Arial Narrow" w:cs="Arial"/>
-          <w:color w:val="000000"/>
-          <w:kern w:val="0"/>
-          <w:lang w:val="es-ES" w:eastAsia="es-ES"/>
-          <w14:ligatures w14:val="none"/>
-        </w:rPr>
-        <w:t>fue acorde a la normativa actual</w:t>
-      </w:r>
-      <w:r>
-        <w:rPr>
-          <w:rFonts w:ascii="Arial Narrow" w:eastAsia="Times New Roman" w:hAnsi="Arial Narrow" w:cs="Arial"/>
-          <w:color w:val="000000"/>
-          <w:kern w:val="0"/>
-          <w:lang w:eastAsia="es-ES"/>
-          <w14:ligatures w14:val="none"/>
-        </w:rPr>
-        <w:t xml:space="preserve">; y, (iii) </w:t>
-      </w:r>
-      <w:r>
-        <w:rPr>
-          <w:rFonts w:ascii="Arial Narrow" w:eastAsia="Times New Roman" w:hAnsi="Arial Narrow" w:cs="Arial"/>
-          <w:color w:val="000000"/>
-          <w:kern w:val="0"/>
-          <w:lang w:val="es-ES" w:eastAsia="es-ES"/>
-          <w14:ligatures w14:val="none"/>
-        </w:rPr>
-        <w:t xml:space="preserve">presentar todas las comunicaciones cursadas </w:t>
-      </w:r>
-      <w:r>
-        <w:rPr>
-          <w:rFonts w:ascii="Arial Narrow" w:eastAsia="Times New Roman" w:hAnsi="Arial Narrow" w:cs="Arial"/>
-          <w:color w:val="000000"/>
-          <w:kern w:val="0"/>
-          <w:lang w:val="es-ES" w:eastAsia="es-ES"/>
-          <w14:ligatures w14:val="none"/>
-        </w:rPr>
-        <w:t xml:space="preserve">con la parte denunciante </w:t>
-      </w:r>
-      <w:r>
-        <w:rPr>
-          <w:rFonts w:ascii="Arial Narrow" w:eastAsia="Times New Roman" w:hAnsi="Arial Narrow" w:cs="Arial"/>
-          <w:color w:val="000000"/>
-          <w:kern w:val="0"/>
-          <w:lang w:val="es-ES" w:eastAsia="es-ES"/>
-          <w14:ligatures w14:val="none"/>
-        </w:rPr>
-        <w:t xml:space="preserve">en virtud </w:t>
-      </w:r>
-      <w:r>
-        <w:rPr>
-          <w:rFonts w:ascii="Arial Narrow" w:eastAsia="Times New Roman" w:hAnsi="Arial Narrow" w:cs="Arial"/>
-          <w:color w:val="000000"/>
-          <w:kern w:val="0"/>
-          <w:lang w:val="es-ES" w:eastAsia="es-ES"/>
-          <w14:ligatures w14:val="none"/>
-        </w:rPr>
-        <w:t xml:space="preserve">de los hechos materia </w:t>
-      </w:r>
-      <w:r>
-        <w:rPr>
-          <w:rFonts w:ascii="Arial Narrow" w:eastAsia="Times New Roman" w:hAnsi="Arial Narrow" w:cs="Arial"/>
-          <w:color w:val="000000"/>
-          <w:kern w:val="0"/>
-          <w:lang w:val="es-ES" w:eastAsia="es-ES"/>
-          <w14:ligatures w14:val="none"/>
-        </w:rPr>
-        <w:t>de denuncia.</w:t>
-      </w:r>
-    </w:p>
-    <w:p>
-      <w:pPr>
-        <w:spacing w:after="0" w:line="240" w:lineRule="auto"/>
-        <w:jc w:val="both"/>
-        <w:rPr>
-          <w:rFonts w:ascii="Arial Narrow" w:eastAsia="Arial Narrow" w:hAnsi="Arial Narrow" w:cs="Arial Narrow"/>
-          <w:b/>
-          <w:color w:val="000000"/>
-          <w:kern w:val="0"/>
-          <w:lang w:val="es-ES" w:eastAsia="es-PE"/>
-          <w14:ligatures w14:val="none"/>
-        </w:rPr>
-      </w:pPr>
-    </w:p>
-    <w:p>
-      <w:pPr>
-        <w:spacing w:after="0" w:line="240" w:lineRule="auto"/>
-        <w:jc w:val="both"/>
-        <w:rPr>
-          <w:rFonts w:ascii="Arial Narrow" w:eastAsia="Arial Narrow" w:hAnsi="Arial Narrow" w:cs="Arial Narrow"/>
-          <w:color w:val="000000"/>
-          <w:kern w:val="0"/>
-          <w:lang w:eastAsia="es-PE"/>
-          <w14:ligatures w14:val="none"/>
-        </w:rPr>
-      </w:pPr>
-      <w:r>
-        <w:rPr>
-          <w:rFonts w:ascii="Arial Narrow" w:eastAsia="Arial Narrow" w:hAnsi="Arial Narrow" w:cs="Arial Narrow"/>
-          <w:b/>
-          <w:color w:val="000000"/>
-          <w:kern w:val="0"/>
-          <w:lang w:eastAsia="es-PE"/>
-          <w14:ligatures w14:val="none"/>
-        </w:rPr>
-        <w:t>SEXTO:</w:t>
-      </w:r>
-      <w:r>
-        <w:rPr>
-          <w:rFonts w:ascii="Arial Narrow" w:eastAsia="Arial Narrow" w:hAnsi="Arial Narrow" w:cs="Arial Narrow"/>
-          <w:color w:val="000000"/>
-          <w:kern w:val="0"/>
-          <w:lang w:eastAsia="es-PE"/>
-          <w14:ligatures w14:val="none"/>
-        </w:rPr>
-        <w:t xml:space="preserve"> </w:t>
-      </w:r>
-      <w:bookmarkStart w:id="32" w:name="_Hlk188286915"/>
-      <w:r>
-        <w:rPr>
-          <w:rFonts w:ascii="Arial Narrow" w:eastAsia="Arial Narrow" w:hAnsi="Arial Narrow" w:cs="Arial Narrow"/>
-          <w:color w:val="000000"/>
-          <w:kern w:val="0"/>
-          <w:lang w:eastAsia="es-PE"/>
-          <w14:ligatures w14:val="none"/>
-        </w:rPr>
-        <w:t xml:space="preserve">informar a las partes que el artículo 110 de la Ley </w:t>
-      </w:r>
-      <w:r>
-        <w:rPr>
-          <w:rFonts w:ascii="Arial Narrow" w:eastAsia="Times New Roman" w:hAnsi="Arial Narrow" w:cs="Times New Roman"/>
-          <w:kern w:val="0"/>
-          <w:shd w:val="clear" w:color="auto" w:fill="FFFFFF"/>
-          <w:lang w:eastAsia="es-PE"/>
-          <w14:ligatures w14:val="none"/>
+          <ns2:ligatures ns2:val="none"/>
         </w:rPr>
         <w:t>29571</w:t>
       </w:r>
@@ -3406,7 +3334,7 @@
           <w:color w:val="000000"/>
           <w:kern w:val="0"/>
           <w:lang w:eastAsia="es-PE"/>
-          <w14:ligatures w14:val="none"/>
+          <ns2:ligatures ns2:val="none"/>
         </w:rPr>
         <w:t>, Código de Protección y Defensa del Consumidor</w:t>
       </w:r>
@@ -3418,7 +3346,7 @@
           <w:kern w:val="0"/>
           <w:vertAlign w:val="superscript"/>
           <w:lang w:eastAsia="es-PE"/>
-          <w14:ligatures w14:val="none"/>
+          <ns2:ligatures ns2:val="none"/>
         </w:rPr>
         <w:footnoteReference w:id="12"/>
       </w:r>
@@ -3428,7 +3356,7 @@
           <w:color w:val="000000"/>
           <w:kern w:val="0"/>
           <w:lang w:eastAsia="es-PE"/>
-          <w14:ligatures w14:val="none"/>
+          <ns2:ligatures ns2:val="none"/>
         </w:rPr>
         <w:t xml:space="preserve">, faculta a la Comisión a calificar las infracciones de la referida norma como leves, graves o muy graves e imponer sanciones que van desde una amonestación hasta una multa por un máximo de 450 </w:t>
       </w:r>
@@ -3438,7 +3366,7 @@
           <w:color w:val="000000"/>
           <w:kern w:val="0"/>
           <w:lang w:eastAsia="es-PE"/>
-          <w14:ligatures w14:val="none"/>
+          <ns2:ligatures ns2:val="none"/>
         </w:rPr>
         <w:lastRenderedPageBreak/>
         <w:t>Unidades Impositivas Tributarias, sin perjuicio de las medidas correctivas, reparadoras y complementarias, que puedan ordenarse de acuerdo a lo estipulado en los artículos 114, 115 y 116 de la referida norma</w:t>
@@ -3451,7 +3379,7 @@
           <w:kern w:val="0"/>
           <w:vertAlign w:val="superscript"/>
           <w:lang w:eastAsia="es-PE"/>
-          <w14:ligatures w14:val="none"/>
+          <ns2:ligatures ns2:val="none"/>
         </w:rPr>
         <w:footnoteReference w:id="13"/>
       </w:r>
@@ -3461,7 +3389,7 @@
           <w:color w:val="000000"/>
           <w:kern w:val="0"/>
           <w:lang w:eastAsia="es-PE"/>
-          <w14:ligatures w14:val="none"/>
+          <ns2:ligatures ns2:val="none"/>
         </w:rPr>
         <w:t xml:space="preserve">. </w:t>
       </w:r>
@@ -3472,7 +3400,7 @@
           <w:color w:val="000000"/>
           <w:kern w:val="0"/>
           <w:lang w:eastAsia="es-PE"/>
-          <w14:ligatures w14:val="none"/>
+          <ns2:ligatures ns2:val="none"/>
         </w:rPr>
         <w:lastRenderedPageBreak/>
         <w:t>Asimismo, se consideran circunstancias atenuantes para la graduación de la sanción, el allanamiento de la denuncia o el reconocimiento de las pretensiones en ella contenidas, de acuerdo con el artículo 112 del Código</w:t>
@@ -3485,7 +3413,7 @@
           <w:kern w:val="0"/>
           <w:vertAlign w:val="superscript"/>
           <w:lang w:eastAsia="es-PE"/>
-          <w14:ligatures w14:val="none"/>
+          <ns2:ligatures ns2:val="none"/>
         </w:rPr>
         <w:footnoteReference w:id="14"/>
       </w:r>
@@ -3495,12 +3423,12 @@
           <w:color w:val="000000"/>
           <w:kern w:val="0"/>
           <w:lang w:eastAsia="es-PE"/>
-          <w14:ligatures w14:val="none"/>
+          <ns2:ligatures ns2:val="none"/>
         </w:rPr>
         <w:t>.</w:t>
       </w:r>
     </w:p>
-    <w:p>
+    <w:p ns2:paraId="0ECE55DF" ns2:textId="77777777">
       <w:pPr>
         <w:shd w:val="clear" w:color="auto" w:fill="FFFFFF"/>
         <w:spacing w:after="0" w:line="240" w:lineRule="auto"/>
@@ -3511,11 +3439,11 @@
           <w:color w:val="000000"/>
           <w:kern w:val="0"/>
           <w:lang w:eastAsia="es-PE"/>
-          <w14:ligatures w14:val="none"/>
-        </w:rPr>
-      </w:pPr>
-    </w:p>
-    <w:p>
+          <ns2:ligatures ns2:val="none"/>
+        </w:rPr>
+      </w:pPr>
+    </w:p>
+    <w:p ns2:paraId="1CC114EB" ns2:textId="27EE39A5">
       <w:pPr>
         <w:shd w:val="clear" w:color="auto" w:fill="FFFFFF"/>
         <w:spacing w:after="0" w:line="240" w:lineRule="auto"/>
@@ -3525,17 +3453,17 @@
           <w:color w:val="000000"/>
           <w:kern w:val="0"/>
           <w:lang w:eastAsia="es-PE"/>
-          <w14:ligatures w14:val="none"/>
-        </w:rPr>
-      </w:pPr>
-      <w:r>
-        <w:rPr>
-          <w:rFonts w:ascii="Arial Narrow" w:eastAsia="Arial Narrow" w:hAnsi="Arial Narrow" w:cs="Arial Narrow"/>
-          <w:b/>
-          <w:color w:val="000000"/>
-          <w:kern w:val="0"/>
-          <w:lang w:eastAsia="es-PE"/>
-          <w14:ligatures w14:val="none"/>
+          <ns2:ligatures ns2:val="none"/>
+        </w:rPr>
+      </w:pPr>
+      <w:r>
+        <w:rPr>
+          <w:rFonts w:ascii="Arial Narrow" w:eastAsia="Arial Narrow" w:hAnsi="Arial Narrow" w:cs="Arial Narrow"/>
+          <w:b/>
+          <w:color w:val="000000"/>
+          <w:kern w:val="0"/>
+          <w:lang w:eastAsia="es-PE"/>
+          <ns2:ligatures ns2:val="none"/>
         </w:rPr>
         <w:t>SÉTIMO:</w:t>
       </w:r>
@@ -3545,12 +3473,12 @@
           <w:color w:val="000000"/>
           <w:kern w:val="0"/>
           <w:lang w:eastAsia="es-PE"/>
-          <w14:ligatures w14:val="none"/>
+          <ns2:ligatures ns2:val="none"/>
         </w:rPr>
         <w:t xml:space="preserve"> informar a las partes que conforme a lo establecido en el artículo 39 de la Ley sobre Facultades, Normas y Organización del Indecopi, aprobada por Decreto Legislativo 807, los gastos por los peritajes realizados, actuación de pruebas, inspecciones y otros derivados de la tramitación del proceso serán de cargo de la parte que solicita la prueba, salvo pacto en contrario. En todos los casos, la resolución final determinará si los gastos deben ser asumidos por alguna de las partes, o reembolsados a la otra parte o al Indecopi, según sea el caso, de manera adicional a la sanción que haya podido imponerse. </w:t>
       </w:r>
     </w:p>
-    <w:p>
+    <w:p ns2:paraId="364C4B19" ns2:textId="77777777">
       <w:pPr>
         <w:shd w:val="clear" w:color="auto" w:fill="FFFFFF"/>
         <w:spacing w:after="0" w:line="240" w:lineRule="auto"/>
@@ -3560,11 +3488,11 @@
           <w:color w:val="000000"/>
           <w:kern w:val="0"/>
           <w:lang w:eastAsia="es-PE"/>
-          <w14:ligatures w14:val="none"/>
-        </w:rPr>
-      </w:pPr>
-    </w:p>
-    <w:p>
+          <ns2:ligatures ns2:val="none"/>
+        </w:rPr>
+      </w:pPr>
+    </w:p>
+    <w:p ns2:paraId="27E9BBC0" ns2:textId="79262C3B">
       <w:pPr>
         <w:suppressAutoHyphens/>
         <w:spacing w:after="0" w:line="240" w:lineRule="auto"/>
@@ -3573,7 +3501,7 @@
           <w:rFonts w:ascii="Arial Narrow" w:eastAsia="Calibri" w:hAnsi="Arial Narrow" w:cs="Arial"/>
           <w:kern w:val="0"/>
           <w:u w:val="single"/>
-          <w14:ligatures w14:val="none"/>
+          <ns2:ligatures ns2:val="none"/>
         </w:rPr>
       </w:pPr>
       <w:r>
@@ -3582,7 +3510,7 @@
           <w:b/>
           <w:bCs/>
           <w:kern w:val="0"/>
-          <w14:ligatures w14:val="none"/>
+          <ns2:ligatures ns2:val="none"/>
         </w:rPr>
         <w:t>OCTAVO</w:t>
       </w:r>
@@ -3591,7 +3519,7 @@
           <w:rFonts w:ascii="Arial Narrow" w:eastAsia="Calibri" w:hAnsi="Arial Narrow" w:cs="Arial"/>
           <w:b/>
           <w:kern w:val="0"/>
-          <w14:ligatures w14:val="none"/>
+          <ns2:ligatures ns2:val="none"/>
         </w:rPr>
         <w:t>:</w:t>
       </w:r>
@@ -3599,7 +3527,7 @@
         <w:rPr>
           <w:rFonts w:ascii="Arial Narrow" w:eastAsia="Calibri" w:hAnsi="Arial Narrow" w:cs="Arial"/>
           <w:kern w:val="0"/>
-          <w14:ligatures w14:val="none"/>
+          <ns2:ligatures ns2:val="none"/>
         </w:rPr>
         <w:t xml:space="preserve"> comunicar a las partes que, de acuerdo a lo señalado por el artículo 29 del Decreto Legislativo  807</w:t>
       </w:r>
@@ -3609,7 +3537,7 @@
           <w:rFonts w:ascii="Arial Narrow" w:eastAsia="Calibri" w:hAnsi="Arial Narrow" w:cs="Arial"/>
           <w:kern w:val="0"/>
           <w:vertAlign w:val="superscript"/>
-          <w14:ligatures w14:val="none"/>
+          <ns2:ligatures ns2:val="none"/>
         </w:rPr>
         <w:footnoteReference w:id="15"/>
       </w:r>
@@ -3617,7 +3545,7 @@
         <w:rPr>
           <w:rFonts w:ascii="Arial Narrow" w:eastAsia="Calibri" w:hAnsi="Arial Narrow" w:cs="Arial"/>
           <w:kern w:val="0"/>
-          <w14:ligatures w14:val="none"/>
+          <ns2:ligatures ns2:val="none"/>
         </w:rPr>
         <w:t xml:space="preserve">, hasta antes de la emisión de la Resolución Final tienen la posibilidad de solicitar una audiencia de conciliación. En caso deleguen a favor de una tercera persona su actuación en la diligencia programada, ésta deberá presentar un poder especial con firma legalizada ante Notario Público, donde conste </w:t>
       </w:r>
@@ -3626,7 +3554,7 @@
           <w:rFonts w:ascii="Arial Narrow" w:eastAsia="Calibri" w:hAnsi="Arial Narrow" w:cs="Arial"/>
           <w:kern w:val="0"/>
           <w:u w:val="single"/>
-          <w14:ligatures w14:val="none"/>
+          <ns2:ligatures ns2:val="none"/>
         </w:rPr>
         <w:t>expresamente su facultad para asistir y conciliar en su representación</w:t>
       </w:r>
@@ -3635,7 +3563,7 @@
           <w:rFonts w:ascii="Arial Narrow" w:eastAsia="Calibri" w:hAnsi="Arial Narrow" w:cs="Arial"/>
           <w:bCs/>
           <w:kern w:val="0"/>
-          <w14:ligatures w14:val="none"/>
+          <ns2:ligatures ns2:val="none"/>
         </w:rPr>
         <w:t>.</w:t>
       </w:r>
@@ -3645,7 +3573,7 @@
           <w:b/>
           <w:bCs/>
           <w:kern w:val="0"/>
-          <w14:ligatures w14:val="none"/>
+          <ns2:ligatures ns2:val="none"/>
         </w:rPr>
         <w:t xml:space="preserve"> </w:t>
       </w:r>
@@ -3654,12 +3582,12 @@
           <w:rFonts w:ascii="Arial Narrow" w:eastAsia="Calibri" w:hAnsi="Arial Narrow" w:cs="Arial"/>
           <w:kern w:val="0"/>
           <w:u w:val="single"/>
-          <w14:ligatures w14:val="none"/>
+          <ns2:ligatures ns2:val="none"/>
         </w:rPr>
         <w:t xml:space="preserve">Ello bajo apercibimiento de no realizar la audiencia de conciliación y levantar el acta de inasistencia correspondiente. </w:t>
       </w:r>
     </w:p>
-    <w:p>
+    <w:p ns2:paraId="4CD47B08" ns2:textId="77777777">
       <w:pPr>
         <w:suppressAutoHyphens/>
         <w:spacing w:after="0" w:line="240" w:lineRule="auto"/>
@@ -3668,11 +3596,11 @@
           <w:rFonts w:ascii="Arial Narrow" w:eastAsia="Calibri" w:hAnsi="Arial Narrow" w:cs="Arial"/>
           <w:kern w:val="0"/>
           <w:u w:val="single"/>
-          <w14:ligatures w14:val="none"/>
-        </w:rPr>
-      </w:pPr>
-    </w:p>
-    <w:p>
+          <ns2:ligatures ns2:val="none"/>
+        </w:rPr>
+      </w:pPr>
+    </w:p>
+    <w:p ns2:paraId="0E80CA49" ns2:textId="77777777">
       <w:pPr>
         <w:suppressAutoHyphens/>
         <w:spacing w:after="0" w:line="240" w:lineRule="auto"/>
@@ -3682,7 +3610,7 @@
           <w:color w:val="000000"/>
           <w:kern w:val="0"/>
           <w:lang w:eastAsia="es-PE"/>
-          <w14:ligatures w14:val="none"/>
+          <ns2:ligatures ns2:val="none"/>
         </w:rPr>
       </w:pPr>
       <w:r>
@@ -3692,7 +3620,7 @@
           <w:color w:val="000000"/>
           <w:kern w:val="0"/>
           <w:lang w:eastAsia="es-PE"/>
-          <w14:ligatures w14:val="none"/>
+          <ns2:ligatures ns2:val="none"/>
         </w:rPr>
         <w:t>NOVENO:</w:t>
       </w:r>
@@ -3702,14 +3630,14 @@
           <w:color w:val="000000"/>
           <w:kern w:val="0"/>
           <w:lang w:eastAsia="es-PE"/>
-          <w14:ligatures w14:val="none"/>
+          <ns2:ligatures ns2:val="none"/>
         </w:rPr>
         <w:t xml:space="preserve"> poner en conocimiento de las partes que, antes de la emisión de la Resolución Final, tienen la posibilidad de formular su desistimiento o presentar el acuerdo arribado mediante la conciliación, mediación, transacción o cualquier otro que, de forma indubitable, deje constancia que se ha solucionado la controversia materia de denuncia.</w:t>
       </w:r>
       <w:bookmarkStart w:id="33" w:name="h.gjdgxs" w:colFirst="0" w:colLast="0"/>
       <w:bookmarkEnd w:id="33"/>
     </w:p>
-    <w:p>
+    <w:p ns2:paraId="7DDD06F7" ns2:textId="77777777">
       <w:pPr>
         <w:suppressAutoHyphens/>
         <w:spacing w:after="0" w:line="240" w:lineRule="auto"/>
@@ -3719,11 +3647,11 @@
           <w:color w:val="000000"/>
           <w:kern w:val="0"/>
           <w:lang w:eastAsia="es-PE"/>
-          <w14:ligatures w14:val="none"/>
-        </w:rPr>
-      </w:pPr>
-    </w:p>
-    <w:p>
+          <ns2:ligatures ns2:val="none"/>
+        </w:rPr>
+      </w:pPr>
+    </w:p>
+    <w:p ns2:paraId="00C1E8AE" ns2:textId="4F0BC1A3">
       <w:pPr>
         <w:suppressAutoHyphens/>
         <w:spacing w:after="0" w:line="240" w:lineRule="auto"/>
@@ -3746,7 +3674,7 @@
           <w:b/>
           <w:spacing w:val="-3"/>
           <w:kern w:val="0"/>
-          <w14:ligatures w14:val="none"/>
+          <ns2:ligatures ns2:val="none"/>
         </w:rPr>
         <w:t>:</w:t>
       </w:r>
@@ -3756,7 +3684,7 @@
           <w:bCs/>
           <w:spacing w:val="-3"/>
           <w:kern w:val="0"/>
-          <w14:ligatures w14:val="none"/>
+          <ns2:ligatures ns2:val="none"/>
         </w:rPr>
         <w:t xml:space="preserve"> requerir </w:t>
       </w:r>
@@ -3766,7 +3694,7 @@
           <w:bCs/>
           <w:spacing w:val="-3"/>
           <w:kern w:val="0"/>
-          <w14:ligatures w14:val="none"/>
+          <ns2:ligatures ns2:val="none"/>
         </w:rPr>
         <w:t xml:space="preserve">a la señora </w:t>
       </w:r>
@@ -3777,7 +3705,7 @@
           <w:kern w:val="0"/>
           <w:shd w:val="clear" w:color="auto" w:fill="FFFFFF"/>
           <w:lang w:eastAsia="es-PE"/>
-          <w14:ligatures w14:val="none"/>
+          <ns2:ligatures ns2:val="none"/>
         </w:rPr>
         <w:t xml:space="preserve">Liliana Ursula Asencios Malca </w:t>
       </w:r>
@@ -3881,7 +3809,7 @@
         <w:t>.</w:t>
       </w:r>
     </w:p>
-    <w:p>
+    <w:p ns2:paraId="61F34625" ns2:textId="77777777">
       <w:pPr>
         <w:suppressAutoHyphens/>
         <w:spacing w:after="0" w:line="240" w:lineRule="auto"/>
@@ -3891,7 +3819,7 @@
         </w:rPr>
       </w:pPr>
     </w:p>
-    <w:p>
+    <w:p ns2:paraId="083D8417" ns2:textId="77777777">
       <w:pPr>
         <w:suppressAutoHyphens/>
         <w:spacing w:after="0" w:line="240" w:lineRule="auto"/>
@@ -3980,7 +3908,7 @@
       </w:r>
       <w:bookmarkStart w:id="34" w:name="_Hlk198890962"/>
     </w:p>
-    <w:p>
+    <w:p ns2:paraId="3B012692" ns2:textId="77777777">
       <w:pPr>
         <w:suppressAutoHyphens/>
         <w:spacing w:after="0" w:line="240" w:lineRule="auto"/>
@@ -3995,7 +3923,7 @@
           <w:b/>
           <w:spacing w:val="-3"/>
           <w:kern w:val="0"/>
-          <w14:ligatures w14:val="none"/>
+          <ns2:ligatures ns2:val="none"/>
         </w:rPr>
         <w:t>DÉCIMO SEGUNDO:</w:t>
       </w:r>
@@ -4005,7 +3933,7 @@
           <w:bCs/>
           <w:spacing w:val="-3"/>
           <w:kern w:val="0"/>
-          <w14:ligatures w14:val="none"/>
+          <ns2:ligatures ns2:val="none"/>
         </w:rPr>
         <w:t xml:space="preserve"> requerir al</w:t>
       </w:r>
@@ -4022,7 +3950,7 @@
           <w:bCs/>
           <w:spacing w:val="-3"/>
           <w:kern w:val="0"/>
-          <w14:ligatures w14:val="none"/>
+          <ns2:ligatures ns2:val="none"/>
         </w:rPr>
         <w:t xml:space="preserve"> </w:t>
       </w:r>
@@ -4040,7 +3968,7 @@
           <w:color w:val="000000"/>
           <w:kern w:val="0"/>
           <w:lang w:eastAsia="es-PE"/>
-          <w14:ligatures w14:val="none"/>
+          <ns2:ligatures ns2:val="none"/>
         </w:rPr>
         <w:t>dentro del plazo de dos (2) días hábiles siguientes a la fecha en que reciba(NNN) la notificación en su domicilio procesal</w:t>
       </w:r>
@@ -4059,7 +3987,7 @@
         <w:t xml:space="preserve"> </w:t>
       </w:r>
     </w:p>
-    <w:p>
+    <w:p ns2:paraId="36317C11" ns2:textId="77777777">
       <w:pPr>
         <w:suppressAutoHyphens/>
         <w:spacing w:after="0" w:line="240" w:lineRule="auto"/>
@@ -4071,7 +3999,7 @@
       </w:pPr>
     </w:p>
     <w:bookmarkEnd w:id="34"/>
-    <w:p>
+    <w:p ns2:paraId="23716787" ns2:textId="77777777">
       <w:pPr>
         <w:suppressAutoHyphens/>
         <w:spacing w:after="0" w:line="240" w:lineRule="auto"/>
@@ -4081,22 +4009,22 @@
         </w:rPr>
       </w:pPr>
     </w:p>
-    <w:p>
-      <w:pPr>
-        <w:spacing w:after="0" w:line="240" w:lineRule="auto"/>
-        <w:jc w:val="both"/>
-        <w:rPr>
-          <w:rFonts w:ascii="Arial Narrow" w:eastAsia="Arial Narrow" w:hAnsi="Arial Narrow" w:cs="Arial Narrow"/>
-          <w:b/>
-          <w:color w:val="000000"/>
-          <w:kern w:val="0"/>
-          <w:lang w:eastAsia="es-PE"/>
-          <w14:ligatures w14:val="none"/>
+    <w:p ns2:paraId="418E1D52" ns2:textId="77777777">
+      <w:pPr>
+        <w:spacing w:after="0" w:line="240" w:lineRule="auto"/>
+        <w:jc w:val="both"/>
+        <w:rPr>
+          <w:rFonts w:ascii="Arial Narrow" w:eastAsia="Arial Narrow" w:hAnsi="Arial Narrow" w:cs="Arial Narrow"/>
+          <w:b/>
+          <w:color w:val="000000"/>
+          <w:kern w:val="0"/>
+          <w:lang w:eastAsia="es-PE"/>
+          <ns2:ligatures ns2:val="none"/>
         </w:rPr>
       </w:pPr>
     </w:p>
     <w:bookmarkEnd w:id="0"/>
-    <w:p>
+    <w:p ns2:paraId="2E71D930" ns2:textId="77777777">
       <w:pPr>
         <w:spacing w:after="0" w:line="240" w:lineRule="auto"/>
         <w:jc w:val="both"/>
@@ -4106,11 +4034,11 @@
           <w:color w:val="000000"/>
           <w:kern w:val="0"/>
           <w:lang w:val="es-ES" w:eastAsia="es-PE"/>
-          <w14:ligatures w14:val="none"/>
-        </w:rPr>
-      </w:pPr>
-    </w:p>
-    <w:p>
+          <ns2:ligatures ns2:val="none"/>
+        </w:rPr>
+      </w:pPr>
+    </w:p>
+    <w:p ns2:paraId="3900249E" ns2:textId="77777777">
       <w:pPr>
         <w:spacing w:after="0" w:line="240" w:lineRule="auto"/>
         <w:jc w:val="center"/>
@@ -4131,7 +4059,7 @@
         <w:t>Firmado digitalmente por</w:t>
       </w:r>
     </w:p>
-    <w:p>
+    <w:p ns2:paraId="558984AF" ns2:textId="77777777">
       <w:pPr>
         <w:spacing w:after="0" w:line="240" w:lineRule="auto"/>
         <w:jc w:val="center"/>
@@ -4152,7 +4080,7 @@
         <w:t>EVELING ROA QUISPE</w:t>
       </w:r>
     </w:p>
-    <w:p>
+    <w:p ns2:paraId="17B40BC3" ns2:textId="77777777">
       <w:pPr>
         <w:spacing w:after="0" w:line="240" w:lineRule="auto"/>
         <w:jc w:val="center"/>
@@ -4173,7 +4101,7 @@
         <w:t>Secretaria Técnica</w:t>
       </w:r>
     </w:p>
-    <w:p>
+    <w:p ns2:paraId="46245C81" ns2:textId="77777777">
       <w:pPr>
         <w:spacing w:after="0" w:line="240" w:lineRule="auto"/>
         <w:jc w:val="center"/>
@@ -4194,7 +4122,7 @@
         <w:t>Comisión de Protección al Consumidor 1</w:t>
       </w:r>
     </w:p>
-    <w:p>
+    <w:p ns2:paraId="4423ADE9" ns2:textId="71B19EC2">
       <w:pPr>
         <w:spacing w:after="0" w:line="240" w:lineRule="auto"/>
         <w:rPr>
@@ -4218,18 +4146,18 @@
         <w:t>/DCQ</w:t>
       </w:r>
     </w:p>
-    <w:p>
+    <w:p ns2:paraId="74AAB5F4" ns2:textId="77777777">
       <w:pPr>
         <w:spacing w:after="0" w:line="240" w:lineRule="auto"/>
       </w:pPr>
     </w:p>
     <w:sectPr>
-      <w:headerReference w:type="even" r:id="rId8"/>
-      <w:headerReference w:type="default" r:id="rId9"/>
-      <w:footerReference w:type="even" r:id="rId10"/>
-      <w:footerReference w:type="default" r:id="rId11"/>
-      <w:headerReference w:type="first" r:id="rId12"/>
-      <w:footerReference w:type="first" r:id="rId13"/>
+      <w:headerReference w:type="even" ns3:id="rId8"/>
+      <w:headerReference w:type="default" ns3:id="rId9"/>
+      <w:footerReference w:type="even" ns3:id="rId10"/>
+      <w:footerReference w:type="default" ns3:id="rId11"/>
+      <w:headerReference w:type="first" ns3:id="rId12"/>
+      <w:footerReference w:type="first" ns3:id="rId13"/>
       <w:pgSz w:w="11906" w:h="16838"/>
       <w:pgMar w:top="1417" w:right="1701" w:bottom="1417" w:left="1701" w:header="708" w:footer="708" w:gutter="0"/>
       <w:cols w:space="708"/>

</xml_diff>

<commit_message>
feat(core): individualizacion multi-proveedor v2.3.2, admisorios ad hoc y purga de modelos base
- Consagrar el principio de tipicidad e imputacion concreta (TUO LPAG art. 248.4) para denuncias multi-proveedor.
- Erradicar formulas ambiguas con conectores 'y/o' y separar imputaciones materiales por fecha/sede cierta (arts. 1.1.b y 2).
- Subsumir deficiencias de reclamaciones formalizadas en el numeral 88.1 del art. 88 (lex specialis).
- Bifurcar requerimientos probatorios en ordinales independientes: QUINTO (Aseguradora) y SEXTO (Entidad Financiera).
- Calibrar R-108, R-110, R-153 y R-155 en scripts/verificar_admisorio.py para soportar esquemas Ad Hoc de 12 ordinales.
- Purgar patrones anomalos (dfdfdf, (((N))), (NNN)) en automatizacion_antigravity/modelos/.
- Actualizar version del motor a 2.3.2 y documentar estandares en README.md y CHANGELOG.md.
</commit_message>
<xml_diff>
--- a/automatizacion_antigravity/modelos/MODELO_1_DDO.docx
+++ b/automatizacion_antigravity/modelos/MODELO_1_DDO.docx
@@ -270,7 +270,7 @@
           <ns2:ligatures ns2:val="none"/>
         </w:rPr>
         <w:tab/>
-        <w:t xml:space="preserve">:       </w:t>
+        <w:t xml:space="preserve">:    </w:t>
       </w:r>
       <w:r>
         <w:rPr>
@@ -752,7 +752,7 @@
           <w:lang w:eastAsia="es-ES"/>
           <ns2:ligatures ns2:val="none"/>
         </w:rPr>
-        <w:t xml:space="preserve">El xx de abril de 202x, adquirió la Póliza 1364266 del Seguro Vehicular de Rímac en favor del vehículo con Placa de Rodaje  xxx-322 cuya vigencia se extendía hasta el 24 de abril de 2024, acordando que se le otorgaría una indemnización por el valor equivalente a US$ xxxx. Asimismo, se acordó que el valor de la prima mensual era equivalente a US$ 4xxx,00. </w:t>
+        <w:t xml:space="preserve">El xx de abril de 202x, adquirió la Póliza 1364266 del Seguro Vehicular de Rímac en favor del vehículo con Placa de Rodaje xxx-322 cuya vigencia se extendía hasta el 24 de abril de 2024, acordando que se le otorgaría una indemnización por el valor equivalente a US$ xxxx. Asimismo, se acordó que el valor de la prima mensual era equivalente a US$ 4xxx,00. </w:t>
       </w:r>
     </w:p>
     <w:p ns2:paraId="512911CE" ns2:textId="77777777">
@@ -800,7 +800,7 @@
           <w:lang w:eastAsia="es-ES"/>
           <ns2:ligatures ns2:val="none"/>
         </w:rPr>
-        <w:t xml:space="preserve">El 5 de abril de 2024, fue víctima del robo total del vehículo asegurado. El 24 de abril de 2024, mediante a Carta CRT-854049, Rímac le comunicó que para calcular el valor indemnizable del vehículo asegurado se tomará como base el importe de US$ 8,300.00. Por ello, a través de un documento de transacción, le informó que el valor indemnizable del vehículo asegurado era equivalente a US$ 6 640,00, siendo este valor monetario inferior al acordado en la Póliza  2101-1031084 del Seguro Vehicular. </w:t>
+        <w:t xml:space="preserve">El 5 de abril de 2024, fue víctima del robo total del vehículo asegurado. El 24 de abril de 2024, mediante a Carta CRT-854049, Rímac le comunicó que para calcular el valor indemnizable del vehículo asegurado se tomará como base el importe de US$ 8,300.00. Por ello, a través de un documento de transacción, le informó que el valor indemnizable del vehículo asegurado era equivalente a US$ 6 640,00, siendo este valor monetario inferior al acordado en la Póliza 2101-1031084 del Seguro Vehicular. </w:t>
       </w:r>
     </w:p>
     <w:p ns2:paraId="33E14FF7" ns2:textId="77777777">
@@ -848,7 +848,7 @@
           <w:lang w:val="es-ES" w:eastAsia="es-ES"/>
           <ns2:ligatures ns2:val="none"/>
         </w:rPr>
-        <w:t>La señora Medina solicitó, en calidad de medida correctiva, que Rímac cumpla con otorgar la suma asegurada convenida en la Póliza  2101-1031084 del Seguro Vehicular, ascendente a US$ 9 959, 40. Asimismo, requirió el reembolso de costos y costas del presente procedimiento.</w:t>
+        <w:t>La señora Medina solicitó, en calidad de medida correctiva, que Rímac cumpla con otorgar la suma asegurada convenida en la Póliza 2101-1031084 del Seguro Vehicular, ascendente a US$ 9 959, 40. Asimismo, requirió el reembolso de costos y costas del presente procedimiento.</w:t>
       </w:r>
     </w:p>
     <w:p ns2:paraId="66005174" ns2:textId="77777777">
@@ -1019,7 +1019,7 @@
           <w:lang w:eastAsia="es-PE"/>
           <ns2:ligatures ns2:val="none"/>
         </w:rPr>
-        <w:t>habría condicionado la activación del Seguro de Protección de Tarjeta BCP  1000001429 a que la denunciante se sometiera a una prueba poligráfica, pese a que dicho requisito no fue informado al momento de la contratación y le habría generado una afectación a su estado emocional</w:t>
+        <w:t>habría condicionado la activación del Seguro de Protección de Tarjeta BCP 1000001429 a que la denunciante se sometiera a una prueba poligráfica, pese a que dicho requisito no fue informado al momento de la contratación y le habría generado una afectación a su estado emocional</w:t>
       </w:r>
       <w:bookmarkStart w:id="8" w:name="_Hlk213160885"/>
       <w:bookmarkStart w:id="9" w:name="_Hlk213151898"/>
@@ -1117,7 +1117,7 @@
           <w:kern w:val="0"/>
           <ns2:ligatures ns2:val="none"/>
         </w:rPr>
-        <w:t>e Seguros y Reaseguros S.A. negado injustificadamente la cobertura del Seguro de Protección de Tarjeta BCP – Póliza  1000001429 a la denunciante por el siniestro del 28 de marzo de 2025</w:t>
+        <w:t>e Seguros y Reaseguros S.A. negado injustificadamente la cobertura del Seguro de Protección de Tarjeta BCP – Póliza 1000001429 a la denunciante por el siniestro del 28 de marzo de 2025</w:t>
       </w:r>
       <w:r>
         <w:rPr>
@@ -1207,7 +1207,7 @@
           <w:lang w:eastAsia="es-PE"/>
           <ns2:ligatures ns2:val="none"/>
         </w:rPr>
-        <w:t xml:space="preserve">.  </w:t>
+        <w:t xml:space="preserve">. </w:t>
       </w:r>
     </w:p>
     <w:bookmarkEnd w:id="1"/>
@@ -1270,7 +1270,7 @@
           <w:kern w:val="0"/>
           <ns2:ligatures ns2:val="none"/>
         </w:rPr>
-        <w:t>el Banco de Crédito del Perú S.A. y Pacífico Compañía de Seguros y Reaseguros S.A. no habrían cumplido oportunamente con entregar a la denunciante los documentos contractuales del Seguro de Protección de Tarjeta BCP  1000001429</w:t>
+        <w:t>el Banco de Crédito del Perú S.A. y Pacífico Compañía de Seguros y Reaseguros S.A. no habrían cumplido oportunamente con entregar a la denunciante los documentos contractuales del Seguro de Protección de Tarjeta BCP 1000001429</w:t>
       </w:r>
       <w:r>
         <w:rPr>
@@ -1449,7 +1449,7 @@
           <w:lang w:eastAsia="es-PE"/>
           <ns2:ligatures ns2:val="none"/>
         </w:rPr>
-        <w:t xml:space="preserve">.    </w:t>
+        <w:t xml:space="preserve">.  </w:t>
       </w:r>
       <w:bookmarkEnd w:id="16"/>
       <w:bookmarkEnd w:id="18"/>
@@ -1725,7 +1725,7 @@
           <w:lang w:val="es-ES" w:eastAsia="es-ES"/>
           <ns2:ligatures ns2:val="none"/>
         </w:rPr>
-        <w:t xml:space="preserve">(i) presentar una copia completa, legible y debidamente suscrita de la Póliza  2101-1031084 del Seguro Vehicular, </w:t>
+        <w:t xml:space="preserve">(i) presentar una copia completa, legible y debidamente suscrita de la Póliza 2101-1031084 del Seguro Vehicular, </w:t>
       </w:r>
       <w:bookmarkStart w:id="25" w:name="_Hlk211877008"/>
       <w:r>
@@ -1868,7 +1868,7 @@
           <w:lang w:eastAsia="es-PE"/>
           <ns2:ligatures ns2:val="none"/>
         </w:rPr>
-        <w:t xml:space="preserve">RESOLUCIÓN DE LA SECRETARÍA TÉCNICA  </w:t>
+        <w:t xml:space="preserve">RESOLUCIÓN DE LA SECRETARÍA TÉCNICA </w:t>
       </w:r>
     </w:p>
     <w:p ns2:paraId="7F554EB2" ns2:textId="77777777">
@@ -2128,7 +2128,7 @@
           <w:lang w:eastAsia="es-PE"/>
           <ns2:ligatures ns2:val="none"/>
         </w:rPr>
-        <w:t>al denunciante la cobertura del Seguro Vehicular - Póliza  2101-1513017 por el siniestro del 12 de abril de 2025</w:t>
+        <w:t>al denunciante la cobertura del Seguro Vehicular - Póliza 2101-1513017 por el siniestro del 12 de abril de 2025</w:t>
       </w:r>
       <w:r>
         <w:rPr>
@@ -2222,7 +2222,7 @@
           <w:lang w:eastAsia="es-ES"/>
           <ns2:ligatures ns2:val="none"/>
         </w:rPr>
-        <w:t xml:space="preserve">Seguro de Protección de Tarjeta BCP  1000001429 a que </w:t>
+        <w:t xml:space="preserve">Seguro de Protección de Tarjeta BCP 1000001429 a que </w:t>
       </w:r>
       <w:r>
         <w:rPr>
@@ -2402,7 +2402,7 @@
           <w:lang w:eastAsia="es-ES"/>
           <ns2:ligatures ns2:val="none"/>
         </w:rPr>
-        <w:t>Seguro de Protección de Tarjeta BCP  1000001429.</w:t>
+        <w:t>Seguro de Protección de Tarjeta BCP 1000001429.</w:t>
       </w:r>
       <w:bookmarkStart w:id="27" w:name="_Hlk215162047"/>
     </w:p>
@@ -2528,7 +2528,7 @@
           <w:lang w:eastAsia="es-ES"/>
           <ns2:ligatures ns2:val="none"/>
         </w:rPr>
-        <w:t>Seguro de Protección de Tarjeta BCP  1000001429</w:t>
+        <w:t>Seguro de Protección de Tarjeta BCP 1000001429</w:t>
       </w:r>
       <w:r>
         <w:rPr>
@@ -3137,7 +3137,7 @@
           <w:lang w:val="es-ES" w:eastAsia="es-ES"/>
           <ns2:ligatures ns2:val="none"/>
         </w:rPr>
-        <w:t xml:space="preserve">Póliza  30150448 del </w:t>
+        <w:t xml:space="preserve">Póliza 30150448 del </w:t>
       </w:r>
       <w:r>
         <w:rPr>
@@ -3177,7 +3177,7 @@
           <w:lang w:val="es-ES" w:eastAsia="es-ES"/>
           <ns2:ligatures ns2:val="none"/>
         </w:rPr>
-        <w:t xml:space="preserve">que el cálculo realizado para definir el monto de la liquidación única total y definitiva de la Póliza  30150448 del </w:t>
+        <w:t xml:space="preserve">que el cálculo realizado para definir el monto de la liquidación única total y definitiva de la Póliza 30150448 del </w:t>
       </w:r>
       <w:r>
         <w:rPr>
@@ -3529,7 +3529,7 @@
           <w:kern w:val="0"/>
           <ns2:ligatures ns2:val="none"/>
         </w:rPr>
-        <w:t xml:space="preserve"> comunicar a las partes que, de acuerdo a lo señalado por el artículo 29 del Decreto Legislativo  807</w:t>
+        <w:t xml:space="preserve"> comunicar a las partes que, de acuerdo a lo señalado por el artículo 29 del Decreto Legislativo 807</w:t>
       </w:r>
       <w:r>
         <w:rPr>
@@ -3778,7 +3778,7 @@
           <w:color w:val="000000"/>
         </w:rPr>
         <w:lastRenderedPageBreak/>
-        <w:t xml:space="preserve">Procedimiento Administrativo General, aprobado mediante Decreto Supremo  006-2026-JUS, bajo apercibimiento de rehacer el acto de notificación y </w:t>
+        <w:t xml:space="preserve">Procedimiento Administrativo General, aprobado mediante Decreto Supremo 006-2026-JUS, bajo apercibimiento de rehacer el acto de notificación y </w:t>
       </w:r>
       <w:r>
         <w:rPr>
@@ -3874,7 +3874,7 @@
         <w:rPr>
           <w:rFonts w:ascii="Arial Narrow" w:eastAsia="Calibri" w:hAnsi="Arial Narrow"/>
         </w:rPr>
-        <w:t>efectúe(((N))))</w:t>
+        <w:t>efectúe</w:t>
       </w:r>
       <w:r>
         <w:rPr>
@@ -3970,14 +3970,14 @@
           <w:lang w:eastAsia="es-PE"/>
           <ns2:ligatures ns2:val="none"/>
         </w:rPr>
-        <w:t>dentro del plazo de dos (2) días hábiles siguientes a la fecha en que reciba(NNN) la notificación en su domicilio procesal</w:t>
+        <w:t>dentro del plazo de dos (2) días hábiles siguientes a la fecha en que reciba la notificación en su domicilio procesal</w:t>
       </w:r>
       <w:r>
         <w:rPr>
           <w:rFonts w:ascii="Arial Narrow" w:hAnsi="Arial Narrow"/>
           <w:color w:val="000000"/>
         </w:rPr>
-        <w:t>, señale(NNN) un correo electrónico autorizando recibir las notificaciones correspondientes por dicho medio.</w:t>
+        <w:t>, señale un correo electrónico autorizando recibir las notificaciones correspondientes por dicho medio.</w:t>
       </w:r>
       <w:r>
         <w:rPr>
@@ -4365,7 +4365,7 @@
           <w:sz w:val="16"/>
           <w:szCs w:val="16"/>
         </w:rPr>
-        <w:t xml:space="preserve">MEMORANDUM  000405-2025-LAM/INDECOPI </w:t>
+        <w:t xml:space="preserve">MEMORANDUM 000405-2025-LAM/INDECOPI </w:t>
       </w:r>
       <w:r>
         <w:rPr>
@@ -4516,7 +4516,7 @@
           <w:sz w:val="16"/>
           <w:szCs w:val="16"/>
         </w:rPr>
-        <w:t xml:space="preserve">  </w:t>
+        <w:t xml:space="preserve"> </w:t>
       </w:r>
       <w:r>
         <w:rPr>
@@ -4770,7 +4770,7 @@
           <w:sz w:val="16"/>
           <w:szCs w:val="16"/>
         </w:rPr>
-        <w:t xml:space="preserve">           </w:t>
+        <w:t xml:space="preserve">      </w:t>
       </w:r>
       <w:r>
         <w:rPr>
@@ -4788,7 +4788,7 @@
           <w:sz w:val="16"/>
           <w:szCs w:val="16"/>
         </w:rPr>
-        <w:t xml:space="preserve">LEY 29571, CÓDIGO DE PROTECCIÓN Y DEFENSA DEL CONSUMIDOR, publicado el 2 de setiembre de 2010 y modificado por Decreto Legislativo N 1308   </w:t>
+        <w:t xml:space="preserve">LEY 29571, CÓDIGO DE PROTECCIÓN Y DEFENSA DEL CONSUMIDOR, publicado el 2 de setiembre de 2010 y modificado por Decreto Legislativo N 1308  </w:t>
       </w:r>
     </w:p>
     <w:p>
@@ -4812,7 +4812,7 @@
           <w:sz w:val="16"/>
           <w:szCs w:val="16"/>
         </w:rPr>
-        <w:t xml:space="preserve">Artículo 18.- Idoneidad   </w:t>
+        <w:t xml:space="preserve">Artículo 18.- Idoneidad  </w:t>
       </w:r>
     </w:p>
     <w:p>
@@ -4832,7 +4832,7 @@
           <w:sz w:val="16"/>
           <w:szCs w:val="16"/>
         </w:rPr>
-        <w:t xml:space="preserve">Se entiende por idoneidad la correspondencia entre lo que un consumidor espera y lo que efectivamente recibe, en función a lo que se le hubiera ofrecido, la publicidad e información transmitida, las condiciones y circunstancias de la transacción, las características y naturaleza del producto o servicio, el precio, entre otros factores, atendiendo a las circunstancias del caso.    </w:t>
+        <w:t xml:space="preserve">Se entiende por idoneidad la correspondencia entre lo que un consumidor espera y lo que efectivamente recibe, en función a lo que se le hubiera ofrecido, la publicidad e información transmitida, las condiciones y circunstancias de la transacción, las características y naturaleza del producto o servicio, el precio, entre otros factores, atendiendo a las circunstancias del caso.  </w:t>
       </w:r>
     </w:p>
     <w:p>
@@ -4972,7 +4972,7 @@
           <w:sz w:val="16"/>
           <w:szCs w:val="16"/>
         </w:rPr>
-        <w:t xml:space="preserve">LEY 29571, CÓDIGO DE PROTECCIÓN Y DEFENSA DEL CONSUMIDOR, publicado el 2 de setiembre de 2010 y modificado por Decreto Legislativo N 1308   </w:t>
+        <w:t xml:space="preserve">LEY 29571, CÓDIGO DE PROTECCIÓN Y DEFENSA DEL CONSUMIDOR, publicado el 2 de setiembre de 2010 y modificado por Decreto Legislativo N 1308  </w:t>
       </w:r>
     </w:p>
     <w:p>
@@ -5106,7 +5106,7 @@
           <w:sz w:val="16"/>
           <w:szCs w:val="16"/>
         </w:rPr>
-        <w:t xml:space="preserve">           </w:t>
+        <w:t xml:space="preserve">      </w:t>
       </w:r>
       <w:r>
         <w:rPr>
@@ -5124,7 +5124,7 @@
           <w:sz w:val="16"/>
           <w:szCs w:val="16"/>
         </w:rPr>
-        <w:t xml:space="preserve">LEY 29571, CÓDIGO DE PROTECCIÓN Y DEFENSA DEL CONSUMIDOR, publicado el 2 de setiembre de 2010 y modificado por Decreto Legislativo N 1308   </w:t>
+        <w:t xml:space="preserve">LEY 29571, CÓDIGO DE PROTECCIÓN Y DEFENSA DEL CONSUMIDOR, publicado el 2 de setiembre de 2010 y modificado por Decreto Legislativo N 1308  </w:t>
       </w:r>
     </w:p>
     <w:p>
@@ -5274,7 +5274,7 @@
           <w:sz w:val="16"/>
           <w:szCs w:val="16"/>
         </w:rPr>
-        <w:t xml:space="preserve">LEY 29571, CÓDIGO DE PROTECCIÓN Y DEFENSA DEL CONSUMIDOR, publicado el 2 de setiembre de 2010 y modificado por Decreto Legislativo N 1308   </w:t>
+        <w:t xml:space="preserve">LEY 29571, CÓDIGO DE PROTECCIÓN Y DEFENSA DEL CONSUMIDOR, publicado el 2 de setiembre de 2010 y modificado por Decreto Legislativo N 1308  </w:t>
       </w:r>
     </w:p>
     <w:p>
@@ -5683,7 +5683,7 @@
           <w:sz w:val="16"/>
           <w:szCs w:val="16"/>
         </w:rPr>
-        <w:t xml:space="preserve">  </w:t>
+        <w:t xml:space="preserve"> </w:t>
       </w:r>
       <w:r>
         <w:rPr>
@@ -6115,15 +6115,15 @@
           <w:szCs w:val="16"/>
           <w:vertAlign w:val="superscript"/>
         </w:rPr>
-        <w:t xml:space="preserve">  </w:t>
-      </w:r>
-      <w:r>
-        <w:rPr>
-          <w:rFonts w:ascii="Arial Narrow" w:hAnsi="Arial Narrow" w:cs="Arial"/>
-          <w:sz w:val="16"/>
-          <w:szCs w:val="16"/>
-        </w:rPr>
-        <w:t xml:space="preserve">     </w:t>
+        <w:t xml:space="preserve"> </w:t>
+      </w:r>
+      <w:r>
+        <w:rPr>
+          <w:rFonts w:ascii="Arial Narrow" w:hAnsi="Arial Narrow" w:cs="Arial"/>
+          <w:sz w:val="16"/>
+          <w:szCs w:val="16"/>
+        </w:rPr>
+        <w:t xml:space="preserve">   </w:t>
       </w:r>
       <w:r>
         <w:rPr>
@@ -6345,7 +6345,7 @@
           <w:sz w:val="16"/>
           <w:szCs w:val="16"/>
         </w:rPr>
-        <w:t xml:space="preserve">        </w:t>
+        <w:t xml:space="preserve">    </w:t>
       </w:r>
       <w:r>
         <w:rPr>
@@ -7131,7 +7131,7 @@
           <w:sz w:val="16"/>
           <w:szCs w:val="16"/>
         </w:rPr>
-        <w:t xml:space="preserve">         </w:t>
+        <w:t xml:space="preserve">     </w:t>
       </w:r>
       <w:r>
         <w:rPr>
@@ -7821,7 +7821,7 @@
               <w:sz w:val="16"/>
               <w:szCs w:val="16"/>
             </w:rPr>
-            <w:t xml:space="preserve">CNICA DE LA    </w:t>
+            <w:t xml:space="preserve">CNICA DE LA  </w:t>
           </w:r>
         </w:p>
         <w:p>

</xml_diff>

<commit_message>
v3.0.0-parte2.2 — Word legible, formato conservado, notas del traslado y lista cerrada
- Causa raiz de «contenido no legible» (ElementTree, v2.3.0) reparada en las 577 plantillas; Word abre 577/577.
- reescribir_parrafo conserva el run de cada tramo: fin de la negrita/subrayado de parrafo entero y de las notas desplazadas.
- Encabezado «ETIQUETA<tab>:<tab>VALOR» reparado (575).
- Dos notas al pie en el traslado (art. 26 D. Leg. 807 y art. 223 TUO) en las 577.
- Ninguna nota sobre la presentacion de la denuncia; nota del traslado cotejada con _CASO.json.
- Lista cerrada de archivos y comandos; el Word se copia a la carpeta del usuario.
- Falsadores R-168..R-171, R-173; R-167 endurecida; 18 mutaciones.

Co-Authored-By: Claude Opus 5.5 <noreply@anthropic.com>
</commit_message>
<xml_diff>
--- a/automatizacion_antigravity/modelos/MODELO_1_DDO.docx
+++ b/automatizacion_antigravity/modelos/MODELO_1_DDO.docx
@@ -1,8 +1,8 @@
 
 <file path=word/document.xml><?xml version="1.0" encoding="utf-8"?>
-<w:document xmlns:ns1="http://schemas.openxmlformats.org/markup-compatibility/2006" xmlns:ns2="http://schemas.microsoft.com/office/word/2010/wordml" xmlns:ns3="http://schemas.openxmlformats.org/officeDocument/2006/relationships" xmlns:w="http://schemas.openxmlformats.org/wordprocessingml/2006/main" ns1:Ignorable="w14 w15 w16se w16cid w16 w16cex w16sdtdh w16sdtfl w16du wp14">
+<w:document xmlns:mc="http://schemas.openxmlformats.org/markup-compatibility/2006" xmlns:r="http://schemas.openxmlformats.org/officeDocument/2006/relationships" xmlns:w="http://schemas.openxmlformats.org/wordprocessingml/2006/main" xmlns:w14="http://schemas.microsoft.com/office/word/2010/wordml" xmlns:w15="http://schemas.microsoft.com/office/word/2012/wordml" xmlns:w16="http://schemas.microsoft.com/office/word/2018/wordml" xmlns:w16cex="http://schemas.microsoft.com/office/word/2018/wordml/cex" xmlns:w16cid="http://schemas.microsoft.com/office/word/2016/wordml/cid" xmlns:w16du="http://schemas.microsoft.com/office/word/2023/wordml/word16du" xmlns:w16sdtdh="http://schemas.microsoft.com/office/word/2020/wordml/sdtdatahash" xmlns:w16se="http://schemas.microsoft.com/office/word/2015/wordml/symex" xmlns:wp14="http://schemas.microsoft.com/office/word/2010/wordprocessingDrawing" mc:Ignorable="w14 w15 w16se w16cid w16 w16cex w16sdtdh w16du wp14">
   <w:body>
-    <w:p ns2:paraId="1B509B2D" ns2:textId="614B86B2">
+    <w:p>
       <w:pPr>
         <w:tabs>
           <w:tab w:val="left" w:pos="1701"/>
@@ -14,7 +14,7 @@
           <w:color w:val="000000"/>
           <w:kern w:val="0"/>
           <w:lang w:eastAsia="es-PE"/>
-          <ns2:ligatures ns2:val="none"/>
+          <w14:ligatures w14:val="none"/>
         </w:rPr>
       </w:pPr>
       <w:bookmarkStart w:id="0" w:name="_Hlk80343540"/>
@@ -25,7 +25,7 @@
           <w:color w:val="000000"/>
           <w:kern w:val="0"/>
           <w:lang w:eastAsia="es-PE"/>
-          <ns2:ligatures ns2:val="none"/>
+          <w14:ligatures w14:val="none"/>
         </w:rPr>
         <w:t xml:space="preserve">EXPEDIENTE </w:t>
       </w:r>
@@ -36,7 +36,7 @@
           <w:color w:val="000000"/>
           <w:kern w:val="0"/>
           <w:lang w:eastAsia="es-PE"/>
-          <ns2:ligatures ns2:val="none"/>
+          <w14:ligatures w14:val="none"/>
         </w:rPr>
         <w:tab/>
         <w:t>:</w:t>
@@ -48,7 +48,7 @@
           <w:color w:val="000000"/>
           <w:kern w:val="0"/>
           <w:lang w:eastAsia="es-PE"/>
-          <ns2:ligatures ns2:val="none"/>
+          <w14:ligatures w14:val="none"/>
         </w:rPr>
         <w:tab/>
       </w:r>
@@ -61,7 +61,7 @@
           <w:kern w:val="0"/>
           <w:shd w:val="clear" w:color="auto" w:fill="FFFFFF"/>
           <w:lang w:eastAsia="es-PE"/>
-          <ns2:ligatures ns2:val="none"/>
+          <w14:ligatures w14:val="none"/>
         </w:rPr>
         <w:t>0672-202</w:t>
       </w:r>
@@ -74,7 +74,7 @@
           <w:kern w:val="0"/>
           <w:shd w:val="clear" w:color="auto" w:fill="FFFFFF"/>
           <w:lang w:eastAsia="es-PE"/>
-          <ns2:ligatures ns2:val="none"/>
+          <w14:ligatures w14:val="none"/>
         </w:rPr>
         <w:t>6</w:t>
       </w:r>
@@ -87,12 +87,12 @@
           <w:kern w:val="0"/>
           <w:shd w:val="clear" w:color="auto" w:fill="FFFFFF"/>
           <w:lang w:eastAsia="es-PE"/>
-          <ns2:ligatures ns2:val="none"/>
+          <w14:ligatures w14:val="none"/>
         </w:rPr>
         <w:t>/CC1</w:t>
       </w:r>
     </w:p>
-    <w:p ns2:paraId="7E5DC22B" ns2:textId="77777777">
+    <w:p>
       <w:pPr>
         <w:tabs>
           <w:tab w:val="left" w:pos="1701"/>
@@ -107,17 +107,17 @@
           <w:color w:val="000000"/>
           <w:kern w:val="0"/>
           <w:lang w:eastAsia="es-PE"/>
-          <ns2:ligatures ns2:val="none"/>
-        </w:rPr>
-      </w:pPr>
-      <w:r>
-        <w:rPr>
-          <w:rFonts w:ascii="Arial Narrow" w:eastAsia="Arial Narrow" w:hAnsi="Arial Narrow" w:cs="Arial Narrow"/>
-          <w:b/>
-          <w:color w:val="000000"/>
-          <w:kern w:val="0"/>
-          <w:lang w:eastAsia="es-PE"/>
-          <ns2:ligatures ns2:val="none"/>
+          <w14:ligatures w14:val="none"/>
+        </w:rPr>
+      </w:pPr>
+      <w:r>
+        <w:rPr>
+          <w:rFonts w:ascii="Arial Narrow" w:eastAsia="Arial Narrow" w:hAnsi="Arial Narrow" w:cs="Arial Narrow"/>
+          <w:b/>
+          <w:color w:val="000000"/>
+          <w:kern w:val="0"/>
+          <w:lang w:eastAsia="es-PE"/>
+          <w14:ligatures w14:val="none"/>
         </w:rPr>
         <w:t>DENUNCIANTE</w:t>
       </w:r>
@@ -128,7 +128,7 @@
           <w:color w:val="000000"/>
           <w:kern w:val="0"/>
           <w:lang w:eastAsia="es-PE"/>
-          <ns2:ligatures ns2:val="none"/>
+          <w14:ligatures w14:val="none"/>
         </w:rPr>
         <w:tab/>
         <w:t>:</w:t>
@@ -140,7 +140,7 @@
           <w:color w:val="000000"/>
           <w:kern w:val="0"/>
           <w:lang w:eastAsia="es-PE"/>
-          <ns2:ligatures ns2:val="none"/>
+          <w14:ligatures w14:val="none"/>
         </w:rPr>
         <w:tab/>
       </w:r>
@@ -151,12 +151,12 @@
           <w:color w:val="000000"/>
           <w:kern w:val="0"/>
           <w:lang w:eastAsia="es-PE"/>
-          <ns2:ligatures ns2:val="none"/>
+          <w14:ligatures w14:val="none"/>
         </w:rPr>
         <w:t>MEDALITH MEDINA GUTIERREZ (SEÑORA MEDINA)</w:t>
       </w:r>
     </w:p>
-    <w:p ns2:paraId="6DEEEDFE" ns2:textId="57C2DEC6">
+    <w:p>
       <w:pPr>
         <w:tabs>
           <w:tab w:val="left" w:pos="1701"/>
@@ -171,17 +171,17 @@
           <w:color w:val="000000"/>
           <w:kern w:val="0"/>
           <w:lang w:eastAsia="es-PE"/>
-          <ns2:ligatures ns2:val="none"/>
-        </w:rPr>
-      </w:pPr>
-      <w:r>
-        <w:rPr>
-          <w:rFonts w:ascii="Arial Narrow" w:eastAsia="Arial Narrow" w:hAnsi="Arial Narrow" w:cs="Arial Narrow"/>
-          <w:b/>
-          <w:color w:val="000000"/>
-          <w:kern w:val="0"/>
-          <w:lang w:eastAsia="es-PE"/>
-          <ns2:ligatures ns2:val="none"/>
+          <w14:ligatures w14:val="none"/>
+        </w:rPr>
+      </w:pPr>
+      <w:r>
+        <w:rPr>
+          <w:rFonts w:ascii="Arial Narrow" w:eastAsia="Arial Narrow" w:hAnsi="Arial Narrow" w:cs="Arial Narrow"/>
+          <w:b/>
+          <w:color w:val="000000"/>
+          <w:kern w:val="0"/>
+          <w:lang w:eastAsia="es-PE"/>
+          <w14:ligatures w14:val="none"/>
         </w:rPr>
         <w:t>DENUNCIADO</w:t>
       </w:r>
@@ -192,7 +192,7 @@
           <w:color w:val="000000"/>
           <w:kern w:val="0"/>
           <w:lang w:eastAsia="es-PE"/>
-          <ns2:ligatures ns2:val="none"/>
+          <w14:ligatures w14:val="none"/>
         </w:rPr>
         <w:t>(S)</w:t>
       </w:r>
@@ -203,7 +203,7 @@
           <w:color w:val="000000"/>
           <w:kern w:val="0"/>
           <w:lang w:eastAsia="es-PE"/>
-          <ns2:ligatures ns2:val="none"/>
+          <w14:ligatures w14:val="none"/>
         </w:rPr>
         <w:tab/>
         <w:t>:</w:t>
@@ -215,7 +215,7 @@
           <w:color w:val="000000"/>
           <w:kern w:val="0"/>
           <w:lang w:eastAsia="es-PE"/>
-          <ns2:ligatures ns2:val="none"/>
+          <w14:ligatures w14:val="none"/>
         </w:rPr>
         <w:tab/>
       </w:r>
@@ -226,12 +226,12 @@
           <w:color w:val="000000"/>
           <w:kern w:val="0"/>
           <w:lang w:eastAsia="es-PE"/>
-          <ns2:ligatures ns2:val="none"/>
+          <w14:ligatures w14:val="none"/>
         </w:rPr>
         <w:t>RÍMAC SEGUROS Y REASEGUROS S.A. (RÍMAC)</w:t>
       </w:r>
     </w:p>
-    <w:p ns2:paraId="022D2B94" ns2:textId="77777777">
+    <w:p>
       <w:pPr>
         <w:tabs>
           <w:tab w:val="left" w:pos="1701"/>
@@ -246,17 +246,17 @@
           <w:color w:val="000000"/>
           <w:kern w:val="0"/>
           <w:lang w:eastAsia="es-PE"/>
-          <ns2:ligatures ns2:val="none"/>
-        </w:rPr>
-      </w:pPr>
-      <w:r>
-        <w:rPr>
-          <w:rFonts w:ascii="Arial Narrow" w:eastAsia="Arial Narrow" w:hAnsi="Arial Narrow" w:cs="Arial Narrow"/>
-          <w:b/>
-          <w:color w:val="000000"/>
-          <w:kern w:val="0"/>
-          <w:lang w:eastAsia="es-PE"/>
-          <ns2:ligatures ns2:val="none"/>
+          <w14:ligatures w14:val="none"/>
+        </w:rPr>
+      </w:pPr>
+      <w:r>
+        <w:rPr>
+          <w:rFonts w:ascii="Arial Narrow" w:eastAsia="Arial Narrow" w:hAnsi="Arial Narrow" w:cs="Arial Narrow"/>
+          <w:b/>
+          <w:color w:val="000000"/>
+          <w:kern w:val="0"/>
+          <w:lang w:eastAsia="es-PE"/>
+          <w14:ligatures w14:val="none"/>
         </w:rPr>
         <w:t>MATERIAS</w:t>
       </w:r>
@@ -267,7 +267,7 @@
           <w:color w:val="000000"/>
           <w:kern w:val="0"/>
           <w:lang w:eastAsia="es-PE"/>
-          <ns2:ligatures ns2:val="none"/>
+          <w14:ligatures w14:val="none"/>
         </w:rPr>
         <w:tab/>
         <w:t xml:space="preserve">:    </w:t>
@@ -279,13 +279,13 @@
           <w:color w:val="000000"/>
           <w:kern w:val="0"/>
           <w:lang w:eastAsia="es-PE"/>
-          <ns2:ligatures ns2:val="none"/>
+          <w14:ligatures w14:val="none"/>
         </w:rPr>
         <w:tab/>
         <w:t>ADMISIÓN A TRÁMITE</w:t>
       </w:r>
     </w:p>
-    <w:p ns2:paraId="19ED7B73" ns2:textId="77777777">
+    <w:p>
       <w:pPr>
         <w:tabs>
           <w:tab w:val="left" w:pos="1701"/>
@@ -300,22 +300,22 @@
           <w:color w:val="000000"/>
           <w:kern w:val="0"/>
           <w:lang w:eastAsia="es-PE"/>
-          <ns2:ligatures ns2:val="none"/>
-        </w:rPr>
-      </w:pPr>
-      <w:r>
-        <w:rPr>
-          <w:rFonts w:ascii="Arial Narrow" w:eastAsia="Arial Narrow" w:hAnsi="Arial Narrow" w:cs="Arial Narrow"/>
-          <w:b/>
-          <w:color w:val="000000"/>
-          <w:kern w:val="0"/>
-          <w:lang w:eastAsia="es-PE"/>
-          <ns2:ligatures ns2:val="none"/>
+          <w14:ligatures w14:val="none"/>
+        </w:rPr>
+      </w:pPr>
+      <w:r>
+        <w:rPr>
+          <w:rFonts w:ascii="Arial Narrow" w:eastAsia="Arial Narrow" w:hAnsi="Arial Narrow" w:cs="Arial Narrow"/>
+          <w:b/>
+          <w:color w:val="000000"/>
+          <w:kern w:val="0"/>
+          <w:lang w:eastAsia="es-PE"/>
+          <w14:ligatures w14:val="none"/>
         </w:rPr>
         <w:t xml:space="preserve">REQUERIMIENTO DE INFORMACIÓN </w:t>
       </w:r>
     </w:p>
-    <w:p ns2:paraId="46A5A479" ns2:textId="48A7B29A">
+    <w:p>
       <w:pPr>
         <w:tabs>
           <w:tab w:val="left" w:pos="1701"/>
@@ -329,17 +329,17 @@
           <w:color w:val="000000"/>
           <w:kern w:val="0"/>
           <w:lang w:eastAsia="es-PE"/>
-          <ns2:ligatures ns2:val="none"/>
-        </w:rPr>
-      </w:pPr>
-      <w:r>
-        <w:rPr>
-          <w:rFonts w:ascii="Arial Narrow" w:eastAsia="Arial Narrow" w:hAnsi="Arial Narrow" w:cs="Arial Narrow"/>
-          <w:b/>
-          <w:color w:val="000000"/>
-          <w:kern w:val="0"/>
-          <w:lang w:eastAsia="es-PE"/>
-          <ns2:ligatures ns2:val="none"/>
+          <w14:ligatures w14:val="none"/>
+        </w:rPr>
+      </w:pPr>
+      <w:r>
+        <w:rPr>
+          <w:rFonts w:ascii="Arial Narrow" w:eastAsia="Arial Narrow" w:hAnsi="Arial Narrow" w:cs="Arial Narrow"/>
+          <w:b/>
+          <w:color w:val="000000"/>
+          <w:kern w:val="0"/>
+          <w:lang w:eastAsia="es-PE"/>
+          <w14:ligatures w14:val="none"/>
         </w:rPr>
         <w:t xml:space="preserve">RESOLUCIÓN </w:t>
       </w:r>
@@ -350,7 +350,7 @@
           <w:color w:val="000000"/>
           <w:kern w:val="0"/>
           <w:lang w:eastAsia="es-PE"/>
-          <ns2:ligatures ns2:val="none"/>
+          <w14:ligatures w14:val="none"/>
         </w:rPr>
         <w:tab/>
         <w:t>:</w:t>
@@ -362,7 +362,7 @@
           <w:color w:val="000000"/>
           <w:kern w:val="0"/>
           <w:lang w:eastAsia="es-PE"/>
-          <ns2:ligatures ns2:val="none"/>
+          <w14:ligatures w14:val="none"/>
         </w:rPr>
         <w:tab/>
       </w:r>
@@ -373,12 +373,12 @@
           <w:color w:val="000000"/>
           <w:kern w:val="0"/>
           <w:lang w:eastAsia="es-PE"/>
-          <ns2:ligatures ns2:val="none"/>
+          <w14:ligatures w14:val="none"/>
         </w:rPr>
         <w:t>1</w:t>
       </w:r>
     </w:p>
-    <w:p ns2:paraId="5BA3A18D" ns2:textId="77777777">
+    <w:p>
       <w:pPr>
         <w:tabs>
           <w:tab w:val="left" w:pos="1014"/>
@@ -391,11 +391,11 @@
           <w:kern w:val="0"/>
           <w:shd w:val="clear" w:color="auto" w:fill="FFFFFF"/>
           <w:lang w:eastAsia="es-PE"/>
-          <ns2:ligatures ns2:val="none"/>
-        </w:rPr>
-      </w:pPr>
-    </w:p>
-    <w:p ns2:paraId="2F799822" ns2:textId="3084BC0F">
+          <w14:ligatures w14:val="none"/>
+        </w:rPr>
+      </w:pPr>
+    </w:p>
+    <w:p>
       <w:pPr>
         <w:tabs>
           <w:tab w:val="left" w:pos="1014"/>
@@ -408,7 +408,7 @@
           <w:kern w:val="0"/>
           <w:shd w:val="clear" w:color="auto" w:fill="FFFFFF"/>
           <w:lang w:eastAsia="es-PE"/>
-          <ns2:ligatures ns2:val="none"/>
+          <w14:ligatures w14:val="none"/>
         </w:rPr>
       </w:pPr>
       <w:r>
@@ -418,7 +418,7 @@
           <w:kern w:val="0"/>
           <w:shd w:val="clear" w:color="auto" w:fill="FFFFFF"/>
           <w:lang w:eastAsia="es-PE"/>
-          <ns2:ligatures ns2:val="none"/>
+          <w14:ligatures w14:val="none"/>
         </w:rPr>
         <w:t xml:space="preserve">Lima, </w:t>
       </w:r>
@@ -429,7 +429,7 @@
           <w:kern w:val="0"/>
           <w:shd w:val="clear" w:color="auto" w:fill="FFFFFF"/>
           <w:lang w:eastAsia="es-PE"/>
-          <ns2:ligatures ns2:val="none"/>
+          <w14:ligatures w14:val="none"/>
         </w:rPr>
         <w:t xml:space="preserve">14 de agosto de 2026</w:t>
       </w:r>
@@ -440,7 +440,7 @@
           <w:kern w:val="0"/>
           <w:shd w:val="clear" w:color="auto" w:fill="FFFFFF"/>
           <w:lang w:eastAsia="es-PE"/>
-          <ns2:ligatures ns2:val="none"/>
+          <w14:ligatures w14:val="none"/>
         </w:rPr>
         <w:t xml:space="preserve"/>
       </w:r>
@@ -451,7 +451,7 @@
           <w:kern w:val="0"/>
           <w:shd w:val="clear" w:color="auto" w:fill="FFFFFF"/>
           <w:lang w:eastAsia="es-PE"/>
-          <ns2:ligatures ns2:val="none"/>
+          <w14:ligatures w14:val="none"/>
         </w:rPr>
         <w:t xml:space="preserve"/>
       </w:r>
@@ -462,7 +462,7 @@
           <w:kern w:val="0"/>
           <w:shd w:val="clear" w:color="auto" w:fill="FFFFFF"/>
           <w:lang w:eastAsia="es-PE"/>
-          <ns2:ligatures ns2:val="none"/>
+          <w14:ligatures w14:val="none"/>
         </w:rPr>
         <w:t xml:space="preserve"/>
       </w:r>
@@ -473,7 +473,7 @@
           <w:kern w:val="0"/>
           <w:shd w:val="clear" w:color="auto" w:fill="FFFFFF"/>
           <w:lang w:eastAsia="es-PE"/>
-          <ns2:ligatures ns2:val="none"/>
+          <w14:ligatures w14:val="none"/>
         </w:rPr>
         <w:t xml:space="preserve"/>
       </w:r>
@@ -484,12 +484,12 @@
           <w:kern w:val="0"/>
           <w:shd w:val="clear" w:color="auto" w:fill="FFFFFF"/>
           <w:lang w:eastAsia="es-PE"/>
-          <ns2:ligatures ns2:val="none"/>
+          <w14:ligatures w14:val="none"/>
         </w:rPr>
         <w:t xml:space="preserve"/>
       </w:r>
     </w:p>
-    <w:p ns2:paraId="66CE1821" ns2:textId="77777777">
+    <w:p>
       <w:pPr>
         <w:tabs>
           <w:tab w:val="left" w:pos="1014"/>
@@ -501,11 +501,11 @@
           <w:color w:val="000000"/>
           <w:kern w:val="0"/>
           <w:lang w:eastAsia="es-PE"/>
-          <ns2:ligatures ns2:val="none"/>
-        </w:rPr>
-      </w:pPr>
-    </w:p>
-    <w:p ns2:paraId="0B80AAA5" ns2:textId="77777777">
+          <w14:ligatures w14:val="none"/>
+        </w:rPr>
+      </w:pPr>
+    </w:p>
+    <w:p>
       <w:pPr>
         <w:numPr>
           <w:ilvl w:val="0"/>
@@ -519,22 +519,22 @@
           <w:color w:val="000000"/>
           <w:kern w:val="0"/>
           <w:lang w:eastAsia="es-PE"/>
-          <ns2:ligatures ns2:val="none"/>
-        </w:rPr>
-      </w:pPr>
-      <w:r>
-        <w:rPr>
-          <w:rFonts w:ascii="Arial Narrow" w:eastAsia="Arial Narrow" w:hAnsi="Arial Narrow" w:cs="Arial Narrow"/>
-          <w:b/>
-          <w:color w:val="000000"/>
-          <w:kern w:val="0"/>
-          <w:lang w:eastAsia="es-PE"/>
-          <ns2:ligatures ns2:val="none"/>
+          <w14:ligatures w14:val="none"/>
+        </w:rPr>
+      </w:pPr>
+      <w:r>
+        <w:rPr>
+          <w:rFonts w:ascii="Arial Narrow" w:eastAsia="Arial Narrow" w:hAnsi="Arial Narrow" w:cs="Arial Narrow"/>
+          <w:b/>
+          <w:color w:val="000000"/>
+          <w:kern w:val="0"/>
+          <w:lang w:eastAsia="es-PE"/>
+          <w14:ligatures w14:val="none"/>
         </w:rPr>
         <w:t xml:space="preserve">HECHOS </w:t>
       </w:r>
     </w:p>
-    <w:p ns2:paraId="621F2AB2" ns2:textId="77777777">
+    <w:p>
       <w:pPr>
         <w:spacing w:after="0" w:line="240" w:lineRule="auto"/>
         <w:jc w:val="both"/>
@@ -543,11 +543,11 @@
           <w:color w:val="000000"/>
           <w:kern w:val="0"/>
           <w:lang w:eastAsia="es-PE"/>
-          <ns2:ligatures ns2:val="none"/>
-        </w:rPr>
-      </w:pPr>
-    </w:p>
-    <w:p ns2:paraId="60B5D5B0" ns2:textId="2E851644">
+          <w14:ligatures w14:val="none"/>
+        </w:rPr>
+      </w:pPr>
+    </w:p>
+    <w:p>
       <w:pPr>
         <w:numPr>
           <w:ilvl w:val="1"/>
@@ -561,7 +561,7 @@
           <w:color w:val="000000"/>
           <w:kern w:val="0"/>
           <w:lang w:val="es-ES" w:eastAsia="es-ES"/>
-          <ns2:ligatures ns2:val="none"/>
+          <w14:ligatures w14:val="none"/>
         </w:rPr>
       </w:pPr>
       <w:r>
@@ -570,7 +570,7 @@
           <w:color w:val="000000"/>
           <w:kern w:val="0"/>
           <w:lang w:val="es-ES" w:eastAsia="es-ES"/>
-          <ns2:ligatures ns2:val="none"/>
+          <w14:ligatures w14:val="none"/>
         </w:rPr>
         <w:t xml:space="preserve">Mediante </w:t>
       </w:r>
@@ -580,7 +580,7 @@
           <w:color w:val="000000"/>
           <w:kern w:val="0"/>
           <w:lang w:val="es-ES" w:eastAsia="es-ES"/>
-          <ns2:ligatures ns2:val="none"/>
+          <w14:ligatures w14:val="none"/>
         </w:rPr>
         <w:t>el escrito del 17 de marzo de 2025</w:t>
       </w:r>
@@ -592,7 +592,7 @@
           <w:kern w:val="0"/>
           <w:vertAlign w:val="superscript"/>
           <w:lang w:val="es-ES" w:eastAsia="es-ES"/>
-          <ns2:ligatures ns2:val="none"/>
+          <w14:ligatures w14:val="none"/>
         </w:rPr>
         <w:footnoteReference w:id="1"/>
       </w:r>
@@ -602,7 +602,7 @@
           <w:color w:val="000000"/>
           <w:kern w:val="0"/>
           <w:lang w:val="es-ES" w:eastAsia="es-ES"/>
-          <ns2:ligatures ns2:val="none"/>
+          <w14:ligatures w14:val="none"/>
         </w:rPr>
         <w:t>, subsanada mediante escrito del 12 de marzo de 2025</w:t>
       </w:r>
@@ -610,7 +610,7 @@
         <w:rPr>
           <w:rFonts w:ascii="Arial Narrow" w:eastAsia="Calibri" w:hAnsi="Arial Narrow" w:cs="Arial"/>
           <w:kern w:val="0"/>
-          <ns2:ligatures ns2:val="none"/>
+          <w14:ligatures w14:val="none"/>
         </w:rPr>
         <w:t>, y mediante el escrito del 12 de mayo de 2025,</w:t>
       </w:r>
@@ -618,7 +618,7 @@
         <w:rPr>
           <w:rFonts w:ascii="Arial Narrow" w:eastAsia="Calibri" w:hAnsi="Arial Narrow" w:cs="Arial"/>
           <w:kern w:val="0"/>
-          <ns2:ligatures ns2:val="none"/>
+          <w14:ligatures w14:val="none"/>
         </w:rPr>
         <w:t xml:space="preserve"> la señora Medina d</w:t>
       </w:r>
@@ -628,7 +628,7 @@
           <w:color w:val="000000"/>
           <w:kern w:val="0"/>
           <w:lang w:val="es-ES" w:eastAsia="es-ES"/>
-          <ns2:ligatures ns2:val="none"/>
+          <w14:ligatures w14:val="none"/>
         </w:rPr>
         <w:t>enunció a Rímac</w:t>
       </w:r>
@@ -638,7 +638,7 @@
           <w:color w:val="000000"/>
           <w:kern w:val="0"/>
           <w:lang w:val="es-ES" w:eastAsia="es-ES"/>
-          <ns2:ligatures ns2:val="none"/>
+          <w14:ligatures w14:val="none"/>
         </w:rPr>
         <w:t xml:space="preserve"> por presuntas infracciones a la </w:t>
       </w:r>
@@ -648,7 +648,7 @@
           <w:color w:val="000000"/>
           <w:kern w:val="0"/>
           <w:lang w:val="es-ES" w:eastAsia="es-ES"/>
-          <ns2:ligatures ns2:val="none"/>
+          <w14:ligatures w14:val="none"/>
         </w:rPr>
         <w:t xml:space="preserve">Ley </w:t>
       </w:r>
@@ -658,7 +658,7 @@
           <w:kern w:val="0"/>
           <w:shd w:val="clear" w:color="auto" w:fill="FFFFFF"/>
           <w:lang w:eastAsia="es-PE"/>
-          <ns2:ligatures ns2:val="none"/>
+          <w14:ligatures w14:val="none"/>
         </w:rPr>
         <w:t>29571</w:t>
       </w:r>
@@ -668,7 +668,7 @@
           <w:color w:val="000000"/>
           <w:kern w:val="0"/>
           <w:lang w:val="es-ES" w:eastAsia="es-ES"/>
-          <ns2:ligatures ns2:val="none"/>
+          <w14:ligatures w14:val="none"/>
         </w:rPr>
         <w:t>, Código de Protección y Defensa del Consumidor (en adelante, Código)</w:t>
       </w:r>
@@ -680,7 +680,7 @@
           <w:kern w:val="0"/>
           <w:vertAlign w:val="superscript"/>
           <w:lang w:val="es-ES" w:eastAsia="es-ES"/>
-          <ns2:ligatures ns2:val="none"/>
+          <w14:ligatures w14:val="none"/>
         </w:rPr>
         <w:footnoteReference w:id="2"/>
       </w:r>
@@ -690,7 +690,7 @@
           <w:color w:val="000000"/>
           <w:kern w:val="0"/>
           <w:lang w:val="es-ES" w:eastAsia="es-ES"/>
-          <ns2:ligatures ns2:val="none"/>
+          <w14:ligatures w14:val="none"/>
         </w:rPr>
         <w:t xml:space="preserve">, señalando </w:t>
       </w:r>
@@ -701,12 +701,12 @@
           <w:color w:val="000000"/>
           <w:kern w:val="0"/>
           <w:lang w:val="es-ES" w:eastAsia="es-ES"/>
-          <ns2:ligatures ns2:val="none"/>
+          <w14:ligatures w14:val="none"/>
         </w:rPr>
         <w:t>lo siguiente:</w:t>
       </w:r>
     </w:p>
-    <w:p ns2:paraId="3AD3B7C6" ns2:textId="77777777">
+    <w:p>
       <w:pPr>
         <w:tabs>
           <w:tab w:val="left" w:pos="1134"/>
@@ -718,11 +718,11 @@
           <w:color w:val="000000"/>
           <w:kern w:val="0"/>
           <w:lang w:val="es-ES" w:eastAsia="es-ES"/>
-          <ns2:ligatures ns2:val="none"/>
-        </w:rPr>
-      </w:pPr>
-    </w:p>
-    <w:p ns2:paraId="673E03EA" ns2:textId="482CAA5C">
+          <w14:ligatures w14:val="none"/>
+        </w:rPr>
+      </w:pPr>
+    </w:p>
+    <w:p>
       <w:pPr>
         <w:pStyle w:val="Prrafodelista"/>
         <w:numPr>
@@ -741,7 +741,7 @@
           <w:color w:val="000000"/>
           <w:kern w:val="0"/>
           <w:lang w:eastAsia="es-ES"/>
-          <ns2:ligatures ns2:val="none"/>
+          <w14:ligatures w14:val="none"/>
         </w:rPr>
       </w:pPr>
       <w:r>
@@ -750,12 +750,12 @@
           <w:color w:val="000000"/>
           <w:kern w:val="0"/>
           <w:lang w:eastAsia="es-ES"/>
-          <ns2:ligatures ns2:val="none"/>
+          <w14:ligatures w14:val="none"/>
         </w:rPr>
         <w:t xml:space="preserve">El xx de abril de 202x, adquirió la Póliza 1364266 del Seguro Vehicular de Rímac en favor del vehículo con Placa de Rodaje xxx-322 cuya vigencia se extendía hasta el 24 de abril de 2024, acordando que se le otorgaría una indemnización por el valor equivalente a US$ xxxx. Asimismo, se acordó que el valor de la prima mensual era equivalente a US$ 4xxx,00. </w:t>
       </w:r>
     </w:p>
-    <w:p ns2:paraId="512911CE" ns2:textId="77777777">
+    <w:p>
       <w:pPr>
         <w:pStyle w:val="Prrafodelista"/>
         <w:spacing w:after="0" w:line="240" w:lineRule="auto"/>
@@ -766,11 +766,11 @@
           <w:color w:val="000000"/>
           <w:kern w:val="0"/>
           <w:lang w:eastAsia="es-ES"/>
-          <ns2:ligatures ns2:val="none"/>
-        </w:rPr>
-      </w:pPr>
-    </w:p>
-    <w:p ns2:paraId="2F9CF7F5" ns2:textId="69AA709F">
+          <w14:ligatures w14:val="none"/>
+        </w:rPr>
+      </w:pPr>
+    </w:p>
+    <w:p>
       <w:pPr>
         <w:pStyle w:val="Prrafodelista"/>
         <w:numPr>
@@ -789,7 +789,7 @@
           <w:color w:val="000000"/>
           <w:kern w:val="0"/>
           <w:lang w:eastAsia="es-ES"/>
-          <ns2:ligatures ns2:val="none"/>
+          <w14:ligatures w14:val="none"/>
         </w:rPr>
       </w:pPr>
       <w:r>
@@ -798,12 +798,12 @@
           <w:color w:val="000000"/>
           <w:kern w:val="0"/>
           <w:lang w:eastAsia="es-ES"/>
-          <ns2:ligatures ns2:val="none"/>
+          <w14:ligatures w14:val="none"/>
         </w:rPr>
         <w:t xml:space="preserve">El 5 de abril de 2024, fue víctima del robo total del vehículo asegurado. El 24 de abril de 2024, mediante a Carta CRT-854049, Rímac le comunicó que para calcular el valor indemnizable del vehículo asegurado se tomará como base el importe de US$ 8,300.00. Por ello, a través de un documento de transacción, le informó que el valor indemnizable del vehículo asegurado era equivalente a US$ 6 640,00, siendo este valor monetario inferior al acordado en la Póliza 2101-1031084 del Seguro Vehicular. </w:t>
       </w:r>
     </w:p>
-    <w:p ns2:paraId="33E14FF7" ns2:textId="77777777">
+    <w:p>
       <w:pPr>
         <w:tabs>
           <w:tab w:val="left" w:pos="1134"/>
@@ -815,11 +815,11 @@
           <w:color w:val="000000"/>
           <w:kern w:val="0"/>
           <w:lang w:eastAsia="es-ES"/>
-          <ns2:ligatures ns2:val="none"/>
-        </w:rPr>
-      </w:pPr>
-    </w:p>
-    <w:p ns2:paraId="65C58807" ns2:textId="4AAF6D09">
+          <w14:ligatures w14:val="none"/>
+        </w:rPr>
+      </w:pPr>
+    </w:p>
+    <w:p>
       <w:pPr>
         <w:numPr>
           <w:ilvl w:val="1"/>
@@ -837,7 +837,7 @@
           <w:color w:val="000000"/>
           <w:kern w:val="0"/>
           <w:lang w:val="es-ES" w:eastAsia="es-ES"/>
-          <ns2:ligatures ns2:val="none"/>
+          <w14:ligatures w14:val="none"/>
         </w:rPr>
       </w:pPr>
       <w:r>
@@ -846,12 +846,12 @@
           <w:color w:val="000000"/>
           <w:kern w:val="0"/>
           <w:lang w:val="es-ES" w:eastAsia="es-ES"/>
-          <ns2:ligatures ns2:val="none"/>
+          <w14:ligatures w14:val="none"/>
         </w:rPr>
         <w:t>La señora Medina solicitó, en calidad de medida correctiva, que Rímac cumpla con otorgar la suma asegurada convenida en la Póliza 2101-1031084 del Seguro Vehicular, ascendente a US$ 9 959, 40. Asimismo, requirió el reembolso de costos y costas del presente procedimiento.</w:t>
       </w:r>
     </w:p>
-    <w:p ns2:paraId="66005174" ns2:textId="77777777">
+    <w:p>
       <w:pPr>
         <w:spacing w:after="0" w:line="240" w:lineRule="auto"/>
         <w:contextualSpacing/>
@@ -862,11 +862,11 @@
           <w:color w:val="000000"/>
           <w:kern w:val="0"/>
           <w:lang w:eastAsia="es-PE"/>
-          <ns2:ligatures ns2:val="none"/>
-        </w:rPr>
-      </w:pPr>
-    </w:p>
-    <w:p ns2:paraId="3541B1F9" ns2:textId="77777777">
+          <w14:ligatures w14:val="none"/>
+        </w:rPr>
+      </w:pPr>
+    </w:p>
+    <w:p>
       <w:pPr>
         <w:pStyle w:val="Prrafodelista"/>
         <w:numPr>
@@ -886,22 +886,22 @@
           <w:color w:val="000000"/>
           <w:kern w:val="0"/>
           <w:lang w:eastAsia="es-PE"/>
-          <ns2:ligatures ns2:val="none"/>
-        </w:rPr>
-      </w:pPr>
-      <w:r>
-        <w:rPr>
-          <w:rFonts w:ascii="Arial Narrow" w:eastAsia="Arial Narrow" w:hAnsi="Arial Narrow" w:cs="Arial Narrow"/>
-          <w:b/>
-          <w:color w:val="000000"/>
-          <w:kern w:val="0"/>
-          <w:lang w:eastAsia="es-PE"/>
-          <ns2:ligatures ns2:val="none"/>
+          <w14:ligatures w14:val="none"/>
+        </w:rPr>
+      </w:pPr>
+      <w:r>
+        <w:rPr>
+          <w:rFonts w:ascii="Arial Narrow" w:eastAsia="Arial Narrow" w:hAnsi="Arial Narrow" w:cs="Arial Narrow"/>
+          <w:b/>
+          <w:color w:val="000000"/>
+          <w:kern w:val="0"/>
+          <w:lang w:eastAsia="es-PE"/>
+          <w14:ligatures w14:val="none"/>
         </w:rPr>
         <w:t>DE LA ADMISIÓN A TRÁMITE DE LA DENUNCIA</w:t>
       </w:r>
     </w:p>
-    <w:p ns2:paraId="34556756" ns2:textId="77777777">
+    <w:p>
       <w:pPr>
         <w:spacing w:after="0" w:line="240" w:lineRule="auto"/>
         <w:contextualSpacing/>
@@ -912,13 +912,13 @@
           <w:color w:val="000000"/>
           <w:kern w:val="0"/>
           <w:lang w:eastAsia="es-PE"/>
-          <ns2:ligatures ns2:val="none"/>
+          <w14:ligatures w14:val="none"/>
         </w:rPr>
       </w:pPr>
       <w:bookmarkStart w:id="1" w:name="_Hlk212795168"/>
       <w:bookmarkStart w:id="2" w:name="_Hlk218848146"/>
     </w:p>
-    <w:p ns2:paraId="5F4266A4" ns2:textId="1BFD44A9">
+    <w:p>
       <w:pPr>
         <w:pStyle w:val="Prrafodelista"/>
         <w:numPr>
@@ -931,7 +931,7 @@
         <w:rPr>
           <w:rFonts w:ascii="Arial Narrow" w:eastAsia="Arial Narrow" w:hAnsi="Arial Narrow" w:cs="Arial Narrow"/>
           <w:kern w:val="0"/>
-          <ns2:ligatures ns2:val="none"/>
+          <w14:ligatures w14:val="none"/>
         </w:rPr>
       </w:pPr>
       <w:bookmarkStart w:id="3" w:name="_Hlk140755208"/>
@@ -943,7 +943,7 @@
           <w:color w:val="000000"/>
           <w:kern w:val="0"/>
           <w:lang w:eastAsia="es-PE"/>
-          <ns2:ligatures ns2:val="none"/>
+          <w14:ligatures w14:val="none"/>
         </w:rPr>
         <w:t>La Secretaría Técnica de la Comisión de Protección al Consumidor 1 (en adelante, la Secretaría Técnica), en ejercicio de sus facultades</w:t>
       </w:r>
@@ -956,7 +956,7 @@
           <w:rFonts w:ascii="Arial Narrow" w:eastAsia="Arial Narrow" w:hAnsi="Arial Narrow" w:cs="Arial Narrow"/>
           <w:kern w:val="0"/>
           <w:vertAlign w:val="superscript"/>
-          <ns2:ligatures ns2:val="none"/>
+          <w14:ligatures w14:val="none"/>
         </w:rPr>
         <w:footnoteReference w:id="3"/>
       </w:r>
@@ -966,7 +966,7 @@
           <w:color w:val="000000"/>
           <w:kern w:val="0"/>
           <w:lang w:eastAsia="es-PE"/>
-          <ns2:ligatures ns2:val="none"/>
+          <w14:ligatures w14:val="none"/>
         </w:rPr>
         <w:t xml:space="preserve">, </w:t>
       </w:r>
@@ -976,7 +976,7 @@
           <w:color w:val="000000"/>
           <w:kern w:val="0"/>
           <w:lang w:eastAsia="es-PE"/>
-          <ns2:ligatures ns2:val="none"/>
+          <w14:ligatures w14:val="none"/>
         </w:rPr>
         <w:t xml:space="preserve">considera </w:t>
       </w:r>
@@ -984,7 +984,7 @@
         <w:rPr>
           <w:rFonts w:ascii="Arial Narrow" w:eastAsia="Arial Narrow" w:hAnsi="Arial Narrow" w:cs="Arial Narrow"/>
           <w:kern w:val="0"/>
-          <ns2:ligatures ns2:val="none"/>
+          <w14:ligatures w14:val="none"/>
         </w:rPr>
         <w:t xml:space="preserve">que el hecho denunciado, </w:t>
       </w:r>
@@ -993,7 +993,7 @@
         <w:rPr>
           <w:rFonts w:ascii="Arial Narrow" w:eastAsia="Arial Narrow" w:hAnsi="Arial Narrow" w:cs="Arial Narrow"/>
           <w:kern w:val="0"/>
-          <ns2:ligatures ns2:val="none"/>
+          <w14:ligatures w14:val="none"/>
         </w:rPr>
         <w:t xml:space="preserve">consistente en que </w:t>
       </w:r>
@@ -1004,7 +1004,7 @@
           <w:kern w:val="0"/>
           <w:shd w:val="clear" w:color="auto" w:fill="FFFFFF"/>
           <w:lang w:eastAsia="es-PE"/>
-          <ns2:ligatures ns2:val="none"/>
+          <w14:ligatures w14:val="none"/>
         </w:rPr>
         <w:lastRenderedPageBreak/>
         <w:t xml:space="preserve">Pacífico Compañía de Seguros y Reaseguros S.A. </w:t>
@@ -1017,7 +1017,7 @@
           <w:kern w:val="0"/>
           <w:shd w:val="clear" w:color="auto" w:fill="FFFFFF"/>
           <w:lang w:eastAsia="es-PE"/>
-          <ns2:ligatures ns2:val="none"/>
+          <w14:ligatures w14:val="none"/>
         </w:rPr>
         <w:t>habría condicionado la activación del Seguro de Protección de Tarjeta BCP 1000001429 a que la denunciante se sometiera a una prueba poligráfica, pese a que dicho requisito no fue informado al momento de la contratación y le habría generado una afectación a su estado emocional</w:t>
       </w:r>
@@ -1027,7 +1027,7 @@
         <w:rPr>
           <w:rFonts w:ascii="Arial Narrow" w:eastAsia="Arial Narrow" w:hAnsi="Arial Narrow" w:cs="Arial Narrow"/>
           <w:kern w:val="0"/>
-          <ns2:ligatures ns2:val="none"/>
+          <w14:ligatures w14:val="none"/>
         </w:rPr>
         <w:t>; involucraría una presunta afectación a sus expectativas, quien no habría encontrado una correspondencia entre lo que esperaba recibir de parte del proveedor y lo que realmente recibió. Por consiguiente, corresponde calificar el hecho materia de denuncia como una presunta infracción al deber de idoneidad, tipificado en los artículos 18 y 19 del Código</w:t>
       </w:r>
@@ -1039,7 +1039,7 @@
           <w:rFonts w:ascii="Arial Narrow" w:eastAsia="Arial Narrow" w:hAnsi="Arial Narrow" w:cs="Arial"/>
           <w:kern w:val="0"/>
           <w:vertAlign w:val="superscript"/>
-          <ns2:ligatures ns2:val="none"/>
+          <w14:ligatures w14:val="none"/>
         </w:rPr>
         <w:footnoteReference w:id="4"/>
       </w:r>
@@ -1048,13 +1048,13 @@
         <w:rPr>
           <w:rFonts w:ascii="Arial Narrow" w:eastAsia="Arial Narrow" w:hAnsi="Arial Narrow" w:cs="Arial Narrow"/>
           <w:kern w:val="0"/>
-          <ns2:ligatures ns2:val="none"/>
+          <w14:ligatures w14:val="none"/>
         </w:rPr>
         <w:t>.</w:t>
       </w:r>
       <w:bookmarkEnd w:id="9"/>
     </w:p>
-    <w:p ns2:paraId="116891C0" ns2:textId="77777777">
+    <w:p>
       <w:pPr>
         <w:pStyle w:val="Prrafodelista"/>
         <w:spacing w:after="0" w:line="240" w:lineRule="auto"/>
@@ -1063,11 +1063,11 @@
         <w:rPr>
           <w:rFonts w:ascii="Arial Narrow" w:eastAsia="Arial Narrow" w:hAnsi="Arial Narrow" w:cs="Arial Narrow"/>
           <w:kern w:val="0"/>
-          <ns2:ligatures ns2:val="none"/>
-        </w:rPr>
-      </w:pPr>
-    </w:p>
-    <w:p ns2:paraId="73AC2300" ns2:textId="0C37930E">
+          <w14:ligatures w14:val="none"/>
+        </w:rPr>
+      </w:pPr>
+    </w:p>
+    <w:p>
       <w:pPr>
         <w:pStyle w:val="Prrafodelista"/>
         <w:numPr>
@@ -1080,7 +1080,7 @@
         <w:rPr>
           <w:rFonts w:ascii="Arial Narrow" w:eastAsia="Arial Narrow" w:hAnsi="Arial Narrow" w:cs="Arial Narrow"/>
           <w:kern w:val="0"/>
-          <ns2:ligatures ns2:val="none"/>
+          <w14:ligatures w14:val="none"/>
         </w:rPr>
       </w:pPr>
       <w:bookmarkStart w:id="11" w:name="_Hlk213150180"/>
@@ -1088,7 +1088,7 @@
         <w:rPr>
           <w:rFonts w:ascii="Arial Narrow" w:eastAsia="Arial Narrow" w:hAnsi="Arial Narrow" w:cs="Arial Narrow"/>
           <w:kern w:val="0"/>
-          <ns2:ligatures ns2:val="none"/>
+          <w14:ligatures w14:val="none"/>
         </w:rPr>
         <w:t xml:space="preserve">Así también, la Secretaría Técnica, en ejercicio de sus facultades, </w:t>
       </w:r>
@@ -1098,7 +1098,7 @@
           <w:color w:val="000000"/>
           <w:kern w:val="0"/>
           <w:lang w:eastAsia="es-PE"/>
-          <ns2:ligatures ns2:val="none"/>
+          <w14:ligatures w14:val="none"/>
         </w:rPr>
         <w:t xml:space="preserve">considera </w:t>
       </w:r>
@@ -1106,7 +1106,7 @@
         <w:rPr>
           <w:rFonts w:ascii="Arial Narrow" w:eastAsia="Arial Narrow" w:hAnsi="Arial Narrow" w:cs="Arial Narrow"/>
           <w:kern w:val="0"/>
-          <ns2:ligatures ns2:val="none"/>
+          <w14:ligatures w14:val="none"/>
         </w:rPr>
         <w:t>que el hecho denunciado, consistente en que Pacífico Compañía d</w:t>
       </w:r>
@@ -1115,7 +1115,7 @@
         <w:rPr>
           <w:rFonts w:ascii="Arial Narrow" w:eastAsia="Arial Narrow" w:hAnsi="Arial Narrow" w:cs="Arial Narrow"/>
           <w:kern w:val="0"/>
-          <ns2:ligatures ns2:val="none"/>
+          <w14:ligatures w14:val="none"/>
         </w:rPr>
         <w:t>e Seguros y Reaseguros S.A. negado injustificadamente la cobertura del Seguro de Protección de Tarjeta BCP – Póliza 1000001429 a la denunciante por el siniestro del 28 de marzo de 2025</w:t>
       </w:r>
@@ -1123,7 +1123,7 @@
         <w:rPr>
           <w:rFonts w:ascii="Arial Narrow" w:eastAsia="Arial Narrow" w:hAnsi="Arial Narrow" w:cs="Arial Narrow"/>
           <w:kern w:val="0"/>
-          <ns2:ligatures ns2:val="none"/>
+          <w14:ligatures w14:val="none"/>
         </w:rPr>
         <w:t>.</w:t>
       </w:r>
@@ -1131,7 +1131,7 @@
         <w:rPr>
           <w:rFonts w:ascii="Arial Narrow" w:eastAsia="Arial Narrow" w:hAnsi="Arial Narrow" w:cs="Arial Narrow"/>
           <w:kern w:val="0"/>
-          <ns2:ligatures ns2:val="none"/>
+          <w14:ligatures w14:val="none"/>
         </w:rPr>
         <w:t xml:space="preserve"> </w:t>
       </w:r>
@@ -1142,7 +1142,7 @@
           <w:color w:val="000000"/>
           <w:kern w:val="0"/>
           <w:lang w:eastAsia="es-PE"/>
-          <ns2:ligatures ns2:val="none"/>
+          <w14:ligatures w14:val="none"/>
         </w:rPr>
         <w:t>Por consiguiente, corresponde calificar el hecho materia de denuncia como una presunta infracción al deber de protección contra los métodos comerciales</w:t>
       </w:r>
@@ -1153,7 +1153,7 @@
           <w:color w:val="000000"/>
           <w:kern w:val="0"/>
           <w:lang w:eastAsia="es-PE"/>
-          <ns2:ligatures ns2:val="none"/>
+          <w14:ligatures w14:val="none"/>
         </w:rPr>
         <w:t xml:space="preserve"> coercitivos</w:t>
       </w:r>
@@ -1164,7 +1164,7 @@
           <w:color w:val="000000"/>
           <w:kern w:val="0"/>
           <w:lang w:eastAsia="es-PE"/>
-          <ns2:ligatures ns2:val="none"/>
+          <w14:ligatures w14:val="none"/>
         </w:rPr>
         <w:t xml:space="preserve">, tipificado en </w:t>
       </w:r>
@@ -1175,7 +1175,7 @@
           <w:kern w:val="0"/>
           <w:shd w:val="clear" w:color="auto" w:fill="FFFFFF"/>
           <w:lang w:eastAsia="es-PE"/>
-          <ns2:ligatures ns2:val="none"/>
+          <w14:ligatures w14:val="none"/>
         </w:rPr>
         <w:t xml:space="preserve">literal g) del artículo 56 </w:t>
       </w:r>
@@ -1186,7 +1186,7 @@
           <w:color w:val="000000"/>
           <w:kern w:val="0"/>
           <w:lang w:eastAsia="es-PE"/>
-          <ns2:ligatures ns2:val="none"/>
+          <w14:ligatures w14:val="none"/>
         </w:rPr>
         <w:t>del Código</w:t>
       </w:r>
@@ -1205,24 +1205,24 @@
           <w:color w:val="000000"/>
           <w:kern w:val="0"/>
           <w:lang w:eastAsia="es-PE"/>
-          <ns2:ligatures ns2:val="none"/>
+          <w14:ligatures w14:val="none"/>
         </w:rPr>
         <w:t xml:space="preserve">. </w:t>
       </w:r>
     </w:p>
     <w:bookmarkEnd w:id="1"/>
-    <w:p ns2:paraId="2DC7B64E" ns2:textId="77777777">
-      <w:pPr>
-        <w:spacing w:after="0" w:line="240" w:lineRule="auto"/>
-        <w:jc w:val="both"/>
-        <w:rPr>
-          <w:rFonts w:ascii="Arial Narrow" w:eastAsia="Arial Narrow" w:hAnsi="Arial Narrow" w:cs="Arial Narrow"/>
-          <w:kern w:val="0"/>
-          <ns2:ligatures ns2:val="none"/>
-        </w:rPr>
-      </w:pPr>
-    </w:p>
-    <w:p ns2:paraId="61A99930" ns2:textId="436D73FF">
+    <w:p>
+      <w:pPr>
+        <w:spacing w:after="0" w:line="240" w:lineRule="auto"/>
+        <w:jc w:val="both"/>
+        <w:rPr>
+          <w:rFonts w:ascii="Arial Narrow" w:eastAsia="Arial Narrow" w:hAnsi="Arial Narrow" w:cs="Arial Narrow"/>
+          <w:kern w:val="0"/>
+          <w14:ligatures w14:val="none"/>
+        </w:rPr>
+      </w:pPr>
+    </w:p>
+    <w:p>
       <w:pPr>
         <w:pStyle w:val="Prrafodelista"/>
         <w:numPr>
@@ -1235,14 +1235,14 @@
         <w:rPr>
           <w:rFonts w:ascii="Arial Narrow" w:eastAsia="Arial Narrow" w:hAnsi="Arial Narrow" w:cs="Arial Narrow"/>
           <w:kern w:val="0"/>
-          <ns2:ligatures ns2:val="none"/>
-        </w:rPr>
-      </w:pPr>
-      <w:r>
-        <w:rPr>
-          <w:rFonts w:ascii="Arial Narrow" w:eastAsia="Arial Narrow" w:hAnsi="Arial Narrow" w:cs="Arial Narrow"/>
-          <w:kern w:val="0"/>
-          <ns2:ligatures ns2:val="none"/>
+          <w14:ligatures w14:val="none"/>
+        </w:rPr>
+      </w:pPr>
+      <w:r>
+        <w:rPr>
+          <w:rFonts w:ascii="Arial Narrow" w:eastAsia="Arial Narrow" w:hAnsi="Arial Narrow" w:cs="Arial Narrow"/>
+          <w:kern w:val="0"/>
+          <w14:ligatures w14:val="none"/>
         </w:rPr>
         <w:t xml:space="preserve">Asimismo, </w:t>
       </w:r>
@@ -1252,7 +1252,7 @@
           <w:color w:val="000000"/>
           <w:kern w:val="0"/>
           <w:lang w:eastAsia="es-PE"/>
-          <ns2:ligatures ns2:val="none"/>
+          <w14:ligatures w14:val="none"/>
         </w:rPr>
         <w:t xml:space="preserve">la Secretaría Técnica, en ejercicio de sus facultades, considera </w:t>
       </w:r>
@@ -1260,7 +1260,7 @@
         <w:rPr>
           <w:rFonts w:ascii="Arial Narrow" w:eastAsia="Arial Narrow" w:hAnsi="Arial Narrow" w:cs="Arial"/>
           <w:kern w:val="0"/>
-          <ns2:ligatures ns2:val="none"/>
+          <w14:ligatures w14:val="none"/>
         </w:rPr>
         <w:t xml:space="preserve">que el hecho denunciado, consistente en que </w:t>
       </w:r>
@@ -1268,7 +1268,7 @@
         <w:rPr>
           <w:rFonts w:ascii="Arial Narrow" w:eastAsia="Arial Narrow" w:hAnsi="Arial Narrow" w:cs="Arial Narrow"/>
           <w:kern w:val="0"/>
-          <ns2:ligatures ns2:val="none"/>
+          <w14:ligatures w14:val="none"/>
         </w:rPr>
         <w:t>el Banco de Crédito del Perú S.A. y Pacífico Compañía de Seguros y Reaseguros S.A. no habrían cumplido oportunamente con entregar a la denunciante los documentos contractuales del Seguro de Protección de Tarjeta BCP 1000001429</w:t>
       </w:r>
@@ -1276,7 +1276,7 @@
         <w:rPr>
           <w:rFonts w:ascii="Arial Narrow" w:eastAsia="Arial Narrow" w:hAnsi="Arial Narrow" w:cs="Arial"/>
           <w:kern w:val="0"/>
-          <ns2:ligatures ns2:val="none"/>
+          <w14:ligatures w14:val="none"/>
         </w:rPr>
         <w:t xml:space="preserve">. </w:t>
       </w:r>
@@ -1285,7 +1285,7 @@
         <w:rPr>
           <w:rFonts w:ascii="Arial Narrow" w:eastAsia="Arial Narrow" w:hAnsi="Arial Narrow" w:cs="Arial"/>
           <w:kern w:val="0"/>
-          <ns2:ligatures ns2:val="none"/>
+          <w14:ligatures w14:val="none"/>
         </w:rPr>
         <w:t>Por consiguiente, corresponde calificar el hecho materia de denuncia como una presunta infracción al deber de entregar a los usuarios copia de los contratos y demás documentación relacionada con dichos actos jurídicos, tipificado en el literal e) del artículo 47 del Código</w:t>
       </w:r>
@@ -1295,7 +1295,7 @@
           <w:rFonts w:ascii="Arial Narrow" w:eastAsia="Arial Narrow" w:hAnsi="Arial Narrow" w:cs="Arial"/>
           <w:kern w:val="0"/>
           <w:vertAlign w:val="superscript"/>
-          <ns2:ligatures ns2:val="none"/>
+          <w14:ligatures w14:val="none"/>
         </w:rPr>
         <w:footnoteReference w:id="6"/>
       </w:r>
@@ -1303,25 +1303,25 @@
         <w:rPr>
           <w:rFonts w:ascii="Arial Narrow" w:eastAsia="Arial Narrow" w:hAnsi="Arial Narrow" w:cs="Arial"/>
           <w:kern w:val="0"/>
-          <ns2:ligatures ns2:val="none"/>
+          <w14:ligatures w14:val="none"/>
         </w:rPr>
         <w:t>.</w:t>
       </w:r>
       <w:bookmarkStart w:id="13" w:name="_Hlk212534267"/>
       <w:bookmarkEnd w:id="12"/>
     </w:p>
-    <w:p ns2:paraId="4266B1E3" ns2:textId="77777777">
-      <w:pPr>
-        <w:spacing w:after="0" w:line="240" w:lineRule="auto"/>
-        <w:jc w:val="both"/>
-        <w:rPr>
-          <w:rFonts w:ascii="Arial Narrow" w:eastAsia="Arial Narrow" w:hAnsi="Arial Narrow" w:cs="Arial Narrow"/>
-          <w:kern w:val="0"/>
-          <ns2:ligatures ns2:val="none"/>
-        </w:rPr>
-      </w:pPr>
-    </w:p>
-    <w:p ns2:paraId="78C31712" ns2:textId="19F6D69F">
+    <w:p>
+      <w:pPr>
+        <w:spacing w:after="0" w:line="240" w:lineRule="auto"/>
+        <w:jc w:val="both"/>
+        <w:rPr>
+          <w:rFonts w:ascii="Arial Narrow" w:eastAsia="Arial Narrow" w:hAnsi="Arial Narrow" w:cs="Arial Narrow"/>
+          <w:kern w:val="0"/>
+          <w14:ligatures w14:val="none"/>
+        </w:rPr>
+      </w:pPr>
+    </w:p>
+    <w:p>
       <w:pPr>
         <w:pStyle w:val="Prrafodelista"/>
         <w:numPr>
@@ -1334,7 +1334,7 @@
         <w:rPr>
           <w:rFonts w:ascii="Arial Narrow" w:eastAsia="Arial Narrow" w:hAnsi="Arial Narrow" w:cs="Arial Narrow"/>
           <w:kern w:val="0"/>
-          <ns2:ligatures ns2:val="none"/>
+          <w14:ligatures w14:val="none"/>
         </w:rPr>
       </w:pPr>
       <w:bookmarkStart w:id="14" w:name="_Hlk214534552"/>
@@ -1345,7 +1345,7 @@
           <w:color w:val="000000"/>
           <w:kern w:val="0"/>
           <w:lang w:eastAsia="es-PE"/>
-          <ns2:ligatures ns2:val="none"/>
+          <w14:ligatures w14:val="none"/>
         </w:rPr>
         <w:t xml:space="preserve">Además, </w:t>
       </w:r>
@@ -1356,7 +1356,7 @@
           <w:color w:val="000000"/>
           <w:kern w:val="0"/>
           <w:lang w:eastAsia="es-PE"/>
-          <ns2:ligatures ns2:val="none"/>
+          <w14:ligatures w14:val="none"/>
         </w:rPr>
         <w:t xml:space="preserve">la Secretaría Técnica, en ejercicio de sus facultades, considera </w:t>
       </w:r>
@@ -1364,7 +1364,7 @@
         <w:rPr>
           <w:rFonts w:ascii="Arial Narrow" w:eastAsia="Arial Narrow" w:hAnsi="Arial Narrow" w:cs="Arial"/>
           <w:kern w:val="0"/>
-          <ns2:ligatures ns2:val="none"/>
+          <w14:ligatures w14:val="none"/>
         </w:rPr>
         <w:t xml:space="preserve">que el hecho denunciado, consistente en que </w:t>
       </w:r>
@@ -1372,7 +1372,7 @@
         <w:rPr>
           <w:rFonts w:ascii="Arial Narrow" w:eastAsia="Arial Narrow" w:hAnsi="Arial Narrow" w:cs="Arial Narrow"/>
           <w:kern w:val="0"/>
-          <ns2:ligatures ns2:val="none"/>
+          <w14:ligatures w14:val="none"/>
         </w:rPr>
         <w:t>los proveedores denunciados no habrían cumplido con informar a la denunciante que el Seguro Devolución Vida suscrito el 5 de setiembre de 2023 con Pacífico Compañía de Seguros y Reaseguros S.A. había sido transferido a Rímac Seguros y Reaseguros S.A</w:t>
       </w:r>
@@ -1383,7 +1383,7 @@
           <w:color w:val="000000"/>
           <w:kern w:val="0"/>
           <w:lang w:eastAsia="es-PE"/>
-          <ns2:ligatures ns2:val="none"/>
+          <w14:ligatures w14:val="none"/>
         </w:rPr>
         <w:t xml:space="preserve">. </w:t>
       </w:r>
@@ -1396,7 +1396,7 @@
           <w:color w:val="000000"/>
           <w:kern w:val="0"/>
           <w:lang w:eastAsia="es-PE"/>
-          <ns2:ligatures ns2:val="none"/>
+          <w14:ligatures w14:val="none"/>
         </w:rPr>
         <w:t xml:space="preserve">Por consiguiente, corresponde calificar el hecho materia de denuncia como una presunta infracción al deber de información, tipificado en el </w:t>
       </w:r>
@@ -1408,7 +1408,7 @@
           <w:color w:val="000000"/>
           <w:kern w:val="0"/>
           <w:lang w:eastAsia="es-PE"/>
-          <ns2:ligatures ns2:val="none"/>
+          <w14:ligatures w14:val="none"/>
         </w:rPr>
         <w:t xml:space="preserve">artículo 1, numeral 1, literal b) </w:t>
       </w:r>
@@ -1420,7 +1420,7 @@
           <w:color w:val="000000"/>
           <w:kern w:val="0"/>
           <w:lang w:eastAsia="es-PE"/>
-          <ns2:ligatures ns2:val="none"/>
+          <w14:ligatures w14:val="none"/>
         </w:rPr>
         <w:t>y al artículo 2 del Código</w:t>
       </w:r>
@@ -1435,7 +1435,7 @@
           <w:kern w:val="0"/>
           <w:vertAlign w:val="superscript"/>
           <w:lang w:eastAsia="es-PE"/>
-          <ns2:ligatures ns2:val="none"/>
+          <w14:ligatures w14:val="none"/>
         </w:rPr>
         <w:footnoteReference w:id="7"/>
       </w:r>
@@ -1447,7 +1447,7 @@
           <w:color w:val="000000"/>
           <w:kern w:val="0"/>
           <w:lang w:eastAsia="es-PE"/>
-          <ns2:ligatures ns2:val="none"/>
+          <w14:ligatures w14:val="none"/>
         </w:rPr>
         <w:t xml:space="preserve">.  </w:t>
       </w:r>
@@ -1456,18 +1456,18 @@
     </w:p>
     <w:bookmarkEnd w:id="13"/>
     <w:bookmarkEnd w:id="14"/>
-    <w:p ns2:paraId="7A2CF596" ns2:textId="77777777">
+    <w:p>
       <w:pPr>
         <w:pStyle w:val="Prrafodelista"/>
         <w:spacing w:after="0" w:line="240" w:lineRule="auto"/>
         <w:rPr>
           <w:rFonts w:ascii="Arial Narrow" w:eastAsia="Arial Narrow" w:hAnsi="Arial Narrow" w:cs="Arial Narrow"/>
           <w:kern w:val="0"/>
-          <ns2:ligatures ns2:val="none"/>
-        </w:rPr>
-      </w:pPr>
-    </w:p>
-    <w:p ns2:paraId="07559B21" ns2:textId="2BB84C44">
+          <w14:ligatures w14:val="none"/>
+        </w:rPr>
+      </w:pPr>
+    </w:p>
+    <w:p>
       <w:pPr>
         <w:pStyle w:val="Prrafodelista"/>
         <w:numPr>
@@ -1480,7 +1480,7 @@
         <w:rPr>
           <w:rFonts w:ascii="Arial Narrow" w:eastAsia="Arial Narrow" w:hAnsi="Arial Narrow" w:cs="Arial Narrow"/>
           <w:kern w:val="0"/>
-          <ns2:ligatures ns2:val="none"/>
+          <w14:ligatures w14:val="none"/>
         </w:rPr>
       </w:pPr>
       <w:bookmarkStart w:id="21" w:name="_Hlk214962902"/>
@@ -1489,7 +1489,7 @@
         <w:rPr>
           <w:rFonts w:ascii="Arial Narrow" w:eastAsia="Arial Narrow" w:hAnsi="Arial Narrow" w:cs="Arial Narrow"/>
           <w:kern w:val="0"/>
-          <ns2:ligatures ns2:val="none"/>
+          <w14:ligatures w14:val="none"/>
         </w:rPr>
         <w:t xml:space="preserve">Asimismo, la Secretaría Técnica, en ejercicio de sus facultades, considera que el hecho denunciado, consistente en que </w:t>
       </w:r>
@@ -1497,7 +1497,7 @@
         <w:rPr>
           <w:rFonts w:ascii="Arial Narrow" w:eastAsia="Arial Narrow" w:hAnsi="Arial Narrow" w:cs="Arial"/>
           <w:kern w:val="0"/>
-          <ns2:ligatures ns2:val="none"/>
+          <w14:ligatures w14:val="none"/>
         </w:rPr>
         <w:t>el proveedor denunciado habría brindado una respuesta inadecuada al reclamo presentado por el denunciante el 12 de agosto de 2024. Por consiguiente, corresponde calificar el hecho materia de denuncia como una presunta infracción al numeral 88.1 del artículo 88 del Código</w:t>
       </w:r>
@@ -1511,7 +1511,7 @@
           <w:kern w:val="0"/>
           <w:vertAlign w:val="superscript"/>
           <w:lang w:eastAsia="es-PE"/>
-          <ns2:ligatures ns2:val="none"/>
+          <w14:ligatures w14:val="none"/>
         </w:rPr>
         <w:footnoteReference w:id="8"/>
       </w:r>
@@ -1522,7 +1522,7 @@
           <w:color w:val="000000"/>
           <w:kern w:val="0"/>
           <w:lang w:eastAsia="es-PE"/>
-          <ns2:ligatures ns2:val="none"/>
+          <w14:ligatures w14:val="none"/>
         </w:rPr>
         <w:t>.</w:t>
       </w:r>
@@ -1531,7 +1531,7 @@
     <w:bookmarkEnd w:id="7"/>
     <w:bookmarkEnd w:id="15"/>
     <w:bookmarkEnd w:id="22"/>
-    <w:p ns2:paraId="432038D6" ns2:textId="0A9F6D75">
+    <w:p>
       <w:pPr>
         <w:spacing w:after="0" w:line="240" w:lineRule="auto"/>
         <w:jc w:val="both"/>
@@ -1539,12 +1539,12 @@
           <w:rFonts w:ascii="Arial Narrow" w:eastAsia="Calibri" w:hAnsi="Arial Narrow" w:cs="Arial Narrow"/>
           <w:kern w:val="0"/>
           <w:lang w:eastAsia="es-PE"/>
-          <ns2:ligatures ns2:val="none"/>
+          <w14:ligatures w14:val="none"/>
         </w:rPr>
       </w:pPr>
     </w:p>
     <w:bookmarkEnd w:id="2"/>
-    <w:p ns2:paraId="463134E5" ns2:textId="77777777">
+    <w:p>
       <w:pPr>
         <w:pStyle w:val="Prrafodelista"/>
         <w:numPr>
@@ -1558,7 +1558,7 @@
           <w:rFonts w:ascii="Arial Narrow" w:eastAsia="Calibri" w:hAnsi="Arial Narrow" w:cs="Arial Narrow"/>
           <w:kern w:val="0"/>
           <w:lang w:eastAsia="es-PE"/>
-          <ns2:ligatures ns2:val="none"/>
+          <w14:ligatures w14:val="none"/>
         </w:rPr>
       </w:pPr>
       <w:r>
@@ -1567,7 +1567,7 @@
           <w:color w:val="000000"/>
           <w:kern w:val="0"/>
           <w:lang w:eastAsia="es-PE"/>
-          <ns2:ligatures ns2:val="none"/>
+          <w14:ligatures w14:val="none"/>
         </w:rPr>
         <w:t>En tanto la denuncia reúne los requisitos establecidos por la norma citada, corresponde admitirla a trámite</w:t>
       </w:r>
@@ -1577,7 +1577,7 @@
           <w:rFonts w:ascii="Arial Narrow" w:eastAsia="Arial Narrow" w:hAnsi="Arial Narrow" w:cs="Arial Narrow"/>
           <w:kern w:val="0"/>
           <w:vertAlign w:val="superscript"/>
-          <ns2:ligatures ns2:val="none"/>
+          <w14:ligatures w14:val="none"/>
         </w:rPr>
         <w:footnoteReference w:id="9"/>
       </w:r>
@@ -1587,13 +1587,13 @@
           <w:color w:val="000000"/>
           <w:kern w:val="0"/>
           <w:lang w:eastAsia="es-PE"/>
-          <ns2:ligatures ns2:val="none"/>
+          <w14:ligatures w14:val="none"/>
         </w:rPr>
         <w:t>.</w:t>
       </w:r>
       <w:bookmarkStart w:id="23" w:name="_Hlk214963039"/>
     </w:p>
-    <w:p ns2:paraId="68C71625" ns2:textId="77777777">
+    <w:p>
       <w:pPr>
         <w:spacing w:after="0" w:line="240" w:lineRule="auto"/>
         <w:ind w:left="567"/>
@@ -1604,12 +1604,12 @@
           <w:color w:val="000000"/>
           <w:kern w:val="0"/>
           <w:lang w:eastAsia="es-PE"/>
-          <ns2:ligatures ns2:val="none"/>
+          <w14:ligatures w14:val="none"/>
         </w:rPr>
       </w:pPr>
       <w:bookmarkStart w:id="24" w:name="_Hlk214963071"/>
     </w:p>
-    <w:p ns2:paraId="38A98B4B" ns2:textId="77777777">
+    <w:p>
       <w:pPr>
         <w:pStyle w:val="Prrafodelista"/>
         <w:numPr>
@@ -1629,22 +1629,22 @@
           <w:color w:val="000000"/>
           <w:kern w:val="0"/>
           <w:lang w:eastAsia="es-PE"/>
-          <ns2:ligatures ns2:val="none"/>
-        </w:rPr>
-      </w:pPr>
-      <w:r>
-        <w:rPr>
-          <w:rFonts w:ascii="Arial Narrow" w:eastAsia="Arial Narrow" w:hAnsi="Arial Narrow" w:cs="Arial Narrow"/>
-          <w:b/>
-          <w:color w:val="000000"/>
-          <w:kern w:val="0"/>
-          <w:lang w:eastAsia="es-PE"/>
-          <ns2:ligatures ns2:val="none"/>
+          <w14:ligatures w14:val="none"/>
+        </w:rPr>
+      </w:pPr>
+      <w:r>
+        <w:rPr>
+          <w:rFonts w:ascii="Arial Narrow" w:eastAsia="Arial Narrow" w:hAnsi="Arial Narrow" w:cs="Arial Narrow"/>
+          <w:b/>
+          <w:color w:val="000000"/>
+          <w:kern w:val="0"/>
+          <w:lang w:eastAsia="es-PE"/>
+          <w14:ligatures w14:val="none"/>
         </w:rPr>
         <w:t>REQUERIMIENTO DE INFORMACIÓN</w:t>
       </w:r>
     </w:p>
-    <w:p ns2:paraId="5B518DC4" ns2:textId="77777777">
+    <w:p>
       <w:pPr>
         <w:spacing w:after="0" w:line="240" w:lineRule="auto"/>
         <w:jc w:val="both"/>
@@ -1653,11 +1653,11 @@
           <w:color w:val="000000"/>
           <w:kern w:val="0"/>
           <w:lang w:val="es-ES" w:eastAsia="es-ES"/>
-          <ns2:ligatures ns2:val="none"/>
-        </w:rPr>
-      </w:pPr>
-    </w:p>
-    <w:p ns2:paraId="62B88A04" ns2:textId="1C43ABBA">
+          <w14:ligatures w14:val="none"/>
+        </w:rPr>
+      </w:pPr>
+    </w:p>
+    <w:p>
       <w:pPr>
         <w:pStyle w:val="Prrafodelista"/>
         <w:numPr>
@@ -1672,7 +1672,7 @@
           <w:color w:val="000000"/>
           <w:kern w:val="0"/>
           <w:lang w:val="es-ES" w:eastAsia="es-ES"/>
-          <ns2:ligatures ns2:val="none"/>
+          <w14:ligatures w14:val="none"/>
         </w:rPr>
       </w:pPr>
       <w:r>
@@ -1681,7 +1681,7 @@
           <w:color w:val="000000"/>
           <w:kern w:val="0"/>
           <w:lang w:val="es-ES" w:eastAsia="es-ES"/>
-          <ns2:ligatures ns2:val="none"/>
+          <w14:ligatures w14:val="none"/>
         </w:rPr>
         <w:lastRenderedPageBreak/>
         <w:t xml:space="preserve">A efectos de tener mayores elementos </w:t>
@@ -1693,7 +1693,7 @@
           <w:color w:val="000000"/>
           <w:kern w:val="0"/>
           <w:lang w:val="es-ES" w:eastAsia="es-ES"/>
-          <ns2:ligatures ns2:val="none"/>
+          <w14:ligatures w14:val="none"/>
         </w:rPr>
         <w:t xml:space="preserve">que sirvan para la resolución definitiva del presente caso, la Secretaría Técnica, en ejercicio de las facultades que la ley le confiere, conviene </w:t>
       </w:r>
@@ -1703,7 +1703,7 @@
           <w:color w:val="000000"/>
           <w:kern w:val="0"/>
           <w:lang w:val="es-ES" w:eastAsia="es-ES"/>
-          <ns2:ligatures ns2:val="none"/>
+          <w14:ligatures w14:val="none"/>
         </w:rPr>
         <w:t>requerir al proveedor denunciado que</w:t>
       </w:r>
@@ -1713,7 +1713,7 @@
           <w:color w:val="000000"/>
           <w:kern w:val="0"/>
           <w:lang w:val="es-ES" w:eastAsia="es-ES"/>
-          <ns2:ligatures ns2:val="none"/>
+          <w14:ligatures w14:val="none"/>
         </w:rPr>
         <w:t xml:space="preserve">, en un plazo no mayor de cinco (5) días hábiles contado a partir del día siguiente de la notificación de la presente resolución, cumpla con lo siguiente: </w:t>
       </w:r>
@@ -1723,7 +1723,7 @@
           <w:color w:val="000000"/>
           <w:kern w:val="0"/>
           <w:lang w:val="es-ES" w:eastAsia="es-ES"/>
-          <ns2:ligatures ns2:val="none"/>
+          <w14:ligatures w14:val="none"/>
         </w:rPr>
         <w:t xml:space="preserve">(i) presentar una copia completa, legible y debidamente suscrita de la Póliza 2101-1031084 del Seguro Vehicular, </w:t>
       </w:r>
@@ -1734,7 +1734,7 @@
           <w:color w:val="000000"/>
           <w:kern w:val="0"/>
           <w:lang w:val="es-ES" w:eastAsia="es-ES"/>
-          <ns2:ligatures ns2:val="none"/>
+          <w14:ligatures w14:val="none"/>
         </w:rPr>
         <w:t>así como el cargo de remisión de la póliza</w:t>
       </w:r>
@@ -1745,7 +1745,7 @@
           <w:color w:val="000000"/>
           <w:kern w:val="0"/>
           <w:lang w:val="es-ES" w:eastAsia="es-ES"/>
-          <ns2:ligatures ns2:val="none"/>
+          <w14:ligatures w14:val="none"/>
         </w:rPr>
         <w:t xml:space="preserve">; (ii) presentar los medios probatorios que acrediten el valor a indemnizar del vehículo asegurado de acuerdo a los términos y condiciones de la póliza; y, (iii) presentar todas las comunicaciones cursadas </w:t>
       </w:r>
@@ -1755,7 +1755,7 @@
           <w:color w:val="000000"/>
           <w:kern w:val="0"/>
           <w:lang w:val="es-ES" w:eastAsia="es-ES"/>
-          <ns2:ligatures ns2:val="none"/>
+          <w14:ligatures w14:val="none"/>
         </w:rPr>
         <w:t>con la parte denunciante</w:t>
       </w:r>
@@ -1765,7 +1765,7 @@
           <w:color w:val="000000"/>
           <w:kern w:val="0"/>
           <w:lang w:val="es-ES" w:eastAsia="es-ES"/>
-          <ns2:ligatures ns2:val="none"/>
+          <w14:ligatures w14:val="none"/>
         </w:rPr>
         <w:t xml:space="preserve"> </w:t>
       </w:r>
@@ -1775,7 +1775,7 @@
           <w:color w:val="000000"/>
           <w:kern w:val="0"/>
           <w:lang w:val="es-ES" w:eastAsia="es-ES"/>
-          <ns2:ligatures ns2:val="none"/>
+          <w14:ligatures w14:val="none"/>
         </w:rPr>
         <w:t xml:space="preserve">en virtud </w:t>
       </w:r>
@@ -1785,7 +1785,7 @@
           <w:color w:val="000000"/>
           <w:kern w:val="0"/>
           <w:lang w:val="es-ES" w:eastAsia="es-ES"/>
-          <ns2:ligatures ns2:val="none"/>
+          <w14:ligatures w14:val="none"/>
         </w:rPr>
         <w:t xml:space="preserve">de los hechos materia </w:t>
       </w:r>
@@ -1795,7 +1795,7 @@
           <w:color w:val="000000"/>
           <w:kern w:val="0"/>
           <w:lang w:val="es-ES" w:eastAsia="es-ES"/>
-          <ns2:ligatures ns2:val="none"/>
+          <w14:ligatures w14:val="none"/>
         </w:rPr>
         <w:t>de denuncia</w:t>
       </w:r>
@@ -1805,7 +1805,7 @@
           <w:color w:val="000000"/>
           <w:kern w:val="0"/>
           <w:lang w:val="es-ES" w:eastAsia="es-ES"/>
-          <ns2:ligatures ns2:val="none"/>
+          <w14:ligatures w14:val="none"/>
         </w:rPr>
         <w:t>.</w:t>
       </w:r>
@@ -1815,13 +1815,13 @@
           <w:color w:val="000000"/>
           <w:kern w:val="0"/>
           <w:lang w:eastAsia="es-ES"/>
-          <ns2:ligatures ns2:val="none"/>
+          <w14:ligatures w14:val="none"/>
         </w:rPr>
         <w:t xml:space="preserve"> </w:t>
       </w:r>
     </w:p>
     <w:bookmarkEnd w:id="24"/>
-    <w:p ns2:paraId="5C93B848" ns2:textId="77777777">
+    <w:p>
       <w:pPr>
         <w:pStyle w:val="Prrafodelista"/>
         <w:spacing w:after="0" w:line="240" w:lineRule="auto"/>
@@ -1832,11 +1832,11 @@
           <w:color w:val="000000"/>
           <w:kern w:val="0"/>
           <w:lang w:val="es-ES" w:eastAsia="es-ES"/>
-          <ns2:ligatures ns2:val="none"/>
-        </w:rPr>
-      </w:pPr>
-    </w:p>
-    <w:p ns2:paraId="2A119386" ns2:textId="77777777">
+          <w14:ligatures w14:val="none"/>
+        </w:rPr>
+      </w:pPr>
+    </w:p>
+    <w:p>
       <w:pPr>
         <w:pStyle w:val="Prrafodelista"/>
         <w:numPr>
@@ -1856,36 +1856,36 @@
           <w:color w:val="000000"/>
           <w:kern w:val="0"/>
           <w:lang w:eastAsia="es-PE"/>
-          <ns2:ligatures ns2:val="none"/>
-        </w:rPr>
-      </w:pPr>
-      <w:r>
-        <w:rPr>
-          <w:rFonts w:ascii="Arial Narrow" w:eastAsia="Arial Narrow" w:hAnsi="Arial Narrow" w:cs="Arial Narrow"/>
-          <w:b/>
-          <w:color w:val="000000"/>
-          <w:kern w:val="0"/>
-          <w:lang w:eastAsia="es-PE"/>
-          <ns2:ligatures ns2:val="none"/>
+          <w14:ligatures w14:val="none"/>
+        </w:rPr>
+      </w:pPr>
+      <w:r>
+        <w:rPr>
+          <w:rFonts w:ascii="Arial Narrow" w:eastAsia="Arial Narrow" w:hAnsi="Arial Narrow" w:cs="Arial Narrow"/>
+          <w:b/>
+          <w:color w:val="000000"/>
+          <w:kern w:val="0"/>
+          <w:lang w:eastAsia="es-PE"/>
+          <w14:ligatures w14:val="none"/>
         </w:rPr>
         <w:t xml:space="preserve">RESOLUCIÓN DE LA SECRETARÍA TÉCNICA </w:t>
       </w:r>
     </w:p>
-    <w:p ns2:paraId="7F554EB2" ns2:textId="77777777">
-      <w:pPr>
-        <w:spacing w:after="0" w:line="240" w:lineRule="auto"/>
-        <w:jc w:val="both"/>
-        <w:rPr>
-          <w:rFonts w:ascii="Arial Narrow" w:eastAsia="Arial Narrow" w:hAnsi="Arial Narrow" w:cs="Arial Narrow"/>
-          <w:b/>
-          <w:color w:val="000000"/>
-          <w:kern w:val="0"/>
-          <w:lang w:eastAsia="es-PE"/>
-          <ns2:ligatures ns2:val="none"/>
-        </w:rPr>
-      </w:pPr>
-    </w:p>
-    <w:p ns2:paraId="40BE44E6" ns2:textId="77777777">
+    <w:p>
+      <w:pPr>
+        <w:spacing w:after="0" w:line="240" w:lineRule="auto"/>
+        <w:jc w:val="both"/>
+        <w:rPr>
+          <w:rFonts w:ascii="Arial Narrow" w:eastAsia="Arial Narrow" w:hAnsi="Arial Narrow" w:cs="Arial Narrow"/>
+          <w:b/>
+          <w:color w:val="000000"/>
+          <w:kern w:val="0"/>
+          <w:lang w:eastAsia="es-PE"/>
+          <w14:ligatures w14:val="none"/>
+        </w:rPr>
+      </w:pPr>
+    </w:p>
+    <w:p>
       <w:pPr>
         <w:spacing w:after="0" w:line="240" w:lineRule="auto"/>
         <w:jc w:val="both"/>
@@ -1894,17 +1894,17 @@
           <w:color w:val="000000"/>
           <w:kern w:val="0"/>
           <w:lang w:eastAsia="es-PE"/>
-          <ns2:ligatures ns2:val="none"/>
-        </w:rPr>
-      </w:pPr>
-      <w:r>
-        <w:rPr>
-          <w:rFonts w:ascii="Arial Narrow" w:eastAsia="Arial Narrow" w:hAnsi="Arial Narrow" w:cs="Arial Narrow"/>
-          <w:b/>
-          <w:color w:val="000000"/>
-          <w:kern w:val="0"/>
-          <w:lang w:eastAsia="es-PE"/>
-          <ns2:ligatures ns2:val="none"/>
+          <w14:ligatures w14:val="none"/>
+        </w:rPr>
+      </w:pPr>
+      <w:r>
+        <w:rPr>
+          <w:rFonts w:ascii="Arial Narrow" w:eastAsia="Arial Narrow" w:hAnsi="Arial Narrow" w:cs="Arial Narrow"/>
+          <w:b/>
+          <w:color w:val="000000"/>
+          <w:kern w:val="0"/>
+          <w:lang w:eastAsia="es-PE"/>
+          <w14:ligatures w14:val="none"/>
         </w:rPr>
         <w:t xml:space="preserve">PRIMERO: </w:t>
       </w:r>
@@ -1915,7 +1915,7 @@
           <w:kern w:val="0"/>
           <w:shd w:val="clear" w:color="auto" w:fill="FFFFFF"/>
           <w:lang w:eastAsia="es-PE"/>
-          <ns2:ligatures ns2:val="none"/>
+          <w14:ligatures w14:val="none"/>
         </w:rPr>
         <w:t xml:space="preserve">admitir a trámite la denuncia del </w:t>
       </w:r>
@@ -1926,7 +1926,7 @@
           <w:kern w:val="0"/>
           <w:shd w:val="clear" w:color="auto" w:fill="FFFFFF"/>
           <w:lang w:eastAsia="es-PE"/>
-          <ns2:ligatures ns2:val="none"/>
+          <w14:ligatures w14:val="none"/>
         </w:rPr>
         <w:t xml:space="preserve">12 de enero de 2025 </w:t>
       </w:r>
@@ -1937,7 +1937,7 @@
           <w:kern w:val="0"/>
           <w:shd w:val="clear" w:color="auto" w:fill="FFFFFF"/>
           <w:lang w:eastAsia="es-PE"/>
-          <ns2:ligatures ns2:val="none"/>
+          <w14:ligatures w14:val="none"/>
         </w:rPr>
         <w:t xml:space="preserve">interpuesta </w:t>
       </w:r>
@@ -1948,7 +1948,7 @@
           <w:kern w:val="0"/>
           <w:shd w:val="clear" w:color="auto" w:fill="FFFFFF"/>
           <w:lang w:eastAsia="es-PE"/>
-          <ns2:ligatures ns2:val="none"/>
+          <w14:ligatures w14:val="none"/>
         </w:rPr>
         <w:t xml:space="preserve">por el señor Oswaldo Chamorro Cisterna </w:t>
       </w:r>
@@ -1959,7 +1959,7 @@
           <w:kern w:val="0"/>
           <w:shd w:val="clear" w:color="auto" w:fill="FFFFFF"/>
           <w:lang w:eastAsia="es-PE"/>
-          <ns2:ligatures ns2:val="none"/>
+          <w14:ligatures w14:val="none"/>
         </w:rPr>
         <w:t xml:space="preserve">contra </w:t>
       </w:r>
@@ -1970,7 +1970,7 @@
           <w:kern w:val="0"/>
           <w:shd w:val="clear" w:color="auto" w:fill="FFFFFF"/>
           <w:lang w:eastAsia="es-PE"/>
-          <ns2:ligatures ns2:val="none"/>
+          <w14:ligatures w14:val="none"/>
         </w:rPr>
         <w:t xml:space="preserve">Rímac Seguros y Reaseguros S.A., </w:t>
       </w:r>
@@ -1982,12 +1982,12 @@
           <w:kern w:val="0"/>
           <w:shd w:val="clear" w:color="auto" w:fill="FFFFFF"/>
           <w:lang w:eastAsia="es-PE"/>
-          <ns2:ligatures ns2:val="none"/>
+          <w14:ligatures w14:val="none"/>
         </w:rPr>
         <w:t>por lo siguiente:</w:t>
       </w:r>
     </w:p>
-    <w:p ns2:paraId="5E66126E" ns2:textId="77777777">
+    <w:p>
       <w:pPr>
         <w:spacing w:after="0" w:line="240" w:lineRule="auto"/>
         <w:jc w:val="both"/>
@@ -1996,11 +1996,11 @@
           <w:color w:val="000000"/>
           <w:kern w:val="0"/>
           <w:lang w:eastAsia="es-PE"/>
-          <ns2:ligatures ns2:val="none"/>
-        </w:rPr>
-      </w:pPr>
-    </w:p>
-    <w:p ns2:paraId="0CDDEEDD" ns2:textId="7CF54386">
+          <w14:ligatures w14:val="none"/>
+        </w:rPr>
+      </w:pPr>
+    </w:p>
+    <w:p>
       <w:pPr>
         <w:pStyle w:val="Prrafodelista"/>
         <w:numPr>
@@ -2018,7 +2018,7 @@
           <w:rFonts w:ascii="Arial Narrow" w:eastAsia="Calibri" w:hAnsi="Arial Narrow" w:cs="Arial Narrow"/>
           <w:kern w:val="0"/>
           <w:lang w:eastAsia="es-PE"/>
-          <ns2:ligatures ns2:val="none"/>
+          <w14:ligatures w14:val="none"/>
         </w:rPr>
       </w:pPr>
       <w:r>
@@ -2027,7 +2027,7 @@
           <w:color w:val="000000"/>
           <w:kern w:val="0"/>
           <w:lang w:eastAsia="es-PE"/>
-          <ns2:ligatures ns2:val="none"/>
+          <w14:ligatures w14:val="none"/>
         </w:rPr>
         <w:t>Presunta</w:t>
       </w:r>
@@ -2037,7 +2037,7 @@
           <w:kern w:val="0"/>
           <w:shd w:val="clear" w:color="auto" w:fill="FFFFFF"/>
           <w:lang w:eastAsia="es-PE"/>
-          <ns2:ligatures ns2:val="none"/>
+          <w14:ligatures w14:val="none"/>
         </w:rPr>
         <w:t xml:space="preserve"> infracción a los artículos 18 y 19</w:t>
       </w:r>
@@ -2046,7 +2046,7 @@
           <w:rFonts w:ascii="Arial Narrow" w:eastAsia="Calibri" w:hAnsi="Arial Narrow" w:cs="Arial Narrow"/>
           <w:kern w:val="0"/>
           <w:lang w:eastAsia="es-PE"/>
-          <ns2:ligatures ns2:val="none"/>
+          <w14:ligatures w14:val="none"/>
         </w:rPr>
         <w:t xml:space="preserve"> de </w:t>
       </w:r>
@@ -2056,7 +2056,7 @@
           <w:kern w:val="0"/>
           <w:shd w:val="clear" w:color="auto" w:fill="FFFFFF"/>
           <w:lang w:eastAsia="es-PE"/>
-          <ns2:ligatures ns2:val="none"/>
+          <w14:ligatures w14:val="none"/>
         </w:rPr>
         <w:t xml:space="preserve">la Ley </w:t>
       </w:r>
@@ -2066,7 +2066,7 @@
           <w:kern w:val="0"/>
           <w:shd w:val="clear" w:color="auto" w:fill="FFFFFF"/>
           <w:lang w:eastAsia="es-PE"/>
-          <ns2:ligatures ns2:val="none"/>
+          <w14:ligatures w14:val="none"/>
         </w:rPr>
         <w:t>29571</w:t>
       </w:r>
@@ -2076,7 +2076,7 @@
           <w:kern w:val="0"/>
           <w:shd w:val="clear" w:color="auto" w:fill="FFFFFF"/>
           <w:lang w:eastAsia="es-PE"/>
-          <ns2:ligatures ns2:val="none"/>
+          <w14:ligatures w14:val="none"/>
         </w:rPr>
         <w:t xml:space="preserve">, Código de Protección y Defensa del Consumidor, en tanto </w:t>
       </w:r>
@@ -2086,7 +2086,7 @@
           <w:kern w:val="0"/>
           <w:shd w:val="clear" w:color="auto" w:fill="FFFFFF"/>
           <w:lang w:eastAsia="es-PE"/>
-          <ns2:ligatures ns2:val="none"/>
+          <w14:ligatures w14:val="none"/>
         </w:rPr>
         <w:t xml:space="preserve">la compañía aseguradora habría </w:t>
       </w:r>
@@ -2096,7 +2096,7 @@
           <w:kern w:val="0"/>
           <w:shd w:val="clear" w:color="auto" w:fill="FFFFFF"/>
           <w:lang w:eastAsia="es-PE"/>
-          <ns2:ligatures ns2:val="none"/>
+          <w14:ligatures w14:val="none"/>
         </w:rPr>
         <w:t xml:space="preserve">negado </w:t>
       </w:r>
@@ -2106,7 +2106,7 @@
           <w:kern w:val="0"/>
           <w:shd w:val="clear" w:color="auto" w:fill="FFFFFF"/>
           <w:lang w:eastAsia="es-PE"/>
-          <ns2:ligatures ns2:val="none"/>
+          <w14:ligatures w14:val="none"/>
         </w:rPr>
         <w:t>de manera injustificada</w:t>
       </w:r>
@@ -2116,7 +2116,7 @@
           <w:kern w:val="0"/>
           <w:shd w:val="clear" w:color="auto" w:fill="FFFFFF"/>
           <w:lang w:eastAsia="es-PE"/>
-          <ns2:ligatures ns2:val="none"/>
+          <w14:ligatures w14:val="none"/>
         </w:rPr>
         <w:t xml:space="preserve"> </w:t>
       </w:r>
@@ -2126,7 +2126,7 @@
           <w:kern w:val="0"/>
           <w:shd w:val="clear" w:color="auto" w:fill="FFFFFF"/>
           <w:lang w:eastAsia="es-PE"/>
-          <ns2:ligatures ns2:val="none"/>
+          <w14:ligatures w14:val="none"/>
         </w:rPr>
         <w:t>al denunciante la cobertura del Seguro Vehicular - Póliza 2101-1513017 por el siniestro del 12 de abril de 2025</w:t>
       </w:r>
@@ -2134,12 +2134,12 @@
         <w:rPr>
           <w:rFonts w:ascii="Arial Narrow" w:eastAsia="Arial Narrow" w:hAnsi="Arial Narrow" w:cs="Arial Narrow"/>
           <w:kern w:val="0"/>
-          <ns2:ligatures ns2:val="none"/>
+          <w14:ligatures w14:val="none"/>
         </w:rPr>
         <w:t>.</w:t>
       </w:r>
     </w:p>
-    <w:p ns2:paraId="39215327" ns2:textId="77777777">
+    <w:p>
       <w:pPr>
         <w:pStyle w:val="Prrafodelista"/>
         <w:spacing w:after="0" w:line="240" w:lineRule="auto"/>
@@ -2149,11 +2149,11 @@
           <w:rFonts w:ascii="Arial Narrow" w:eastAsia="Calibri" w:hAnsi="Arial Narrow" w:cs="Arial Narrow"/>
           <w:kern w:val="0"/>
           <w:lang w:eastAsia="es-PE"/>
-          <ns2:ligatures ns2:val="none"/>
-        </w:rPr>
-      </w:pPr>
-    </w:p>
-    <w:p ns2:paraId="4E7FC1DB" ns2:textId="0AEA4586">
+          <w14:ligatures w14:val="none"/>
+        </w:rPr>
+      </w:pPr>
+    </w:p>
+    <w:p>
       <w:pPr>
         <w:pStyle w:val="Prrafodelista"/>
         <w:numPr>
@@ -2171,7 +2171,7 @@
           <w:rFonts w:ascii="Arial Narrow" w:eastAsia="Calibri" w:hAnsi="Arial Narrow" w:cs="Arial Narrow"/>
           <w:kern w:val="0"/>
           <w:lang w:eastAsia="es-PE"/>
-          <ns2:ligatures ns2:val="none"/>
+          <w14:ligatures w14:val="none"/>
         </w:rPr>
       </w:pPr>
       <w:r>
@@ -2180,7 +2180,7 @@
           <w:color w:val="000000"/>
           <w:kern w:val="0"/>
           <w:lang w:eastAsia="es-PE"/>
-          <ns2:ligatures ns2:val="none"/>
+          <w14:ligatures w14:val="none"/>
         </w:rPr>
         <w:t xml:space="preserve">Presunta infracción al literal g) del artículo 56 de la Ley </w:t>
       </w:r>
@@ -2190,7 +2190,7 @@
           <w:kern w:val="0"/>
           <w:shd w:val="clear" w:color="auto" w:fill="FFFFFF"/>
           <w:lang w:eastAsia="es-PE"/>
-          <ns2:ligatures ns2:val="none"/>
+          <w14:ligatures w14:val="none"/>
         </w:rPr>
         <w:t>29571</w:t>
       </w:r>
@@ -2200,7 +2200,7 @@
           <w:color w:val="000000"/>
           <w:kern w:val="0"/>
           <w:lang w:eastAsia="es-PE"/>
-          <ns2:ligatures ns2:val="none"/>
+          <w14:ligatures w14:val="none"/>
         </w:rPr>
         <w:t>, Código de Protección y Defensa del Consumidor</w:t>
       </w:r>
@@ -2210,7 +2210,7 @@
           <w:kern w:val="0"/>
           <w:shd w:val="clear" w:color="auto" w:fill="FFFFFF"/>
           <w:lang w:eastAsia="es-PE"/>
-          <ns2:ligatures ns2:val="none"/>
+          <w14:ligatures w14:val="none"/>
         </w:rPr>
         <w:t xml:space="preserve">, en tanto Pacífico Compañía de Seguros y Reaseguros S.A. habría condicionado la activación del </w:t>
       </w:r>
@@ -2220,7 +2220,7 @@
           <w:color w:val="000000"/>
           <w:kern w:val="0"/>
           <w:lang w:eastAsia="es-ES"/>
-          <ns2:ligatures ns2:val="none"/>
+          <w14:ligatures w14:val="none"/>
         </w:rPr>
         <w:t xml:space="preserve">Seguro de Protección de Tarjeta BCP 1000001429 a que </w:t>
       </w:r>
@@ -2230,7 +2230,7 @@
           <w:kern w:val="0"/>
           <w:shd w:val="clear" w:color="auto" w:fill="FFFFFF"/>
           <w:lang w:eastAsia="es-PE"/>
-          <ns2:ligatures ns2:val="none"/>
+          <w14:ligatures w14:val="none"/>
         </w:rPr>
         <w:t>la denunciante se sometiera a una prueba poligráfica, pese a que dicho requisito no fue informado al momento de la contratación y le habría generado una afectación a su estado emocional</w:t>
       </w:r>
@@ -2240,12 +2240,12 @@
           <w:kern w:val="0"/>
           <w:shd w:val="clear" w:color="auto" w:fill="FFFFFF"/>
           <w:lang w:eastAsia="es-PE"/>
-          <ns2:ligatures ns2:val="none"/>
+          <w14:ligatures w14:val="none"/>
         </w:rPr>
         <w:t>.</w:t>
       </w:r>
     </w:p>
-    <w:p ns2:paraId="163CBB5D" ns2:textId="77777777">
+    <w:p>
       <w:pPr>
         <w:spacing w:after="0" w:line="240" w:lineRule="auto"/>
         <w:jc w:val="both"/>
@@ -2253,11 +2253,11 @@
           <w:rFonts w:ascii="Arial Narrow" w:eastAsia="Calibri" w:hAnsi="Arial Narrow" w:cs="Arial Narrow"/>
           <w:kern w:val="0"/>
           <w:lang w:eastAsia="es-PE"/>
-          <ns2:ligatures ns2:val="none"/>
-        </w:rPr>
-      </w:pPr>
-    </w:p>
-    <w:p ns2:paraId="32EC993B" ns2:textId="5879D7CE">
+          <w14:ligatures w14:val="none"/>
+        </w:rPr>
+      </w:pPr>
+    </w:p>
+    <w:p>
       <w:pPr>
         <w:pStyle w:val="Prrafodelista"/>
         <w:numPr>
@@ -2274,14 +2274,14 @@
         <w:rPr>
           <w:rFonts w:ascii="Arial Narrow" w:eastAsia="Arial Narrow" w:hAnsi="Arial Narrow" w:cs="Arial Narrow"/>
           <w:kern w:val="0"/>
-          <ns2:ligatures ns2:val="none"/>
-        </w:rPr>
-      </w:pPr>
-      <w:r>
-        <w:rPr>
-          <w:rFonts w:ascii="Arial Narrow" w:eastAsia="Arial Narrow" w:hAnsi="Arial Narrow" w:cs="Arial Narrow"/>
-          <w:kern w:val="0"/>
-          <ns2:ligatures ns2:val="none"/>
+          <w14:ligatures w14:val="none"/>
+        </w:rPr>
+      </w:pPr>
+      <w:r>
+        <w:rPr>
+          <w:rFonts w:ascii="Arial Narrow" w:eastAsia="Arial Narrow" w:hAnsi="Arial Narrow" w:cs="Arial Narrow"/>
+          <w:kern w:val="0"/>
+          <w14:ligatures w14:val="none"/>
         </w:rPr>
         <w:t xml:space="preserve">Presunta </w:t>
       </w:r>
@@ -2291,7 +2291,7 @@
           <w:kern w:val="0"/>
           <w:shd w:val="clear" w:color="auto" w:fill="FFFFFF"/>
           <w:lang w:eastAsia="es-PE"/>
-          <ns2:ligatures ns2:val="none"/>
+          <w14:ligatures w14:val="none"/>
         </w:rPr>
         <w:t xml:space="preserve">infracción al literal e) del artículo 47 </w:t>
       </w:r>
@@ -2299,7 +2299,7 @@
         <w:rPr>
           <w:rFonts w:ascii="Arial Narrow" w:eastAsia="Calibri" w:hAnsi="Arial Narrow" w:cs="Arial"/>
           <w:kern w:val="0"/>
-          <ns2:ligatures ns2:val="none"/>
+          <w14:ligatures w14:val="none"/>
         </w:rPr>
         <w:t>de</w:t>
       </w:r>
@@ -2309,7 +2309,7 @@
           <w:kern w:val="0"/>
           <w:shd w:val="clear" w:color="auto" w:fill="FFFFFF"/>
           <w:lang w:eastAsia="es-PE"/>
-          <ns2:ligatures ns2:val="none"/>
+          <w14:ligatures w14:val="none"/>
         </w:rPr>
         <w:t xml:space="preserve"> la Ley </w:t>
       </w:r>
@@ -2319,7 +2319,7 @@
           <w:kern w:val="0"/>
           <w:shd w:val="clear" w:color="auto" w:fill="FFFFFF"/>
           <w:lang w:eastAsia="es-PE"/>
-          <ns2:ligatures ns2:val="none"/>
+          <w14:ligatures w14:val="none"/>
         </w:rPr>
         <w:t>29571</w:t>
       </w:r>
@@ -2329,7 +2329,7 @@
           <w:kern w:val="0"/>
           <w:shd w:val="clear" w:color="auto" w:fill="FFFFFF"/>
           <w:lang w:eastAsia="es-PE"/>
-          <ns2:ligatures ns2:val="none"/>
+          <w14:ligatures w14:val="none"/>
         </w:rPr>
         <w:t xml:space="preserve">, Código de Protección y Defensa del Consumidor, </w:t>
       </w:r>
@@ -2340,7 +2340,7 @@
           <w:color w:val="000000"/>
           <w:kern w:val="0"/>
           <w:lang w:eastAsia="es-PE"/>
-          <ns2:ligatures ns2:val="none"/>
+          <w14:ligatures w14:val="none"/>
         </w:rPr>
         <w:t xml:space="preserve">en tanto </w:t>
       </w:r>
@@ -2348,7 +2348,7 @@
         <w:rPr>
           <w:rFonts w:ascii="Arial Narrow" w:eastAsia="Arial Narrow" w:hAnsi="Arial Narrow" w:cs="Arial Narrow"/>
           <w:kern w:val="0"/>
-          <ns2:ligatures ns2:val="none"/>
+          <w14:ligatures w14:val="none"/>
         </w:rPr>
         <w:t xml:space="preserve">el </w:t>
       </w:r>
@@ -2358,7 +2358,7 @@
           <w:kern w:val="0"/>
           <w:shd w:val="clear" w:color="auto" w:fill="FFFFFF"/>
           <w:lang w:eastAsia="es-PE"/>
-          <ns2:ligatures ns2:val="none"/>
+          <w14:ligatures w14:val="none"/>
         </w:rPr>
         <w:t>Banco de Crédito del Perú S.A. y Pacífico Compañía de Seguros y Reaseguros S.A. no habrían</w:t>
       </w:r>
@@ -2369,7 +2369,7 @@
           <w:color w:val="000000"/>
           <w:kern w:val="0"/>
           <w:lang w:eastAsia="es-PE"/>
-          <ns2:ligatures ns2:val="none"/>
+          <w14:ligatures w14:val="none"/>
         </w:rPr>
         <w:t xml:space="preserve"> cumplido </w:t>
       </w:r>
@@ -2379,7 +2379,7 @@
           <w:color w:val="000000"/>
           <w:kern w:val="0"/>
           <w:lang w:eastAsia="es-ES"/>
-          <ns2:ligatures ns2:val="none"/>
+          <w14:ligatures w14:val="none"/>
         </w:rPr>
         <w:t xml:space="preserve">oportunamente </w:t>
       </w:r>
@@ -2390,7 +2390,7 @@
           <w:color w:val="000000"/>
           <w:kern w:val="0"/>
           <w:lang w:eastAsia="es-PE"/>
-          <ns2:ligatures ns2:val="none"/>
+          <w14:ligatures w14:val="none"/>
         </w:rPr>
         <w:t xml:space="preserve">con entregar a la denunciante los documentos contractuales del </w:t>
       </w:r>
@@ -2400,13 +2400,13 @@
           <w:color w:val="000000"/>
           <w:kern w:val="0"/>
           <w:lang w:eastAsia="es-ES"/>
-          <ns2:ligatures ns2:val="none"/>
+          <w14:ligatures w14:val="none"/>
         </w:rPr>
         <w:t>Seguro de Protección de Tarjeta BCP 1000001429.</w:t>
       </w:r>
       <w:bookmarkStart w:id="27" w:name="_Hlk215162047"/>
     </w:p>
-    <w:p ns2:paraId="39BF39FC" ns2:textId="77777777">
+    <w:p>
       <w:pPr>
         <w:spacing w:after="0" w:line="240" w:lineRule="auto"/>
         <w:jc w:val="both"/>
@@ -2414,11 +2414,11 @@
           <w:rFonts w:ascii="Arial Narrow" w:eastAsia="Calibri" w:hAnsi="Arial Narrow" w:cs="Arial Narrow"/>
           <w:kern w:val="0"/>
           <w:lang w:eastAsia="es-PE"/>
-          <ns2:ligatures ns2:val="none"/>
-        </w:rPr>
-      </w:pPr>
-    </w:p>
-    <w:p ns2:paraId="7820524F" ns2:textId="5558E788">
+          <w14:ligatures w14:val="none"/>
+        </w:rPr>
+      </w:pPr>
+    </w:p>
+    <w:p>
       <w:pPr>
         <w:pStyle w:val="Prrafodelista"/>
         <w:numPr>
@@ -2435,7 +2435,7 @@
         <w:rPr>
           <w:rFonts w:ascii="Arial Narrow" w:eastAsia="Arial Narrow" w:hAnsi="Arial Narrow" w:cs="Arial Narrow"/>
           <w:kern w:val="0"/>
-          <ns2:ligatures ns2:val="none"/>
+          <w14:ligatures w14:val="none"/>
         </w:rPr>
       </w:pPr>
       <w:bookmarkStart w:id="28" w:name="_Hlk212534295"/>
@@ -2443,7 +2443,7 @@
         <w:rPr>
           <w:rFonts w:ascii="Arial Narrow" w:eastAsia="Arial Narrow" w:hAnsi="Arial Narrow" w:cs="Arial Narrow"/>
           <w:kern w:val="0"/>
-          <ns2:ligatures ns2:val="none"/>
+          <w14:ligatures w14:val="none"/>
         </w:rPr>
         <w:t xml:space="preserve">Presunta infracción al artículo 1, numeral 1, literal b) y al artículo 2 de la Ley </w:t>
       </w:r>
@@ -2451,7 +2451,7 @@
         <w:rPr>
           <w:rFonts w:ascii="Arial Narrow" w:eastAsia="Arial Narrow" w:hAnsi="Arial Narrow" w:cs="Arial Narrow"/>
           <w:kern w:val="0"/>
-          <ns2:ligatures ns2:val="none"/>
+          <w14:ligatures w14:val="none"/>
         </w:rPr>
         <w:t>29571</w:t>
       </w:r>
@@ -2459,7 +2459,7 @@
         <w:rPr>
           <w:rFonts w:ascii="Arial Narrow" w:eastAsia="Arial Narrow" w:hAnsi="Arial Narrow" w:cs="Arial Narrow"/>
           <w:kern w:val="0"/>
-          <ns2:ligatures ns2:val="none"/>
+          <w14:ligatures w14:val="none"/>
         </w:rPr>
         <w:t>, Código de Protección y Defensa del Consumidor</w:t>
       </w:r>
@@ -2468,7 +2468,7 @@
         <w:rPr>
           <w:rFonts w:ascii="Arial Narrow" w:eastAsia="Arial Narrow" w:hAnsi="Arial Narrow" w:cs="Arial Narrow"/>
           <w:kern w:val="0"/>
-          <ns2:ligatures ns2:val="none"/>
+          <w14:ligatures w14:val="none"/>
         </w:rPr>
         <w:t xml:space="preserve">, </w:t>
       </w:r>
@@ -2478,7 +2478,7 @@
           <w:kern w:val="0"/>
           <w:shd w:val="clear" w:color="auto" w:fill="FFFFFF"/>
           <w:lang w:eastAsia="es-PE"/>
-          <ns2:ligatures ns2:val="none"/>
+          <w14:ligatures w14:val="none"/>
         </w:rPr>
         <w:t xml:space="preserve">en tanto </w:t>
       </w:r>
@@ -2486,7 +2486,7 @@
         <w:rPr>
           <w:rFonts w:ascii="Arial Narrow" w:eastAsia="Arial Narrow" w:hAnsi="Arial Narrow" w:cs="Arial Narrow"/>
           <w:kern w:val="0"/>
-          <ns2:ligatures ns2:val="none"/>
+          <w14:ligatures w14:val="none"/>
         </w:rPr>
         <w:t xml:space="preserve">el </w:t>
       </w:r>
@@ -2496,7 +2496,7 @@
           <w:kern w:val="0"/>
           <w:shd w:val="clear" w:color="auto" w:fill="FFFFFF"/>
           <w:lang w:eastAsia="es-PE"/>
-          <ns2:ligatures ns2:val="none"/>
+          <w14:ligatures w14:val="none"/>
         </w:rPr>
         <w:t xml:space="preserve">Banco de Crédito del Perú S.A. y Pacífico Compañía de Seguros y Reaseguros S.A. no habrían cumplido con informar a la denunciante el </w:t>
       </w:r>
@@ -2506,7 +2506,7 @@
           <w:color w:val="000000"/>
           <w:kern w:val="0"/>
           <w:lang w:eastAsia="es-ES"/>
-          <ns2:ligatures ns2:val="none"/>
+          <w14:ligatures w14:val="none"/>
         </w:rPr>
         <w:t>28 de marzo de 2025</w:t>
       </w:r>
@@ -2516,7 +2516,7 @@
           <w:kern w:val="0"/>
           <w:shd w:val="clear" w:color="auto" w:fill="FFFFFF"/>
           <w:lang w:eastAsia="es-PE"/>
-          <ns2:ligatures ns2:val="none"/>
+          <w14:ligatures w14:val="none"/>
         </w:rPr>
         <w:t xml:space="preserve"> el procedimiento para activar el </w:t>
       </w:r>
@@ -2526,7 +2526,7 @@
           <w:color w:val="000000"/>
           <w:kern w:val="0"/>
           <w:lang w:eastAsia="es-ES"/>
-          <ns2:ligatures ns2:val="none"/>
+          <w14:ligatures w14:val="none"/>
         </w:rPr>
         <w:t>Seguro de Protección de Tarjeta BCP 1000001429</w:t>
       </w:r>
@@ -2534,23 +2534,23 @@
         <w:rPr>
           <w:rFonts w:ascii="Arial Narrow" w:eastAsia="Arial Narrow" w:hAnsi="Arial Narrow" w:cs="Arial Narrow"/>
           <w:kern w:val="0"/>
-          <ns2:ligatures ns2:val="none"/>
+          <w14:ligatures w14:val="none"/>
         </w:rPr>
         <w:t>.</w:t>
       </w:r>
     </w:p>
-    <w:p ns2:paraId="0B0291C5" ns2:textId="77777777">
+    <w:p>
       <w:pPr>
         <w:pStyle w:val="Prrafodelista"/>
         <w:spacing w:after="0" w:line="240" w:lineRule="auto"/>
         <w:rPr>
           <w:rFonts w:ascii="Arial Narrow" w:eastAsia="Arial Narrow" w:hAnsi="Arial Narrow" w:cs="Arial Narrow"/>
           <w:kern w:val="0"/>
-          <ns2:ligatures ns2:val="none"/>
-        </w:rPr>
-      </w:pPr>
-    </w:p>
-    <w:p ns2:paraId="7C9EE9C9" ns2:textId="4EB7233F">
+          <w14:ligatures w14:val="none"/>
+        </w:rPr>
+      </w:pPr>
+    </w:p>
+    <w:p>
       <w:pPr>
         <w:pStyle w:val="Prrafodelista"/>
         <w:numPr>
@@ -2567,7 +2567,7 @@
         <w:rPr>
           <w:rFonts w:ascii="Arial Narrow" w:eastAsia="Arial Narrow" w:hAnsi="Arial Narrow" w:cs="Arial Narrow"/>
           <w:kern w:val="0"/>
-          <ns2:ligatures ns2:val="none"/>
+          <w14:ligatures w14:val="none"/>
         </w:rPr>
       </w:pPr>
       <w:bookmarkStart w:id="29" w:name="_Hlk213688106"/>
@@ -2583,7 +2583,7 @@
           <w:kern w:val="0"/>
           <w:shd w:val="clear" w:color="auto" w:fill="FFFFFF"/>
           <w:lang w:eastAsia="es-PE"/>
-          <ns2:ligatures ns2:val="none"/>
+          <w14:ligatures w14:val="none"/>
         </w:rPr>
         <w:t>29571</w:t>
       </w:r>
@@ -2597,7 +2597,7 @@
         <w:rPr>
           <w:rFonts w:ascii="Arial Narrow" w:eastAsia="Arial Narrow" w:hAnsi="Arial Narrow" w:cs="Arial Narrow"/>
           <w:kern w:val="0"/>
-          <ns2:ligatures ns2:val="none"/>
+          <w14:ligatures w14:val="none"/>
         </w:rPr>
         <w:t>en tanto el proveedor denunciado habría brindado una respuesta inadecuada al reclamo presentado por el denunciante el 12 de agosto de 2024</w:t>
       </w:r>
@@ -2606,25 +2606,25 @@
         <w:rPr>
           <w:rFonts w:ascii="Arial Narrow" w:eastAsia="Arial Narrow" w:hAnsi="Arial Narrow" w:cs="Arial Narrow"/>
           <w:kern w:val="0"/>
-          <ns2:ligatures ns2:val="none"/>
+          <w14:ligatures w14:val="none"/>
         </w:rPr>
         <w:t>.</w:t>
       </w:r>
     </w:p>
     <w:bookmarkEnd w:id="26"/>
     <w:bookmarkEnd w:id="27"/>
-    <w:p ns2:paraId="042B3F54" ns2:textId="777BBF33">
-      <w:pPr>
-        <w:spacing w:after="0" w:line="240" w:lineRule="auto"/>
-        <w:jc w:val="both"/>
-        <w:rPr>
-          <w:rFonts w:ascii="Arial Narrow" w:eastAsia="Arial Narrow" w:hAnsi="Arial Narrow" w:cs="Arial Narrow"/>
-          <w:kern w:val="0"/>
-          <ns2:ligatures ns2:val="none"/>
-        </w:rPr>
-      </w:pPr>
-    </w:p>
-    <w:p ns2:paraId="0A292C9F" ns2:textId="77777777">
+    <w:p>
+      <w:pPr>
+        <w:spacing w:after="0" w:line="240" w:lineRule="auto"/>
+        <w:jc w:val="both"/>
+        <w:rPr>
+          <w:rFonts w:ascii="Arial Narrow" w:eastAsia="Arial Narrow" w:hAnsi="Arial Narrow" w:cs="Arial Narrow"/>
+          <w:kern w:val="0"/>
+          <w14:ligatures w14:val="none"/>
+        </w:rPr>
+      </w:pPr>
+    </w:p>
+    <w:p>
       <w:pPr>
         <w:spacing w:after="0" w:line="240" w:lineRule="auto"/>
         <w:contextualSpacing/>
@@ -2632,17 +2632,17 @@
         <w:rPr>
           <w:rFonts w:ascii="Arial Narrow" w:eastAsia="Calibri" w:hAnsi="Arial Narrow" w:cs="Arial"/>
           <w:kern w:val="0"/>
-          <ns2:ligatures ns2:val="none"/>
-        </w:rPr>
-      </w:pPr>
-      <w:r>
-        <w:rPr>
-          <w:rFonts w:ascii="Arial Narrow" w:eastAsia="Arial Narrow" w:hAnsi="Arial Narrow" w:cs="Arial Narrow"/>
-          <w:b/>
-          <w:color w:val="000000"/>
-          <w:kern w:val="0"/>
-          <w:lang w:eastAsia="es-PE"/>
-          <ns2:ligatures ns2:val="none"/>
+          <w14:ligatures w14:val="none"/>
+        </w:rPr>
+      </w:pPr>
+      <w:r>
+        <w:rPr>
+          <w:rFonts w:ascii="Arial Narrow" w:eastAsia="Arial Narrow" w:hAnsi="Arial Narrow" w:cs="Arial Narrow"/>
+          <w:b/>
+          <w:color w:val="000000"/>
+          <w:kern w:val="0"/>
+          <w:lang w:eastAsia="es-PE"/>
+          <w14:ligatures w14:val="none"/>
         </w:rPr>
         <w:t>SEGUNDO:</w:t>
       </w:r>
@@ -2652,7 +2652,7 @@
           <w:color w:val="000000"/>
           <w:kern w:val="0"/>
           <w:lang w:eastAsia="es-PE"/>
-          <ns2:ligatures ns2:val="none"/>
+          <w14:ligatures w14:val="none"/>
         </w:rPr>
         <w:t xml:space="preserve"> tener por ofrecidos los medios probatorios presentados en el escrito de denuncia </w:t>
       </w:r>
@@ -2662,7 +2662,7 @@
           <w:color w:val="000000"/>
           <w:kern w:val="0"/>
           <w:lang w:val="es-ES" w:eastAsia="es-ES"/>
-          <ns2:ligatures ns2:val="none"/>
+          <w14:ligatures w14:val="none"/>
         </w:rPr>
         <w:t xml:space="preserve">del </w:t>
       </w:r>
@@ -2672,7 +2672,7 @@
           <w:color w:val="000000"/>
           <w:kern w:val="0"/>
           <w:lang w:val="es-ES" w:eastAsia="es-ES"/>
-          <ns2:ligatures ns2:val="none"/>
+          <w14:ligatures w14:val="none"/>
         </w:rPr>
         <w:t xml:space="preserve">5 de marzo de 2025</w:t>
       </w:r>
@@ -2680,7 +2680,7 @@
         <w:rPr>
           <w:rFonts w:ascii="Arial Narrow" w:eastAsia="Calibri" w:hAnsi="Arial Narrow" w:cs="Arial"/>
           <w:kern w:val="0"/>
-          <ns2:ligatures ns2:val="none"/>
+          <w14:ligatures w14:val="none"/>
         </w:rPr>
         <w:t xml:space="preserve">, subsanada por escrito del 4 de abril de 2025</w:t>
       </w:r>
@@ -2688,12 +2688,12 @@
         <w:rPr>
           <w:rFonts w:ascii="Arial Narrow" w:eastAsia="Calibri" w:hAnsi="Arial Narrow" w:cs="Arial"/>
           <w:kern w:val="0"/>
-          <ns2:ligatures ns2:val="none"/>
+          <w14:ligatures w14:val="none"/>
         </w:rPr>
         <w:t>.</w:t>
       </w:r>
     </w:p>
-    <w:p ns2:paraId="68A17E97" ns2:textId="77777777">
+    <w:p>
       <w:pPr>
         <w:spacing w:after="0" w:line="240" w:lineRule="auto"/>
         <w:contextualSpacing/>
@@ -2703,30 +2703,30 @@
           <w:color w:val="000000"/>
           <w:kern w:val="0"/>
           <w:lang w:eastAsia="es-PE"/>
-          <ns2:ligatures ns2:val="none"/>
-        </w:rPr>
-      </w:pPr>
-    </w:p>
-    <w:p ns2:paraId="168254DA" ns2:textId="77777777">
-      <w:pPr>
-        <w:spacing w:after="0" w:line="240" w:lineRule="auto"/>
-        <w:jc w:val="both"/>
-        <w:rPr>
-          <w:rFonts w:ascii="Arial Narrow" w:eastAsia="Arial Narrow" w:hAnsi="Arial Narrow" w:cs="Arial Narrow"/>
-          <w:color w:val="000000"/>
-          <w:kern w:val="0"/>
-          <w:lang w:eastAsia="es-PE"/>
-          <ns2:ligatures ns2:val="none"/>
-        </w:rPr>
-      </w:pPr>
-      <w:r>
-        <w:rPr>
-          <w:rFonts w:ascii="Arial Narrow" w:eastAsia="Arial Narrow" w:hAnsi="Arial Narrow" w:cs="Arial Narrow"/>
-          <w:b/>
-          <w:color w:val="000000"/>
-          <w:kern w:val="0"/>
-          <w:lang w:eastAsia="es-PE"/>
-          <ns2:ligatures ns2:val="none"/>
+          <w14:ligatures w14:val="none"/>
+        </w:rPr>
+      </w:pPr>
+    </w:p>
+    <w:p>
+      <w:pPr>
+        <w:spacing w:after="0" w:line="240" w:lineRule="auto"/>
+        <w:jc w:val="both"/>
+        <w:rPr>
+          <w:rFonts w:ascii="Arial Narrow" w:eastAsia="Arial Narrow" w:hAnsi="Arial Narrow" w:cs="Arial Narrow"/>
+          <w:color w:val="000000"/>
+          <w:kern w:val="0"/>
+          <w:lang w:eastAsia="es-PE"/>
+          <w14:ligatures w14:val="none"/>
+        </w:rPr>
+      </w:pPr>
+      <w:r>
+        <w:rPr>
+          <w:rFonts w:ascii="Arial Narrow" w:eastAsia="Arial Narrow" w:hAnsi="Arial Narrow" w:cs="Arial Narrow"/>
+          <w:b/>
+          <w:color w:val="000000"/>
+          <w:kern w:val="0"/>
+          <w:lang w:eastAsia="es-PE"/>
+          <w14:ligatures w14:val="none"/>
         </w:rPr>
         <w:t xml:space="preserve">TERCERO: </w:t>
       </w:r>
@@ -2736,7 +2736,7 @@
           <w:color w:val="000000"/>
           <w:kern w:val="0"/>
           <w:lang w:eastAsia="es-PE"/>
-          <ns2:ligatures ns2:val="none"/>
+          <w14:ligatures w14:val="none"/>
         </w:rPr>
         <w:t xml:space="preserve">requerir a </w:t>
       </w:r>
@@ -2746,7 +2746,7 @@
           <w:color w:val="000000"/>
           <w:kern w:val="0"/>
           <w:lang w:eastAsia="es-PE"/>
-          <ns2:ligatures ns2:val="none"/>
+          <w14:ligatures w14:val="none"/>
         </w:rPr>
         <w:t>Rímac Seguros y Reaseguros S.A.</w:t>
       </w:r>
@@ -2756,12 +2756,12 @@
           <w:color w:val="000000"/>
           <w:kern w:val="0"/>
           <w:lang w:eastAsia="es-PE"/>
-          <ns2:ligatures ns2:val="none"/>
+          <w14:ligatures w14:val="none"/>
         </w:rPr>
         <w:t xml:space="preserve"> que cumpla con lo siguiente:</w:t>
       </w:r>
     </w:p>
-    <w:p ns2:paraId="20FDFB8D" ns2:textId="77777777">
+    <w:p>
       <w:pPr>
         <w:spacing w:after="0" w:line="240" w:lineRule="auto"/>
         <w:jc w:val="both"/>
@@ -2770,11 +2770,11 @@
           <w:color w:val="000000"/>
           <w:kern w:val="0"/>
           <w:lang w:eastAsia="es-PE"/>
-          <ns2:ligatures ns2:val="none"/>
-        </w:rPr>
-      </w:pPr>
-    </w:p>
-    <w:p ns2:paraId="4AA80738" ns2:textId="77777777">
+          <w14:ligatures w14:val="none"/>
+        </w:rPr>
+      </w:pPr>
+    </w:p>
+    <w:p>
       <w:pPr>
         <w:numPr>
           <w:ilvl w:val="0"/>
@@ -2788,21 +2788,21 @@
           <w:color w:val="000000"/>
           <w:kern w:val="0"/>
           <w:lang w:eastAsia="es-PE"/>
-          <ns2:ligatures ns2:val="none"/>
-        </w:rPr>
-      </w:pPr>
-      <w:r>
-        <w:rPr>
-          <w:rFonts w:ascii="Arial Narrow" w:eastAsia="Arial Narrow" w:hAnsi="Arial Narrow" w:cs="Arial Narrow"/>
-          <w:color w:val="000000"/>
-          <w:kern w:val="0"/>
-          <w:lang w:eastAsia="es-PE"/>
-          <ns2:ligatures ns2:val="none"/>
+          <w14:ligatures w14:val="none"/>
+        </w:rPr>
+      </w:pPr>
+      <w:r>
+        <w:rPr>
+          <w:rFonts w:ascii="Arial Narrow" w:eastAsia="Arial Narrow" w:hAnsi="Arial Narrow" w:cs="Arial Narrow"/>
+          <w:color w:val="000000"/>
+          <w:kern w:val="0"/>
+          <w:lang w:eastAsia="es-PE"/>
+          <w14:ligatures w14:val="none"/>
         </w:rPr>
         <w:t>presentar documentos que acrediten su inscripción en los Registros Públicos o una declaración jurada que indique que cuenta con dicha inscripción;</w:t>
       </w:r>
     </w:p>
-    <w:p ns2:paraId="2B29D59F" ns2:textId="77777777">
+    <w:p>
       <w:pPr>
         <w:numPr>
           <w:ilvl w:val="0"/>
@@ -2816,22 +2816,22 @@
           <w:color w:val="000000"/>
           <w:kern w:val="0"/>
           <w:lang w:eastAsia="es-PE"/>
-          <ns2:ligatures ns2:val="none"/>
-        </w:rPr>
-      </w:pPr>
-      <w:r>
-        <w:rPr>
-          <w:rFonts w:ascii="Arial Narrow" w:eastAsia="Arial Narrow" w:hAnsi="Arial Narrow" w:cs="Arial Narrow"/>
-          <w:color w:val="000000"/>
-          <w:kern w:val="0"/>
-          <w:lang w:eastAsia="es-PE"/>
-          <ns2:ligatures ns2:val="none"/>
+          <w14:ligatures w14:val="none"/>
+        </w:rPr>
+      </w:pPr>
+      <w:r>
+        <w:rPr>
+          <w:rFonts w:ascii="Arial Narrow" w:eastAsia="Arial Narrow" w:hAnsi="Arial Narrow" w:cs="Arial Narrow"/>
+          <w:color w:val="000000"/>
+          <w:kern w:val="0"/>
+          <w:lang w:eastAsia="es-PE"/>
+          <w14:ligatures w14:val="none"/>
         </w:rPr>
         <w:lastRenderedPageBreak/>
         <w:t>presentar copia simple de las facultades de representación de su representante legal en el presente procedimiento o la declaración jurada que indique que cuenta con dichas facultades y que estas se encuentran vigentes;</w:t>
       </w:r>
     </w:p>
-    <w:p ns2:paraId="7EF50C46" ns2:textId="77777777">
+    <w:p>
       <w:pPr>
         <w:numPr>
           <w:ilvl w:val="0"/>
@@ -2845,21 +2845,21 @@
           <w:color w:val="000000"/>
           <w:kern w:val="0"/>
           <w:lang w:eastAsia="es-PE"/>
-          <ns2:ligatures ns2:val="none"/>
-        </w:rPr>
-      </w:pPr>
-      <w:r>
-        <w:rPr>
-          <w:rFonts w:ascii="Arial Narrow" w:eastAsia="Arial Narrow" w:hAnsi="Arial Narrow" w:cs="Arial Narrow"/>
-          <w:color w:val="000000"/>
-          <w:kern w:val="0"/>
-          <w:lang w:eastAsia="es-PE"/>
-          <ns2:ligatures ns2:val="none"/>
+          <w14:ligatures w14:val="none"/>
+        </w:rPr>
+      </w:pPr>
+      <w:r>
+        <w:rPr>
+          <w:rFonts w:ascii="Arial Narrow" w:eastAsia="Arial Narrow" w:hAnsi="Arial Narrow" w:cs="Arial Narrow"/>
+          <w:color w:val="000000"/>
+          <w:kern w:val="0"/>
+          <w:lang w:eastAsia="es-PE"/>
+          <w14:ligatures w14:val="none"/>
         </w:rPr>
         <w:t>consignar el Número de Registro Único de Contribuyentes (RUC); y,</w:t>
       </w:r>
     </w:p>
-    <w:p ns2:paraId="19E4DFA1" ns2:textId="2D033D4A">
+    <w:p>
       <w:pPr>
         <w:numPr>
           <w:ilvl w:val="0"/>
@@ -2871,16 +2871,16 @@
         <w:rPr>
           <w:rFonts w:ascii="Arial Narrow" w:eastAsia="Calibri" w:hAnsi="Arial Narrow" w:cs="Arial"/>
           <w:kern w:val="0"/>
-          <ns2:ligatures ns2:val="none"/>
-        </w:rPr>
-      </w:pPr>
-      <w:r>
-        <w:rPr>
-          <w:rFonts w:ascii="Arial Narrow" w:eastAsia="Arial Narrow" w:hAnsi="Arial Narrow" w:cs="Arial Narrow"/>
-          <w:color w:val="000000"/>
-          <w:kern w:val="0"/>
-          <w:lang w:eastAsia="es-PE"/>
-          <ns2:ligatures ns2:val="none"/>
+          <w14:ligatures w14:val="none"/>
+        </w:rPr>
+      </w:pPr>
+      <w:r>
+        <w:rPr>
+          <w:rFonts w:ascii="Arial Narrow" w:eastAsia="Arial Narrow" w:hAnsi="Arial Narrow" w:cs="Arial Narrow"/>
+          <w:color w:val="000000"/>
+          <w:kern w:val="0"/>
+          <w:lang w:eastAsia="es-PE"/>
+          <w14:ligatures w14:val="none"/>
         </w:rPr>
         <w:t xml:space="preserve">fijar domicilio procesal para el procedimiento, de conformidad con el numeral 1 del artículo 442 del Código Procesal Civil. </w:t>
       </w:r>
@@ -2888,7 +2888,7 @@
         <w:rPr>
           <w:rFonts w:ascii="Arial Narrow" w:eastAsia="Calibri" w:hAnsi="Arial Narrow" w:cs="Arial"/>
           <w:kern w:val="0"/>
-          <ns2:ligatures ns2:val="none"/>
+          <w14:ligatures w14:val="none"/>
         </w:rPr>
         <w:t>Para ello podrá señalar domicilio físico o una dirección electrónica a la que pueda remitirse las notificaciones</w:t>
       </w:r>
@@ -2897,12 +2897,12 @@
           <w:rFonts w:ascii="Arial Narrow" w:eastAsia="Arial" w:hAnsi="Arial Narrow" w:cs="Arial"/>
           <w:kern w:val="0"/>
           <w:lang w:val="es"/>
-          <ns2:ligatures ns2:val="none"/>
+          <w14:ligatures w14:val="none"/>
         </w:rPr>
         <w:t>;</w:t>
       </w:r>
     </w:p>
-    <w:p ns2:paraId="7C63E340" ns2:textId="70531021">
+    <w:p>
       <w:pPr>
         <w:numPr>
           <w:ilvl w:val="0"/>
@@ -2914,14 +2914,14 @@
         <w:rPr>
           <w:rFonts w:ascii="Arial Narrow" w:eastAsia="Calibri" w:hAnsi="Arial Narrow" w:cs="Arial"/>
           <w:kern w:val="0"/>
-          <ns2:ligatures ns2:val="none"/>
+          <w14:ligatures w14:val="none"/>
         </w:rPr>
       </w:pPr>
       <w:r>
         <w:rPr>
           <w:rFonts w:ascii="Arial Narrow" w:eastAsia="Calibri" w:hAnsi="Arial Narrow" w:cs="Arial"/>
           <w:kern w:val="0"/>
-          <ns2:ligatures ns2:val="none"/>
+          <w14:ligatures w14:val="none"/>
         </w:rPr>
         <w:t>en caso califique como micro empresa o pequeña empresa, presentar los documentos que acrediten su volumen de ventas o ingresos brutos percibidos el año anterior relativo a todas sus actividades económicas y el número de trabajadores con el que cuenta</w:t>
       </w:r>
@@ -2931,7 +2931,7 @@
           <w:rFonts w:ascii="Arial Narrow" w:eastAsia="Calibri" w:hAnsi="Arial Narrow" w:cs="Arial"/>
           <w:kern w:val="0"/>
           <w:vertAlign w:val="superscript"/>
-          <ns2:ligatures ns2:val="none"/>
+          <w14:ligatures w14:val="none"/>
         </w:rPr>
         <w:footnoteReference w:id="10"/>
       </w:r>
@@ -2939,7 +2939,7 @@
         <w:rPr>
           <w:rFonts w:ascii="Arial Narrow" w:eastAsia="Calibri" w:hAnsi="Arial Narrow" w:cs="Arial"/>
           <w:kern w:val="0"/>
-          <ns2:ligatures ns2:val="none"/>
+          <w14:ligatures w14:val="none"/>
         </w:rPr>
         <w:t xml:space="preserve">. Ello, a fin de que la Comisión pueda meritar dicha documentación, conforme lo establece el artículo 110 del </w:t>
       </w:r>
@@ -2948,7 +2948,7 @@
           <w:rFonts w:ascii="Arial Narrow" w:eastAsia="Calibri" w:hAnsi="Arial Narrow" w:cs="Arial"/>
           <w:spacing w:val="-2"/>
           <w:kern w:val="0"/>
-          <ns2:ligatures ns2:val="none"/>
+          <w14:ligatures w14:val="none"/>
         </w:rPr>
         <w:t>Código</w:t>
       </w:r>
@@ -2959,7 +2959,7 @@
           <w:spacing w:val="-2"/>
           <w:kern w:val="0"/>
           <w:vertAlign w:val="superscript"/>
-          <ns2:ligatures ns2:val="none"/>
+          <w14:ligatures w14:val="none"/>
         </w:rPr>
         <w:footnoteReference w:id="11"/>
       </w:r>
@@ -2968,12 +2968,12 @@
           <w:rFonts w:ascii="Arial Narrow" w:eastAsia="Calibri" w:hAnsi="Arial Narrow" w:cs="Arial"/>
           <w:spacing w:val="-2"/>
           <w:kern w:val="0"/>
-          <ns2:ligatures ns2:val="none"/>
+          <w14:ligatures w14:val="none"/>
         </w:rPr>
         <w:t>.</w:t>
       </w:r>
     </w:p>
-    <w:p ns2:paraId="1F11FE32" ns2:textId="77777777">
+    <w:p>
       <w:pPr>
         <w:spacing w:after="0" w:line="240" w:lineRule="auto"/>
         <w:ind w:left="567"/>
@@ -2983,20 +2983,20 @@
           <w:color w:val="000000"/>
           <w:kern w:val="0"/>
           <w:lang w:eastAsia="es-PE"/>
-          <ns2:ligatures ns2:val="none"/>
-        </w:rPr>
-      </w:pPr>
-    </w:p>
-    <w:p>
-      <w:pPr>
-        <w:spacing w:after="0" w:line="240" w:lineRule="auto"/>
-        <w:jc w:val="both"/>
-        <w:rPr>
-          <w:rFonts w:ascii="Arial Narrow" w:eastAsia="Arial Narrow" w:hAnsi="Arial Narrow" w:cs="Arial Narrow"/>
-          <w:color w:val="000000"/>
-          <w:kern w:val="0"/>
-          <w:lang w:eastAsia="es-PE"/>
-          <ns2:ligatures ns2:val="none"/>
+          <w14:ligatures w14:val="none"/>
+        </w:rPr>
+      </w:pPr>
+    </w:p>
+    <w:p>
+      <w:pPr>
+        <w:spacing w:after="0" w:line="240" w:lineRule="auto"/>
+        <w:jc w:val="both"/>
+        <w:rPr>
+          <w:rFonts w:ascii="Arial Narrow" w:eastAsia="Arial Narrow" w:hAnsi="Arial Narrow" w:cs="Arial Narrow"/>
+          <w:color w:val="000000"/>
+          <w:kern w:val="0"/>
+          <w:lang w:eastAsia="es-PE"/>
+          <w14:ligatures w14:val="none"/>
         </w:rPr>
       </w:pPr>
       <w:r>
@@ -3015,23 +3015,63 @@
           <w:sz w:val="20"/>
           <w:szCs w:val="20"/>
         </w:rPr>
-        <w:t xml:space="preserve">correr traslado de la presente resolución a La Positiva Vida Seguros y Reaseguros S.A. para que, de conformidad con lo dispuesto por el artículo 26 de la Ley sobre Facultades, Normas y Organización del Indecopi, aprobada por Decreto Legislativo 807, presente sus descargos sobre la imputación de cargos realizada en un plazo no mayor a cinco (5) días hábiles contado a partir del día siguiente de la notificación de la presente resolución, vencido el cual, el Secretario Técnico declarará en rebeldía al denunciado que no lo hubiera presentado. Debe precisarse que de conformidad con lo establecido por el artículo 223 del Texto Único Ordenado de la Ley 27444, Ley del Procedimiento Administrativo General, las alegaciones y los hechos relevantes de la reclamación, salvo que hayan sido específicamente negadas en la contestación, se tendrán por aceptadas o merituadas como ciertas.</w:t>
-      </w:r>
-    </w:p>
-    <w:p ns2:paraId="228F876C" ns2:textId="77777777">
-      <w:pPr>
-        <w:spacing w:after="0" w:line="240" w:lineRule="auto"/>
-        <w:jc w:val="both"/>
-        <w:rPr>
-          <w:rFonts w:ascii="Arial Narrow" w:eastAsia="Arial Narrow" w:hAnsi="Arial Narrow" w:cs="Arial Narrow"/>
-          <w:color w:val="000000"/>
-          <w:kern w:val="0"/>
-          <w:lang w:eastAsia="es-PE"/>
-          <ns2:ligatures ns2:val="none"/>
-        </w:rPr>
-      </w:pPr>
-    </w:p>
-    <w:p ns2:paraId="774AFBA5" ns2:textId="7702CEFA">
+        <w:t xml:space="preserve">correr traslado de la presente resolución a La Positiva Vida Seguros y Reaseguros S.A. para que, de conformidad con lo dispuesto por el artículo 26 de la Ley sobre Facultades, Normas y Organización del Indecopi, aprobada por Decreto Legislativo 807</w:t>
+      </w:r>
+      <w:r>
+        <w:rPr>
+          <w:rStyle w:val="Refdenotaalpie"/>
+          <w:rFonts w:ascii="Arial Narrow" w:eastAsia="Times New Roman" w:hAnsi="Arial Narrow" w:cs="Times New Roman"/>
+          <w:color w:val="000000"/>
+          <w:kern w:val="0"/>
+          <w:vertAlign w:val="superscript"/>
+          <w:lang w:val="es-ES" w:eastAsia="es-ES"/>
+          <w14:ligatures w14:val="none"/>
+        </w:rPr>
+        <w:footnoteReference w:id="17"/>
+      </w:r>
+      <w:r>
+        <w:rPr>
+          <w:rFonts w:ascii="Arial Narrow" w:hAnsi="Arial Narrow" w:cs="Arial Narrow"/>
+          <w:sz w:val="20"/>
+          <w:szCs w:val="20"/>
+        </w:rPr>
+        <w:t xml:space="preserve">, presente sus descargos sobre la imputación de cargos realizada en un plazo no mayor a cinco (5) días hábiles contado a partir del día siguiente de la notificación de la presente resolución, vencido el cual, el Secretario Técnico declarará en rebeldía al denunciado que no lo hubiera presentado. Debe precisarse que de conformidad con lo establecido por el artículo 223 del Texto Único Ordenado de la Ley 27444, Ley del Procedimiento Administrativo General</w:t>
+      </w:r>
+      <w:r>
+        <w:rPr>
+          <w:rStyle w:val="Refdenotaalpie"/>
+          <w:rFonts w:ascii="Arial Narrow" w:eastAsia="Times New Roman" w:hAnsi="Arial Narrow" w:cs="Times New Roman"/>
+          <w:color w:val="000000"/>
+          <w:kern w:val="0"/>
+          <w:vertAlign w:val="superscript"/>
+          <w:lang w:val="es-ES" w:eastAsia="es-ES"/>
+          <w14:ligatures w14:val="none"/>
+        </w:rPr>
+        <w:footnoteReference w:id="18"/>
+      </w:r>
+      <w:r>
+        <w:rPr>
+          <w:rFonts w:ascii="Arial Narrow" w:hAnsi="Arial Narrow" w:cs="Arial Narrow"/>
+          <w:sz w:val="20"/>
+          <w:szCs w:val="20"/>
+        </w:rPr>
+        <w:t xml:space="preserve">, las alegaciones y los hechos relevantes de la reclamación, salvo que hayan sido específicamente negadas en la contestación, se tendrán por aceptadas o merituadas como ciertas.</w:t>
+      </w:r>
+    </w:p>
+    <w:p>
+      <w:pPr>
+        <w:spacing w:after="0" w:line="240" w:lineRule="auto"/>
+        <w:jc w:val="both"/>
+        <w:rPr>
+          <w:rFonts w:ascii="Arial Narrow" w:eastAsia="Arial Narrow" w:hAnsi="Arial Narrow" w:cs="Arial Narrow"/>
+          <w:color w:val="000000"/>
+          <w:kern w:val="0"/>
+          <w:lang w:eastAsia="es-PE"/>
+          <w14:ligatures w14:val="none"/>
+        </w:rPr>
+      </w:pPr>
+    </w:p>
+    <w:p>
       <w:pPr>
         <w:spacing w:after="0" w:line="240" w:lineRule="auto"/>
         <w:jc w:val="both"/>
@@ -3040,17 +3080,17 @@
           <w:color w:val="000000"/>
           <w:kern w:val="0"/>
           <w:lang w:val="es-ES" w:eastAsia="es-ES"/>
-          <ns2:ligatures ns2:val="none"/>
-        </w:rPr>
-      </w:pPr>
-      <w:r>
-        <w:rPr>
-          <w:rFonts w:ascii="Arial Narrow" w:eastAsia="Arial Narrow" w:hAnsi="Arial Narrow" w:cs="Arial Narrow"/>
-          <w:b/>
-          <w:color w:val="000000"/>
-          <w:kern w:val="0"/>
-          <w:lang w:eastAsia="es-PE"/>
-          <ns2:ligatures ns2:val="none"/>
+          <w14:ligatures w14:val="none"/>
+        </w:rPr>
+      </w:pPr>
+      <w:r>
+        <w:rPr>
+          <w:rFonts w:ascii="Arial Narrow" w:eastAsia="Arial Narrow" w:hAnsi="Arial Narrow" w:cs="Arial Narrow"/>
+          <w:b/>
+          <w:color w:val="000000"/>
+          <w:kern w:val="0"/>
+          <w:lang w:eastAsia="es-PE"/>
+          <w14:ligatures w14:val="none"/>
         </w:rPr>
         <w:t xml:space="preserve">QUINTO: </w:t>
       </w:r>
@@ -3061,7 +3101,7 @@
           <w:color w:val="000000"/>
           <w:kern w:val="0"/>
           <w:lang w:eastAsia="es-ES"/>
-          <ns2:ligatures ns2:val="none"/>
+          <w14:ligatures w14:val="none"/>
         </w:rPr>
         <w:t xml:space="preserve">requerir </w:t>
       </w:r>
@@ -3071,7 +3111,7 @@
           <w:color w:val="000000"/>
           <w:kern w:val="0"/>
           <w:lang w:val="es-ES" w:eastAsia="es-ES"/>
-          <ns2:ligatures ns2:val="none"/>
+          <w14:ligatures w14:val="none"/>
         </w:rPr>
         <w:t xml:space="preserve">que, en un </w:t>
       </w:r>
@@ -3081,7 +3121,7 @@
           <w:color w:val="000000"/>
           <w:kern w:val="0"/>
           <w:lang w:eastAsia="es-ES"/>
-          <ns2:ligatures ns2:val="none"/>
+          <w14:ligatures w14:val="none"/>
         </w:rPr>
         <w:t>plazo no mayor de cinco (5) días hábiles contado a partir del día siguiente de la notificación de la presente resolución</w:t>
       </w:r>
@@ -3092,7 +3132,7 @@
           <w:color w:val="000000"/>
           <w:kern w:val="0"/>
           <w:lang w:eastAsia="es-ES"/>
-          <ns2:ligatures ns2:val="none"/>
+          <w14:ligatures w14:val="none"/>
         </w:rPr>
         <w:t xml:space="preserve">, </w:t>
       </w:r>
@@ -3104,7 +3144,7 @@
           <w:kern w:val="0"/>
           <w:shd w:val="clear" w:color="auto" w:fill="FFFFFF"/>
           <w:lang w:eastAsia="es-PE"/>
-          <ns2:ligatures ns2:val="none"/>
+          <w14:ligatures w14:val="none"/>
         </w:rPr>
         <w:t>el proveedor denunciado</w:t>
       </w:r>
@@ -3114,7 +3154,7 @@
           <w:color w:val="000000"/>
           <w:kern w:val="0"/>
           <w:lang w:eastAsia="es-ES"/>
-          <ns2:ligatures ns2:val="none"/>
+          <w14:ligatures w14:val="none"/>
         </w:rPr>
         <w:t xml:space="preserve"> </w:t>
       </w:r>
@@ -3125,7 +3165,7 @@
           <w:color w:val="000000"/>
           <w:kern w:val="0"/>
           <w:lang w:val="es-ES" w:eastAsia="es-ES"/>
-          <ns2:ligatures ns2:val="none"/>
+          <w14:ligatures w14:val="none"/>
         </w:rPr>
         <w:t xml:space="preserve">cumpla con: (i) presentar una copia completa, legible y debidamente suscrita de la </w:t>
       </w:r>
@@ -3135,7 +3175,7 @@
           <w:color w:val="000000"/>
           <w:kern w:val="0"/>
           <w:lang w:val="es-ES" w:eastAsia="es-ES"/>
-          <ns2:ligatures ns2:val="none"/>
+          <w14:ligatures w14:val="none"/>
         </w:rPr>
         <w:t xml:space="preserve">Póliza 30150448 del </w:t>
       </w:r>
@@ -3145,7 +3185,7 @@
           <w:color w:val="000000"/>
           <w:kern w:val="0"/>
           <w:lang w:eastAsia="es-ES"/>
-          <ns2:ligatures ns2:val="none"/>
+          <w14:ligatures w14:val="none"/>
         </w:rPr>
         <w:t>Seguro Complementario de Trabajo de Riesgo</w:t>
       </w:r>
@@ -3155,7 +3195,7 @@
           <w:color w:val="000000"/>
           <w:kern w:val="0"/>
           <w:lang w:val="es-ES" w:eastAsia="es-ES"/>
-          <ns2:ligatures ns2:val="none"/>
+          <w14:ligatures w14:val="none"/>
         </w:rPr>
         <w:t>, así como el cargo de remisión de la póliza</w:t>
       </w:r>
@@ -3165,7 +3205,7 @@
           <w:color w:val="000000"/>
           <w:kern w:val="0"/>
           <w:lang w:val="es-ES" w:eastAsia="es-ES"/>
-          <ns2:ligatures ns2:val="none"/>
+          <w14:ligatures w14:val="none"/>
         </w:rPr>
         <w:t xml:space="preserve">; (ii) presentar los medios probatorios que acrediten </w:t>
       </w:r>
@@ -3175,7 +3215,7 @@
           <w:color w:val="000000"/>
           <w:kern w:val="0"/>
           <w:lang w:val="es-ES" w:eastAsia="es-ES"/>
-          <ns2:ligatures ns2:val="none"/>
+          <w14:ligatures w14:val="none"/>
         </w:rPr>
         <w:t xml:space="preserve">que el cálculo realizado para definir el monto de la liquidación única total y definitiva de la Póliza 30150448 del </w:t>
       </w:r>
@@ -3185,7 +3225,7 @@
           <w:color w:val="000000"/>
           <w:kern w:val="0"/>
           <w:lang w:eastAsia="es-ES"/>
-          <ns2:ligatures ns2:val="none"/>
+          <w14:ligatures w14:val="none"/>
         </w:rPr>
         <w:t xml:space="preserve">Seguro Complementario de Trabajo de Riesgo </w:t>
       </w:r>
@@ -3195,7 +3235,7 @@
           <w:color w:val="000000"/>
           <w:kern w:val="0"/>
           <w:lang w:val="es-ES" w:eastAsia="es-ES"/>
-          <ns2:ligatures ns2:val="none"/>
+          <w14:ligatures w14:val="none"/>
         </w:rPr>
         <w:t>fue acorde a la normativa actual</w:t>
       </w:r>
@@ -3205,7 +3245,7 @@
           <w:color w:val="000000"/>
           <w:kern w:val="0"/>
           <w:lang w:eastAsia="es-ES"/>
-          <ns2:ligatures ns2:val="none"/>
+          <w14:ligatures w14:val="none"/>
         </w:rPr>
         <w:t xml:space="preserve">; y, (iii) </w:t>
       </w:r>
@@ -3215,7 +3255,7 @@
           <w:color w:val="000000"/>
           <w:kern w:val="0"/>
           <w:lang w:val="es-ES" w:eastAsia="es-ES"/>
-          <ns2:ligatures ns2:val="none"/>
+          <w14:ligatures w14:val="none"/>
         </w:rPr>
         <w:t xml:space="preserve">presentar todas las comunicaciones cursadas </w:t>
       </w:r>
@@ -3225,7 +3265,7 @@
           <w:color w:val="000000"/>
           <w:kern w:val="0"/>
           <w:lang w:val="es-ES" w:eastAsia="es-ES"/>
-          <ns2:ligatures ns2:val="none"/>
+          <w14:ligatures w14:val="none"/>
         </w:rPr>
         <w:t xml:space="preserve">con la parte denunciante </w:t>
       </w:r>
@@ -3235,7 +3275,7 @@
           <w:color w:val="000000"/>
           <w:kern w:val="0"/>
           <w:lang w:val="es-ES" w:eastAsia="es-ES"/>
-          <ns2:ligatures ns2:val="none"/>
+          <w14:ligatures w14:val="none"/>
         </w:rPr>
         <w:t xml:space="preserve">en virtud </w:t>
       </w:r>
@@ -3245,7 +3285,7 @@
           <w:color w:val="000000"/>
           <w:kern w:val="0"/>
           <w:lang w:val="es-ES" w:eastAsia="es-ES"/>
-          <ns2:ligatures ns2:val="none"/>
+          <w14:ligatures w14:val="none"/>
         </w:rPr>
         <w:t xml:space="preserve">de los hechos materia </w:t>
       </w:r>
@@ -3255,12 +3295,12 @@
           <w:color w:val="000000"/>
           <w:kern w:val="0"/>
           <w:lang w:val="es-ES" w:eastAsia="es-ES"/>
-          <ns2:ligatures ns2:val="none"/>
+          <w14:ligatures w14:val="none"/>
         </w:rPr>
         <w:t>de denuncia.</w:t>
       </w:r>
     </w:p>
-    <w:p ns2:paraId="12A4D8BD" ns2:textId="77777777">
+    <w:p>
       <w:pPr>
         <w:spacing w:after="0" w:line="240" w:lineRule="auto"/>
         <w:jc w:val="both"/>
@@ -3270,30 +3310,30 @@
           <w:color w:val="000000"/>
           <w:kern w:val="0"/>
           <w:lang w:val="es-ES" w:eastAsia="es-PE"/>
-          <ns2:ligatures ns2:val="none"/>
-        </w:rPr>
-      </w:pPr>
-    </w:p>
-    <w:p ns2:paraId="591B7E6F" ns2:textId="62D015BB">
-      <w:pPr>
-        <w:spacing w:after="0" w:line="240" w:lineRule="auto"/>
-        <w:jc w:val="both"/>
-        <w:rPr>
-          <w:rFonts w:ascii="Arial Narrow" w:eastAsia="Arial Narrow" w:hAnsi="Arial Narrow" w:cs="Arial Narrow"/>
-          <w:color w:val="000000"/>
-          <w:kern w:val="0"/>
-          <w:lang w:eastAsia="es-PE"/>
-          <ns2:ligatures ns2:val="none"/>
-        </w:rPr>
-      </w:pPr>
-      <w:r>
-        <w:rPr>
-          <w:rFonts w:ascii="Arial Narrow" w:eastAsia="Arial Narrow" w:hAnsi="Arial Narrow" w:cs="Arial Narrow"/>
-          <w:b/>
-          <w:color w:val="000000"/>
-          <w:kern w:val="0"/>
-          <w:lang w:eastAsia="es-PE"/>
-          <ns2:ligatures ns2:val="none"/>
+          <w14:ligatures w14:val="none"/>
+        </w:rPr>
+      </w:pPr>
+    </w:p>
+    <w:p>
+      <w:pPr>
+        <w:spacing w:after="0" w:line="240" w:lineRule="auto"/>
+        <w:jc w:val="both"/>
+        <w:rPr>
+          <w:rFonts w:ascii="Arial Narrow" w:eastAsia="Arial Narrow" w:hAnsi="Arial Narrow" w:cs="Arial Narrow"/>
+          <w:color w:val="000000"/>
+          <w:kern w:val="0"/>
+          <w:lang w:eastAsia="es-PE"/>
+          <w14:ligatures w14:val="none"/>
+        </w:rPr>
+      </w:pPr>
+      <w:r>
+        <w:rPr>
+          <w:rFonts w:ascii="Arial Narrow" w:eastAsia="Arial Narrow" w:hAnsi="Arial Narrow" w:cs="Arial Narrow"/>
+          <w:b/>
+          <w:color w:val="000000"/>
+          <w:kern w:val="0"/>
+          <w:lang w:eastAsia="es-PE"/>
+          <w14:ligatures w14:val="none"/>
         </w:rPr>
         <w:t>SEXTO:</w:t>
       </w:r>
@@ -3303,7 +3343,7 @@
           <w:color w:val="000000"/>
           <w:kern w:val="0"/>
           <w:lang w:eastAsia="es-PE"/>
-          <ns2:ligatures ns2:val="none"/>
+          <w14:ligatures w14:val="none"/>
         </w:rPr>
         <w:t xml:space="preserve"> </w:t>
       </w:r>
@@ -3314,7 +3354,7 @@
           <w:color w:val="000000"/>
           <w:kern w:val="0"/>
           <w:lang w:eastAsia="es-PE"/>
-          <ns2:ligatures ns2:val="none"/>
+          <w14:ligatures w14:val="none"/>
         </w:rPr>
         <w:t xml:space="preserve">informar a las partes que el artículo 110 de la Ley </w:t>
       </w:r>
@@ -3324,7 +3364,7 @@
           <w:kern w:val="0"/>
           <w:shd w:val="clear" w:color="auto" w:fill="FFFFFF"/>
           <w:lang w:eastAsia="es-PE"/>
-          <ns2:ligatures ns2:val="none"/>
+          <w14:ligatures w14:val="none"/>
         </w:rPr>
         <w:t>29571</w:t>
       </w:r>
@@ -3334,7 +3374,7 @@
           <w:color w:val="000000"/>
           <w:kern w:val="0"/>
           <w:lang w:eastAsia="es-PE"/>
-          <ns2:ligatures ns2:val="none"/>
+          <w14:ligatures w14:val="none"/>
         </w:rPr>
         <w:t>, Código de Protección y Defensa del Consumidor</w:t>
       </w:r>
@@ -3346,7 +3386,7 @@
           <w:kern w:val="0"/>
           <w:vertAlign w:val="superscript"/>
           <w:lang w:eastAsia="es-PE"/>
-          <ns2:ligatures ns2:val="none"/>
+          <w14:ligatures w14:val="none"/>
         </w:rPr>
         <w:footnoteReference w:id="12"/>
       </w:r>
@@ -3356,7 +3396,7 @@
           <w:color w:val="000000"/>
           <w:kern w:val="0"/>
           <w:lang w:eastAsia="es-PE"/>
-          <ns2:ligatures ns2:val="none"/>
+          <w14:ligatures w14:val="none"/>
         </w:rPr>
         <w:t xml:space="preserve">, faculta a la Comisión a calificar las infracciones de la referida norma como leves, graves o muy graves e imponer sanciones que van desde una amonestación hasta una multa por un máximo de 450 </w:t>
       </w:r>
@@ -3366,7 +3406,7 @@
           <w:color w:val="000000"/>
           <w:kern w:val="0"/>
           <w:lang w:eastAsia="es-PE"/>
-          <ns2:ligatures ns2:val="none"/>
+          <w14:ligatures w14:val="none"/>
         </w:rPr>
         <w:lastRenderedPageBreak/>
         <w:t>Unidades Impositivas Tributarias, sin perjuicio de las medidas correctivas, reparadoras y complementarias, que puedan ordenarse de acuerdo a lo estipulado en los artículos 114, 115 y 116 de la referida norma</w:t>
@@ -3379,7 +3419,7 @@
           <w:kern w:val="0"/>
           <w:vertAlign w:val="superscript"/>
           <w:lang w:eastAsia="es-PE"/>
-          <ns2:ligatures ns2:val="none"/>
+          <w14:ligatures w14:val="none"/>
         </w:rPr>
         <w:footnoteReference w:id="13"/>
       </w:r>
@@ -3389,7 +3429,7 @@
           <w:color w:val="000000"/>
           <w:kern w:val="0"/>
           <w:lang w:eastAsia="es-PE"/>
-          <ns2:ligatures ns2:val="none"/>
+          <w14:ligatures w14:val="none"/>
         </w:rPr>
         <w:t xml:space="preserve">. </w:t>
       </w:r>
@@ -3400,7 +3440,7 @@
           <w:color w:val="000000"/>
           <w:kern w:val="0"/>
           <w:lang w:eastAsia="es-PE"/>
-          <ns2:ligatures ns2:val="none"/>
+          <w14:ligatures w14:val="none"/>
         </w:rPr>
         <w:lastRenderedPageBreak/>
         <w:t>Asimismo, se consideran circunstancias atenuantes para la graduación de la sanción, el allanamiento de la denuncia o el reconocimiento de las pretensiones en ella contenidas, de acuerdo con el artículo 112 del Código</w:t>
@@ -3413,7 +3453,7 @@
           <w:kern w:val="0"/>
           <w:vertAlign w:val="superscript"/>
           <w:lang w:eastAsia="es-PE"/>
-          <ns2:ligatures ns2:val="none"/>
+          <w14:ligatures w14:val="none"/>
         </w:rPr>
         <w:footnoteReference w:id="14"/>
       </w:r>
@@ -3423,12 +3463,12 @@
           <w:color w:val="000000"/>
           <w:kern w:val="0"/>
           <w:lang w:eastAsia="es-PE"/>
-          <ns2:ligatures ns2:val="none"/>
+          <w14:ligatures w14:val="none"/>
         </w:rPr>
         <w:t>.</w:t>
       </w:r>
     </w:p>
-    <w:p ns2:paraId="0ECE55DF" ns2:textId="77777777">
+    <w:p>
       <w:pPr>
         <w:shd w:val="clear" w:color="auto" w:fill="FFFFFF"/>
         <w:spacing w:after="0" w:line="240" w:lineRule="auto"/>
@@ -3439,11 +3479,11 @@
           <w:color w:val="000000"/>
           <w:kern w:val="0"/>
           <w:lang w:eastAsia="es-PE"/>
-          <ns2:ligatures ns2:val="none"/>
-        </w:rPr>
-      </w:pPr>
-    </w:p>
-    <w:p ns2:paraId="1CC114EB" ns2:textId="27EE39A5">
+          <w14:ligatures w14:val="none"/>
+        </w:rPr>
+      </w:pPr>
+    </w:p>
+    <w:p>
       <w:pPr>
         <w:shd w:val="clear" w:color="auto" w:fill="FFFFFF"/>
         <w:spacing w:after="0" w:line="240" w:lineRule="auto"/>
@@ -3453,17 +3493,17 @@
           <w:color w:val="000000"/>
           <w:kern w:val="0"/>
           <w:lang w:eastAsia="es-PE"/>
-          <ns2:ligatures ns2:val="none"/>
-        </w:rPr>
-      </w:pPr>
-      <w:r>
-        <w:rPr>
-          <w:rFonts w:ascii="Arial Narrow" w:eastAsia="Arial Narrow" w:hAnsi="Arial Narrow" w:cs="Arial Narrow"/>
-          <w:b/>
-          <w:color w:val="000000"/>
-          <w:kern w:val="0"/>
-          <w:lang w:eastAsia="es-PE"/>
-          <ns2:ligatures ns2:val="none"/>
+          <w14:ligatures w14:val="none"/>
+        </w:rPr>
+      </w:pPr>
+      <w:r>
+        <w:rPr>
+          <w:rFonts w:ascii="Arial Narrow" w:eastAsia="Arial Narrow" w:hAnsi="Arial Narrow" w:cs="Arial Narrow"/>
+          <w:b/>
+          <w:color w:val="000000"/>
+          <w:kern w:val="0"/>
+          <w:lang w:eastAsia="es-PE"/>
+          <w14:ligatures w14:val="none"/>
         </w:rPr>
         <w:t>SÉTIMO:</w:t>
       </w:r>
@@ -3473,12 +3513,12 @@
           <w:color w:val="000000"/>
           <w:kern w:val="0"/>
           <w:lang w:eastAsia="es-PE"/>
-          <ns2:ligatures ns2:val="none"/>
+          <w14:ligatures w14:val="none"/>
         </w:rPr>
         <w:t xml:space="preserve"> informar a las partes que conforme a lo establecido en el artículo 39 de la Ley sobre Facultades, Normas y Organización del Indecopi, aprobada por Decreto Legislativo 807, los gastos por los peritajes realizados, actuación de pruebas, inspecciones y otros derivados de la tramitación del proceso serán de cargo de la parte que solicita la prueba, salvo pacto en contrario. En todos los casos, la resolución final determinará si los gastos deben ser asumidos por alguna de las partes, o reembolsados a la otra parte o al Indecopi, según sea el caso, de manera adicional a la sanción que haya podido imponerse. </w:t>
       </w:r>
     </w:p>
-    <w:p ns2:paraId="364C4B19" ns2:textId="77777777">
+    <w:p>
       <w:pPr>
         <w:shd w:val="clear" w:color="auto" w:fill="FFFFFF"/>
         <w:spacing w:after="0" w:line="240" w:lineRule="auto"/>
@@ -3488,11 +3528,11 @@
           <w:color w:val="000000"/>
           <w:kern w:val="0"/>
           <w:lang w:eastAsia="es-PE"/>
-          <ns2:ligatures ns2:val="none"/>
-        </w:rPr>
-      </w:pPr>
-    </w:p>
-    <w:p ns2:paraId="27E9BBC0" ns2:textId="79262C3B">
+          <w14:ligatures w14:val="none"/>
+        </w:rPr>
+      </w:pPr>
+    </w:p>
+    <w:p>
       <w:pPr>
         <w:suppressAutoHyphens/>
         <w:spacing w:after="0" w:line="240" w:lineRule="auto"/>
@@ -3501,7 +3541,7 @@
           <w:rFonts w:ascii="Arial Narrow" w:eastAsia="Calibri" w:hAnsi="Arial Narrow" w:cs="Arial"/>
           <w:kern w:val="0"/>
           <w:u w:val="single"/>
-          <ns2:ligatures ns2:val="none"/>
+          <w14:ligatures w14:val="none"/>
         </w:rPr>
       </w:pPr>
       <w:r>
@@ -3510,7 +3550,7 @@
           <w:b/>
           <w:bCs/>
           <w:kern w:val="0"/>
-          <ns2:ligatures ns2:val="none"/>
+          <w14:ligatures w14:val="none"/>
         </w:rPr>
         <w:t>OCTAVO</w:t>
       </w:r>
@@ -3519,7 +3559,7 @@
           <w:rFonts w:ascii="Arial Narrow" w:eastAsia="Calibri" w:hAnsi="Arial Narrow" w:cs="Arial"/>
           <w:b/>
           <w:kern w:val="0"/>
-          <ns2:ligatures ns2:val="none"/>
+          <w14:ligatures w14:val="none"/>
         </w:rPr>
         <w:t>:</w:t>
       </w:r>
@@ -3527,7 +3567,7 @@
         <w:rPr>
           <w:rFonts w:ascii="Arial Narrow" w:eastAsia="Calibri" w:hAnsi="Arial Narrow" w:cs="Arial"/>
           <w:kern w:val="0"/>
-          <ns2:ligatures ns2:val="none"/>
+          <w14:ligatures w14:val="none"/>
         </w:rPr>
         <w:t xml:space="preserve"> comunicar a las partes que, de acuerdo a lo señalado por el artículo 29 del Decreto Legislativo 807</w:t>
       </w:r>
@@ -3537,7 +3577,7 @@
           <w:rFonts w:ascii="Arial Narrow" w:eastAsia="Calibri" w:hAnsi="Arial Narrow" w:cs="Arial"/>
           <w:kern w:val="0"/>
           <w:vertAlign w:val="superscript"/>
-          <ns2:ligatures ns2:val="none"/>
+          <w14:ligatures w14:val="none"/>
         </w:rPr>
         <w:footnoteReference w:id="15"/>
       </w:r>
@@ -3545,7 +3585,7 @@
         <w:rPr>
           <w:rFonts w:ascii="Arial Narrow" w:eastAsia="Calibri" w:hAnsi="Arial Narrow" w:cs="Arial"/>
           <w:kern w:val="0"/>
-          <ns2:ligatures ns2:val="none"/>
+          <w14:ligatures w14:val="none"/>
         </w:rPr>
         <w:t xml:space="preserve">, hasta antes de la emisión de la Resolución Final tienen la posibilidad de solicitar una audiencia de conciliación. En caso deleguen a favor de una tercera persona su actuación en la diligencia programada, ésta deberá presentar un poder especial con firma legalizada ante Notario Público, donde conste </w:t>
       </w:r>
@@ -3554,7 +3594,7 @@
           <w:rFonts w:ascii="Arial Narrow" w:eastAsia="Calibri" w:hAnsi="Arial Narrow" w:cs="Arial"/>
           <w:kern w:val="0"/>
           <w:u w:val="single"/>
-          <ns2:ligatures ns2:val="none"/>
+          <w14:ligatures w14:val="none"/>
         </w:rPr>
         <w:t>expresamente su facultad para asistir y conciliar en su representación</w:t>
       </w:r>
@@ -3563,7 +3603,7 @@
           <w:rFonts w:ascii="Arial Narrow" w:eastAsia="Calibri" w:hAnsi="Arial Narrow" w:cs="Arial"/>
           <w:bCs/>
           <w:kern w:val="0"/>
-          <ns2:ligatures ns2:val="none"/>
+          <w14:ligatures w14:val="none"/>
         </w:rPr>
         <w:t>.</w:t>
       </w:r>
@@ -3573,7 +3613,7 @@
           <w:b/>
           <w:bCs/>
           <w:kern w:val="0"/>
-          <ns2:ligatures ns2:val="none"/>
+          <w14:ligatures w14:val="none"/>
         </w:rPr>
         <w:t xml:space="preserve"> </w:t>
       </w:r>
@@ -3582,12 +3622,12 @@
           <w:rFonts w:ascii="Arial Narrow" w:eastAsia="Calibri" w:hAnsi="Arial Narrow" w:cs="Arial"/>
           <w:kern w:val="0"/>
           <w:u w:val="single"/>
-          <ns2:ligatures ns2:val="none"/>
+          <w14:ligatures w14:val="none"/>
         </w:rPr>
         <w:t xml:space="preserve">Ello bajo apercibimiento de no realizar la audiencia de conciliación y levantar el acta de inasistencia correspondiente. </w:t>
       </w:r>
     </w:p>
-    <w:p ns2:paraId="4CD47B08" ns2:textId="77777777">
+    <w:p>
       <w:pPr>
         <w:suppressAutoHyphens/>
         <w:spacing w:after="0" w:line="240" w:lineRule="auto"/>
@@ -3596,11 +3636,11 @@
           <w:rFonts w:ascii="Arial Narrow" w:eastAsia="Calibri" w:hAnsi="Arial Narrow" w:cs="Arial"/>
           <w:kern w:val="0"/>
           <w:u w:val="single"/>
-          <ns2:ligatures ns2:val="none"/>
-        </w:rPr>
-      </w:pPr>
-    </w:p>
-    <w:p ns2:paraId="0E80CA49" ns2:textId="77777777">
+          <w14:ligatures w14:val="none"/>
+        </w:rPr>
+      </w:pPr>
+    </w:p>
+    <w:p>
       <w:pPr>
         <w:suppressAutoHyphens/>
         <w:spacing w:after="0" w:line="240" w:lineRule="auto"/>
@@ -3610,7 +3650,7 @@
           <w:color w:val="000000"/>
           <w:kern w:val="0"/>
           <w:lang w:eastAsia="es-PE"/>
-          <ns2:ligatures ns2:val="none"/>
+          <w14:ligatures w14:val="none"/>
         </w:rPr>
       </w:pPr>
       <w:r>
@@ -3620,7 +3660,7 @@
           <w:color w:val="000000"/>
           <w:kern w:val="0"/>
           <w:lang w:eastAsia="es-PE"/>
-          <ns2:ligatures ns2:val="none"/>
+          <w14:ligatures w14:val="none"/>
         </w:rPr>
         <w:t>NOVENO:</w:t>
       </w:r>
@@ -3630,14 +3670,14 @@
           <w:color w:val="000000"/>
           <w:kern w:val="0"/>
           <w:lang w:eastAsia="es-PE"/>
-          <ns2:ligatures ns2:val="none"/>
+          <w14:ligatures w14:val="none"/>
         </w:rPr>
         <w:t xml:space="preserve"> poner en conocimiento de las partes que, antes de la emisión de la Resolución Final, tienen la posibilidad de formular su desistimiento o presentar el acuerdo arribado mediante la conciliación, mediación, transacción o cualquier otro que, de forma indubitable, deje constancia que se ha solucionado la controversia materia de denuncia.</w:t>
       </w:r>
       <w:bookmarkStart w:id="33" w:name="h.gjdgxs" w:colFirst="0" w:colLast="0"/>
       <w:bookmarkEnd w:id="33"/>
     </w:p>
-    <w:p ns2:paraId="7DDD06F7" ns2:textId="77777777">
+    <w:p>
       <w:pPr>
         <w:suppressAutoHyphens/>
         <w:spacing w:after="0" w:line="240" w:lineRule="auto"/>
@@ -3647,11 +3687,11 @@
           <w:color w:val="000000"/>
           <w:kern w:val="0"/>
           <w:lang w:eastAsia="es-PE"/>
-          <ns2:ligatures ns2:val="none"/>
-        </w:rPr>
-      </w:pPr>
-    </w:p>
-    <w:p ns2:paraId="00C1E8AE" ns2:textId="4F0BC1A3">
+          <w14:ligatures w14:val="none"/>
+        </w:rPr>
+      </w:pPr>
+    </w:p>
+    <w:p>
       <w:pPr>
         <w:suppressAutoHyphens/>
         <w:spacing w:after="0" w:line="240" w:lineRule="auto"/>
@@ -3674,7 +3714,7 @@
           <w:b/>
           <w:spacing w:val="-3"/>
           <w:kern w:val="0"/>
-          <ns2:ligatures ns2:val="none"/>
+          <w14:ligatures w14:val="none"/>
         </w:rPr>
         <w:t>:</w:t>
       </w:r>
@@ -3684,7 +3724,7 @@
           <w:bCs/>
           <w:spacing w:val="-3"/>
           <w:kern w:val="0"/>
-          <ns2:ligatures ns2:val="none"/>
+          <w14:ligatures w14:val="none"/>
         </w:rPr>
         <w:t xml:space="preserve"> requerir </w:t>
       </w:r>
@@ -3694,7 +3734,7 @@
           <w:bCs/>
           <w:spacing w:val="-3"/>
           <w:kern w:val="0"/>
-          <ns2:ligatures ns2:val="none"/>
+          <w14:ligatures w14:val="none"/>
         </w:rPr>
         <w:t xml:space="preserve">a la señora </w:t>
       </w:r>
@@ -3705,7 +3745,7 @@
           <w:kern w:val="0"/>
           <w:shd w:val="clear" w:color="auto" w:fill="FFFFFF"/>
           <w:lang w:eastAsia="es-PE"/>
-          <ns2:ligatures ns2:val="none"/>
+          <w14:ligatures w14:val="none"/>
         </w:rPr>
         <w:t xml:space="preserve">Liliana Ursula Asencios Malca </w:t>
       </w:r>
@@ -3809,7 +3849,7 @@
         <w:t>.</w:t>
       </w:r>
     </w:p>
-    <w:p ns2:paraId="61F34625" ns2:textId="77777777">
+    <w:p>
       <w:pPr>
         <w:suppressAutoHyphens/>
         <w:spacing w:after="0" w:line="240" w:lineRule="auto"/>
@@ -3819,7 +3859,7 @@
         </w:rPr>
       </w:pPr>
     </w:p>
-    <w:p ns2:paraId="083D8417" ns2:textId="77777777">
+    <w:p>
       <w:pPr>
         <w:suppressAutoHyphens/>
         <w:spacing w:after="0" w:line="240" w:lineRule="auto"/>
@@ -3908,7 +3948,7 @@
       </w:r>
       <w:bookmarkStart w:id="34" w:name="_Hlk198890962"/>
     </w:p>
-    <w:p ns2:paraId="3B012692" ns2:textId="77777777">
+    <w:p>
       <w:pPr>
         <w:suppressAutoHyphens/>
         <w:spacing w:after="0" w:line="240" w:lineRule="auto"/>
@@ -3923,7 +3963,7 @@
           <w:b/>
           <w:spacing w:val="-3"/>
           <w:kern w:val="0"/>
-          <ns2:ligatures ns2:val="none"/>
+          <w14:ligatures w14:val="none"/>
         </w:rPr>
         <w:t>DÉCIMO SEGUNDO:</w:t>
       </w:r>
@@ -3933,7 +3973,7 @@
           <w:bCs/>
           <w:spacing w:val="-3"/>
           <w:kern w:val="0"/>
-          <ns2:ligatures ns2:val="none"/>
+          <w14:ligatures w14:val="none"/>
         </w:rPr>
         <w:t xml:space="preserve"> requerir al</w:t>
       </w:r>
@@ -3950,7 +3990,7 @@
           <w:bCs/>
           <w:spacing w:val="-3"/>
           <w:kern w:val="0"/>
-          <ns2:ligatures ns2:val="none"/>
+          <w14:ligatures w14:val="none"/>
         </w:rPr>
         <w:t xml:space="preserve"> </w:t>
       </w:r>
@@ -3968,7 +4008,7 @@
           <w:color w:val="000000"/>
           <w:kern w:val="0"/>
           <w:lang w:eastAsia="es-PE"/>
-          <ns2:ligatures ns2:val="none"/>
+          <w14:ligatures w14:val="none"/>
         </w:rPr>
         <w:t>dentro del plazo de dos (2) días hábiles siguientes a la fecha en que reciba la notificación en su domicilio procesal</w:t>
       </w:r>
@@ -3987,7 +4027,7 @@
         <w:t xml:space="preserve"> </w:t>
       </w:r>
     </w:p>
-    <w:p ns2:paraId="36317C11" ns2:textId="77777777">
+    <w:p>
       <w:pPr>
         <w:suppressAutoHyphens/>
         <w:spacing w:after="0" w:line="240" w:lineRule="auto"/>
@@ -3999,7 +4039,7 @@
       </w:pPr>
     </w:p>
     <w:bookmarkEnd w:id="34"/>
-    <w:p ns2:paraId="23716787" ns2:textId="77777777">
+    <w:p>
       <w:pPr>
         <w:suppressAutoHyphens/>
         <w:spacing w:after="0" w:line="240" w:lineRule="auto"/>
@@ -4009,22 +4049,22 @@
         </w:rPr>
       </w:pPr>
     </w:p>
-    <w:p ns2:paraId="418E1D52" ns2:textId="77777777">
-      <w:pPr>
-        <w:spacing w:after="0" w:line="240" w:lineRule="auto"/>
-        <w:jc w:val="both"/>
-        <w:rPr>
-          <w:rFonts w:ascii="Arial Narrow" w:eastAsia="Arial Narrow" w:hAnsi="Arial Narrow" w:cs="Arial Narrow"/>
-          <w:b/>
-          <w:color w:val="000000"/>
-          <w:kern w:val="0"/>
-          <w:lang w:eastAsia="es-PE"/>
-          <ns2:ligatures ns2:val="none"/>
+    <w:p>
+      <w:pPr>
+        <w:spacing w:after="0" w:line="240" w:lineRule="auto"/>
+        <w:jc w:val="both"/>
+        <w:rPr>
+          <w:rFonts w:ascii="Arial Narrow" w:eastAsia="Arial Narrow" w:hAnsi="Arial Narrow" w:cs="Arial Narrow"/>
+          <w:b/>
+          <w:color w:val="000000"/>
+          <w:kern w:val="0"/>
+          <w:lang w:eastAsia="es-PE"/>
+          <w14:ligatures w14:val="none"/>
         </w:rPr>
       </w:pPr>
     </w:p>
     <w:bookmarkEnd w:id="0"/>
-    <w:p ns2:paraId="2E71D930" ns2:textId="77777777">
+    <w:p>
       <w:pPr>
         <w:spacing w:after="0" w:line="240" w:lineRule="auto"/>
         <w:jc w:val="both"/>
@@ -4034,11 +4074,11 @@
           <w:color w:val="000000"/>
           <w:kern w:val="0"/>
           <w:lang w:val="es-ES" w:eastAsia="es-PE"/>
-          <ns2:ligatures ns2:val="none"/>
-        </w:rPr>
-      </w:pPr>
-    </w:p>
-    <w:p ns2:paraId="3900249E" ns2:textId="77777777">
+          <w14:ligatures w14:val="none"/>
+        </w:rPr>
+      </w:pPr>
+    </w:p>
+    <w:p>
       <w:pPr>
         <w:spacing w:after="0" w:line="240" w:lineRule="auto"/>
         <w:jc w:val="center"/>
@@ -4059,7 +4099,7 @@
         <w:t>Firmado digitalmente por</w:t>
       </w:r>
     </w:p>
-    <w:p ns2:paraId="558984AF" ns2:textId="77777777">
+    <w:p>
       <w:pPr>
         <w:spacing w:after="0" w:line="240" w:lineRule="auto"/>
         <w:jc w:val="center"/>
@@ -4080,7 +4120,7 @@
         <w:t xml:space="preserve">LUISA ANALÍ SILVA MALPARTIDA</w:t>
       </w:r>
     </w:p>
-    <w:p ns2:paraId="17B40BC3" ns2:textId="77777777">
+    <w:p>
       <w:pPr>
         <w:spacing w:after="0" w:line="240" w:lineRule="auto"/>
         <w:jc w:val="center"/>
@@ -4101,7 +4141,7 @@
         <w:t xml:space="preserve">Secretaria Técnica Ad Hoc</w:t>
       </w:r>
     </w:p>
-    <w:p ns2:paraId="46245C81" ns2:textId="77777777">
+    <w:p>
       <w:pPr>
         <w:spacing w:after="0" w:line="240" w:lineRule="auto"/>
         <w:jc w:val="center"/>
@@ -4122,7 +4162,7 @@
         <w:t>Comisión de Protección al Consumidor 1</w:t>
       </w:r>
     </w:p>
-    <w:p ns2:paraId="4423ADE9" ns2:textId="71B19EC2">
+    <w:p>
       <w:pPr>
         <w:spacing w:after="0" w:line="240" w:lineRule="auto"/>
         <w:rPr>
@@ -4146,18 +4186,18 @@
         <w:t>/DCQ</w:t>
       </w:r>
     </w:p>
-    <w:p ns2:paraId="74AAB5F4" ns2:textId="77777777">
+    <w:p>
       <w:pPr>
         <w:spacing w:after="0" w:line="240" w:lineRule="auto"/>
       </w:pPr>
     </w:p>
     <w:sectPr>
-      <w:headerReference w:type="even" ns3:id="rId8"/>
-      <w:headerReference w:type="default" ns3:id="rId9"/>
-      <w:footerReference w:type="even" ns3:id="rId10"/>
-      <w:footerReference w:type="default" ns3:id="rId11"/>
-      <w:headerReference w:type="first" ns3:id="rId12"/>
-      <w:footerReference w:type="first" ns3:id="rId13"/>
+      <w:headerReference w:type="even" r:id="rId8"/>
+      <w:headerReference w:type="default" r:id="rId9"/>
+      <w:footerReference w:type="even" r:id="rId10"/>
+      <w:footerReference w:type="default" r:id="rId11"/>
+      <w:headerReference w:type="first" r:id="rId12"/>
+      <w:footerReference w:type="first" r:id="rId13"/>
       <w:pgSz w:w="11906" w:h="16838"/>
       <w:pgMar w:top="1417" w:right="1701" w:bottom="1417" w:left="1701" w:header="708" w:footer="708" w:gutter="0"/>
       <w:cols w:space="708"/>
@@ -4168,7 +4208,7 @@
 </file>
 
 <file path=word/endnotes.xml><?xml version="1.0" encoding="utf-8"?>
-<w:endnotes xmlns:wpc="http://schemas.microsoft.com/office/word/2010/wordprocessingCanvas" xmlns:cx="http://schemas.microsoft.com/office/drawing/2014/chartex" xmlns:cx1="http://schemas.microsoft.com/office/drawing/2015/9/8/chartex" xmlns:cx2="http://schemas.microsoft.com/office/drawing/2015/10/21/chartex" xmlns:cx3="http://schemas.microsoft.com/office/drawing/2016/5/9/chartex" xmlns:cx4="http://schemas.microsoft.com/office/drawing/2016/5/10/chartex" xmlns:cx5="http://schemas.microsoft.com/office/drawing/2016/5/11/chartex" xmlns:cx6="http://schemas.microsoft.com/office/drawing/2016/5/12/chartex" xmlns:cx7="http://schemas.microsoft.com/office/drawing/2016/5/13/chartex" xmlns:cx8="http://schemas.microsoft.com/office/drawing/2016/5/14/chartex" xmlns:mc="http://schemas.openxmlformats.org/markup-compatibility/2006" xmlns:aink="http://schemas.microsoft.com/office/drawing/2016/ink" xmlns:am3d="http://schemas.microsoft.com/office/drawing/2017/model3d" xmlns:o="urn:schemas-microsoft-com:office:office" xmlns:oel="http://schemas.microsoft.com/office/2019/extlst" xmlns:r="http://schemas.openxmlformats.org/officeDocument/2006/relationships" xmlns:m="http://schemas.openxmlformats.org/officeDocument/2006/math" xmlns:v="urn:schemas-microsoft-com:vml" xmlns:wp14="http://schemas.microsoft.com/office/word/2010/wordprocessingDrawing" xmlns:wp="http://schemas.openxmlformats.org/drawingml/2006/wordprocessingDrawing" xmlns:w10="urn:schemas-microsoft-com:office:word" xmlns:w="http://schemas.openxmlformats.org/wordprocessingml/2006/main" xmlns:w14="http://schemas.microsoft.com/office/word/2010/wordml" xmlns:w15="http://schemas.microsoft.com/office/word/2012/wordml" xmlns:w16cei="http://schemas.microsoft.com/office/word/2026/wordml/cei" xmlns:w16cex="http://schemas.microsoft.com/office/word/2018/wordml/cex" xmlns:w16cid="http://schemas.microsoft.com/office/word/2016/wordml/cid" xmlns:w16="http://schemas.microsoft.com/office/word/2018/wordml" xmlns:w16du="http://schemas.microsoft.com/office/word/2023/wordml/word16du" xmlns:w16sdtdh="http://schemas.microsoft.com/office/word/2020/wordml/sdtdatahash" xmlns:w16sdtfl="http://schemas.microsoft.com/office/word/2024/wordml/sdtformatlock" xmlns:w16se="http://schemas.microsoft.com/office/word/2015/wordml/symex" xmlns:wpg="http://schemas.microsoft.com/office/word/2010/wordprocessingGroup" xmlns:wpi="http://schemas.microsoft.com/office/word/2010/wordprocessingInk" xmlns:wne="http://schemas.microsoft.com/office/word/2006/wordml" xmlns:wps="http://schemas.microsoft.com/office/word/2010/wordprocessingShape" mc:Ignorable="w14 w15 w16se w16cid w16 w16cex w16sdtdh w16sdtfl w16du wp14">
+<w:endnotes xmlns:mc="http://schemas.openxmlformats.org/markup-compatibility/2006" xmlns:r="http://schemas.openxmlformats.org/officeDocument/2006/relationships" xmlns:w="http://schemas.openxmlformats.org/wordprocessingml/2006/main" xmlns:w14="http://schemas.microsoft.com/office/word/2010/wordml" xmlns:w15="http://schemas.microsoft.com/office/word/2012/wordml" xmlns:w16="http://schemas.microsoft.com/office/word/2018/wordml" xmlns:w16cex="http://schemas.microsoft.com/office/word/2018/wordml/cex" xmlns:w16cid="http://schemas.microsoft.com/office/word/2016/wordml/cid" xmlns:w16du="http://schemas.microsoft.com/office/word/2023/wordml/word16du" xmlns:w16sdtdh="http://schemas.microsoft.com/office/word/2020/wordml/sdtdatahash" xmlns:w16se="http://schemas.microsoft.com/office/word/2015/wordml/symex" xmlns:wp14="http://schemas.microsoft.com/office/word/2010/wordprocessingDrawing" mc:Ignorable="w14 w15 w16se w16cid w16 w16cex w16sdtdh w16du wp14">
   <w:endnote w:type="separator" w:id="-1">
     <w:p>
       <w:pPr>
@@ -4193,7 +4233,7 @@
 </file>
 
 <file path=word/footer1.xml><?xml version="1.0" encoding="utf-8"?>
-<w:ftr xmlns:wpc="http://schemas.microsoft.com/office/word/2010/wordprocessingCanvas" xmlns:cx="http://schemas.microsoft.com/office/drawing/2014/chartex" xmlns:cx1="http://schemas.microsoft.com/office/drawing/2015/9/8/chartex" xmlns:cx2="http://schemas.microsoft.com/office/drawing/2015/10/21/chartex" xmlns:cx3="http://schemas.microsoft.com/office/drawing/2016/5/9/chartex" xmlns:cx4="http://schemas.microsoft.com/office/drawing/2016/5/10/chartex" xmlns:cx5="http://schemas.microsoft.com/office/drawing/2016/5/11/chartex" xmlns:cx6="http://schemas.microsoft.com/office/drawing/2016/5/12/chartex" xmlns:cx7="http://schemas.microsoft.com/office/drawing/2016/5/13/chartex" xmlns:cx8="http://schemas.microsoft.com/office/drawing/2016/5/14/chartex" xmlns:mc="http://schemas.openxmlformats.org/markup-compatibility/2006" xmlns:aink="http://schemas.microsoft.com/office/drawing/2016/ink" xmlns:am3d="http://schemas.microsoft.com/office/drawing/2017/model3d" xmlns:o="urn:schemas-microsoft-com:office:office" xmlns:oel="http://schemas.microsoft.com/office/2019/extlst" xmlns:r="http://schemas.openxmlformats.org/officeDocument/2006/relationships" xmlns:m="http://schemas.openxmlformats.org/officeDocument/2006/math" xmlns:v="urn:schemas-microsoft-com:vml" xmlns:wp14="http://schemas.microsoft.com/office/word/2010/wordprocessingDrawing" xmlns:wp="http://schemas.openxmlformats.org/drawingml/2006/wordprocessingDrawing" xmlns:w10="urn:schemas-microsoft-com:office:word" xmlns:w="http://schemas.openxmlformats.org/wordprocessingml/2006/main" xmlns:w14="http://schemas.microsoft.com/office/word/2010/wordml" xmlns:w15="http://schemas.microsoft.com/office/word/2012/wordml" xmlns:w16cei="http://schemas.microsoft.com/office/word/2026/wordml/cei" xmlns:w16cex="http://schemas.microsoft.com/office/word/2018/wordml/cex" xmlns:w16cid="http://schemas.microsoft.com/office/word/2016/wordml/cid" xmlns:w16="http://schemas.microsoft.com/office/word/2018/wordml" xmlns:w16du="http://schemas.microsoft.com/office/word/2023/wordml/word16du" xmlns:w16sdtdh="http://schemas.microsoft.com/office/word/2020/wordml/sdtdatahash" xmlns:w16sdtfl="http://schemas.microsoft.com/office/word/2024/wordml/sdtformatlock" xmlns:w16se="http://schemas.microsoft.com/office/word/2015/wordml/symex" xmlns:wpg="http://schemas.microsoft.com/office/word/2010/wordprocessingGroup" xmlns:wpi="http://schemas.microsoft.com/office/word/2010/wordprocessingInk" xmlns:wne="http://schemas.microsoft.com/office/word/2006/wordml" xmlns:wps="http://schemas.microsoft.com/office/word/2010/wordprocessingShape" mc:Ignorable="w14 w15 w16se w16cid w16 w16cex w16sdtdh w16sdtfl w16du wp14">
+<w:ftr xmlns:mc="http://schemas.openxmlformats.org/markup-compatibility/2006" xmlns:r="http://schemas.openxmlformats.org/officeDocument/2006/relationships" xmlns:w="http://schemas.openxmlformats.org/wordprocessingml/2006/main" xmlns:w14="http://schemas.microsoft.com/office/word/2010/wordml" xmlns:w15="http://schemas.microsoft.com/office/word/2012/wordml" xmlns:w16="http://schemas.microsoft.com/office/word/2018/wordml" xmlns:w16cex="http://schemas.microsoft.com/office/word/2018/wordml/cex" xmlns:w16cid="http://schemas.microsoft.com/office/word/2016/wordml/cid" xmlns:w16du="http://schemas.microsoft.com/office/word/2023/wordml/word16du" xmlns:w16sdtdh="http://schemas.microsoft.com/office/word/2020/wordml/sdtdatahash" xmlns:w16se="http://schemas.microsoft.com/office/word/2015/wordml/symex" xmlns:wp14="http://schemas.microsoft.com/office/word/2010/wordprocessingDrawing" mc:Ignorable="w14 w15 w16se w16cid w16 w16cex w16sdtdh w16du wp14">
   <w:p>
     <w:pPr>
       <w:pStyle w:val="Piedepgina"/>
@@ -4292,7 +4332,7 @@
 </file>
 
 <file path=word/footnotes.xml><?xml version="1.0" encoding="utf-8"?>
-<w:footnotes xmlns:wpc="http://schemas.microsoft.com/office/word/2010/wordprocessingCanvas" xmlns:cx="http://schemas.microsoft.com/office/drawing/2014/chartex" xmlns:cx1="http://schemas.microsoft.com/office/drawing/2015/9/8/chartex" xmlns:cx2="http://schemas.microsoft.com/office/drawing/2015/10/21/chartex" xmlns:cx3="http://schemas.microsoft.com/office/drawing/2016/5/9/chartex" xmlns:cx4="http://schemas.microsoft.com/office/drawing/2016/5/10/chartex" xmlns:cx5="http://schemas.microsoft.com/office/drawing/2016/5/11/chartex" xmlns:cx6="http://schemas.microsoft.com/office/drawing/2016/5/12/chartex" xmlns:cx7="http://schemas.microsoft.com/office/drawing/2016/5/13/chartex" xmlns:cx8="http://schemas.microsoft.com/office/drawing/2016/5/14/chartex" xmlns:mc="http://schemas.openxmlformats.org/markup-compatibility/2006" xmlns:aink="http://schemas.microsoft.com/office/drawing/2016/ink" xmlns:am3d="http://schemas.microsoft.com/office/drawing/2017/model3d" xmlns:o="urn:schemas-microsoft-com:office:office" xmlns:oel="http://schemas.microsoft.com/office/2019/extlst" xmlns:r="http://schemas.openxmlformats.org/officeDocument/2006/relationships" xmlns:m="http://schemas.openxmlformats.org/officeDocument/2006/math" xmlns:v="urn:schemas-microsoft-com:vml" xmlns:wp14="http://schemas.microsoft.com/office/word/2010/wordprocessingDrawing" xmlns:wp="http://schemas.openxmlformats.org/drawingml/2006/wordprocessingDrawing" xmlns:w10="urn:schemas-microsoft-com:office:word" xmlns:w="http://schemas.openxmlformats.org/wordprocessingml/2006/main" xmlns:w14="http://schemas.microsoft.com/office/word/2010/wordml" xmlns:w15="http://schemas.microsoft.com/office/word/2012/wordml" xmlns:w16cei="http://schemas.microsoft.com/office/word/2026/wordml/cei" xmlns:w16cex="http://schemas.microsoft.com/office/word/2018/wordml/cex" xmlns:w16cid="http://schemas.microsoft.com/office/word/2016/wordml/cid" xmlns:w16="http://schemas.microsoft.com/office/word/2018/wordml" xmlns:w16du="http://schemas.microsoft.com/office/word/2023/wordml/word16du" xmlns:w16sdtdh="http://schemas.microsoft.com/office/word/2020/wordml/sdtdatahash" xmlns:w16sdtfl="http://schemas.microsoft.com/office/word/2024/wordml/sdtformatlock" xmlns:w16se="http://schemas.microsoft.com/office/word/2015/wordml/symex" xmlns:wpg="http://schemas.microsoft.com/office/word/2010/wordprocessingGroup" xmlns:wpi="http://schemas.microsoft.com/office/word/2010/wordprocessingInk" xmlns:wne="http://schemas.microsoft.com/office/word/2006/wordml" xmlns:wps="http://schemas.microsoft.com/office/word/2010/wordprocessingShape" mc:Ignorable="w14 w15 w16se w16cid w16 w16cex w16sdtdh w16sdtfl w16du wp14">
+<w:footnotes xmlns:mc="http://schemas.openxmlformats.org/markup-compatibility/2006" xmlns:r="http://schemas.openxmlformats.org/officeDocument/2006/relationships" xmlns:w="http://schemas.openxmlformats.org/wordprocessingml/2006/main" xmlns:w14="http://schemas.microsoft.com/office/word/2010/wordml" xmlns:w15="http://schemas.microsoft.com/office/word/2012/wordml" xmlns:w16="http://schemas.microsoft.com/office/word/2018/wordml" xmlns:w16cex="http://schemas.microsoft.com/office/word/2018/wordml/cex" xmlns:w16cid="http://schemas.microsoft.com/office/word/2016/wordml/cid" xmlns:w16du="http://schemas.microsoft.com/office/word/2023/wordml/word16du" xmlns:w16sdtdh="http://schemas.microsoft.com/office/word/2020/wordml/sdtdatahash" xmlns:w16se="http://schemas.microsoft.com/office/word/2015/wordml/symex" xmlns:wp14="http://schemas.microsoft.com/office/word/2010/wordprocessingDrawing" mc:Ignorable="w14 w15 w16se w16cid w16 w16cex w16sdtdh w16du wp14">
   <w:footnote w:type="separator" w:id="-1">
     <w:p>
       <w:pPr>
@@ -6086,6 +6126,161 @@
       </w:pPr>
     </w:p>
   </w:footnote>
+  <w:footnote w:id="17">
+    <w:p>
+      <w:pPr>
+        <w:pStyle w:val="Textonotapie"/>
+        <w:ind w:left="567" w:hanging="567"/>
+        <w:jc w:val="both"/>
+      </w:pPr>
+      <w:r>
+        <w:rPr>
+          <w:rStyle w:val="Refdenotaalpie"/>
+          <w:rFonts w:ascii="Arial Narrow" w:hAnsi="Arial Narrow" w:cs="Arial"/>
+          <w:sz w:val="16"/>
+          <w:szCs w:val="16"/>
+          <w:vertAlign w:val="superscript"/>
+        </w:rPr>
+        <w:footnoteRef/>
+      </w:r>
+      <w:r>
+        <w:rPr>
+          <w:rFonts w:ascii="Arial Narrow" w:hAnsi="Arial Narrow" w:cs="Arial"/>
+          <w:sz w:val="16"/>
+          <w:szCs w:val="16"/>
+        </w:rPr>
+        <w:tab/>
+      </w:r>
+      <w:r>
+        <w:rPr>
+          <w:rFonts w:ascii="Arial Narrow" w:hAnsi="Arial Narrow" w:cs="Arial"/>
+          <w:b/>
+          <w:bCs/>
+          <w:sz w:val="16"/>
+          <w:szCs w:val="16"/>
+        </w:rPr>
+        <w:t xml:space="preserve">DECRETO LEGISLATIVO 807, LEY SOBRE FACULTADES, NORMAS Y ORGANIZACIÓN DEL INDECOPI, publicado el 18 de abril de 1996</w:t>
+      </w:r>
+    </w:p>
+    <w:p>
+      <w:pPr>
+        <w:pStyle w:val="Textonotapie"/>
+        <w:ind w:left="567" w:hanging="567"/>
+        <w:jc w:val="both"/>
+      </w:pPr>
+      <w:r>
+        <w:rPr>
+          <w:rFonts w:ascii="Arial Narrow" w:hAnsi="Arial Narrow" w:cs="Arial"/>
+          <w:sz w:val="16"/>
+          <w:szCs w:val="16"/>
+        </w:rPr>
+        <w:tab/>
+      </w:r>
+      <w:r>
+        <w:rPr>
+          <w:rFonts w:ascii="Arial Narrow" w:hAnsi="Arial Narrow" w:cs="Arial"/>
+          <w:b/>
+          <w:bCs/>
+          <w:sz w:val="16"/>
+          <w:szCs w:val="16"/>
+        </w:rPr>
+        <w:t xml:space="preserve">Artículo 26.-</w:t>
+      </w:r>
+      <w:r>
+        <w:rPr>
+          <w:rFonts w:ascii="Arial Narrow" w:hAnsi="Arial Narrow" w:cs="Arial"/>
+          <w:sz w:val="16"/>
+          <w:szCs w:val="16"/>
+        </w:rPr>
+        <w:t xml:space="preserve"> Una vez admitida a trámite la denuncia, se correrá traslado de la misma al denunciado, a fin de que éste presente su descargo. El plazo para la presentación del descargo será de cinco (5) días contados desde la notificación, vencido el cual, el Secretario Técnico declarará en rebeldía al denunciado que no lo hubiera presentado.</w:t>
+      </w:r>
+    </w:p>
+  </w:footnote>
+  <w:footnote w:id="18">
+    <w:p>
+      <w:pPr>
+        <w:pStyle w:val="Textonotapie"/>
+        <w:ind w:left="567" w:hanging="567"/>
+        <w:jc w:val="both"/>
+      </w:pPr>
+      <w:r>
+        <w:rPr>
+          <w:rStyle w:val="Refdenotaalpie"/>
+          <w:rFonts w:ascii="Arial Narrow" w:hAnsi="Arial Narrow" w:cs="Arial"/>
+          <w:sz w:val="16"/>
+          <w:szCs w:val="16"/>
+          <w:vertAlign w:val="superscript"/>
+        </w:rPr>
+        <w:footnoteRef/>
+      </w:r>
+      <w:r>
+        <w:rPr>
+          <w:rFonts w:ascii="Arial Narrow" w:hAnsi="Arial Narrow" w:cs="Arial"/>
+          <w:sz w:val="16"/>
+          <w:szCs w:val="16"/>
+        </w:rPr>
+        <w:tab/>
+      </w:r>
+      <w:r>
+        <w:rPr>
+          <w:rFonts w:ascii="Arial Narrow" w:hAnsi="Arial Narrow" w:cs="Arial"/>
+          <w:b/>
+          <w:bCs/>
+          <w:sz w:val="16"/>
+          <w:szCs w:val="16"/>
+        </w:rPr>
+        <w:t xml:space="preserve">DECRETO SUPREMO 006-2026-JUS, TEXTO ÚNICO ORDENADO DE LA LEY 27444, LEY DEL PROCEDIMIENTO ADMINISTRATIVO GENERAL, publicado el 30 de abril de 2026</w:t>
+      </w:r>
+    </w:p>
+    <w:p>
+      <w:pPr>
+        <w:pStyle w:val="Textonotapie"/>
+        <w:ind w:left="567" w:hanging="567"/>
+        <w:jc w:val="both"/>
+      </w:pPr>
+      <w:r>
+        <w:rPr>
+          <w:rFonts w:ascii="Arial Narrow" w:hAnsi="Arial Narrow" w:cs="Arial"/>
+          <w:sz w:val="16"/>
+          <w:szCs w:val="16"/>
+        </w:rPr>
+        <w:tab/>
+      </w:r>
+      <w:r>
+        <w:rPr>
+          <w:rFonts w:ascii="Arial Narrow" w:hAnsi="Arial Narrow" w:cs="Arial"/>
+          <w:b/>
+          <w:bCs/>
+          <w:sz w:val="16"/>
+          <w:szCs w:val="16"/>
+        </w:rPr>
+        <w:t xml:space="preserve">Artículo 223.- Contestación de la reclamación</w:t>
+      </w:r>
+    </w:p>
+    <w:p>
+      <w:pPr>
+        <w:pStyle w:val="Textonotapie"/>
+        <w:ind w:left="567" w:hanging="567"/>
+        <w:jc w:val="both"/>
+      </w:pPr>
+      <w:r>
+        <w:rPr>
+          <w:rFonts w:ascii="Arial Narrow" w:hAnsi="Arial Narrow" w:cs="Arial"/>
+          <w:sz w:val="16"/>
+          <w:szCs w:val="16"/>
+        </w:rPr>
+        <w:tab/>
+      </w:r>
+      <w:r>
+        <w:rPr>
+          <w:rFonts w:ascii="Arial Narrow" w:hAnsi="Arial Narrow" w:cs="Arial"/>
+          <w:sz w:val="16"/>
+          <w:szCs w:val="16"/>
+        </w:rPr>
+        <w:t xml:space="preserve">223.1 El reclamado deberá presentar la contestación de la reclamación dentro de los quince (15) días posteriores a la notificación de ésta; vencido este plazo, la Administración declarará en rebeldía al reclamado que no la hubiera presentado. La contestación deberá contener los requisitos de los escritos previstos en el artículo 113 de la presente Ley, así como la absolución de todos los asuntos controvertidos de hecho y de derecho, Las alegaciones y los hechos relevantes de la reclamación, salvo que hayan sido específicamente negadas en la contestación, se tendrán por aceptadas o merituadas como ciertas.</w:t>
+      </w:r>
+    </w:p>
+  </w:footnote>
   <w:footnote w:id="12">
     <w:p>
       <w:pPr>
@@ -7557,7 +7752,7 @@
 </file>
 
 <file path=word/header1.xml><?xml version="1.0" encoding="utf-8"?>
-<w:hdr xmlns:wpc="http://schemas.microsoft.com/office/word/2010/wordprocessingCanvas" xmlns:cx="http://schemas.microsoft.com/office/drawing/2014/chartex" xmlns:cx1="http://schemas.microsoft.com/office/drawing/2015/9/8/chartex" xmlns:cx2="http://schemas.microsoft.com/office/drawing/2015/10/21/chartex" xmlns:cx3="http://schemas.microsoft.com/office/drawing/2016/5/9/chartex" xmlns:cx4="http://schemas.microsoft.com/office/drawing/2016/5/10/chartex" xmlns:cx5="http://schemas.microsoft.com/office/drawing/2016/5/11/chartex" xmlns:cx6="http://schemas.microsoft.com/office/drawing/2016/5/12/chartex" xmlns:cx7="http://schemas.microsoft.com/office/drawing/2016/5/13/chartex" xmlns:cx8="http://schemas.microsoft.com/office/drawing/2016/5/14/chartex" xmlns:mc="http://schemas.openxmlformats.org/markup-compatibility/2006" xmlns:aink="http://schemas.microsoft.com/office/drawing/2016/ink" xmlns:am3d="http://schemas.microsoft.com/office/drawing/2017/model3d" xmlns:o="urn:schemas-microsoft-com:office:office" xmlns:oel="http://schemas.microsoft.com/office/2019/extlst" xmlns:r="http://schemas.openxmlformats.org/officeDocument/2006/relationships" xmlns:m="http://schemas.openxmlformats.org/officeDocument/2006/math" xmlns:v="urn:schemas-microsoft-com:vml" xmlns:wp14="http://schemas.microsoft.com/office/word/2010/wordprocessingDrawing" xmlns:wp="http://schemas.openxmlformats.org/drawingml/2006/wordprocessingDrawing" xmlns:w10="urn:schemas-microsoft-com:office:word" xmlns:w="http://schemas.openxmlformats.org/wordprocessingml/2006/main" xmlns:w14="http://schemas.microsoft.com/office/word/2010/wordml" xmlns:w15="http://schemas.microsoft.com/office/word/2012/wordml" xmlns:w16cei="http://schemas.microsoft.com/office/word/2026/wordml/cei" xmlns:w16cex="http://schemas.microsoft.com/office/word/2018/wordml/cex" xmlns:w16cid="http://schemas.microsoft.com/office/word/2016/wordml/cid" xmlns:w16="http://schemas.microsoft.com/office/word/2018/wordml" xmlns:w16du="http://schemas.microsoft.com/office/word/2023/wordml/word16du" xmlns:w16sdtdh="http://schemas.microsoft.com/office/word/2020/wordml/sdtdatahash" xmlns:w16sdtfl="http://schemas.microsoft.com/office/word/2024/wordml/sdtformatlock" xmlns:w16se="http://schemas.microsoft.com/office/word/2015/wordml/symex" xmlns:wpg="http://schemas.microsoft.com/office/word/2010/wordprocessingGroup" xmlns:wpi="http://schemas.microsoft.com/office/word/2010/wordprocessingInk" xmlns:wne="http://schemas.microsoft.com/office/word/2006/wordml" xmlns:wps="http://schemas.microsoft.com/office/word/2010/wordprocessingShape" mc:Ignorable="w14 w15 w16se w16cid w16 w16cex w16sdtdh w16sdtfl w16du wp14">
+<w:hdr xmlns:mc="http://schemas.openxmlformats.org/markup-compatibility/2006" xmlns:r="http://schemas.openxmlformats.org/officeDocument/2006/relationships" xmlns:w="http://schemas.openxmlformats.org/wordprocessingml/2006/main" xmlns:w14="http://schemas.microsoft.com/office/word/2010/wordml" xmlns:w15="http://schemas.microsoft.com/office/word/2012/wordml" xmlns:w16="http://schemas.microsoft.com/office/word/2018/wordml" xmlns:w16cex="http://schemas.microsoft.com/office/word/2018/wordml/cex" xmlns:w16cid="http://schemas.microsoft.com/office/word/2016/wordml/cid" xmlns:w16du="http://schemas.microsoft.com/office/word/2023/wordml/word16du" xmlns:w16sdtdh="http://schemas.microsoft.com/office/word/2020/wordml/sdtdatahash" xmlns:w16se="http://schemas.microsoft.com/office/word/2015/wordml/symex" xmlns:wp14="http://schemas.microsoft.com/office/word/2010/wordprocessingDrawing" mc:Ignorable="w14 w15 w16se w16cid w16 w16cex w16sdtdh w16du wp14">
   <w:p>
     <w:pPr>
       <w:pStyle w:val="Encabezado"/>

</xml_diff>